<commit_message>
feat(test-framework): bind suites to test runs
</commit_message>
<xml_diff>
--- a/docs/ATEP_Volume_VIII_Test_Framework_Engineering_Workbook.docx
+++ b/docs/ATEP_Volume_VIII_Test_Framework_Engineering_Workbook.docx
@@ -19,12 +19,12 @@
         <w:rPr>
           <w:b/>
         </w:rPr>
-        <w:t>Version 0.1.0   VIII 1 Test Catalog Implemented</w:t>
+        <w:t>Version 0.2.0   VIII 2 Execution Binding Implemented</w:t>
       </w:r>
     </w:p>
     <w:p>
       <w:r>
-        <w:t>This workbook records the first Test Framework baseline for ATEP. Reusable definitions now describe test intent independently from execution, while suites preserve ordered, versioned composition for later scheduling and result analysis.</w:t>
+        <w:t>This workbook records the catalog and execution-binding baseline for ATEP. Reusable definitions describe test intent, suites preserve reviewed composition, and catalog-backed runs now persist deterministic case results and aggregate outcomes.</w:t>
       </w:r>
     </w:p>
     <w:tbl>
@@ -125,7 +125,7 @@
           </w:tcPr>
           <w:p>
             <w:r>
-              <w:t>VIII-1 implemented and verified</w:t>
+              <w:t>VIII-1 and VIII-2 implemented and verified</w:t>
             </w:r>
           </w:p>
         </w:tc>
@@ -289,7 +289,7 @@
           </w:tcPr>
           <w:p>
             <w:r>
-              <w:t>VIII-2 suite execution binding and case results</w:t>
+              <w:t>VIII-3 scheduler and smoke, sanity, regression selection</w:t>
             </w:r>
           </w:p>
         </w:tc>
@@ -306,7 +306,7 @@
     </w:p>
     <w:p>
       <w:r>
-        <w:t>VIII-1 separates reusable test design from test execution. A definition captures one test's preconditions, actions, inputs, expectations, classification, and resource budget. A suite selects active definitions in an explicit order and freezes their versions.</w:t>
+        <w:t>VIII-1 separates reusable test design from test execution. A definition captures one test's preconditions, actions, inputs, expectations, classification, and resource budget. A suite selects active definitions in an explicit order and freezes their versions. VIII-2 binds that snapshot to a run and records each case outcome.</w:t>
       </w:r>
     </w:p>
     <w:p>
@@ -330,7 +330,7 @@
         <w:pStyle w:val="ListBullet"/>
       </w:pPr>
       <w:r>
-        <w:t>Execution, scheduling, campaigns, mutation testing, and coverage remain later increments.</w:t>
+        <w:t>Scheduling, campaigns, mutation testing, and coverage remain later increments.</w:t>
       </w:r>
     </w:p>
     <w:p>
@@ -568,7 +568,7 @@
           </w:tcPr>
           <w:p>
             <w:r>
-              <w:t>Linear migration 0051 with reversible schema creation</w:t>
+              <w:t>Linear migrations 0051 and 0052 with reversible schema changes</w:t>
             </w:r>
           </w:p>
         </w:tc>
@@ -589,7 +589,7 @@
           </w:tcPr>
           <w:p>
             <w:r>
-              <w:t>Future executor</w:t>
+              <w:t>Run executor</w:t>
             </w:r>
           </w:p>
         </w:tc>
@@ -608,7 +608,7 @@
           </w:tcPr>
           <w:p>
             <w:r>
-              <w:t>Consumes an active suite snapshot without rewriting catalog intent</w:t>
+              <w:t>Materializes and updates ordered cases without rewriting catalog intent</w:t>
             </w:r>
           </w:p>
         </w:tc>
@@ -1848,7 +1848,820 @@
         <w:pStyle w:val="Heading1"/>
       </w:pPr>
       <w:r>
-        <w:t>7 Events and Audit</w:t>
+        <w:t>7 Execution Binding</w:t>
+      </w:r>
+    </w:p>
+    <w:p>
+      <w:r>
+        <w:t>A run may reference an active catalog suite. Creation freezes the suite identifier, name, type, version, and composition and creates one pending result per ordered case in the same transaction. Existing runs remain reproducible after the source suite is archived.</w:t>
+      </w:r>
+    </w:p>
+    <w:tbl>
+      <w:tblPr>
+        <w:tblW w:type="auto" w:w="0"/>
+        <w:tblLayout w:type="fixed"/>
+        <w:tblLook w:firstColumn="1" w:firstRow="1" w:lastColumn="0" w:lastRow="0" w:noHBand="0" w:noVBand="1" w:val="04A0"/>
+      </w:tblPr>
+      <w:tblGrid>
+        <w:gridCol w:w="3312"/>
+        <w:gridCol w:w="3312"/>
+        <w:gridCol w:w="3312"/>
+      </w:tblGrid>
+      <w:tr>
+        <w:trPr>
+          <w:tblHeader/>
+        </w:trPr>
+        <w:tc>
+          <w:tcPr>
+            <w:tcW w:type="dxa" w:w="2376"/>
+            <w:shd w:fill="17365D"/>
+            <w:tcBorders>
+              <w:top w:val="single" w:sz="4" w:color="D9D9D9"/>
+              <w:left w:val="single" w:sz="4" w:color="D9D9D9"/>
+              <w:bottom w:val="single" w:sz="4" w:color="D9D9D9"/>
+              <w:right w:val="single" w:sz="4" w:color="D9D9D9"/>
+              <w:insideH w:val="single" w:sz="4" w:color="D9D9D9"/>
+              <w:insideV w:val="single" w:sz="4" w:color="D9D9D9"/>
+            </w:tcBorders>
+            <w:vAlign w:val="center"/>
+          </w:tcPr>
+          <w:p>
+            <w:r>
+              <w:rPr>
+                <w:b/>
+                <w:color w:val="FFFFFF"/>
+              </w:rPr>
+              <w:t>Persisted input</w:t>
+            </w:r>
+          </w:p>
+        </w:tc>
+        <w:tc>
+          <w:tcPr>
+            <w:tcW w:type="dxa" w:w="2592"/>
+            <w:shd w:fill="17365D"/>
+            <w:tcBorders>
+              <w:top w:val="single" w:sz="4" w:color="D9D9D9"/>
+              <w:left w:val="single" w:sz="4" w:color="D9D9D9"/>
+              <w:bottom w:val="single" w:sz="4" w:color="D9D9D9"/>
+              <w:right w:val="single" w:sz="4" w:color="D9D9D9"/>
+              <w:insideH w:val="single" w:sz="4" w:color="D9D9D9"/>
+              <w:insideV w:val="single" w:sz="4" w:color="D9D9D9"/>
+            </w:tcBorders>
+            <w:vAlign w:val="center"/>
+          </w:tcPr>
+          <w:p>
+            <w:r>
+              <w:rPr>
+                <w:b/>
+                <w:color w:val="FFFFFF"/>
+              </w:rPr>
+              <w:t>Bound</w:t>
+            </w:r>
+          </w:p>
+        </w:tc>
+        <w:tc>
+          <w:tcPr>
+            <w:tcW w:type="dxa" w:w="5112"/>
+            <w:shd w:fill="17365D"/>
+            <w:tcBorders>
+              <w:top w:val="single" w:sz="4" w:color="D9D9D9"/>
+              <w:left w:val="single" w:sz="4" w:color="D9D9D9"/>
+              <w:bottom w:val="single" w:sz="4" w:color="D9D9D9"/>
+              <w:right w:val="single" w:sz="4" w:color="D9D9D9"/>
+              <w:insideH w:val="single" w:sz="4" w:color="D9D9D9"/>
+              <w:insideV w:val="single" w:sz="4" w:color="D9D9D9"/>
+            </w:tcBorders>
+            <w:vAlign w:val="center"/>
+          </w:tcPr>
+          <w:p>
+            <w:r>
+              <w:rPr>
+                <w:b/>
+                <w:color w:val="FFFFFF"/>
+              </w:rPr>
+              <w:t>Purpose</w:t>
+            </w:r>
+          </w:p>
+        </w:tc>
+      </w:tr>
+      <w:tr>
+        <w:tc>
+          <w:tcPr>
+            <w:tcW w:type="dxa" w:w="2376"/>
+            <w:tcBorders>
+              <w:top w:val="single" w:sz="4" w:color="D9D9D9"/>
+              <w:left w:val="single" w:sz="4" w:color="D9D9D9"/>
+              <w:bottom w:val="single" w:sz="4" w:color="D9D9D9"/>
+              <w:right w:val="single" w:sz="4" w:color="D9D9D9"/>
+              <w:insideH w:val="single" w:sz="4" w:color="D9D9D9"/>
+              <w:insideV w:val="single" w:sz="4" w:color="D9D9D9"/>
+            </w:tcBorders>
+            <w:vAlign w:val="center"/>
+          </w:tcPr>
+          <w:p>
+            <w:r>
+              <w:t>Attempt</w:t>
+            </w:r>
+          </w:p>
+        </w:tc>
+        <w:tc>
+          <w:tcPr>
+            <w:tcW w:type="dxa" w:w="2592"/>
+            <w:tcBorders>
+              <w:top w:val="single" w:sz="4" w:color="D9D9D9"/>
+              <w:left w:val="single" w:sz="4" w:color="D9D9D9"/>
+              <w:bottom w:val="single" w:sz="4" w:color="D9D9D9"/>
+              <w:right w:val="single" w:sz="4" w:color="D9D9D9"/>
+              <w:insideH w:val="single" w:sz="4" w:color="D9D9D9"/>
+              <w:insideV w:val="single" w:sz="4" w:color="D9D9D9"/>
+            </w:tcBorders>
+            <w:vAlign w:val="center"/>
+          </w:tcPr>
+          <w:p>
+            <w:r>
+              <w:t>0 to 100</w:t>
+            </w:r>
+          </w:p>
+        </w:tc>
+        <w:tc>
+          <w:tcPr>
+            <w:tcW w:type="dxa" w:w="5112"/>
+            <w:tcBorders>
+              <w:top w:val="single" w:sz="4" w:color="D9D9D9"/>
+              <w:left w:val="single" w:sz="4" w:color="D9D9D9"/>
+              <w:bottom w:val="single" w:sz="4" w:color="D9D9D9"/>
+              <w:right w:val="single" w:sz="4" w:color="D9D9D9"/>
+              <w:insideH w:val="single" w:sz="4" w:color="D9D9D9"/>
+              <w:insideV w:val="single" w:sz="4" w:color="D9D9D9"/>
+            </w:tcBorders>
+            <w:vAlign w:val="center"/>
+          </w:tcPr>
+          <w:p>
+            <w:r>
+              <w:t>Represent controlled execution attempts</w:t>
+            </w:r>
+          </w:p>
+        </w:tc>
+      </w:tr>
+      <w:tr>
+        <w:tc>
+          <w:tcPr>
+            <w:tcW w:type="dxa" w:w="2376"/>
+            <w:tcBorders>
+              <w:top w:val="single" w:sz="4" w:color="D9D9D9"/>
+              <w:left w:val="single" w:sz="4" w:color="D9D9D9"/>
+              <w:bottom w:val="single" w:sz="4" w:color="D9D9D9"/>
+              <w:right w:val="single" w:sz="4" w:color="D9D9D9"/>
+              <w:insideH w:val="single" w:sz="4" w:color="D9D9D9"/>
+              <w:insideV w:val="single" w:sz="4" w:color="D9D9D9"/>
+            </w:tcBorders>
+            <w:shd w:fill="EAF0F7"/>
+            <w:vAlign w:val="center"/>
+          </w:tcPr>
+          <w:p>
+            <w:r>
+              <w:t>Duration</w:t>
+            </w:r>
+          </w:p>
+        </w:tc>
+        <w:tc>
+          <w:tcPr>
+            <w:tcW w:type="dxa" w:w="2592"/>
+            <w:tcBorders>
+              <w:top w:val="single" w:sz="4" w:color="D9D9D9"/>
+              <w:left w:val="single" w:sz="4" w:color="D9D9D9"/>
+              <w:bottom w:val="single" w:sz="4" w:color="D9D9D9"/>
+              <w:right w:val="single" w:sz="4" w:color="D9D9D9"/>
+              <w:insideH w:val="single" w:sz="4" w:color="D9D9D9"/>
+              <w:insideV w:val="single" w:sz="4" w:color="D9D9D9"/>
+            </w:tcBorders>
+            <w:shd w:fill="EAF0F7"/>
+            <w:vAlign w:val="center"/>
+          </w:tcPr>
+          <w:p>
+            <w:r>
+              <w:t>0 to 86400000 ms</w:t>
+            </w:r>
+          </w:p>
+        </w:tc>
+        <w:tc>
+          <w:tcPr>
+            <w:tcW w:type="dxa" w:w="5112"/>
+            <w:tcBorders>
+              <w:top w:val="single" w:sz="4" w:color="D9D9D9"/>
+              <w:left w:val="single" w:sz="4" w:color="D9D9D9"/>
+              <w:bottom w:val="single" w:sz="4" w:color="D9D9D9"/>
+              <w:right w:val="single" w:sz="4" w:color="D9D9D9"/>
+              <w:insideH w:val="single" w:sz="4" w:color="D9D9D9"/>
+              <w:insideV w:val="single" w:sz="4" w:color="D9D9D9"/>
+            </w:tcBorders>
+            <w:shd w:fill="EAF0F7"/>
+            <w:vAlign w:val="center"/>
+          </w:tcPr>
+          <w:p>
+            <w:r>
+              <w:t>Record terminal execution time</w:t>
+            </w:r>
+          </w:p>
+        </w:tc>
+      </w:tr>
+      <w:tr>
+        <w:tc>
+          <w:tcPr>
+            <w:tcW w:type="dxa" w:w="2376"/>
+            <w:tcBorders>
+              <w:top w:val="single" w:sz="4" w:color="D9D9D9"/>
+              <w:left w:val="single" w:sz="4" w:color="D9D9D9"/>
+              <w:bottom w:val="single" w:sz="4" w:color="D9D9D9"/>
+              <w:right w:val="single" w:sz="4" w:color="D9D9D9"/>
+              <w:insideH w:val="single" w:sz="4" w:color="D9D9D9"/>
+              <w:insideV w:val="single" w:sz="4" w:color="D9D9D9"/>
+            </w:tcBorders>
+            <w:vAlign w:val="center"/>
+          </w:tcPr>
+          <w:p>
+            <w:r>
+              <w:t>Observed result</w:t>
+            </w:r>
+          </w:p>
+        </w:tc>
+        <w:tc>
+          <w:tcPr>
+            <w:tcW w:type="dxa" w:w="2592"/>
+            <w:tcBorders>
+              <w:top w:val="single" w:sz="4" w:color="D9D9D9"/>
+              <w:left w:val="single" w:sz="4" w:color="D9D9D9"/>
+              <w:bottom w:val="single" w:sz="4" w:color="D9D9D9"/>
+              <w:right w:val="single" w:sz="4" w:color="D9D9D9"/>
+              <w:insideH w:val="single" w:sz="4" w:color="D9D9D9"/>
+              <w:insideV w:val="single" w:sz="4" w:color="D9D9D9"/>
+            </w:tcBorders>
+            <w:vAlign w:val="center"/>
+          </w:tcPr>
+          <w:p>
+            <w:r>
+              <w:t>4000 characters</w:t>
+            </w:r>
+          </w:p>
+        </w:tc>
+        <w:tc>
+          <w:tcPr>
+            <w:tcW w:type="dxa" w:w="5112"/>
+            <w:tcBorders>
+              <w:top w:val="single" w:sz="4" w:color="D9D9D9"/>
+              <w:left w:val="single" w:sz="4" w:color="D9D9D9"/>
+              <w:bottom w:val="single" w:sz="4" w:color="D9D9D9"/>
+              <w:right w:val="single" w:sz="4" w:color="D9D9D9"/>
+              <w:insideH w:val="single" w:sz="4" w:color="D9D9D9"/>
+              <w:insideV w:val="single" w:sz="4" w:color="D9D9D9"/>
+            </w:tcBorders>
+            <w:vAlign w:val="center"/>
+          </w:tcPr>
+          <w:p>
+            <w:r>
+              <w:t>Explain the measured outcome</w:t>
+            </w:r>
+          </w:p>
+        </w:tc>
+      </w:tr>
+      <w:tr>
+        <w:tc>
+          <w:tcPr>
+            <w:tcW w:type="dxa" w:w="2376"/>
+            <w:tcBorders>
+              <w:top w:val="single" w:sz="4" w:color="D9D9D9"/>
+              <w:left w:val="single" w:sz="4" w:color="D9D9D9"/>
+              <w:bottom w:val="single" w:sz="4" w:color="D9D9D9"/>
+              <w:right w:val="single" w:sz="4" w:color="D9D9D9"/>
+              <w:insideH w:val="single" w:sz="4" w:color="D9D9D9"/>
+              <w:insideV w:val="single" w:sz="4" w:color="D9D9D9"/>
+            </w:tcBorders>
+            <w:shd w:fill="EAF0F7"/>
+            <w:vAlign w:val="center"/>
+          </w:tcPr>
+          <w:p>
+            <w:r>
+              <w:t>Evidence</w:t>
+            </w:r>
+          </w:p>
+        </w:tc>
+        <w:tc>
+          <w:tcPr>
+            <w:tcW w:type="dxa" w:w="2592"/>
+            <w:tcBorders>
+              <w:top w:val="single" w:sz="4" w:color="D9D9D9"/>
+              <w:left w:val="single" w:sz="4" w:color="D9D9D9"/>
+              <w:bottom w:val="single" w:sz="4" w:color="D9D9D9"/>
+              <w:right w:val="single" w:sz="4" w:color="D9D9D9"/>
+              <w:insideH w:val="single" w:sz="4" w:color="D9D9D9"/>
+              <w:insideV w:val="single" w:sz="4" w:color="D9D9D9"/>
+            </w:tcBorders>
+            <w:shd w:fill="EAF0F7"/>
+            <w:vAlign w:val="center"/>
+          </w:tcPr>
+          <w:p>
+            <w:r>
+              <w:t>20 references</w:t>
+            </w:r>
+          </w:p>
+        </w:tc>
+        <w:tc>
+          <w:tcPr>
+            <w:tcW w:type="dxa" w:w="5112"/>
+            <w:tcBorders>
+              <w:top w:val="single" w:sz="4" w:color="D9D9D9"/>
+              <w:left w:val="single" w:sz="4" w:color="D9D9D9"/>
+              <w:bottom w:val="single" w:sz="4" w:color="D9D9D9"/>
+              <w:right w:val="single" w:sz="4" w:color="D9D9D9"/>
+              <w:insideH w:val="single" w:sz="4" w:color="D9D9D9"/>
+              <w:insideV w:val="single" w:sz="4" w:color="D9D9D9"/>
+            </w:tcBorders>
+            <w:shd w:fill="EAF0F7"/>
+            <w:vAlign w:val="center"/>
+          </w:tcPr>
+          <w:p>
+            <w:r>
+              <w:t>Link artifacts without copying content</w:t>
+            </w:r>
+          </w:p>
+        </w:tc>
+      </w:tr>
+      <w:tr>
+        <w:tc>
+          <w:tcPr>
+            <w:tcW w:type="dxa" w:w="2376"/>
+            <w:tcBorders>
+              <w:top w:val="single" w:sz="4" w:color="D9D9D9"/>
+              <w:left w:val="single" w:sz="4" w:color="D9D9D9"/>
+              <w:bottom w:val="single" w:sz="4" w:color="D9D9D9"/>
+              <w:right w:val="single" w:sz="4" w:color="D9D9D9"/>
+              <w:insideH w:val="single" w:sz="4" w:color="D9D9D9"/>
+              <w:insideV w:val="single" w:sz="4" w:color="D9D9D9"/>
+            </w:tcBorders>
+            <w:vAlign w:val="center"/>
+          </w:tcPr>
+          <w:p>
+            <w:r>
+              <w:t>Case page</w:t>
+            </w:r>
+          </w:p>
+        </w:tc>
+        <w:tc>
+          <w:tcPr>
+            <w:tcW w:type="dxa" w:w="2592"/>
+            <w:tcBorders>
+              <w:top w:val="single" w:sz="4" w:color="D9D9D9"/>
+              <w:left w:val="single" w:sz="4" w:color="D9D9D9"/>
+              <w:bottom w:val="single" w:sz="4" w:color="D9D9D9"/>
+              <w:right w:val="single" w:sz="4" w:color="D9D9D9"/>
+              <w:insideH w:val="single" w:sz="4" w:color="D9D9D9"/>
+              <w:insideV w:val="single" w:sz="4" w:color="D9D9D9"/>
+            </w:tcBorders>
+            <w:vAlign w:val="center"/>
+          </w:tcPr>
+          <w:p>
+            <w:r>
+              <w:t>200 records</w:t>
+            </w:r>
+          </w:p>
+        </w:tc>
+        <w:tc>
+          <w:tcPr>
+            <w:tcW w:type="dxa" w:w="5112"/>
+            <w:tcBorders>
+              <w:top w:val="single" w:sz="4" w:color="D9D9D9"/>
+              <w:left w:val="single" w:sz="4" w:color="D9D9D9"/>
+              <w:bottom w:val="single" w:sz="4" w:color="D9D9D9"/>
+              <w:right w:val="single" w:sz="4" w:color="D9D9D9"/>
+              <w:insideH w:val="single" w:sz="4" w:color="D9D9D9"/>
+              <w:insideV w:val="single" w:sz="4" w:color="D9D9D9"/>
+            </w:tcBorders>
+            <w:vAlign w:val="center"/>
+          </w:tcPr>
+          <w:p>
+            <w:r>
+              <w:t>Protect query and response resources</w:t>
+            </w:r>
+          </w:p>
+        </w:tc>
+      </w:tr>
+    </w:tbl>
+    <w:p/>
+    <w:p>
+      <w:pPr>
+        <w:pStyle w:val="Heading1"/>
+      </w:pPr>
+      <w:r>
+        <w:t>8 Result Aggregation</w:t>
+      </w:r>
+    </w:p>
+    <w:tbl>
+      <w:tblPr>
+        <w:tblW w:type="auto" w:w="0"/>
+        <w:tblLayout w:type="fixed"/>
+        <w:tblLook w:firstColumn="1" w:firstRow="1" w:lastColumn="0" w:lastRow="0" w:noHBand="0" w:noVBand="1" w:val="04A0"/>
+      </w:tblPr>
+      <w:tblGrid>
+        <w:gridCol w:w="3312"/>
+        <w:gridCol w:w="3312"/>
+        <w:gridCol w:w="3312"/>
+      </w:tblGrid>
+      <w:tr>
+        <w:trPr>
+          <w:tblHeader/>
+        </w:trPr>
+        <w:tc>
+          <w:tcPr>
+            <w:tcW w:type="dxa" w:w="3240"/>
+            <w:shd w:fill="17365D"/>
+            <w:tcBorders>
+              <w:top w:val="single" w:sz="4" w:color="D9D9D9"/>
+              <w:left w:val="single" w:sz="4" w:color="D9D9D9"/>
+              <w:bottom w:val="single" w:sz="4" w:color="D9D9D9"/>
+              <w:right w:val="single" w:sz="4" w:color="D9D9D9"/>
+              <w:insideH w:val="single" w:sz="4" w:color="D9D9D9"/>
+              <w:insideV w:val="single" w:sz="4" w:color="D9D9D9"/>
+            </w:tcBorders>
+            <w:vAlign w:val="center"/>
+          </w:tcPr>
+          <w:p>
+            <w:r>
+              <w:rPr>
+                <w:b/>
+                <w:color w:val="FFFFFF"/>
+              </w:rPr>
+              <w:t>Condition</w:t>
+            </w:r>
+          </w:p>
+        </w:tc>
+        <w:tc>
+          <w:tcPr>
+            <w:tcW w:type="dxa" w:w="3024"/>
+            <w:shd w:fill="17365D"/>
+            <w:tcBorders>
+              <w:top w:val="single" w:sz="4" w:color="D9D9D9"/>
+              <w:left w:val="single" w:sz="4" w:color="D9D9D9"/>
+              <w:bottom w:val="single" w:sz="4" w:color="D9D9D9"/>
+              <w:right w:val="single" w:sz="4" w:color="D9D9D9"/>
+              <w:insideH w:val="single" w:sz="4" w:color="D9D9D9"/>
+              <w:insideV w:val="single" w:sz="4" w:color="D9D9D9"/>
+            </w:tcBorders>
+            <w:vAlign w:val="center"/>
+          </w:tcPr>
+          <w:p>
+            <w:r>
+              <w:rPr>
+                <w:b/>
+                <w:color w:val="FFFFFF"/>
+              </w:rPr>
+              <w:t>Run outcome</w:t>
+            </w:r>
+          </w:p>
+        </w:tc>
+        <w:tc>
+          <w:tcPr>
+            <w:tcW w:type="dxa" w:w="3816"/>
+            <w:shd w:fill="17365D"/>
+            <w:tcBorders>
+              <w:top w:val="single" w:sz="4" w:color="D9D9D9"/>
+              <w:left w:val="single" w:sz="4" w:color="D9D9D9"/>
+              <w:bottom w:val="single" w:sz="4" w:color="D9D9D9"/>
+              <w:right w:val="single" w:sz="4" w:color="D9D9D9"/>
+              <w:insideH w:val="single" w:sz="4" w:color="D9D9D9"/>
+              <w:insideV w:val="single" w:sz="4" w:color="D9D9D9"/>
+            </w:tcBorders>
+            <w:vAlign w:val="center"/>
+          </w:tcPr>
+          <w:p>
+            <w:r>
+              <w:rPr>
+                <w:b/>
+                <w:color w:val="FFFFFF"/>
+              </w:rPr>
+              <w:t>Reason</w:t>
+            </w:r>
+          </w:p>
+        </w:tc>
+      </w:tr>
+      <w:tr>
+        <w:tc>
+          <w:tcPr>
+            <w:tcW w:type="dxa" w:w="3240"/>
+            <w:tcBorders>
+              <w:top w:val="single" w:sz="4" w:color="D9D9D9"/>
+              <w:left w:val="single" w:sz="4" w:color="D9D9D9"/>
+              <w:bottom w:val="single" w:sz="4" w:color="D9D9D9"/>
+              <w:right w:val="single" w:sz="4" w:color="D9D9D9"/>
+              <w:insideH w:val="single" w:sz="4" w:color="D9D9D9"/>
+              <w:insideV w:val="single" w:sz="4" w:color="D9D9D9"/>
+            </w:tcBorders>
+            <w:vAlign w:val="center"/>
+          </w:tcPr>
+          <w:p>
+            <w:r>
+              <w:t>Cases remain pending or running</w:t>
+            </w:r>
+          </w:p>
+        </w:tc>
+        <w:tc>
+          <w:tcPr>
+            <w:tcW w:type="dxa" w:w="3024"/>
+            <w:tcBorders>
+              <w:top w:val="single" w:sz="4" w:color="D9D9D9"/>
+              <w:left w:val="single" w:sz="4" w:color="D9D9D9"/>
+              <w:bottom w:val="single" w:sz="4" w:color="D9D9D9"/>
+              <w:right w:val="single" w:sz="4" w:color="D9D9D9"/>
+              <w:insideH w:val="single" w:sz="4" w:color="D9D9D9"/>
+              <w:insideV w:val="single" w:sz="4" w:color="D9D9D9"/>
+            </w:tcBorders>
+            <w:vAlign w:val="center"/>
+          </w:tcPr>
+          <w:p>
+            <w:r>
+              <w:t>Running</w:t>
+            </w:r>
+          </w:p>
+        </w:tc>
+        <w:tc>
+          <w:tcPr>
+            <w:tcW w:type="dxa" w:w="3816"/>
+            <w:tcBorders>
+              <w:top w:val="single" w:sz="4" w:color="D9D9D9"/>
+              <w:left w:val="single" w:sz="4" w:color="D9D9D9"/>
+              <w:bottom w:val="single" w:sz="4" w:color="D9D9D9"/>
+              <w:right w:val="single" w:sz="4" w:color="D9D9D9"/>
+              <w:insideH w:val="single" w:sz="4" w:color="D9D9D9"/>
+              <w:insideV w:val="single" w:sz="4" w:color="D9D9D9"/>
+            </w:tcBorders>
+            <w:vAlign w:val="center"/>
+          </w:tcPr>
+          <w:p>
+            <w:r>
+              <w:t>Execution is incomplete</w:t>
+            </w:r>
+          </w:p>
+        </w:tc>
+      </w:tr>
+      <w:tr>
+        <w:tc>
+          <w:tcPr>
+            <w:tcW w:type="dxa" w:w="3240"/>
+            <w:tcBorders>
+              <w:top w:val="single" w:sz="4" w:color="D9D9D9"/>
+              <w:left w:val="single" w:sz="4" w:color="D9D9D9"/>
+              <w:bottom w:val="single" w:sz="4" w:color="D9D9D9"/>
+              <w:right w:val="single" w:sz="4" w:color="D9D9D9"/>
+              <w:insideH w:val="single" w:sz="4" w:color="D9D9D9"/>
+              <w:insideV w:val="single" w:sz="4" w:color="D9D9D9"/>
+            </w:tcBorders>
+            <w:shd w:fill="EAF0F7"/>
+            <w:vAlign w:val="center"/>
+          </w:tcPr>
+          <w:p>
+            <w:r>
+              <w:t>Required case failed</w:t>
+            </w:r>
+          </w:p>
+        </w:tc>
+        <w:tc>
+          <w:tcPr>
+            <w:tcW w:type="dxa" w:w="3024"/>
+            <w:tcBorders>
+              <w:top w:val="single" w:sz="4" w:color="D9D9D9"/>
+              <w:left w:val="single" w:sz="4" w:color="D9D9D9"/>
+              <w:bottom w:val="single" w:sz="4" w:color="D9D9D9"/>
+              <w:right w:val="single" w:sz="4" w:color="D9D9D9"/>
+              <w:insideH w:val="single" w:sz="4" w:color="D9D9D9"/>
+              <w:insideV w:val="single" w:sz="4" w:color="D9D9D9"/>
+            </w:tcBorders>
+            <w:shd w:fill="EAF0F7"/>
+            <w:vAlign w:val="center"/>
+          </w:tcPr>
+          <w:p>
+            <w:r>
+              <w:t>Failed</w:t>
+            </w:r>
+          </w:p>
+        </w:tc>
+        <w:tc>
+          <w:tcPr>
+            <w:tcW w:type="dxa" w:w="3816"/>
+            <w:tcBorders>
+              <w:top w:val="single" w:sz="4" w:color="D9D9D9"/>
+              <w:left w:val="single" w:sz="4" w:color="D9D9D9"/>
+              <w:bottom w:val="single" w:sz="4" w:color="D9D9D9"/>
+              <w:right w:val="single" w:sz="4" w:color="D9D9D9"/>
+              <w:insideH w:val="single" w:sz="4" w:color="D9D9D9"/>
+              <w:insideV w:val="single" w:sz="4" w:color="D9D9D9"/>
+            </w:tcBorders>
+            <w:shd w:fill="EAF0F7"/>
+            <w:vAlign w:val="center"/>
+          </w:tcPr>
+          <w:p>
+            <w:r>
+              <w:t>Required intent was not satisfied</w:t>
+            </w:r>
+          </w:p>
+        </w:tc>
+      </w:tr>
+      <w:tr>
+        <w:tc>
+          <w:tcPr>
+            <w:tcW w:type="dxa" w:w="3240"/>
+            <w:tcBorders>
+              <w:top w:val="single" w:sz="4" w:color="D9D9D9"/>
+              <w:left w:val="single" w:sz="4" w:color="D9D9D9"/>
+              <w:bottom w:val="single" w:sz="4" w:color="D9D9D9"/>
+              <w:right w:val="single" w:sz="4" w:color="D9D9D9"/>
+              <w:insideH w:val="single" w:sz="4" w:color="D9D9D9"/>
+              <w:insideV w:val="single" w:sz="4" w:color="D9D9D9"/>
+            </w:tcBorders>
+            <w:vAlign w:val="center"/>
+          </w:tcPr>
+          <w:p>
+            <w:r>
+              <w:t>Required case skipped</w:t>
+            </w:r>
+          </w:p>
+        </w:tc>
+        <w:tc>
+          <w:tcPr>
+            <w:tcW w:type="dxa" w:w="3024"/>
+            <w:tcBorders>
+              <w:top w:val="single" w:sz="4" w:color="D9D9D9"/>
+              <w:left w:val="single" w:sz="4" w:color="D9D9D9"/>
+              <w:bottom w:val="single" w:sz="4" w:color="D9D9D9"/>
+              <w:right w:val="single" w:sz="4" w:color="D9D9D9"/>
+              <w:insideH w:val="single" w:sz="4" w:color="D9D9D9"/>
+              <w:insideV w:val="single" w:sz="4" w:color="D9D9D9"/>
+            </w:tcBorders>
+            <w:vAlign w:val="center"/>
+          </w:tcPr>
+          <w:p>
+            <w:r>
+              <w:t>Failed</w:t>
+            </w:r>
+          </w:p>
+        </w:tc>
+        <w:tc>
+          <w:tcPr>
+            <w:tcW w:type="dxa" w:w="3816"/>
+            <w:tcBorders>
+              <w:top w:val="single" w:sz="4" w:color="D9D9D9"/>
+              <w:left w:val="single" w:sz="4" w:color="D9D9D9"/>
+              <w:bottom w:val="single" w:sz="4" w:color="D9D9D9"/>
+              <w:right w:val="single" w:sz="4" w:color="D9D9D9"/>
+              <w:insideH w:val="single" w:sz="4" w:color="D9D9D9"/>
+              <w:insideV w:val="single" w:sz="4" w:color="D9D9D9"/>
+            </w:tcBorders>
+            <w:vAlign w:val="center"/>
+          </w:tcPr>
+          <w:p>
+            <w:r>
+              <w:t>Required evidence is missing</w:t>
+            </w:r>
+          </w:p>
+        </w:tc>
+      </w:tr>
+      <w:tr>
+        <w:tc>
+          <w:tcPr>
+            <w:tcW w:type="dxa" w:w="3240"/>
+            <w:tcBorders>
+              <w:top w:val="single" w:sz="4" w:color="D9D9D9"/>
+              <w:left w:val="single" w:sz="4" w:color="D9D9D9"/>
+              <w:bottom w:val="single" w:sz="4" w:color="D9D9D9"/>
+              <w:right w:val="single" w:sz="4" w:color="D9D9D9"/>
+              <w:insideH w:val="single" w:sz="4" w:color="D9D9D9"/>
+              <w:insideV w:val="single" w:sz="4" w:color="D9D9D9"/>
+            </w:tcBorders>
+            <w:shd w:fill="EAF0F7"/>
+            <w:vAlign w:val="center"/>
+          </w:tcPr>
+          <w:p>
+            <w:r>
+              <w:t>All required cases passed</w:t>
+            </w:r>
+          </w:p>
+        </w:tc>
+        <w:tc>
+          <w:tcPr>
+            <w:tcW w:type="dxa" w:w="3024"/>
+            <w:tcBorders>
+              <w:top w:val="single" w:sz="4" w:color="D9D9D9"/>
+              <w:left w:val="single" w:sz="4" w:color="D9D9D9"/>
+              <w:bottom w:val="single" w:sz="4" w:color="D9D9D9"/>
+              <w:right w:val="single" w:sz="4" w:color="D9D9D9"/>
+              <w:insideH w:val="single" w:sz="4" w:color="D9D9D9"/>
+              <w:insideV w:val="single" w:sz="4" w:color="D9D9D9"/>
+            </w:tcBorders>
+            <w:shd w:fill="EAF0F7"/>
+            <w:vAlign w:val="center"/>
+          </w:tcPr>
+          <w:p>
+            <w:r>
+              <w:t>Passed</w:t>
+            </w:r>
+          </w:p>
+        </w:tc>
+        <w:tc>
+          <w:tcPr>
+            <w:tcW w:type="dxa" w:w="3816"/>
+            <w:tcBorders>
+              <w:top w:val="single" w:sz="4" w:color="D9D9D9"/>
+              <w:left w:val="single" w:sz="4" w:color="D9D9D9"/>
+              <w:bottom w:val="single" w:sz="4" w:color="D9D9D9"/>
+              <w:right w:val="single" w:sz="4" w:color="D9D9D9"/>
+              <w:insideH w:val="single" w:sz="4" w:color="D9D9D9"/>
+              <w:insideV w:val="single" w:sz="4" w:color="D9D9D9"/>
+            </w:tcBorders>
+            <w:shd w:fill="EAF0F7"/>
+            <w:vAlign w:val="center"/>
+          </w:tcPr>
+          <w:p>
+            <w:r>
+              <w:t>Reviewed acceptance intent was met</w:t>
+            </w:r>
+          </w:p>
+        </w:tc>
+      </w:tr>
+      <w:tr>
+        <w:tc>
+          <w:tcPr>
+            <w:tcW w:type="dxa" w:w="3240"/>
+            <w:tcBorders>
+              <w:top w:val="single" w:sz="4" w:color="D9D9D9"/>
+              <w:left w:val="single" w:sz="4" w:color="D9D9D9"/>
+              <w:bottom w:val="single" w:sz="4" w:color="D9D9D9"/>
+              <w:right w:val="single" w:sz="4" w:color="D9D9D9"/>
+              <w:insideH w:val="single" w:sz="4" w:color="D9D9D9"/>
+              <w:insideV w:val="single" w:sz="4" w:color="D9D9D9"/>
+            </w:tcBorders>
+            <w:vAlign w:val="center"/>
+          </w:tcPr>
+          <w:p>
+            <w:r>
+              <w:t>Optional case failed or skipped</w:t>
+            </w:r>
+          </w:p>
+        </w:tc>
+        <w:tc>
+          <w:tcPr>
+            <w:tcW w:type="dxa" w:w="3024"/>
+            <w:tcBorders>
+              <w:top w:val="single" w:sz="4" w:color="D9D9D9"/>
+              <w:left w:val="single" w:sz="4" w:color="D9D9D9"/>
+              <w:bottom w:val="single" w:sz="4" w:color="D9D9D9"/>
+              <w:right w:val="single" w:sz="4" w:color="D9D9D9"/>
+              <w:insideH w:val="single" w:sz="4" w:color="D9D9D9"/>
+              <w:insideV w:val="single" w:sz="4" w:color="D9D9D9"/>
+            </w:tcBorders>
+            <w:vAlign w:val="center"/>
+          </w:tcPr>
+          <w:p>
+            <w:r>
+              <w:t>Passed if required cases pass</w:t>
+            </w:r>
+          </w:p>
+        </w:tc>
+        <w:tc>
+          <w:tcPr>
+            <w:tcW w:type="dxa" w:w="3816"/>
+            <w:tcBorders>
+              <w:top w:val="single" w:sz="4" w:color="D9D9D9"/>
+              <w:left w:val="single" w:sz="4" w:color="D9D9D9"/>
+              <w:bottom w:val="single" w:sz="4" w:color="D9D9D9"/>
+              <w:right w:val="single" w:sz="4" w:color="D9D9D9"/>
+              <w:insideH w:val="single" w:sz="4" w:color="D9D9D9"/>
+              <w:insideV w:val="single" w:sz="4" w:color="D9D9D9"/>
+            </w:tcBorders>
+            <w:vAlign w:val="center"/>
+          </w:tcPr>
+          <w:p>
+            <w:r>
+              <w:t>Optional scope is informative</w:t>
+            </w:r>
+          </w:p>
+        </w:tc>
+      </w:tr>
+    </w:tbl>
+    <w:p/>
+    <w:p>
+      <w:r>
+        <w:t>Case results exclusively derive running, passed, and failed states for catalog-backed runs. An authorized operator may still cancel an incomplete run directly.</w:t>
+      </w:r>
+    </w:p>
+    <w:p>
+      <w:r>
+        <w:br w:type="page"/>
+      </w:r>
+    </w:p>
+    <w:p>
+      <w:pPr>
+        <w:pStyle w:val="Heading1"/>
+      </w:pPr>
+      <w:r>
+        <w:t>9 Events and Audit</w:t>
       </w:r>
     </w:p>
     <w:tbl>
@@ -2181,6 +2994,65 @@
           </w:p>
         </w:tc>
       </w:tr>
+      <w:tr>
+        <w:tc>
+          <w:tcPr>
+            <w:tcW w:type="dxa" w:w="2376"/>
+            <w:tcBorders>
+              <w:top w:val="single" w:sz="4" w:color="D9D9D9"/>
+              <w:left w:val="single" w:sz="4" w:color="D9D9D9"/>
+              <w:bottom w:val="single" w:sz="4" w:color="D9D9D9"/>
+              <w:right w:val="single" w:sz="4" w:color="D9D9D9"/>
+              <w:insideH w:val="single" w:sz="4" w:color="D9D9D9"/>
+              <w:insideV w:val="single" w:sz="4" w:color="D9D9D9"/>
+            </w:tcBorders>
+            <w:vAlign w:val="center"/>
+          </w:tcPr>
+          <w:p>
+            <w:r>
+              <w:t>Record case result</w:t>
+            </w:r>
+          </w:p>
+        </w:tc>
+        <w:tc>
+          <w:tcPr>
+            <w:tcW w:type="dxa" w:w="4536"/>
+            <w:tcBorders>
+              <w:top w:val="single" w:sz="4" w:color="D9D9D9"/>
+              <w:left w:val="single" w:sz="4" w:color="D9D9D9"/>
+              <w:bottom w:val="single" w:sz="4" w:color="D9D9D9"/>
+              <w:right w:val="single" w:sz="4" w:color="D9D9D9"/>
+              <w:insideH w:val="single" w:sz="4" w:color="D9D9D9"/>
+              <w:insideV w:val="single" w:sz="4" w:color="D9D9D9"/>
+            </w:tcBorders>
+            <w:vAlign w:val="center"/>
+          </w:tcPr>
+          <w:p>
+            <w:r>
+              <w:t>atep.test_case.result_recorded.v1</w:t>
+            </w:r>
+          </w:p>
+        </w:tc>
+        <w:tc>
+          <w:tcPr>
+            <w:tcW w:type="dxa" w:w="3024"/>
+            <w:tcBorders>
+              <w:top w:val="single" w:sz="4" w:color="D9D9D9"/>
+              <w:left w:val="single" w:sz="4" w:color="D9D9D9"/>
+              <w:bottom w:val="single" w:sz="4" w:color="D9D9D9"/>
+              <w:right w:val="single" w:sz="4" w:color="D9D9D9"/>
+              <w:insideH w:val="single" w:sz="4" w:color="D9D9D9"/>
+              <w:insideV w:val="single" w:sz="4" w:color="D9D9D9"/>
+            </w:tcBorders>
+            <w:vAlign w:val="center"/>
+          </w:tcPr>
+          <w:p>
+            <w:r>
+              <w:t>test_case.result_recorded</w:t>
+            </w:r>
+          </w:p>
+        </w:tc>
+      </w:tr>
     </w:tbl>
     <w:p/>
     <w:p>
@@ -2193,7 +3065,7 @@
         <w:pStyle w:val="Heading1"/>
       </w:pPr>
       <w:r>
-        <w:t>8 Engineering Decisions</w:t>
+        <w:t>10 Engineering Decisions</w:t>
       </w:r>
     </w:p>
     <w:tbl>
@@ -2526,6 +3398,127 @@
           </w:p>
         </w:tc>
       </w:tr>
+      <w:tr>
+        <w:tc>
+          <w:tcPr>
+            <w:tcW w:type="dxa" w:w="2376"/>
+            <w:tcBorders>
+              <w:top w:val="single" w:sz="4" w:color="D9D9D9"/>
+              <w:left w:val="single" w:sz="4" w:color="D9D9D9"/>
+              <w:bottom w:val="single" w:sz="4" w:color="D9D9D9"/>
+              <w:right w:val="single" w:sz="4" w:color="D9D9D9"/>
+              <w:insideH w:val="single" w:sz="4" w:color="D9D9D9"/>
+              <w:insideV w:val="single" w:sz="4" w:color="D9D9D9"/>
+            </w:tcBorders>
+            <w:vAlign w:val="center"/>
+          </w:tcPr>
+          <w:p>
+            <w:r>
+              <w:t>Materialize cases</w:t>
+            </w:r>
+          </w:p>
+        </w:tc>
+        <w:tc>
+          <w:tcPr>
+            <w:tcW w:type="dxa" w:w="3960"/>
+            <w:tcBorders>
+              <w:top w:val="single" w:sz="4" w:color="D9D9D9"/>
+              <w:left w:val="single" w:sz="4" w:color="D9D9D9"/>
+              <w:bottom w:val="single" w:sz="4" w:color="D9D9D9"/>
+              <w:right w:val="single" w:sz="4" w:color="D9D9D9"/>
+              <w:insideH w:val="single" w:sz="4" w:color="D9D9D9"/>
+              <w:insideV w:val="single" w:sz="4" w:color="D9D9D9"/>
+            </w:tcBorders>
+            <w:vAlign w:val="center"/>
+          </w:tcPr>
+          <w:p>
+            <w:r>
+              <w:t>Make execution state queryable</w:t>
+            </w:r>
+          </w:p>
+        </w:tc>
+        <w:tc>
+          <w:tcPr>
+            <w:tcW w:type="dxa" w:w="3600"/>
+            <w:tcBorders>
+              <w:top w:val="single" w:sz="4" w:color="D9D9D9"/>
+              <w:left w:val="single" w:sz="4" w:color="D9D9D9"/>
+              <w:bottom w:val="single" w:sz="4" w:color="D9D9D9"/>
+              <w:right w:val="single" w:sz="4" w:color="D9D9D9"/>
+              <w:insideH w:val="single" w:sz="4" w:color="D9D9D9"/>
+              <w:insideV w:val="single" w:sz="4" w:color="D9D9D9"/>
+            </w:tcBorders>
+            <w:vAlign w:val="center"/>
+          </w:tcPr>
+          <w:p>
+            <w:r>
+              <w:t>Each run owns immutable case identity</w:t>
+            </w:r>
+          </w:p>
+        </w:tc>
+      </w:tr>
+      <w:tr>
+        <w:tc>
+          <w:tcPr>
+            <w:tcW w:type="dxa" w:w="2376"/>
+            <w:tcBorders>
+              <w:top w:val="single" w:sz="4" w:color="D9D9D9"/>
+              <w:left w:val="single" w:sz="4" w:color="D9D9D9"/>
+              <w:bottom w:val="single" w:sz="4" w:color="D9D9D9"/>
+              <w:right w:val="single" w:sz="4" w:color="D9D9D9"/>
+              <w:insideH w:val="single" w:sz="4" w:color="D9D9D9"/>
+              <w:insideV w:val="single" w:sz="4" w:color="D9D9D9"/>
+            </w:tcBorders>
+            <w:shd w:fill="EAF0F7"/>
+            <w:vAlign w:val="center"/>
+          </w:tcPr>
+          <w:p>
+            <w:r>
+              <w:t>Aggregate in transaction</w:t>
+            </w:r>
+          </w:p>
+        </w:tc>
+        <w:tc>
+          <w:tcPr>
+            <w:tcW w:type="dxa" w:w="3960"/>
+            <w:tcBorders>
+              <w:top w:val="single" w:sz="4" w:color="D9D9D9"/>
+              <w:left w:val="single" w:sz="4" w:color="D9D9D9"/>
+              <w:bottom w:val="single" w:sz="4" w:color="D9D9D9"/>
+              <w:right w:val="single" w:sz="4" w:color="D9D9D9"/>
+              <w:insideH w:val="single" w:sz="4" w:color="D9D9D9"/>
+              <w:insideV w:val="single" w:sz="4" w:color="D9D9D9"/>
+            </w:tcBorders>
+            <w:shd w:fill="EAF0F7"/>
+            <w:vAlign w:val="center"/>
+          </w:tcPr>
+          <w:p>
+            <w:r>
+              <w:t>Keep progress consistent</w:t>
+            </w:r>
+          </w:p>
+        </w:tc>
+        <w:tc>
+          <w:tcPr>
+            <w:tcW w:type="dxa" w:w="3600"/>
+            <w:tcBorders>
+              <w:top w:val="single" w:sz="4" w:color="D9D9D9"/>
+              <w:left w:val="single" w:sz="4" w:color="D9D9D9"/>
+              <w:bottom w:val="single" w:sz="4" w:color="D9D9D9"/>
+              <w:right w:val="single" w:sz="4" w:color="D9D9D9"/>
+              <w:insideH w:val="single" w:sz="4" w:color="D9D9D9"/>
+              <w:insideV w:val="single" w:sz="4" w:color="D9D9D9"/>
+            </w:tcBorders>
+            <w:shd w:fill="EAF0F7"/>
+            <w:vAlign w:val="center"/>
+          </w:tcPr>
+          <w:p>
+            <w:r>
+              <w:t>Case and run update together</w:t>
+            </w:r>
+          </w:p>
+        </w:tc>
+      </w:tr>
     </w:tbl>
     <w:p/>
     <w:p>
@@ -2538,7 +3531,7 @@
         <w:pStyle w:val="Heading1"/>
       </w:pPr>
       <w:r>
-        <w:t>9 Verification Catalogue</w:t>
+        <w:t>11 Verification Catalogue</w:t>
       </w:r>
     </w:p>
     <w:tbl>
@@ -2930,14 +3923,140 @@
           </w:p>
         </w:tc>
       </w:tr>
+      <w:tr>
+        <w:tc>
+          <w:tcPr>
+            <w:tcW w:type="dxa" w:w="2232"/>
+            <w:tcBorders>
+              <w:top w:val="single" w:sz="4" w:color="D9D9D9"/>
+              <w:left w:val="single" w:sz="4" w:color="D9D9D9"/>
+              <w:bottom w:val="single" w:sz="4" w:color="D9D9D9"/>
+              <w:right w:val="single" w:sz="4" w:color="D9D9D9"/>
+              <w:insideH w:val="single" w:sz="4" w:color="D9D9D9"/>
+              <w:insideV w:val="single" w:sz="4" w:color="D9D9D9"/>
+            </w:tcBorders>
+            <w:shd w:fill="EAF0F7"/>
+            <w:vAlign w:val="center"/>
+          </w:tcPr>
+          <w:p>
+            <w:r>
+              <w:t>TF-T-016 to 019</w:t>
+            </w:r>
+          </w:p>
+        </w:tc>
+        <w:tc>
+          <w:tcPr>
+            <w:tcW w:type="dxa" w:w="3528"/>
+            <w:tcBorders>
+              <w:top w:val="single" w:sz="4" w:color="D9D9D9"/>
+              <w:left w:val="single" w:sz="4" w:color="D9D9D9"/>
+              <w:bottom w:val="single" w:sz="4" w:color="D9D9D9"/>
+              <w:right w:val="single" w:sz="4" w:color="D9D9D9"/>
+              <w:insideH w:val="single" w:sz="4" w:color="D9D9D9"/>
+              <w:insideV w:val="single" w:sz="4" w:color="D9D9D9"/>
+            </w:tcBorders>
+            <w:shd w:fill="EAF0F7"/>
+            <w:vAlign w:val="center"/>
+          </w:tcPr>
+          <w:p>
+            <w:r>
+              <w:t>Execution binding</w:t>
+            </w:r>
+          </w:p>
+        </w:tc>
+        <w:tc>
+          <w:tcPr>
+            <w:tcW w:type="dxa" w:w="4176"/>
+            <w:tcBorders>
+              <w:top w:val="single" w:sz="4" w:color="D9D9D9"/>
+              <w:left w:val="single" w:sz="4" w:color="D9D9D9"/>
+              <w:bottom w:val="single" w:sz="4" w:color="D9D9D9"/>
+              <w:right w:val="single" w:sz="4" w:color="D9D9D9"/>
+              <w:insideH w:val="single" w:sz="4" w:color="D9D9D9"/>
+              <w:insideV w:val="single" w:sz="4" w:color="D9D9D9"/>
+            </w:tcBorders>
+            <w:shd w:fill="EAF0F7"/>
+            <w:vAlign w:val="center"/>
+          </w:tcPr>
+          <w:p>
+            <w:r>
+              <w:t>Validate snapshots, cases, and replay</w:t>
+            </w:r>
+          </w:p>
+        </w:tc>
+      </w:tr>
+      <w:tr>
+        <w:tc>
+          <w:tcPr>
+            <w:tcW w:type="dxa" w:w="2232"/>
+            <w:tcBorders>
+              <w:top w:val="single" w:sz="4" w:color="D9D9D9"/>
+              <w:left w:val="single" w:sz="4" w:color="D9D9D9"/>
+              <w:bottom w:val="single" w:sz="4" w:color="D9D9D9"/>
+              <w:right w:val="single" w:sz="4" w:color="D9D9D9"/>
+              <w:insideH w:val="single" w:sz="4" w:color="D9D9D9"/>
+              <w:insideV w:val="single" w:sz="4" w:color="D9D9D9"/>
+            </w:tcBorders>
+            <w:vAlign w:val="center"/>
+          </w:tcPr>
+          <w:p>
+            <w:r>
+              <w:t>TF-T-020 to 026</w:t>
+            </w:r>
+          </w:p>
+        </w:tc>
+        <w:tc>
+          <w:tcPr>
+            <w:tcW w:type="dxa" w:w="3528"/>
+            <w:tcBorders>
+              <w:top w:val="single" w:sz="4" w:color="D9D9D9"/>
+              <w:left w:val="single" w:sz="4" w:color="D9D9D9"/>
+              <w:bottom w:val="single" w:sz="4" w:color="D9D9D9"/>
+              <w:right w:val="single" w:sz="4" w:color="D9D9D9"/>
+              <w:insideH w:val="single" w:sz="4" w:color="D9D9D9"/>
+              <w:insideV w:val="single" w:sz="4" w:color="D9D9D9"/>
+            </w:tcBorders>
+            <w:vAlign w:val="center"/>
+          </w:tcPr>
+          <w:p>
+            <w:r>
+              <w:t>Case results</w:t>
+            </w:r>
+          </w:p>
+        </w:tc>
+        <w:tc>
+          <w:tcPr>
+            <w:tcW w:type="dxa" w:w="4176"/>
+            <w:tcBorders>
+              <w:top w:val="single" w:sz="4" w:color="D9D9D9"/>
+              <w:left w:val="single" w:sz="4" w:color="D9D9D9"/>
+              <w:bottom w:val="single" w:sz="4" w:color="D9D9D9"/>
+              <w:right w:val="single" w:sz="4" w:color="D9D9D9"/>
+              <w:insideH w:val="single" w:sz="4" w:color="D9D9D9"/>
+              <w:insideV w:val="single" w:sz="4" w:color="D9D9D9"/>
+            </w:tcBorders>
+            <w:vAlign w:val="center"/>
+          </w:tcPr>
+          <w:p>
+            <w:r>
+              <w:t>Validate bounds, aggregation, APIs, and migration</w:t>
+            </w:r>
+          </w:p>
+        </w:tc>
+      </w:tr>
     </w:tbl>
     <w:p/>
+    <w:p>
+      <w:r>
+        <w:br w:type="page"/>
+      </w:r>
+    </w:p>
     <w:p>
       <w:pPr>
         <w:pStyle w:val="Heading1"/>
       </w:pPr>
       <w:r>
-        <w:t>10 Risks and Controls</w:t>
+        <w:t>12 Risks and Controls</w:t>
       </w:r>
     </w:p>
     <w:tbl>
@@ -3124,7 +4243,7 @@
           </w:tcPr>
           <w:p>
             <w:r>
-              <w:t>Definition version snapshot</w:t>
+              <w:t>Suite and definition snapshots</w:t>
             </w:r>
           </w:p>
         </w:tc>
@@ -3144,7 +4263,7 @@
           </w:tcPr>
           <w:p>
             <w:r>
-              <w:t>Record execution snapshot in VIII-2</w:t>
+              <w:t>Run remains reproducible</w:t>
             </w:r>
           </w:p>
         </w:tc>
@@ -3165,7 +4284,7 @@
           </w:tcPr>
           <w:p>
             <w:r>
-              <w:t>Unbounded tests</w:t>
+              <w:t>Unbounded results</w:t>
             </w:r>
           </w:p>
         </w:tc>
@@ -3184,7 +4303,7 @@
           </w:tcPr>
           <w:p>
             <w:r>
-              <w:t>Timeout and collection limits</w:t>
+              <w:t>Duration and collection limits</w:t>
             </w:r>
           </w:p>
         </w:tc>
@@ -3203,7 +4322,7 @@
           </w:tcPr>
           <w:p>
             <w:r>
-              <w:t>Add run-level budgets</w:t>
+              <w:t>Large evidence stays in artifacts</w:t>
             </w:r>
           </w:p>
         </w:tc>
@@ -3336,23 +4455,12 @@
         <w:pStyle w:val="Heading1"/>
       </w:pPr>
       <w:r>
-        <w:t>11 Study Exercises</w:t>
+        <w:t>13 Study Exercises</w:t>
       </w:r>
     </w:p>
     <w:p>
-      <w:pPr>
-        <w:pStyle w:val="ListBullet"/>
-      </w:pPr>
       <w:r>
-        <w:t>Create one ADAS definition and identify every invariant enforced before persistence.</w:t>
-      </w:r>
-    </w:p>
-    <w:p>
-      <w:pPr>
-        <w:pStyle w:val="ListBullet"/>
-      </w:pPr>
-      <w:r>
-        <w:t>Compose a smoke suite and explain its stored definition versions.</w:t>
+        <w:t>Create one ADAS definition and identify its invariants. Then run two required cases, explain the aggregate result, and compare an exact retry after suite archival with a new run request for the archived suite.</w:t>
       </w:r>
     </w:p>
     <w:p>
@@ -3360,17 +4468,17 @@
         <w:pStyle w:val="Heading1"/>
       </w:pPr>
       <w:r>
-        <w:t>12 Next Development</w:t>
+        <w:t>14 Next Development</w:t>
       </w:r>
     </w:p>
     <w:p>
       <w:r>
-        <w:t>VIII-2 will bind active suite snapshots to runs, persist ordered case results, and correlate artifact evidence.</w:t>
+        <w:t>VIII-3 will connect scheduled jobs to catalog suites for smoke, sanity, and regression selection while preserving the VIII-2 snapshot.</w:t>
       </w:r>
     </w:p>
     <w:sectPr>
       <w:pgSz w:w="12240" w:h="15840"/>
-      <w:pgMar w:top="1037" w:right="1152" w:bottom="1037" w:left="1152" w:header="720" w:footer="720" w:gutter="0"/>
+      <w:pgMar w:top="1037" w:right="1152" w:bottom="792" w:left="1152" w:header="720" w:footer="720" w:gutter="0"/>
       <w:cols w:space="720"/>
       <w:docGrid w:linePitch="360"/>
     </w:sectPr>

</xml_diff>

<commit_message>
feat(test-framework): bind suites to test runs (#92)
</commit_message>
<xml_diff>
--- a/docs/ATEP_Volume_VIII_Test_Framework_Engineering_Workbook.docx
+++ b/docs/ATEP_Volume_VIII_Test_Framework_Engineering_Workbook.docx
@@ -19,12 +19,12 @@
         <w:rPr>
           <w:b/>
         </w:rPr>
-        <w:t>Version 0.1.0   VIII 1 Test Catalog Implemented</w:t>
+        <w:t>Version 0.2.0   VIII 2 Execution Binding Implemented</w:t>
       </w:r>
     </w:p>
     <w:p>
       <w:r>
-        <w:t>This workbook records the first Test Framework baseline for ATEP. Reusable definitions now describe test intent independently from execution, while suites preserve ordered, versioned composition for later scheduling and result analysis.</w:t>
+        <w:t>This workbook records the catalog and execution-binding baseline for ATEP. Reusable definitions describe test intent, suites preserve reviewed composition, and catalog-backed runs now persist deterministic case results and aggregate outcomes.</w:t>
       </w:r>
     </w:p>
     <w:tbl>
@@ -125,7 +125,7 @@
           </w:tcPr>
           <w:p>
             <w:r>
-              <w:t>VIII-1 implemented and verified</w:t>
+              <w:t>VIII-1 and VIII-2 implemented and verified</w:t>
             </w:r>
           </w:p>
         </w:tc>
@@ -289,7 +289,7 @@
           </w:tcPr>
           <w:p>
             <w:r>
-              <w:t>VIII-2 suite execution binding and case results</w:t>
+              <w:t>VIII-3 scheduler and smoke, sanity, regression selection</w:t>
             </w:r>
           </w:p>
         </w:tc>
@@ -306,7 +306,7 @@
     </w:p>
     <w:p>
       <w:r>
-        <w:t>VIII-1 separates reusable test design from test execution. A definition captures one test's preconditions, actions, inputs, expectations, classification, and resource budget. A suite selects active definitions in an explicit order and freezes their versions.</w:t>
+        <w:t>VIII-1 separates reusable test design from test execution. A definition captures one test's preconditions, actions, inputs, expectations, classification, and resource budget. A suite selects active definitions in an explicit order and freezes their versions. VIII-2 binds that snapshot to a run and records each case outcome.</w:t>
       </w:r>
     </w:p>
     <w:p>
@@ -330,7 +330,7 @@
         <w:pStyle w:val="ListBullet"/>
       </w:pPr>
       <w:r>
-        <w:t>Execution, scheduling, campaigns, mutation testing, and coverage remain later increments.</w:t>
+        <w:t>Scheduling, campaigns, mutation testing, and coverage remain later increments.</w:t>
       </w:r>
     </w:p>
     <w:p>
@@ -568,7 +568,7 @@
           </w:tcPr>
           <w:p>
             <w:r>
-              <w:t>Linear migration 0051 with reversible schema creation</w:t>
+              <w:t>Linear migrations 0051 and 0052 with reversible schema changes</w:t>
             </w:r>
           </w:p>
         </w:tc>
@@ -589,7 +589,7 @@
           </w:tcPr>
           <w:p>
             <w:r>
-              <w:t>Future executor</w:t>
+              <w:t>Run executor</w:t>
             </w:r>
           </w:p>
         </w:tc>
@@ -608,7 +608,7 @@
           </w:tcPr>
           <w:p>
             <w:r>
-              <w:t>Consumes an active suite snapshot without rewriting catalog intent</w:t>
+              <w:t>Materializes and updates ordered cases without rewriting catalog intent</w:t>
             </w:r>
           </w:p>
         </w:tc>
@@ -1848,7 +1848,820 @@
         <w:pStyle w:val="Heading1"/>
       </w:pPr>
       <w:r>
-        <w:t>7 Events and Audit</w:t>
+        <w:t>7 Execution Binding</w:t>
+      </w:r>
+    </w:p>
+    <w:p>
+      <w:r>
+        <w:t>A run may reference an active catalog suite. Creation freezes the suite identifier, name, type, version, and composition and creates one pending result per ordered case in the same transaction. Existing runs remain reproducible after the source suite is archived.</w:t>
+      </w:r>
+    </w:p>
+    <w:tbl>
+      <w:tblPr>
+        <w:tblW w:type="auto" w:w="0"/>
+        <w:tblLayout w:type="fixed"/>
+        <w:tblLook w:firstColumn="1" w:firstRow="1" w:lastColumn="0" w:lastRow="0" w:noHBand="0" w:noVBand="1" w:val="04A0"/>
+      </w:tblPr>
+      <w:tblGrid>
+        <w:gridCol w:w="3312"/>
+        <w:gridCol w:w="3312"/>
+        <w:gridCol w:w="3312"/>
+      </w:tblGrid>
+      <w:tr>
+        <w:trPr>
+          <w:tblHeader/>
+        </w:trPr>
+        <w:tc>
+          <w:tcPr>
+            <w:tcW w:type="dxa" w:w="2376"/>
+            <w:shd w:fill="17365D"/>
+            <w:tcBorders>
+              <w:top w:val="single" w:sz="4" w:color="D9D9D9"/>
+              <w:left w:val="single" w:sz="4" w:color="D9D9D9"/>
+              <w:bottom w:val="single" w:sz="4" w:color="D9D9D9"/>
+              <w:right w:val="single" w:sz="4" w:color="D9D9D9"/>
+              <w:insideH w:val="single" w:sz="4" w:color="D9D9D9"/>
+              <w:insideV w:val="single" w:sz="4" w:color="D9D9D9"/>
+            </w:tcBorders>
+            <w:vAlign w:val="center"/>
+          </w:tcPr>
+          <w:p>
+            <w:r>
+              <w:rPr>
+                <w:b/>
+                <w:color w:val="FFFFFF"/>
+              </w:rPr>
+              <w:t>Persisted input</w:t>
+            </w:r>
+          </w:p>
+        </w:tc>
+        <w:tc>
+          <w:tcPr>
+            <w:tcW w:type="dxa" w:w="2592"/>
+            <w:shd w:fill="17365D"/>
+            <w:tcBorders>
+              <w:top w:val="single" w:sz="4" w:color="D9D9D9"/>
+              <w:left w:val="single" w:sz="4" w:color="D9D9D9"/>
+              <w:bottom w:val="single" w:sz="4" w:color="D9D9D9"/>
+              <w:right w:val="single" w:sz="4" w:color="D9D9D9"/>
+              <w:insideH w:val="single" w:sz="4" w:color="D9D9D9"/>
+              <w:insideV w:val="single" w:sz="4" w:color="D9D9D9"/>
+            </w:tcBorders>
+            <w:vAlign w:val="center"/>
+          </w:tcPr>
+          <w:p>
+            <w:r>
+              <w:rPr>
+                <w:b/>
+                <w:color w:val="FFFFFF"/>
+              </w:rPr>
+              <w:t>Bound</w:t>
+            </w:r>
+          </w:p>
+        </w:tc>
+        <w:tc>
+          <w:tcPr>
+            <w:tcW w:type="dxa" w:w="5112"/>
+            <w:shd w:fill="17365D"/>
+            <w:tcBorders>
+              <w:top w:val="single" w:sz="4" w:color="D9D9D9"/>
+              <w:left w:val="single" w:sz="4" w:color="D9D9D9"/>
+              <w:bottom w:val="single" w:sz="4" w:color="D9D9D9"/>
+              <w:right w:val="single" w:sz="4" w:color="D9D9D9"/>
+              <w:insideH w:val="single" w:sz="4" w:color="D9D9D9"/>
+              <w:insideV w:val="single" w:sz="4" w:color="D9D9D9"/>
+            </w:tcBorders>
+            <w:vAlign w:val="center"/>
+          </w:tcPr>
+          <w:p>
+            <w:r>
+              <w:rPr>
+                <w:b/>
+                <w:color w:val="FFFFFF"/>
+              </w:rPr>
+              <w:t>Purpose</w:t>
+            </w:r>
+          </w:p>
+        </w:tc>
+      </w:tr>
+      <w:tr>
+        <w:tc>
+          <w:tcPr>
+            <w:tcW w:type="dxa" w:w="2376"/>
+            <w:tcBorders>
+              <w:top w:val="single" w:sz="4" w:color="D9D9D9"/>
+              <w:left w:val="single" w:sz="4" w:color="D9D9D9"/>
+              <w:bottom w:val="single" w:sz="4" w:color="D9D9D9"/>
+              <w:right w:val="single" w:sz="4" w:color="D9D9D9"/>
+              <w:insideH w:val="single" w:sz="4" w:color="D9D9D9"/>
+              <w:insideV w:val="single" w:sz="4" w:color="D9D9D9"/>
+            </w:tcBorders>
+            <w:vAlign w:val="center"/>
+          </w:tcPr>
+          <w:p>
+            <w:r>
+              <w:t>Attempt</w:t>
+            </w:r>
+          </w:p>
+        </w:tc>
+        <w:tc>
+          <w:tcPr>
+            <w:tcW w:type="dxa" w:w="2592"/>
+            <w:tcBorders>
+              <w:top w:val="single" w:sz="4" w:color="D9D9D9"/>
+              <w:left w:val="single" w:sz="4" w:color="D9D9D9"/>
+              <w:bottom w:val="single" w:sz="4" w:color="D9D9D9"/>
+              <w:right w:val="single" w:sz="4" w:color="D9D9D9"/>
+              <w:insideH w:val="single" w:sz="4" w:color="D9D9D9"/>
+              <w:insideV w:val="single" w:sz="4" w:color="D9D9D9"/>
+            </w:tcBorders>
+            <w:vAlign w:val="center"/>
+          </w:tcPr>
+          <w:p>
+            <w:r>
+              <w:t>0 to 100</w:t>
+            </w:r>
+          </w:p>
+        </w:tc>
+        <w:tc>
+          <w:tcPr>
+            <w:tcW w:type="dxa" w:w="5112"/>
+            <w:tcBorders>
+              <w:top w:val="single" w:sz="4" w:color="D9D9D9"/>
+              <w:left w:val="single" w:sz="4" w:color="D9D9D9"/>
+              <w:bottom w:val="single" w:sz="4" w:color="D9D9D9"/>
+              <w:right w:val="single" w:sz="4" w:color="D9D9D9"/>
+              <w:insideH w:val="single" w:sz="4" w:color="D9D9D9"/>
+              <w:insideV w:val="single" w:sz="4" w:color="D9D9D9"/>
+            </w:tcBorders>
+            <w:vAlign w:val="center"/>
+          </w:tcPr>
+          <w:p>
+            <w:r>
+              <w:t>Represent controlled execution attempts</w:t>
+            </w:r>
+          </w:p>
+        </w:tc>
+      </w:tr>
+      <w:tr>
+        <w:tc>
+          <w:tcPr>
+            <w:tcW w:type="dxa" w:w="2376"/>
+            <w:tcBorders>
+              <w:top w:val="single" w:sz="4" w:color="D9D9D9"/>
+              <w:left w:val="single" w:sz="4" w:color="D9D9D9"/>
+              <w:bottom w:val="single" w:sz="4" w:color="D9D9D9"/>
+              <w:right w:val="single" w:sz="4" w:color="D9D9D9"/>
+              <w:insideH w:val="single" w:sz="4" w:color="D9D9D9"/>
+              <w:insideV w:val="single" w:sz="4" w:color="D9D9D9"/>
+            </w:tcBorders>
+            <w:shd w:fill="EAF0F7"/>
+            <w:vAlign w:val="center"/>
+          </w:tcPr>
+          <w:p>
+            <w:r>
+              <w:t>Duration</w:t>
+            </w:r>
+          </w:p>
+        </w:tc>
+        <w:tc>
+          <w:tcPr>
+            <w:tcW w:type="dxa" w:w="2592"/>
+            <w:tcBorders>
+              <w:top w:val="single" w:sz="4" w:color="D9D9D9"/>
+              <w:left w:val="single" w:sz="4" w:color="D9D9D9"/>
+              <w:bottom w:val="single" w:sz="4" w:color="D9D9D9"/>
+              <w:right w:val="single" w:sz="4" w:color="D9D9D9"/>
+              <w:insideH w:val="single" w:sz="4" w:color="D9D9D9"/>
+              <w:insideV w:val="single" w:sz="4" w:color="D9D9D9"/>
+            </w:tcBorders>
+            <w:shd w:fill="EAF0F7"/>
+            <w:vAlign w:val="center"/>
+          </w:tcPr>
+          <w:p>
+            <w:r>
+              <w:t>0 to 86400000 ms</w:t>
+            </w:r>
+          </w:p>
+        </w:tc>
+        <w:tc>
+          <w:tcPr>
+            <w:tcW w:type="dxa" w:w="5112"/>
+            <w:tcBorders>
+              <w:top w:val="single" w:sz="4" w:color="D9D9D9"/>
+              <w:left w:val="single" w:sz="4" w:color="D9D9D9"/>
+              <w:bottom w:val="single" w:sz="4" w:color="D9D9D9"/>
+              <w:right w:val="single" w:sz="4" w:color="D9D9D9"/>
+              <w:insideH w:val="single" w:sz="4" w:color="D9D9D9"/>
+              <w:insideV w:val="single" w:sz="4" w:color="D9D9D9"/>
+            </w:tcBorders>
+            <w:shd w:fill="EAF0F7"/>
+            <w:vAlign w:val="center"/>
+          </w:tcPr>
+          <w:p>
+            <w:r>
+              <w:t>Record terminal execution time</w:t>
+            </w:r>
+          </w:p>
+        </w:tc>
+      </w:tr>
+      <w:tr>
+        <w:tc>
+          <w:tcPr>
+            <w:tcW w:type="dxa" w:w="2376"/>
+            <w:tcBorders>
+              <w:top w:val="single" w:sz="4" w:color="D9D9D9"/>
+              <w:left w:val="single" w:sz="4" w:color="D9D9D9"/>
+              <w:bottom w:val="single" w:sz="4" w:color="D9D9D9"/>
+              <w:right w:val="single" w:sz="4" w:color="D9D9D9"/>
+              <w:insideH w:val="single" w:sz="4" w:color="D9D9D9"/>
+              <w:insideV w:val="single" w:sz="4" w:color="D9D9D9"/>
+            </w:tcBorders>
+            <w:vAlign w:val="center"/>
+          </w:tcPr>
+          <w:p>
+            <w:r>
+              <w:t>Observed result</w:t>
+            </w:r>
+          </w:p>
+        </w:tc>
+        <w:tc>
+          <w:tcPr>
+            <w:tcW w:type="dxa" w:w="2592"/>
+            <w:tcBorders>
+              <w:top w:val="single" w:sz="4" w:color="D9D9D9"/>
+              <w:left w:val="single" w:sz="4" w:color="D9D9D9"/>
+              <w:bottom w:val="single" w:sz="4" w:color="D9D9D9"/>
+              <w:right w:val="single" w:sz="4" w:color="D9D9D9"/>
+              <w:insideH w:val="single" w:sz="4" w:color="D9D9D9"/>
+              <w:insideV w:val="single" w:sz="4" w:color="D9D9D9"/>
+            </w:tcBorders>
+            <w:vAlign w:val="center"/>
+          </w:tcPr>
+          <w:p>
+            <w:r>
+              <w:t>4000 characters</w:t>
+            </w:r>
+          </w:p>
+        </w:tc>
+        <w:tc>
+          <w:tcPr>
+            <w:tcW w:type="dxa" w:w="5112"/>
+            <w:tcBorders>
+              <w:top w:val="single" w:sz="4" w:color="D9D9D9"/>
+              <w:left w:val="single" w:sz="4" w:color="D9D9D9"/>
+              <w:bottom w:val="single" w:sz="4" w:color="D9D9D9"/>
+              <w:right w:val="single" w:sz="4" w:color="D9D9D9"/>
+              <w:insideH w:val="single" w:sz="4" w:color="D9D9D9"/>
+              <w:insideV w:val="single" w:sz="4" w:color="D9D9D9"/>
+            </w:tcBorders>
+            <w:vAlign w:val="center"/>
+          </w:tcPr>
+          <w:p>
+            <w:r>
+              <w:t>Explain the measured outcome</w:t>
+            </w:r>
+          </w:p>
+        </w:tc>
+      </w:tr>
+      <w:tr>
+        <w:tc>
+          <w:tcPr>
+            <w:tcW w:type="dxa" w:w="2376"/>
+            <w:tcBorders>
+              <w:top w:val="single" w:sz="4" w:color="D9D9D9"/>
+              <w:left w:val="single" w:sz="4" w:color="D9D9D9"/>
+              <w:bottom w:val="single" w:sz="4" w:color="D9D9D9"/>
+              <w:right w:val="single" w:sz="4" w:color="D9D9D9"/>
+              <w:insideH w:val="single" w:sz="4" w:color="D9D9D9"/>
+              <w:insideV w:val="single" w:sz="4" w:color="D9D9D9"/>
+            </w:tcBorders>
+            <w:shd w:fill="EAF0F7"/>
+            <w:vAlign w:val="center"/>
+          </w:tcPr>
+          <w:p>
+            <w:r>
+              <w:t>Evidence</w:t>
+            </w:r>
+          </w:p>
+        </w:tc>
+        <w:tc>
+          <w:tcPr>
+            <w:tcW w:type="dxa" w:w="2592"/>
+            <w:tcBorders>
+              <w:top w:val="single" w:sz="4" w:color="D9D9D9"/>
+              <w:left w:val="single" w:sz="4" w:color="D9D9D9"/>
+              <w:bottom w:val="single" w:sz="4" w:color="D9D9D9"/>
+              <w:right w:val="single" w:sz="4" w:color="D9D9D9"/>
+              <w:insideH w:val="single" w:sz="4" w:color="D9D9D9"/>
+              <w:insideV w:val="single" w:sz="4" w:color="D9D9D9"/>
+            </w:tcBorders>
+            <w:shd w:fill="EAF0F7"/>
+            <w:vAlign w:val="center"/>
+          </w:tcPr>
+          <w:p>
+            <w:r>
+              <w:t>20 references</w:t>
+            </w:r>
+          </w:p>
+        </w:tc>
+        <w:tc>
+          <w:tcPr>
+            <w:tcW w:type="dxa" w:w="5112"/>
+            <w:tcBorders>
+              <w:top w:val="single" w:sz="4" w:color="D9D9D9"/>
+              <w:left w:val="single" w:sz="4" w:color="D9D9D9"/>
+              <w:bottom w:val="single" w:sz="4" w:color="D9D9D9"/>
+              <w:right w:val="single" w:sz="4" w:color="D9D9D9"/>
+              <w:insideH w:val="single" w:sz="4" w:color="D9D9D9"/>
+              <w:insideV w:val="single" w:sz="4" w:color="D9D9D9"/>
+            </w:tcBorders>
+            <w:shd w:fill="EAF0F7"/>
+            <w:vAlign w:val="center"/>
+          </w:tcPr>
+          <w:p>
+            <w:r>
+              <w:t>Link artifacts without copying content</w:t>
+            </w:r>
+          </w:p>
+        </w:tc>
+      </w:tr>
+      <w:tr>
+        <w:tc>
+          <w:tcPr>
+            <w:tcW w:type="dxa" w:w="2376"/>
+            <w:tcBorders>
+              <w:top w:val="single" w:sz="4" w:color="D9D9D9"/>
+              <w:left w:val="single" w:sz="4" w:color="D9D9D9"/>
+              <w:bottom w:val="single" w:sz="4" w:color="D9D9D9"/>
+              <w:right w:val="single" w:sz="4" w:color="D9D9D9"/>
+              <w:insideH w:val="single" w:sz="4" w:color="D9D9D9"/>
+              <w:insideV w:val="single" w:sz="4" w:color="D9D9D9"/>
+            </w:tcBorders>
+            <w:vAlign w:val="center"/>
+          </w:tcPr>
+          <w:p>
+            <w:r>
+              <w:t>Case page</w:t>
+            </w:r>
+          </w:p>
+        </w:tc>
+        <w:tc>
+          <w:tcPr>
+            <w:tcW w:type="dxa" w:w="2592"/>
+            <w:tcBorders>
+              <w:top w:val="single" w:sz="4" w:color="D9D9D9"/>
+              <w:left w:val="single" w:sz="4" w:color="D9D9D9"/>
+              <w:bottom w:val="single" w:sz="4" w:color="D9D9D9"/>
+              <w:right w:val="single" w:sz="4" w:color="D9D9D9"/>
+              <w:insideH w:val="single" w:sz="4" w:color="D9D9D9"/>
+              <w:insideV w:val="single" w:sz="4" w:color="D9D9D9"/>
+            </w:tcBorders>
+            <w:vAlign w:val="center"/>
+          </w:tcPr>
+          <w:p>
+            <w:r>
+              <w:t>200 records</w:t>
+            </w:r>
+          </w:p>
+        </w:tc>
+        <w:tc>
+          <w:tcPr>
+            <w:tcW w:type="dxa" w:w="5112"/>
+            <w:tcBorders>
+              <w:top w:val="single" w:sz="4" w:color="D9D9D9"/>
+              <w:left w:val="single" w:sz="4" w:color="D9D9D9"/>
+              <w:bottom w:val="single" w:sz="4" w:color="D9D9D9"/>
+              <w:right w:val="single" w:sz="4" w:color="D9D9D9"/>
+              <w:insideH w:val="single" w:sz="4" w:color="D9D9D9"/>
+              <w:insideV w:val="single" w:sz="4" w:color="D9D9D9"/>
+            </w:tcBorders>
+            <w:vAlign w:val="center"/>
+          </w:tcPr>
+          <w:p>
+            <w:r>
+              <w:t>Protect query and response resources</w:t>
+            </w:r>
+          </w:p>
+        </w:tc>
+      </w:tr>
+    </w:tbl>
+    <w:p/>
+    <w:p>
+      <w:pPr>
+        <w:pStyle w:val="Heading1"/>
+      </w:pPr>
+      <w:r>
+        <w:t>8 Result Aggregation</w:t>
+      </w:r>
+    </w:p>
+    <w:tbl>
+      <w:tblPr>
+        <w:tblW w:type="auto" w:w="0"/>
+        <w:tblLayout w:type="fixed"/>
+        <w:tblLook w:firstColumn="1" w:firstRow="1" w:lastColumn="0" w:lastRow="0" w:noHBand="0" w:noVBand="1" w:val="04A0"/>
+      </w:tblPr>
+      <w:tblGrid>
+        <w:gridCol w:w="3312"/>
+        <w:gridCol w:w="3312"/>
+        <w:gridCol w:w="3312"/>
+      </w:tblGrid>
+      <w:tr>
+        <w:trPr>
+          <w:tblHeader/>
+        </w:trPr>
+        <w:tc>
+          <w:tcPr>
+            <w:tcW w:type="dxa" w:w="3240"/>
+            <w:shd w:fill="17365D"/>
+            <w:tcBorders>
+              <w:top w:val="single" w:sz="4" w:color="D9D9D9"/>
+              <w:left w:val="single" w:sz="4" w:color="D9D9D9"/>
+              <w:bottom w:val="single" w:sz="4" w:color="D9D9D9"/>
+              <w:right w:val="single" w:sz="4" w:color="D9D9D9"/>
+              <w:insideH w:val="single" w:sz="4" w:color="D9D9D9"/>
+              <w:insideV w:val="single" w:sz="4" w:color="D9D9D9"/>
+            </w:tcBorders>
+            <w:vAlign w:val="center"/>
+          </w:tcPr>
+          <w:p>
+            <w:r>
+              <w:rPr>
+                <w:b/>
+                <w:color w:val="FFFFFF"/>
+              </w:rPr>
+              <w:t>Condition</w:t>
+            </w:r>
+          </w:p>
+        </w:tc>
+        <w:tc>
+          <w:tcPr>
+            <w:tcW w:type="dxa" w:w="3024"/>
+            <w:shd w:fill="17365D"/>
+            <w:tcBorders>
+              <w:top w:val="single" w:sz="4" w:color="D9D9D9"/>
+              <w:left w:val="single" w:sz="4" w:color="D9D9D9"/>
+              <w:bottom w:val="single" w:sz="4" w:color="D9D9D9"/>
+              <w:right w:val="single" w:sz="4" w:color="D9D9D9"/>
+              <w:insideH w:val="single" w:sz="4" w:color="D9D9D9"/>
+              <w:insideV w:val="single" w:sz="4" w:color="D9D9D9"/>
+            </w:tcBorders>
+            <w:vAlign w:val="center"/>
+          </w:tcPr>
+          <w:p>
+            <w:r>
+              <w:rPr>
+                <w:b/>
+                <w:color w:val="FFFFFF"/>
+              </w:rPr>
+              <w:t>Run outcome</w:t>
+            </w:r>
+          </w:p>
+        </w:tc>
+        <w:tc>
+          <w:tcPr>
+            <w:tcW w:type="dxa" w:w="3816"/>
+            <w:shd w:fill="17365D"/>
+            <w:tcBorders>
+              <w:top w:val="single" w:sz="4" w:color="D9D9D9"/>
+              <w:left w:val="single" w:sz="4" w:color="D9D9D9"/>
+              <w:bottom w:val="single" w:sz="4" w:color="D9D9D9"/>
+              <w:right w:val="single" w:sz="4" w:color="D9D9D9"/>
+              <w:insideH w:val="single" w:sz="4" w:color="D9D9D9"/>
+              <w:insideV w:val="single" w:sz="4" w:color="D9D9D9"/>
+            </w:tcBorders>
+            <w:vAlign w:val="center"/>
+          </w:tcPr>
+          <w:p>
+            <w:r>
+              <w:rPr>
+                <w:b/>
+                <w:color w:val="FFFFFF"/>
+              </w:rPr>
+              <w:t>Reason</w:t>
+            </w:r>
+          </w:p>
+        </w:tc>
+      </w:tr>
+      <w:tr>
+        <w:tc>
+          <w:tcPr>
+            <w:tcW w:type="dxa" w:w="3240"/>
+            <w:tcBorders>
+              <w:top w:val="single" w:sz="4" w:color="D9D9D9"/>
+              <w:left w:val="single" w:sz="4" w:color="D9D9D9"/>
+              <w:bottom w:val="single" w:sz="4" w:color="D9D9D9"/>
+              <w:right w:val="single" w:sz="4" w:color="D9D9D9"/>
+              <w:insideH w:val="single" w:sz="4" w:color="D9D9D9"/>
+              <w:insideV w:val="single" w:sz="4" w:color="D9D9D9"/>
+            </w:tcBorders>
+            <w:vAlign w:val="center"/>
+          </w:tcPr>
+          <w:p>
+            <w:r>
+              <w:t>Cases remain pending or running</w:t>
+            </w:r>
+          </w:p>
+        </w:tc>
+        <w:tc>
+          <w:tcPr>
+            <w:tcW w:type="dxa" w:w="3024"/>
+            <w:tcBorders>
+              <w:top w:val="single" w:sz="4" w:color="D9D9D9"/>
+              <w:left w:val="single" w:sz="4" w:color="D9D9D9"/>
+              <w:bottom w:val="single" w:sz="4" w:color="D9D9D9"/>
+              <w:right w:val="single" w:sz="4" w:color="D9D9D9"/>
+              <w:insideH w:val="single" w:sz="4" w:color="D9D9D9"/>
+              <w:insideV w:val="single" w:sz="4" w:color="D9D9D9"/>
+            </w:tcBorders>
+            <w:vAlign w:val="center"/>
+          </w:tcPr>
+          <w:p>
+            <w:r>
+              <w:t>Running</w:t>
+            </w:r>
+          </w:p>
+        </w:tc>
+        <w:tc>
+          <w:tcPr>
+            <w:tcW w:type="dxa" w:w="3816"/>
+            <w:tcBorders>
+              <w:top w:val="single" w:sz="4" w:color="D9D9D9"/>
+              <w:left w:val="single" w:sz="4" w:color="D9D9D9"/>
+              <w:bottom w:val="single" w:sz="4" w:color="D9D9D9"/>
+              <w:right w:val="single" w:sz="4" w:color="D9D9D9"/>
+              <w:insideH w:val="single" w:sz="4" w:color="D9D9D9"/>
+              <w:insideV w:val="single" w:sz="4" w:color="D9D9D9"/>
+            </w:tcBorders>
+            <w:vAlign w:val="center"/>
+          </w:tcPr>
+          <w:p>
+            <w:r>
+              <w:t>Execution is incomplete</w:t>
+            </w:r>
+          </w:p>
+        </w:tc>
+      </w:tr>
+      <w:tr>
+        <w:tc>
+          <w:tcPr>
+            <w:tcW w:type="dxa" w:w="3240"/>
+            <w:tcBorders>
+              <w:top w:val="single" w:sz="4" w:color="D9D9D9"/>
+              <w:left w:val="single" w:sz="4" w:color="D9D9D9"/>
+              <w:bottom w:val="single" w:sz="4" w:color="D9D9D9"/>
+              <w:right w:val="single" w:sz="4" w:color="D9D9D9"/>
+              <w:insideH w:val="single" w:sz="4" w:color="D9D9D9"/>
+              <w:insideV w:val="single" w:sz="4" w:color="D9D9D9"/>
+            </w:tcBorders>
+            <w:shd w:fill="EAF0F7"/>
+            <w:vAlign w:val="center"/>
+          </w:tcPr>
+          <w:p>
+            <w:r>
+              <w:t>Required case failed</w:t>
+            </w:r>
+          </w:p>
+        </w:tc>
+        <w:tc>
+          <w:tcPr>
+            <w:tcW w:type="dxa" w:w="3024"/>
+            <w:tcBorders>
+              <w:top w:val="single" w:sz="4" w:color="D9D9D9"/>
+              <w:left w:val="single" w:sz="4" w:color="D9D9D9"/>
+              <w:bottom w:val="single" w:sz="4" w:color="D9D9D9"/>
+              <w:right w:val="single" w:sz="4" w:color="D9D9D9"/>
+              <w:insideH w:val="single" w:sz="4" w:color="D9D9D9"/>
+              <w:insideV w:val="single" w:sz="4" w:color="D9D9D9"/>
+            </w:tcBorders>
+            <w:shd w:fill="EAF0F7"/>
+            <w:vAlign w:val="center"/>
+          </w:tcPr>
+          <w:p>
+            <w:r>
+              <w:t>Failed</w:t>
+            </w:r>
+          </w:p>
+        </w:tc>
+        <w:tc>
+          <w:tcPr>
+            <w:tcW w:type="dxa" w:w="3816"/>
+            <w:tcBorders>
+              <w:top w:val="single" w:sz="4" w:color="D9D9D9"/>
+              <w:left w:val="single" w:sz="4" w:color="D9D9D9"/>
+              <w:bottom w:val="single" w:sz="4" w:color="D9D9D9"/>
+              <w:right w:val="single" w:sz="4" w:color="D9D9D9"/>
+              <w:insideH w:val="single" w:sz="4" w:color="D9D9D9"/>
+              <w:insideV w:val="single" w:sz="4" w:color="D9D9D9"/>
+            </w:tcBorders>
+            <w:shd w:fill="EAF0F7"/>
+            <w:vAlign w:val="center"/>
+          </w:tcPr>
+          <w:p>
+            <w:r>
+              <w:t>Required intent was not satisfied</w:t>
+            </w:r>
+          </w:p>
+        </w:tc>
+      </w:tr>
+      <w:tr>
+        <w:tc>
+          <w:tcPr>
+            <w:tcW w:type="dxa" w:w="3240"/>
+            <w:tcBorders>
+              <w:top w:val="single" w:sz="4" w:color="D9D9D9"/>
+              <w:left w:val="single" w:sz="4" w:color="D9D9D9"/>
+              <w:bottom w:val="single" w:sz="4" w:color="D9D9D9"/>
+              <w:right w:val="single" w:sz="4" w:color="D9D9D9"/>
+              <w:insideH w:val="single" w:sz="4" w:color="D9D9D9"/>
+              <w:insideV w:val="single" w:sz="4" w:color="D9D9D9"/>
+            </w:tcBorders>
+            <w:vAlign w:val="center"/>
+          </w:tcPr>
+          <w:p>
+            <w:r>
+              <w:t>Required case skipped</w:t>
+            </w:r>
+          </w:p>
+        </w:tc>
+        <w:tc>
+          <w:tcPr>
+            <w:tcW w:type="dxa" w:w="3024"/>
+            <w:tcBorders>
+              <w:top w:val="single" w:sz="4" w:color="D9D9D9"/>
+              <w:left w:val="single" w:sz="4" w:color="D9D9D9"/>
+              <w:bottom w:val="single" w:sz="4" w:color="D9D9D9"/>
+              <w:right w:val="single" w:sz="4" w:color="D9D9D9"/>
+              <w:insideH w:val="single" w:sz="4" w:color="D9D9D9"/>
+              <w:insideV w:val="single" w:sz="4" w:color="D9D9D9"/>
+            </w:tcBorders>
+            <w:vAlign w:val="center"/>
+          </w:tcPr>
+          <w:p>
+            <w:r>
+              <w:t>Failed</w:t>
+            </w:r>
+          </w:p>
+        </w:tc>
+        <w:tc>
+          <w:tcPr>
+            <w:tcW w:type="dxa" w:w="3816"/>
+            <w:tcBorders>
+              <w:top w:val="single" w:sz="4" w:color="D9D9D9"/>
+              <w:left w:val="single" w:sz="4" w:color="D9D9D9"/>
+              <w:bottom w:val="single" w:sz="4" w:color="D9D9D9"/>
+              <w:right w:val="single" w:sz="4" w:color="D9D9D9"/>
+              <w:insideH w:val="single" w:sz="4" w:color="D9D9D9"/>
+              <w:insideV w:val="single" w:sz="4" w:color="D9D9D9"/>
+            </w:tcBorders>
+            <w:vAlign w:val="center"/>
+          </w:tcPr>
+          <w:p>
+            <w:r>
+              <w:t>Required evidence is missing</w:t>
+            </w:r>
+          </w:p>
+        </w:tc>
+      </w:tr>
+      <w:tr>
+        <w:tc>
+          <w:tcPr>
+            <w:tcW w:type="dxa" w:w="3240"/>
+            <w:tcBorders>
+              <w:top w:val="single" w:sz="4" w:color="D9D9D9"/>
+              <w:left w:val="single" w:sz="4" w:color="D9D9D9"/>
+              <w:bottom w:val="single" w:sz="4" w:color="D9D9D9"/>
+              <w:right w:val="single" w:sz="4" w:color="D9D9D9"/>
+              <w:insideH w:val="single" w:sz="4" w:color="D9D9D9"/>
+              <w:insideV w:val="single" w:sz="4" w:color="D9D9D9"/>
+            </w:tcBorders>
+            <w:shd w:fill="EAF0F7"/>
+            <w:vAlign w:val="center"/>
+          </w:tcPr>
+          <w:p>
+            <w:r>
+              <w:t>All required cases passed</w:t>
+            </w:r>
+          </w:p>
+        </w:tc>
+        <w:tc>
+          <w:tcPr>
+            <w:tcW w:type="dxa" w:w="3024"/>
+            <w:tcBorders>
+              <w:top w:val="single" w:sz="4" w:color="D9D9D9"/>
+              <w:left w:val="single" w:sz="4" w:color="D9D9D9"/>
+              <w:bottom w:val="single" w:sz="4" w:color="D9D9D9"/>
+              <w:right w:val="single" w:sz="4" w:color="D9D9D9"/>
+              <w:insideH w:val="single" w:sz="4" w:color="D9D9D9"/>
+              <w:insideV w:val="single" w:sz="4" w:color="D9D9D9"/>
+            </w:tcBorders>
+            <w:shd w:fill="EAF0F7"/>
+            <w:vAlign w:val="center"/>
+          </w:tcPr>
+          <w:p>
+            <w:r>
+              <w:t>Passed</w:t>
+            </w:r>
+          </w:p>
+        </w:tc>
+        <w:tc>
+          <w:tcPr>
+            <w:tcW w:type="dxa" w:w="3816"/>
+            <w:tcBorders>
+              <w:top w:val="single" w:sz="4" w:color="D9D9D9"/>
+              <w:left w:val="single" w:sz="4" w:color="D9D9D9"/>
+              <w:bottom w:val="single" w:sz="4" w:color="D9D9D9"/>
+              <w:right w:val="single" w:sz="4" w:color="D9D9D9"/>
+              <w:insideH w:val="single" w:sz="4" w:color="D9D9D9"/>
+              <w:insideV w:val="single" w:sz="4" w:color="D9D9D9"/>
+            </w:tcBorders>
+            <w:shd w:fill="EAF0F7"/>
+            <w:vAlign w:val="center"/>
+          </w:tcPr>
+          <w:p>
+            <w:r>
+              <w:t>Reviewed acceptance intent was met</w:t>
+            </w:r>
+          </w:p>
+        </w:tc>
+      </w:tr>
+      <w:tr>
+        <w:tc>
+          <w:tcPr>
+            <w:tcW w:type="dxa" w:w="3240"/>
+            <w:tcBorders>
+              <w:top w:val="single" w:sz="4" w:color="D9D9D9"/>
+              <w:left w:val="single" w:sz="4" w:color="D9D9D9"/>
+              <w:bottom w:val="single" w:sz="4" w:color="D9D9D9"/>
+              <w:right w:val="single" w:sz="4" w:color="D9D9D9"/>
+              <w:insideH w:val="single" w:sz="4" w:color="D9D9D9"/>
+              <w:insideV w:val="single" w:sz="4" w:color="D9D9D9"/>
+            </w:tcBorders>
+            <w:vAlign w:val="center"/>
+          </w:tcPr>
+          <w:p>
+            <w:r>
+              <w:t>Optional case failed or skipped</w:t>
+            </w:r>
+          </w:p>
+        </w:tc>
+        <w:tc>
+          <w:tcPr>
+            <w:tcW w:type="dxa" w:w="3024"/>
+            <w:tcBorders>
+              <w:top w:val="single" w:sz="4" w:color="D9D9D9"/>
+              <w:left w:val="single" w:sz="4" w:color="D9D9D9"/>
+              <w:bottom w:val="single" w:sz="4" w:color="D9D9D9"/>
+              <w:right w:val="single" w:sz="4" w:color="D9D9D9"/>
+              <w:insideH w:val="single" w:sz="4" w:color="D9D9D9"/>
+              <w:insideV w:val="single" w:sz="4" w:color="D9D9D9"/>
+            </w:tcBorders>
+            <w:vAlign w:val="center"/>
+          </w:tcPr>
+          <w:p>
+            <w:r>
+              <w:t>Passed if required cases pass</w:t>
+            </w:r>
+          </w:p>
+        </w:tc>
+        <w:tc>
+          <w:tcPr>
+            <w:tcW w:type="dxa" w:w="3816"/>
+            <w:tcBorders>
+              <w:top w:val="single" w:sz="4" w:color="D9D9D9"/>
+              <w:left w:val="single" w:sz="4" w:color="D9D9D9"/>
+              <w:bottom w:val="single" w:sz="4" w:color="D9D9D9"/>
+              <w:right w:val="single" w:sz="4" w:color="D9D9D9"/>
+              <w:insideH w:val="single" w:sz="4" w:color="D9D9D9"/>
+              <w:insideV w:val="single" w:sz="4" w:color="D9D9D9"/>
+            </w:tcBorders>
+            <w:vAlign w:val="center"/>
+          </w:tcPr>
+          <w:p>
+            <w:r>
+              <w:t>Optional scope is informative</w:t>
+            </w:r>
+          </w:p>
+        </w:tc>
+      </w:tr>
+    </w:tbl>
+    <w:p/>
+    <w:p>
+      <w:r>
+        <w:t>Case results exclusively derive running, passed, and failed states for catalog-backed runs. An authorized operator may still cancel an incomplete run directly.</w:t>
+      </w:r>
+    </w:p>
+    <w:p>
+      <w:r>
+        <w:br w:type="page"/>
+      </w:r>
+    </w:p>
+    <w:p>
+      <w:pPr>
+        <w:pStyle w:val="Heading1"/>
+      </w:pPr>
+      <w:r>
+        <w:t>9 Events and Audit</w:t>
       </w:r>
     </w:p>
     <w:tbl>
@@ -2181,6 +2994,65 @@
           </w:p>
         </w:tc>
       </w:tr>
+      <w:tr>
+        <w:tc>
+          <w:tcPr>
+            <w:tcW w:type="dxa" w:w="2376"/>
+            <w:tcBorders>
+              <w:top w:val="single" w:sz="4" w:color="D9D9D9"/>
+              <w:left w:val="single" w:sz="4" w:color="D9D9D9"/>
+              <w:bottom w:val="single" w:sz="4" w:color="D9D9D9"/>
+              <w:right w:val="single" w:sz="4" w:color="D9D9D9"/>
+              <w:insideH w:val="single" w:sz="4" w:color="D9D9D9"/>
+              <w:insideV w:val="single" w:sz="4" w:color="D9D9D9"/>
+            </w:tcBorders>
+            <w:vAlign w:val="center"/>
+          </w:tcPr>
+          <w:p>
+            <w:r>
+              <w:t>Record case result</w:t>
+            </w:r>
+          </w:p>
+        </w:tc>
+        <w:tc>
+          <w:tcPr>
+            <w:tcW w:type="dxa" w:w="4536"/>
+            <w:tcBorders>
+              <w:top w:val="single" w:sz="4" w:color="D9D9D9"/>
+              <w:left w:val="single" w:sz="4" w:color="D9D9D9"/>
+              <w:bottom w:val="single" w:sz="4" w:color="D9D9D9"/>
+              <w:right w:val="single" w:sz="4" w:color="D9D9D9"/>
+              <w:insideH w:val="single" w:sz="4" w:color="D9D9D9"/>
+              <w:insideV w:val="single" w:sz="4" w:color="D9D9D9"/>
+            </w:tcBorders>
+            <w:vAlign w:val="center"/>
+          </w:tcPr>
+          <w:p>
+            <w:r>
+              <w:t>atep.test_case.result_recorded.v1</w:t>
+            </w:r>
+          </w:p>
+        </w:tc>
+        <w:tc>
+          <w:tcPr>
+            <w:tcW w:type="dxa" w:w="3024"/>
+            <w:tcBorders>
+              <w:top w:val="single" w:sz="4" w:color="D9D9D9"/>
+              <w:left w:val="single" w:sz="4" w:color="D9D9D9"/>
+              <w:bottom w:val="single" w:sz="4" w:color="D9D9D9"/>
+              <w:right w:val="single" w:sz="4" w:color="D9D9D9"/>
+              <w:insideH w:val="single" w:sz="4" w:color="D9D9D9"/>
+              <w:insideV w:val="single" w:sz="4" w:color="D9D9D9"/>
+            </w:tcBorders>
+            <w:vAlign w:val="center"/>
+          </w:tcPr>
+          <w:p>
+            <w:r>
+              <w:t>test_case.result_recorded</w:t>
+            </w:r>
+          </w:p>
+        </w:tc>
+      </w:tr>
     </w:tbl>
     <w:p/>
     <w:p>
@@ -2193,7 +3065,7 @@
         <w:pStyle w:val="Heading1"/>
       </w:pPr>
       <w:r>
-        <w:t>8 Engineering Decisions</w:t>
+        <w:t>10 Engineering Decisions</w:t>
       </w:r>
     </w:p>
     <w:tbl>
@@ -2526,6 +3398,127 @@
           </w:p>
         </w:tc>
       </w:tr>
+      <w:tr>
+        <w:tc>
+          <w:tcPr>
+            <w:tcW w:type="dxa" w:w="2376"/>
+            <w:tcBorders>
+              <w:top w:val="single" w:sz="4" w:color="D9D9D9"/>
+              <w:left w:val="single" w:sz="4" w:color="D9D9D9"/>
+              <w:bottom w:val="single" w:sz="4" w:color="D9D9D9"/>
+              <w:right w:val="single" w:sz="4" w:color="D9D9D9"/>
+              <w:insideH w:val="single" w:sz="4" w:color="D9D9D9"/>
+              <w:insideV w:val="single" w:sz="4" w:color="D9D9D9"/>
+            </w:tcBorders>
+            <w:vAlign w:val="center"/>
+          </w:tcPr>
+          <w:p>
+            <w:r>
+              <w:t>Materialize cases</w:t>
+            </w:r>
+          </w:p>
+        </w:tc>
+        <w:tc>
+          <w:tcPr>
+            <w:tcW w:type="dxa" w:w="3960"/>
+            <w:tcBorders>
+              <w:top w:val="single" w:sz="4" w:color="D9D9D9"/>
+              <w:left w:val="single" w:sz="4" w:color="D9D9D9"/>
+              <w:bottom w:val="single" w:sz="4" w:color="D9D9D9"/>
+              <w:right w:val="single" w:sz="4" w:color="D9D9D9"/>
+              <w:insideH w:val="single" w:sz="4" w:color="D9D9D9"/>
+              <w:insideV w:val="single" w:sz="4" w:color="D9D9D9"/>
+            </w:tcBorders>
+            <w:vAlign w:val="center"/>
+          </w:tcPr>
+          <w:p>
+            <w:r>
+              <w:t>Make execution state queryable</w:t>
+            </w:r>
+          </w:p>
+        </w:tc>
+        <w:tc>
+          <w:tcPr>
+            <w:tcW w:type="dxa" w:w="3600"/>
+            <w:tcBorders>
+              <w:top w:val="single" w:sz="4" w:color="D9D9D9"/>
+              <w:left w:val="single" w:sz="4" w:color="D9D9D9"/>
+              <w:bottom w:val="single" w:sz="4" w:color="D9D9D9"/>
+              <w:right w:val="single" w:sz="4" w:color="D9D9D9"/>
+              <w:insideH w:val="single" w:sz="4" w:color="D9D9D9"/>
+              <w:insideV w:val="single" w:sz="4" w:color="D9D9D9"/>
+            </w:tcBorders>
+            <w:vAlign w:val="center"/>
+          </w:tcPr>
+          <w:p>
+            <w:r>
+              <w:t>Each run owns immutable case identity</w:t>
+            </w:r>
+          </w:p>
+        </w:tc>
+      </w:tr>
+      <w:tr>
+        <w:tc>
+          <w:tcPr>
+            <w:tcW w:type="dxa" w:w="2376"/>
+            <w:tcBorders>
+              <w:top w:val="single" w:sz="4" w:color="D9D9D9"/>
+              <w:left w:val="single" w:sz="4" w:color="D9D9D9"/>
+              <w:bottom w:val="single" w:sz="4" w:color="D9D9D9"/>
+              <w:right w:val="single" w:sz="4" w:color="D9D9D9"/>
+              <w:insideH w:val="single" w:sz="4" w:color="D9D9D9"/>
+              <w:insideV w:val="single" w:sz="4" w:color="D9D9D9"/>
+            </w:tcBorders>
+            <w:shd w:fill="EAF0F7"/>
+            <w:vAlign w:val="center"/>
+          </w:tcPr>
+          <w:p>
+            <w:r>
+              <w:t>Aggregate in transaction</w:t>
+            </w:r>
+          </w:p>
+        </w:tc>
+        <w:tc>
+          <w:tcPr>
+            <w:tcW w:type="dxa" w:w="3960"/>
+            <w:tcBorders>
+              <w:top w:val="single" w:sz="4" w:color="D9D9D9"/>
+              <w:left w:val="single" w:sz="4" w:color="D9D9D9"/>
+              <w:bottom w:val="single" w:sz="4" w:color="D9D9D9"/>
+              <w:right w:val="single" w:sz="4" w:color="D9D9D9"/>
+              <w:insideH w:val="single" w:sz="4" w:color="D9D9D9"/>
+              <w:insideV w:val="single" w:sz="4" w:color="D9D9D9"/>
+            </w:tcBorders>
+            <w:shd w:fill="EAF0F7"/>
+            <w:vAlign w:val="center"/>
+          </w:tcPr>
+          <w:p>
+            <w:r>
+              <w:t>Keep progress consistent</w:t>
+            </w:r>
+          </w:p>
+        </w:tc>
+        <w:tc>
+          <w:tcPr>
+            <w:tcW w:type="dxa" w:w="3600"/>
+            <w:tcBorders>
+              <w:top w:val="single" w:sz="4" w:color="D9D9D9"/>
+              <w:left w:val="single" w:sz="4" w:color="D9D9D9"/>
+              <w:bottom w:val="single" w:sz="4" w:color="D9D9D9"/>
+              <w:right w:val="single" w:sz="4" w:color="D9D9D9"/>
+              <w:insideH w:val="single" w:sz="4" w:color="D9D9D9"/>
+              <w:insideV w:val="single" w:sz="4" w:color="D9D9D9"/>
+            </w:tcBorders>
+            <w:shd w:fill="EAF0F7"/>
+            <w:vAlign w:val="center"/>
+          </w:tcPr>
+          <w:p>
+            <w:r>
+              <w:t>Case and run update together</w:t>
+            </w:r>
+          </w:p>
+        </w:tc>
+      </w:tr>
     </w:tbl>
     <w:p/>
     <w:p>
@@ -2538,7 +3531,7 @@
         <w:pStyle w:val="Heading1"/>
       </w:pPr>
       <w:r>
-        <w:t>9 Verification Catalogue</w:t>
+        <w:t>11 Verification Catalogue</w:t>
       </w:r>
     </w:p>
     <w:tbl>
@@ -2930,14 +3923,140 @@
           </w:p>
         </w:tc>
       </w:tr>
+      <w:tr>
+        <w:tc>
+          <w:tcPr>
+            <w:tcW w:type="dxa" w:w="2232"/>
+            <w:tcBorders>
+              <w:top w:val="single" w:sz="4" w:color="D9D9D9"/>
+              <w:left w:val="single" w:sz="4" w:color="D9D9D9"/>
+              <w:bottom w:val="single" w:sz="4" w:color="D9D9D9"/>
+              <w:right w:val="single" w:sz="4" w:color="D9D9D9"/>
+              <w:insideH w:val="single" w:sz="4" w:color="D9D9D9"/>
+              <w:insideV w:val="single" w:sz="4" w:color="D9D9D9"/>
+            </w:tcBorders>
+            <w:shd w:fill="EAF0F7"/>
+            <w:vAlign w:val="center"/>
+          </w:tcPr>
+          <w:p>
+            <w:r>
+              <w:t>TF-T-016 to 019</w:t>
+            </w:r>
+          </w:p>
+        </w:tc>
+        <w:tc>
+          <w:tcPr>
+            <w:tcW w:type="dxa" w:w="3528"/>
+            <w:tcBorders>
+              <w:top w:val="single" w:sz="4" w:color="D9D9D9"/>
+              <w:left w:val="single" w:sz="4" w:color="D9D9D9"/>
+              <w:bottom w:val="single" w:sz="4" w:color="D9D9D9"/>
+              <w:right w:val="single" w:sz="4" w:color="D9D9D9"/>
+              <w:insideH w:val="single" w:sz="4" w:color="D9D9D9"/>
+              <w:insideV w:val="single" w:sz="4" w:color="D9D9D9"/>
+            </w:tcBorders>
+            <w:shd w:fill="EAF0F7"/>
+            <w:vAlign w:val="center"/>
+          </w:tcPr>
+          <w:p>
+            <w:r>
+              <w:t>Execution binding</w:t>
+            </w:r>
+          </w:p>
+        </w:tc>
+        <w:tc>
+          <w:tcPr>
+            <w:tcW w:type="dxa" w:w="4176"/>
+            <w:tcBorders>
+              <w:top w:val="single" w:sz="4" w:color="D9D9D9"/>
+              <w:left w:val="single" w:sz="4" w:color="D9D9D9"/>
+              <w:bottom w:val="single" w:sz="4" w:color="D9D9D9"/>
+              <w:right w:val="single" w:sz="4" w:color="D9D9D9"/>
+              <w:insideH w:val="single" w:sz="4" w:color="D9D9D9"/>
+              <w:insideV w:val="single" w:sz="4" w:color="D9D9D9"/>
+            </w:tcBorders>
+            <w:shd w:fill="EAF0F7"/>
+            <w:vAlign w:val="center"/>
+          </w:tcPr>
+          <w:p>
+            <w:r>
+              <w:t>Validate snapshots, cases, and replay</w:t>
+            </w:r>
+          </w:p>
+        </w:tc>
+      </w:tr>
+      <w:tr>
+        <w:tc>
+          <w:tcPr>
+            <w:tcW w:type="dxa" w:w="2232"/>
+            <w:tcBorders>
+              <w:top w:val="single" w:sz="4" w:color="D9D9D9"/>
+              <w:left w:val="single" w:sz="4" w:color="D9D9D9"/>
+              <w:bottom w:val="single" w:sz="4" w:color="D9D9D9"/>
+              <w:right w:val="single" w:sz="4" w:color="D9D9D9"/>
+              <w:insideH w:val="single" w:sz="4" w:color="D9D9D9"/>
+              <w:insideV w:val="single" w:sz="4" w:color="D9D9D9"/>
+            </w:tcBorders>
+            <w:vAlign w:val="center"/>
+          </w:tcPr>
+          <w:p>
+            <w:r>
+              <w:t>TF-T-020 to 026</w:t>
+            </w:r>
+          </w:p>
+        </w:tc>
+        <w:tc>
+          <w:tcPr>
+            <w:tcW w:type="dxa" w:w="3528"/>
+            <w:tcBorders>
+              <w:top w:val="single" w:sz="4" w:color="D9D9D9"/>
+              <w:left w:val="single" w:sz="4" w:color="D9D9D9"/>
+              <w:bottom w:val="single" w:sz="4" w:color="D9D9D9"/>
+              <w:right w:val="single" w:sz="4" w:color="D9D9D9"/>
+              <w:insideH w:val="single" w:sz="4" w:color="D9D9D9"/>
+              <w:insideV w:val="single" w:sz="4" w:color="D9D9D9"/>
+            </w:tcBorders>
+            <w:vAlign w:val="center"/>
+          </w:tcPr>
+          <w:p>
+            <w:r>
+              <w:t>Case results</w:t>
+            </w:r>
+          </w:p>
+        </w:tc>
+        <w:tc>
+          <w:tcPr>
+            <w:tcW w:type="dxa" w:w="4176"/>
+            <w:tcBorders>
+              <w:top w:val="single" w:sz="4" w:color="D9D9D9"/>
+              <w:left w:val="single" w:sz="4" w:color="D9D9D9"/>
+              <w:bottom w:val="single" w:sz="4" w:color="D9D9D9"/>
+              <w:right w:val="single" w:sz="4" w:color="D9D9D9"/>
+              <w:insideH w:val="single" w:sz="4" w:color="D9D9D9"/>
+              <w:insideV w:val="single" w:sz="4" w:color="D9D9D9"/>
+            </w:tcBorders>
+            <w:vAlign w:val="center"/>
+          </w:tcPr>
+          <w:p>
+            <w:r>
+              <w:t>Validate bounds, aggregation, APIs, and migration</w:t>
+            </w:r>
+          </w:p>
+        </w:tc>
+      </w:tr>
     </w:tbl>
     <w:p/>
+    <w:p>
+      <w:r>
+        <w:br w:type="page"/>
+      </w:r>
+    </w:p>
     <w:p>
       <w:pPr>
         <w:pStyle w:val="Heading1"/>
       </w:pPr>
       <w:r>
-        <w:t>10 Risks and Controls</w:t>
+        <w:t>12 Risks and Controls</w:t>
       </w:r>
     </w:p>
     <w:tbl>
@@ -3124,7 +4243,7 @@
           </w:tcPr>
           <w:p>
             <w:r>
-              <w:t>Definition version snapshot</w:t>
+              <w:t>Suite and definition snapshots</w:t>
             </w:r>
           </w:p>
         </w:tc>
@@ -3144,7 +4263,7 @@
           </w:tcPr>
           <w:p>
             <w:r>
-              <w:t>Record execution snapshot in VIII-2</w:t>
+              <w:t>Run remains reproducible</w:t>
             </w:r>
           </w:p>
         </w:tc>
@@ -3165,7 +4284,7 @@
           </w:tcPr>
           <w:p>
             <w:r>
-              <w:t>Unbounded tests</w:t>
+              <w:t>Unbounded results</w:t>
             </w:r>
           </w:p>
         </w:tc>
@@ -3184,7 +4303,7 @@
           </w:tcPr>
           <w:p>
             <w:r>
-              <w:t>Timeout and collection limits</w:t>
+              <w:t>Duration and collection limits</w:t>
             </w:r>
           </w:p>
         </w:tc>
@@ -3203,7 +4322,7 @@
           </w:tcPr>
           <w:p>
             <w:r>
-              <w:t>Add run-level budgets</w:t>
+              <w:t>Large evidence stays in artifacts</w:t>
             </w:r>
           </w:p>
         </w:tc>
@@ -3336,23 +4455,12 @@
         <w:pStyle w:val="Heading1"/>
       </w:pPr>
       <w:r>
-        <w:t>11 Study Exercises</w:t>
+        <w:t>13 Study Exercises</w:t>
       </w:r>
     </w:p>
     <w:p>
-      <w:pPr>
-        <w:pStyle w:val="ListBullet"/>
-      </w:pPr>
       <w:r>
-        <w:t>Create one ADAS definition and identify every invariant enforced before persistence.</w:t>
-      </w:r>
-    </w:p>
-    <w:p>
-      <w:pPr>
-        <w:pStyle w:val="ListBullet"/>
-      </w:pPr>
-      <w:r>
-        <w:t>Compose a smoke suite and explain its stored definition versions.</w:t>
+        <w:t>Create one ADAS definition and identify its invariants. Then run two required cases, explain the aggregate result, and compare an exact retry after suite archival with a new run request for the archived suite.</w:t>
       </w:r>
     </w:p>
     <w:p>
@@ -3360,17 +4468,17 @@
         <w:pStyle w:val="Heading1"/>
       </w:pPr>
       <w:r>
-        <w:t>12 Next Development</w:t>
+        <w:t>14 Next Development</w:t>
       </w:r>
     </w:p>
     <w:p>
       <w:r>
-        <w:t>VIII-2 will bind active suite snapshots to runs, persist ordered case results, and correlate artifact evidence.</w:t>
+        <w:t>VIII-3 will connect scheduled jobs to catalog suites for smoke, sanity, and regression selection while preserving the VIII-2 snapshot.</w:t>
       </w:r>
     </w:p>
     <w:sectPr>
       <w:pgSz w:w="12240" w:h="15840"/>
-      <w:pgMar w:top="1037" w:right="1152" w:bottom="1037" w:left="1152" w:header="720" w:footer="720" w:gutter="0"/>
+      <w:pgMar w:top="1037" w:right="1152" w:bottom="792" w:left="1152" w:header="720" w:footer="720" w:gutter="0"/>
       <w:cols w:space="720"/>
       <w:docGrid w:linePitch="360"/>
     </w:sectPr>

</xml_diff>

<commit_message>
feat(test-framework): schedule catalog selections
</commit_message>
<xml_diff>
--- a/docs/ATEP_Volume_VIII_Test_Framework_Engineering_Workbook.docx
+++ b/docs/ATEP_Volume_VIII_Test_Framework_Engineering_Workbook.docx
@@ -19,12 +19,12 @@
         <w:rPr>
           <w:b/>
         </w:rPr>
-        <w:t>Version 0.2.0   VIII 2 Execution Binding Implemented</w:t>
+        <w:t>Version 0.3.0   VIII 3 Scheduler and Selection Implemented</w:t>
       </w:r>
     </w:p>
     <w:p>
       <w:r>
-        <w:t>This workbook records the catalog and execution-binding baseline for ATEP. Reusable definitions describe test intent, suites preserve reviewed composition, and catalog-backed runs now persist deterministic case results and aggregate outcomes.</w:t>
+        <w:t>This workbook records the catalog, execution-binding, and scheduled-selection baseline for ATEP. Reusable definitions describe test intent, suites preserve reviewed composition, and catalog-backed runs now persist deterministic case results and aggregate outcomes.</w:t>
       </w:r>
     </w:p>
     <w:tbl>
@@ -125,7 +125,7 @@
           </w:tcPr>
           <w:p>
             <w:r>
-              <w:t>VIII-1 and VIII-2 implemented and verified</w:t>
+              <w:t>VIII-1, VIII-2, and VIII-3 implemented and verified</w:t>
             </w:r>
           </w:p>
         </w:tc>
@@ -289,7 +289,7 @@
           </w:tcPr>
           <w:p>
             <w:r>
-              <w:t>VIII-3 scheduler and smoke, sanity, regression selection</w:t>
+              <w:t>VIII-4 performance and stress profiles, thresholds, and trends</w:t>
             </w:r>
           </w:p>
         </w:tc>
@@ -306,7 +306,7 @@
     </w:p>
     <w:p>
       <w:r>
-        <w:t>VIII-1 separates reusable test design from test execution. A definition captures one test's preconditions, actions, inputs, expectations, classification, and resource budget. A suite selects active definitions in an explicit order and freezes their versions. VIII-2 binds that snapshot to a run and records each case outcome.</w:t>
+        <w:t>VIII-1 separates reusable test design from test execution. A definition captures one test's preconditions, actions, inputs, expectations, classification, and resource budget. A suite selects active definitions in an explicit order and freezes their versions. VIII-2 binds that snapshot to a run and records each case outcome. VIII-3 schedules that immutable intent for later smoke, sanity, or regression execution.</w:t>
       </w:r>
     </w:p>
     <w:p>
@@ -330,7 +330,7 @@
         <w:pStyle w:val="ListBullet"/>
       </w:pPr>
       <w:r>
-        <w:t>Scheduling, campaigns, mutation testing, and coverage remain later increments.</w:t>
+        <w:t>Performance, stress, campaigns, mutation testing, and coverage remain later increments.</w:t>
       </w:r>
     </w:p>
     <w:p>
@@ -568,7 +568,7 @@
           </w:tcPr>
           <w:p>
             <w:r>
-              <w:t>Linear migrations 0051 and 0052 with reversible schema changes</w:t>
+              <w:t>Linear migrations 0051 through 0053 with reversible schema changes</w:t>
             </w:r>
           </w:p>
         </w:tc>
@@ -2661,7 +2661,411 @@
         <w:pStyle w:val="Heading1"/>
       </w:pPr>
       <w:r>
-        <w:t>9 Events and Audit</w:t>
+        <w:t>9 Scheduler and Selection</w:t>
+      </w:r>
+    </w:p>
+    <w:p>
+      <w:r>
+        <w:t>A catalog-backed job requires a suite identifier and matching smoke, sanity, or regression policy. Scheduling freezes suite identity, version, type, tags, and ordered composition. Dispatch later creates the run and pending cases from that stored snapshot without re-reading mutable catalog data. Legacy jobs remain supported.</w:t>
+      </w:r>
+    </w:p>
+    <w:tbl>
+      <w:tblPr>
+        <w:tblW w:type="auto" w:w="0"/>
+        <w:tblLayout w:type="fixed"/>
+        <w:tblLook w:firstColumn="1" w:firstRow="1" w:lastColumn="0" w:lastRow="0" w:noHBand="0" w:noVBand="1" w:val="04A0"/>
+      </w:tblPr>
+      <w:tblGrid>
+        <w:gridCol w:w="3312"/>
+        <w:gridCol w:w="3312"/>
+        <w:gridCol w:w="3312"/>
+      </w:tblGrid>
+      <w:tr>
+        <w:trPr>
+          <w:tblHeader/>
+        </w:trPr>
+        <w:tc>
+          <w:tcPr>
+            <w:tcW w:type="dxa" w:w="2232"/>
+            <w:shd w:fill="17365D"/>
+            <w:tcBorders>
+              <w:top w:val="single" w:sz="4" w:color="D9D9D9"/>
+              <w:left w:val="single" w:sz="4" w:color="D9D9D9"/>
+              <w:bottom w:val="single" w:sz="4" w:color="D9D9D9"/>
+              <w:right w:val="single" w:sz="4" w:color="D9D9D9"/>
+              <w:insideH w:val="single" w:sz="4" w:color="D9D9D9"/>
+              <w:insideV w:val="single" w:sz="4" w:color="D9D9D9"/>
+            </w:tcBorders>
+            <w:vAlign w:val="center"/>
+          </w:tcPr>
+          <w:p>
+            <w:r>
+              <w:rPr>
+                <w:b/>
+                <w:color w:val="FFFFFF"/>
+              </w:rPr>
+              <w:t>Selection rule</w:t>
+            </w:r>
+          </w:p>
+        </w:tc>
+        <w:tc>
+          <w:tcPr>
+            <w:tcW w:type="dxa" w:w="3240"/>
+            <w:shd w:fill="17365D"/>
+            <w:tcBorders>
+              <w:top w:val="single" w:sz="4" w:color="D9D9D9"/>
+              <w:left w:val="single" w:sz="4" w:color="D9D9D9"/>
+              <w:bottom w:val="single" w:sz="4" w:color="D9D9D9"/>
+              <w:right w:val="single" w:sz="4" w:color="D9D9D9"/>
+              <w:insideH w:val="single" w:sz="4" w:color="D9D9D9"/>
+              <w:insideV w:val="single" w:sz="4" w:color="D9D9D9"/>
+            </w:tcBorders>
+            <w:vAlign w:val="center"/>
+          </w:tcPr>
+          <w:p>
+            <w:r>
+              <w:rPr>
+                <w:b/>
+                <w:color w:val="FFFFFF"/>
+              </w:rPr>
+              <w:t>Accepted value</w:t>
+            </w:r>
+          </w:p>
+        </w:tc>
+        <w:tc>
+          <w:tcPr>
+            <w:tcW w:type="dxa" w:w="4464"/>
+            <w:shd w:fill="17365D"/>
+            <w:tcBorders>
+              <w:top w:val="single" w:sz="4" w:color="D9D9D9"/>
+              <w:left w:val="single" w:sz="4" w:color="D9D9D9"/>
+              <w:bottom w:val="single" w:sz="4" w:color="D9D9D9"/>
+              <w:right w:val="single" w:sz="4" w:color="D9D9D9"/>
+              <w:insideH w:val="single" w:sz="4" w:color="D9D9D9"/>
+              <w:insideV w:val="single" w:sz="4" w:color="D9D9D9"/>
+            </w:tcBorders>
+            <w:vAlign w:val="center"/>
+          </w:tcPr>
+          <w:p>
+            <w:r>
+              <w:rPr>
+                <w:b/>
+                <w:color w:val="FFFFFF"/>
+              </w:rPr>
+              <w:t>Engineering purpose</w:t>
+            </w:r>
+          </w:p>
+        </w:tc>
+      </w:tr>
+      <w:tr>
+        <w:tc>
+          <w:tcPr>
+            <w:tcW w:type="dxa" w:w="2232"/>
+            <w:tcBorders>
+              <w:top w:val="single" w:sz="4" w:color="D9D9D9"/>
+              <w:left w:val="single" w:sz="4" w:color="D9D9D9"/>
+              <w:bottom w:val="single" w:sz="4" w:color="D9D9D9"/>
+              <w:right w:val="single" w:sz="4" w:color="D9D9D9"/>
+              <w:insideH w:val="single" w:sz="4" w:color="D9D9D9"/>
+              <w:insideV w:val="single" w:sz="4" w:color="D9D9D9"/>
+            </w:tcBorders>
+            <w:vAlign w:val="center"/>
+          </w:tcPr>
+          <w:p>
+            <w:r>
+              <w:t>Policy</w:t>
+            </w:r>
+          </w:p>
+        </w:tc>
+        <w:tc>
+          <w:tcPr>
+            <w:tcW w:type="dxa" w:w="3240"/>
+            <w:tcBorders>
+              <w:top w:val="single" w:sz="4" w:color="D9D9D9"/>
+              <w:left w:val="single" w:sz="4" w:color="D9D9D9"/>
+              <w:bottom w:val="single" w:sz="4" w:color="D9D9D9"/>
+              <w:right w:val="single" w:sz="4" w:color="D9D9D9"/>
+              <w:insideH w:val="single" w:sz="4" w:color="D9D9D9"/>
+              <w:insideV w:val="single" w:sz="4" w:color="D9D9D9"/>
+            </w:tcBorders>
+            <w:vAlign w:val="center"/>
+          </w:tcPr>
+          <w:p>
+            <w:r>
+              <w:t>Smoke, sanity, regression</w:t>
+            </w:r>
+          </w:p>
+        </w:tc>
+        <w:tc>
+          <w:tcPr>
+            <w:tcW w:type="dxa" w:w="4464"/>
+            <w:tcBorders>
+              <w:top w:val="single" w:sz="4" w:color="D9D9D9"/>
+              <w:left w:val="single" w:sz="4" w:color="D9D9D9"/>
+              <w:bottom w:val="single" w:sz="4" w:color="D9D9D9"/>
+              <w:right w:val="single" w:sz="4" w:color="D9D9D9"/>
+              <w:insideH w:val="single" w:sz="4" w:color="D9D9D9"/>
+              <w:insideV w:val="single" w:sz="4" w:color="D9D9D9"/>
+            </w:tcBorders>
+            <w:vAlign w:val="center"/>
+          </w:tcPr>
+          <w:p>
+            <w:r>
+              <w:t>Keep VIII-3 scope explicit</w:t>
+            </w:r>
+          </w:p>
+        </w:tc>
+      </w:tr>
+      <w:tr>
+        <w:tc>
+          <w:tcPr>
+            <w:tcW w:type="dxa" w:w="2232"/>
+            <w:tcBorders>
+              <w:top w:val="single" w:sz="4" w:color="D9D9D9"/>
+              <w:left w:val="single" w:sz="4" w:color="D9D9D9"/>
+              <w:bottom w:val="single" w:sz="4" w:color="D9D9D9"/>
+              <w:right w:val="single" w:sz="4" w:color="D9D9D9"/>
+              <w:insideH w:val="single" w:sz="4" w:color="D9D9D9"/>
+              <w:insideV w:val="single" w:sz="4" w:color="D9D9D9"/>
+            </w:tcBorders>
+            <w:shd w:fill="EAF0F7"/>
+            <w:vAlign w:val="center"/>
+          </w:tcPr>
+          <w:p>
+            <w:r>
+              <w:t>Type match</w:t>
+            </w:r>
+          </w:p>
+        </w:tc>
+        <w:tc>
+          <w:tcPr>
+            <w:tcW w:type="dxa" w:w="3240"/>
+            <w:tcBorders>
+              <w:top w:val="single" w:sz="4" w:color="D9D9D9"/>
+              <w:left w:val="single" w:sz="4" w:color="D9D9D9"/>
+              <w:bottom w:val="single" w:sz="4" w:color="D9D9D9"/>
+              <w:right w:val="single" w:sz="4" w:color="D9D9D9"/>
+              <w:insideH w:val="single" w:sz="4" w:color="D9D9D9"/>
+              <w:insideV w:val="single" w:sz="4" w:color="D9D9D9"/>
+            </w:tcBorders>
+            <w:shd w:fill="EAF0F7"/>
+            <w:vAlign w:val="center"/>
+          </w:tcPr>
+          <w:p>
+            <w:r>
+              <w:t>Run, policy, and suite agree</w:t>
+            </w:r>
+          </w:p>
+        </w:tc>
+        <w:tc>
+          <w:tcPr>
+            <w:tcW w:type="dxa" w:w="4464"/>
+            <w:tcBorders>
+              <w:top w:val="single" w:sz="4" w:color="D9D9D9"/>
+              <w:left w:val="single" w:sz="4" w:color="D9D9D9"/>
+              <w:bottom w:val="single" w:sz="4" w:color="D9D9D9"/>
+              <w:right w:val="single" w:sz="4" w:color="D9D9D9"/>
+              <w:insideH w:val="single" w:sz="4" w:color="D9D9D9"/>
+              <w:insideV w:val="single" w:sz="4" w:color="D9D9D9"/>
+            </w:tcBorders>
+            <w:shd w:fill="EAF0F7"/>
+            <w:vAlign w:val="center"/>
+          </w:tcPr>
+          <w:p>
+            <w:r>
+              <w:t>Prevent misleading execution intent</w:t>
+            </w:r>
+          </w:p>
+        </w:tc>
+      </w:tr>
+      <w:tr>
+        <w:tc>
+          <w:tcPr>
+            <w:tcW w:type="dxa" w:w="2232"/>
+            <w:tcBorders>
+              <w:top w:val="single" w:sz="4" w:color="D9D9D9"/>
+              <w:left w:val="single" w:sz="4" w:color="D9D9D9"/>
+              <w:bottom w:val="single" w:sz="4" w:color="D9D9D9"/>
+              <w:right w:val="single" w:sz="4" w:color="D9D9D9"/>
+              <w:insideH w:val="single" w:sz="4" w:color="D9D9D9"/>
+              <w:insideV w:val="single" w:sz="4" w:color="D9D9D9"/>
+            </w:tcBorders>
+            <w:vAlign w:val="center"/>
+          </w:tcPr>
+          <w:p>
+            <w:r>
+              <w:t>Lifecycle</w:t>
+            </w:r>
+          </w:p>
+        </w:tc>
+        <w:tc>
+          <w:tcPr>
+            <w:tcW w:type="dxa" w:w="3240"/>
+            <w:tcBorders>
+              <w:top w:val="single" w:sz="4" w:color="D9D9D9"/>
+              <w:left w:val="single" w:sz="4" w:color="D9D9D9"/>
+              <w:bottom w:val="single" w:sz="4" w:color="D9D9D9"/>
+              <w:right w:val="single" w:sz="4" w:color="D9D9D9"/>
+              <w:insideH w:val="single" w:sz="4" w:color="D9D9D9"/>
+              <w:insideV w:val="single" w:sz="4" w:color="D9D9D9"/>
+            </w:tcBorders>
+            <w:vAlign w:val="center"/>
+          </w:tcPr>
+          <w:p>
+            <w:r>
+              <w:t>Active suite at scheduling</w:t>
+            </w:r>
+          </w:p>
+        </w:tc>
+        <w:tc>
+          <w:tcPr>
+            <w:tcW w:type="dxa" w:w="4464"/>
+            <w:tcBorders>
+              <w:top w:val="single" w:sz="4" w:color="D9D9D9"/>
+              <w:left w:val="single" w:sz="4" w:color="D9D9D9"/>
+              <w:bottom w:val="single" w:sz="4" w:color="D9D9D9"/>
+              <w:right w:val="single" w:sz="4" w:color="D9D9D9"/>
+              <w:insideH w:val="single" w:sz="4" w:color="D9D9D9"/>
+              <w:insideV w:val="single" w:sz="4" w:color="D9D9D9"/>
+            </w:tcBorders>
+            <w:vAlign w:val="center"/>
+          </w:tcPr>
+          <w:p>
+            <w:r>
+              <w:t>Select reviewed content</w:t>
+            </w:r>
+          </w:p>
+        </w:tc>
+      </w:tr>
+      <w:tr>
+        <w:tc>
+          <w:tcPr>
+            <w:tcW w:type="dxa" w:w="2232"/>
+            <w:tcBorders>
+              <w:top w:val="single" w:sz="4" w:color="D9D9D9"/>
+              <w:left w:val="single" w:sz="4" w:color="D9D9D9"/>
+              <w:bottom w:val="single" w:sz="4" w:color="D9D9D9"/>
+              <w:right w:val="single" w:sz="4" w:color="D9D9D9"/>
+              <w:insideH w:val="single" w:sz="4" w:color="D9D9D9"/>
+              <w:insideV w:val="single" w:sz="4" w:color="D9D9D9"/>
+            </w:tcBorders>
+            <w:shd w:fill="EAF0F7"/>
+            <w:vAlign w:val="center"/>
+          </w:tcPr>
+          <w:p>
+            <w:r>
+              <w:t>Snapshot</w:t>
+            </w:r>
+          </w:p>
+        </w:tc>
+        <w:tc>
+          <w:tcPr>
+            <w:tcW w:type="dxa" w:w="3240"/>
+            <w:tcBorders>
+              <w:top w:val="single" w:sz="4" w:color="D9D9D9"/>
+              <w:left w:val="single" w:sz="4" w:color="D9D9D9"/>
+              <w:bottom w:val="single" w:sz="4" w:color="D9D9D9"/>
+              <w:right w:val="single" w:sz="4" w:color="D9D9D9"/>
+              <w:insideH w:val="single" w:sz="4" w:color="D9D9D9"/>
+              <w:insideV w:val="single" w:sz="4" w:color="D9D9D9"/>
+            </w:tcBorders>
+            <w:shd w:fill="EAF0F7"/>
+            <w:vAlign w:val="center"/>
+          </w:tcPr>
+          <w:p>
+            <w:r>
+              <w:t>Versioned ordered cases</w:t>
+            </w:r>
+          </w:p>
+        </w:tc>
+        <w:tc>
+          <w:tcPr>
+            <w:tcW w:type="dxa" w:w="4464"/>
+            <w:tcBorders>
+              <w:top w:val="single" w:sz="4" w:color="D9D9D9"/>
+              <w:left w:val="single" w:sz="4" w:color="D9D9D9"/>
+              <w:bottom w:val="single" w:sz="4" w:color="D9D9D9"/>
+              <w:right w:val="single" w:sz="4" w:color="D9D9D9"/>
+              <w:insideH w:val="single" w:sz="4" w:color="D9D9D9"/>
+              <w:insideV w:val="single" w:sz="4" w:color="D9D9D9"/>
+            </w:tcBorders>
+            <w:shd w:fill="EAF0F7"/>
+            <w:vAlign w:val="center"/>
+          </w:tcPr>
+          <w:p>
+            <w:r>
+              <w:t>Make delayed execution reproducible</w:t>
+            </w:r>
+          </w:p>
+        </w:tc>
+      </w:tr>
+      <w:tr>
+        <w:tc>
+          <w:tcPr>
+            <w:tcW w:type="dxa" w:w="2232"/>
+            <w:tcBorders>
+              <w:top w:val="single" w:sz="4" w:color="D9D9D9"/>
+              <w:left w:val="single" w:sz="4" w:color="D9D9D9"/>
+              <w:bottom w:val="single" w:sz="4" w:color="D9D9D9"/>
+              <w:right w:val="single" w:sz="4" w:color="D9D9D9"/>
+              <w:insideH w:val="single" w:sz="4" w:color="D9D9D9"/>
+              <w:insideV w:val="single" w:sz="4" w:color="D9D9D9"/>
+            </w:tcBorders>
+            <w:vAlign w:val="center"/>
+          </w:tcPr>
+          <w:p>
+            <w:r>
+              <w:t>Dispatch</w:t>
+            </w:r>
+          </w:p>
+        </w:tc>
+        <w:tc>
+          <w:tcPr>
+            <w:tcW w:type="dxa" w:w="3240"/>
+            <w:tcBorders>
+              <w:top w:val="single" w:sz="4" w:color="D9D9D9"/>
+              <w:left w:val="single" w:sz="4" w:color="D9D9D9"/>
+              <w:bottom w:val="single" w:sz="4" w:color="D9D9D9"/>
+              <w:right w:val="single" w:sz="4" w:color="D9D9D9"/>
+              <w:insideH w:val="single" w:sz="4" w:color="D9D9D9"/>
+              <w:insideV w:val="single" w:sz="4" w:color="D9D9D9"/>
+            </w:tcBorders>
+            <w:vAlign w:val="center"/>
+          </w:tcPr>
+          <w:p>
+            <w:r>
+              <w:t>Stored snapshot only</w:t>
+            </w:r>
+          </w:p>
+        </w:tc>
+        <w:tc>
+          <w:tcPr>
+            <w:tcW w:type="dxa" w:w="4464"/>
+            <w:tcBorders>
+              <w:top w:val="single" w:sz="4" w:color="D9D9D9"/>
+              <w:left w:val="single" w:sz="4" w:color="D9D9D9"/>
+              <w:bottom w:val="single" w:sz="4" w:color="D9D9D9"/>
+              <w:right w:val="single" w:sz="4" w:color="D9D9D9"/>
+              <w:insideH w:val="single" w:sz="4" w:color="D9D9D9"/>
+              <w:insideV w:val="single" w:sz="4" w:color="D9D9D9"/>
+            </w:tcBorders>
+            <w:vAlign w:val="center"/>
+          </w:tcPr>
+          <w:p>
+            <w:r>
+              <w:t>Survive later catalog archival</w:t>
+            </w:r>
+          </w:p>
+        </w:tc>
+      </w:tr>
+    </w:tbl>
+    <w:p/>
+    <w:p>
+      <w:pPr>
+        <w:pStyle w:val="Heading1"/>
+      </w:pPr>
+      <w:r>
+        <w:t>10 Events and Audit</w:t>
       </w:r>
     </w:p>
     <w:tbl>
@@ -3053,6 +3457,127 @@
           </w:p>
         </w:tc>
       </w:tr>
+      <w:tr>
+        <w:tc>
+          <w:tcPr>
+            <w:tcW w:type="dxa" w:w="2376"/>
+            <w:tcBorders>
+              <w:top w:val="single" w:sz="4" w:color="D9D9D9"/>
+              <w:left w:val="single" w:sz="4" w:color="D9D9D9"/>
+              <w:bottom w:val="single" w:sz="4" w:color="D9D9D9"/>
+              <w:right w:val="single" w:sz="4" w:color="D9D9D9"/>
+              <w:insideH w:val="single" w:sz="4" w:color="D9D9D9"/>
+              <w:insideV w:val="single" w:sz="4" w:color="D9D9D9"/>
+            </w:tcBorders>
+            <w:shd w:fill="EAF0F7"/>
+            <w:vAlign w:val="center"/>
+          </w:tcPr>
+          <w:p>
+            <w:r>
+              <w:t>Schedule selection</w:t>
+            </w:r>
+          </w:p>
+        </w:tc>
+        <w:tc>
+          <w:tcPr>
+            <w:tcW w:type="dxa" w:w="4536"/>
+            <w:tcBorders>
+              <w:top w:val="single" w:sz="4" w:color="D9D9D9"/>
+              <w:left w:val="single" w:sz="4" w:color="D9D9D9"/>
+              <w:bottom w:val="single" w:sz="4" w:color="D9D9D9"/>
+              <w:right w:val="single" w:sz="4" w:color="D9D9D9"/>
+              <w:insideH w:val="single" w:sz="4" w:color="D9D9D9"/>
+              <w:insideV w:val="single" w:sz="4" w:color="D9D9D9"/>
+            </w:tcBorders>
+            <w:shd w:fill="EAF0F7"/>
+            <w:vAlign w:val="center"/>
+          </w:tcPr>
+          <w:p>
+            <w:r>
+              <w:t>atep.test_job.scheduled.v1</w:t>
+            </w:r>
+          </w:p>
+        </w:tc>
+        <w:tc>
+          <w:tcPr>
+            <w:tcW w:type="dxa" w:w="3024"/>
+            <w:tcBorders>
+              <w:top w:val="single" w:sz="4" w:color="D9D9D9"/>
+              <w:left w:val="single" w:sz="4" w:color="D9D9D9"/>
+              <w:bottom w:val="single" w:sz="4" w:color="D9D9D9"/>
+              <w:right w:val="single" w:sz="4" w:color="D9D9D9"/>
+              <w:insideH w:val="single" w:sz="4" w:color="D9D9D9"/>
+              <w:insideV w:val="single" w:sz="4" w:color="D9D9D9"/>
+            </w:tcBorders>
+            <w:shd w:fill="EAF0F7"/>
+            <w:vAlign w:val="center"/>
+          </w:tcPr>
+          <w:p>
+            <w:r>
+              <w:t>test_job.scheduled</w:t>
+            </w:r>
+          </w:p>
+        </w:tc>
+      </w:tr>
+      <w:tr>
+        <w:tc>
+          <w:tcPr>
+            <w:tcW w:type="dxa" w:w="2376"/>
+            <w:tcBorders>
+              <w:top w:val="single" w:sz="4" w:color="D9D9D9"/>
+              <w:left w:val="single" w:sz="4" w:color="D9D9D9"/>
+              <w:bottom w:val="single" w:sz="4" w:color="D9D9D9"/>
+              <w:right w:val="single" w:sz="4" w:color="D9D9D9"/>
+              <w:insideH w:val="single" w:sz="4" w:color="D9D9D9"/>
+              <w:insideV w:val="single" w:sz="4" w:color="D9D9D9"/>
+            </w:tcBorders>
+            <w:vAlign w:val="center"/>
+          </w:tcPr>
+          <w:p>
+            <w:r>
+              <w:t>Dispatch selection</w:t>
+            </w:r>
+          </w:p>
+        </w:tc>
+        <w:tc>
+          <w:tcPr>
+            <w:tcW w:type="dxa" w:w="4536"/>
+            <w:tcBorders>
+              <w:top w:val="single" w:sz="4" w:color="D9D9D9"/>
+              <w:left w:val="single" w:sz="4" w:color="D9D9D9"/>
+              <w:bottom w:val="single" w:sz="4" w:color="D9D9D9"/>
+              <w:right w:val="single" w:sz="4" w:color="D9D9D9"/>
+              <w:insideH w:val="single" w:sz="4" w:color="D9D9D9"/>
+              <w:insideV w:val="single" w:sz="4" w:color="D9D9D9"/>
+            </w:tcBorders>
+            <w:vAlign w:val="center"/>
+          </w:tcPr>
+          <w:p>
+            <w:r>
+              <w:t>atep.test_job.dispatched.v1</w:t>
+            </w:r>
+          </w:p>
+        </w:tc>
+        <w:tc>
+          <w:tcPr>
+            <w:tcW w:type="dxa" w:w="3024"/>
+            <w:tcBorders>
+              <w:top w:val="single" w:sz="4" w:color="D9D9D9"/>
+              <w:left w:val="single" w:sz="4" w:color="D9D9D9"/>
+              <w:bottom w:val="single" w:sz="4" w:color="D9D9D9"/>
+              <w:right w:val="single" w:sz="4" w:color="D9D9D9"/>
+              <w:insideH w:val="single" w:sz="4" w:color="D9D9D9"/>
+              <w:insideV w:val="single" w:sz="4" w:color="D9D9D9"/>
+            </w:tcBorders>
+            <w:vAlign w:val="center"/>
+          </w:tcPr>
+          <w:p>
+            <w:r>
+              <w:t>test_job.dispatched</w:t>
+            </w:r>
+          </w:p>
+        </w:tc>
+      </w:tr>
     </w:tbl>
     <w:p/>
     <w:p>
@@ -3061,11 +3586,16 @@
       </w:r>
     </w:p>
     <w:p>
+      <w:r>
+        <w:br w:type="page"/>
+      </w:r>
+    </w:p>
+    <w:p>
       <w:pPr>
         <w:pStyle w:val="Heading1"/>
       </w:pPr>
       <w:r>
-        <w:t>10 Engineering Decisions</w:t>
+        <w:t>11 Engineering Decisions</w:t>
       </w:r>
     </w:p>
     <w:tbl>
@@ -3519,6 +4049,65 @@
           </w:p>
         </w:tc>
       </w:tr>
+      <w:tr>
+        <w:tc>
+          <w:tcPr>
+            <w:tcW w:type="dxa" w:w="2376"/>
+            <w:tcBorders>
+              <w:top w:val="single" w:sz="4" w:color="D9D9D9"/>
+              <w:left w:val="single" w:sz="4" w:color="D9D9D9"/>
+              <w:bottom w:val="single" w:sz="4" w:color="D9D9D9"/>
+              <w:right w:val="single" w:sz="4" w:color="D9D9D9"/>
+              <w:insideH w:val="single" w:sz="4" w:color="D9D9D9"/>
+              <w:insideV w:val="single" w:sz="4" w:color="D9D9D9"/>
+            </w:tcBorders>
+            <w:vAlign w:val="center"/>
+          </w:tcPr>
+          <w:p>
+            <w:r>
+              <w:t>Snapshot when scheduled</w:t>
+            </w:r>
+          </w:p>
+        </w:tc>
+        <w:tc>
+          <w:tcPr>
+            <w:tcW w:type="dxa" w:w="3960"/>
+            <w:tcBorders>
+              <w:top w:val="single" w:sz="4" w:color="D9D9D9"/>
+              <w:left w:val="single" w:sz="4" w:color="D9D9D9"/>
+              <w:bottom w:val="single" w:sz="4" w:color="D9D9D9"/>
+              <w:right w:val="single" w:sz="4" w:color="D9D9D9"/>
+              <w:insideH w:val="single" w:sz="4" w:color="D9D9D9"/>
+              <w:insideV w:val="single" w:sz="4" w:color="D9D9D9"/>
+            </w:tcBorders>
+            <w:vAlign w:val="center"/>
+          </w:tcPr>
+          <w:p>
+            <w:r>
+              <w:t>Protect delayed execution intent</w:t>
+            </w:r>
+          </w:p>
+        </w:tc>
+        <w:tc>
+          <w:tcPr>
+            <w:tcW w:type="dxa" w:w="3600"/>
+            <w:tcBorders>
+              <w:top w:val="single" w:sz="4" w:color="D9D9D9"/>
+              <w:left w:val="single" w:sz="4" w:color="D9D9D9"/>
+              <w:bottom w:val="single" w:sz="4" w:color="D9D9D9"/>
+              <w:right w:val="single" w:sz="4" w:color="D9D9D9"/>
+              <w:insideH w:val="single" w:sz="4" w:color="D9D9D9"/>
+              <w:insideV w:val="single" w:sz="4" w:color="D9D9D9"/>
+            </w:tcBorders>
+            <w:vAlign w:val="center"/>
+          </w:tcPr>
+          <w:p>
+            <w:r>
+              <w:t>Dispatch ignores later catalog drift</w:t>
+            </w:r>
+          </w:p>
+        </w:tc>
+      </w:tr>
     </w:tbl>
     <w:p/>
     <w:p>
@@ -3531,7 +4120,7 @@
         <w:pStyle w:val="Heading1"/>
       </w:pPr>
       <w:r>
-        <w:t>11 Verification Catalogue</w:t>
+        <w:t>12 Verification Catalogue</w:t>
       </w:r>
     </w:p>
     <w:tbl>
@@ -4044,6 +4633,68 @@
           </w:p>
         </w:tc>
       </w:tr>
+      <w:tr>
+        <w:tc>
+          <w:tcPr>
+            <w:tcW w:type="dxa" w:w="2232"/>
+            <w:tcBorders>
+              <w:top w:val="single" w:sz="4" w:color="D9D9D9"/>
+              <w:left w:val="single" w:sz="4" w:color="D9D9D9"/>
+              <w:bottom w:val="single" w:sz="4" w:color="D9D9D9"/>
+              <w:right w:val="single" w:sz="4" w:color="D9D9D9"/>
+              <w:insideH w:val="single" w:sz="4" w:color="D9D9D9"/>
+              <w:insideV w:val="single" w:sz="4" w:color="D9D9D9"/>
+            </w:tcBorders>
+            <w:shd w:fill="EAF0F7"/>
+            <w:vAlign w:val="center"/>
+          </w:tcPr>
+          <w:p>
+            <w:r>
+              <w:t>TF-T-027 to 034</w:t>
+            </w:r>
+          </w:p>
+        </w:tc>
+        <w:tc>
+          <w:tcPr>
+            <w:tcW w:type="dxa" w:w="3528"/>
+            <w:tcBorders>
+              <w:top w:val="single" w:sz="4" w:color="D9D9D9"/>
+              <w:left w:val="single" w:sz="4" w:color="D9D9D9"/>
+              <w:bottom w:val="single" w:sz="4" w:color="D9D9D9"/>
+              <w:right w:val="single" w:sz="4" w:color="D9D9D9"/>
+              <w:insideH w:val="single" w:sz="4" w:color="D9D9D9"/>
+              <w:insideV w:val="single" w:sz="4" w:color="D9D9D9"/>
+            </w:tcBorders>
+            <w:shd w:fill="EAF0F7"/>
+            <w:vAlign w:val="center"/>
+          </w:tcPr>
+          <w:p>
+            <w:r>
+              <w:t>Scheduled selection</w:t>
+            </w:r>
+          </w:p>
+        </w:tc>
+        <w:tc>
+          <w:tcPr>
+            <w:tcW w:type="dxa" w:w="4176"/>
+            <w:tcBorders>
+              <w:top w:val="single" w:sz="4" w:color="D9D9D9"/>
+              <w:left w:val="single" w:sz="4" w:color="D9D9D9"/>
+              <w:bottom w:val="single" w:sz="4" w:color="D9D9D9"/>
+              <w:right w:val="single" w:sz="4" w:color="D9D9D9"/>
+              <w:insideH w:val="single" w:sz="4" w:color="D9D9D9"/>
+              <w:insideV w:val="single" w:sz="4" w:color="D9D9D9"/>
+            </w:tcBorders>
+            <w:shd w:fill="EAF0F7"/>
+            <w:vAlign w:val="center"/>
+          </w:tcPr>
+          <w:p>
+            <w:r>
+              <w:t>Validate policies, snapshots, dispatch, and migration</w:t>
+            </w:r>
+          </w:p>
+        </w:tc>
+      </w:tr>
     </w:tbl>
     <w:p/>
     <w:p>
@@ -4056,7 +4707,7 @@
         <w:pStyle w:val="Heading1"/>
       </w:pPr>
       <w:r>
-        <w:t>12 Risks and Controls</w:t>
+        <w:t>13 Risks and Controls</w:t>
       </w:r>
     </w:p>
     <w:tbl>
@@ -4448,6 +5099,68 @@
           </w:p>
         </w:tc>
       </w:tr>
+      <w:tr>
+        <w:tc>
+          <w:tcPr>
+            <w:tcW w:type="dxa" w:w="2160"/>
+            <w:tcBorders>
+              <w:top w:val="single" w:sz="4" w:color="D9D9D9"/>
+              <w:left w:val="single" w:sz="4" w:color="D9D9D9"/>
+              <w:bottom w:val="single" w:sz="4" w:color="D9D9D9"/>
+              <w:right w:val="single" w:sz="4" w:color="D9D9D9"/>
+              <w:insideH w:val="single" w:sz="4" w:color="D9D9D9"/>
+              <w:insideV w:val="single" w:sz="4" w:color="D9D9D9"/>
+            </w:tcBorders>
+            <w:shd w:fill="EAF0F7"/>
+            <w:vAlign w:val="center"/>
+          </w:tcPr>
+          <w:p>
+            <w:r>
+              <w:t>Catalog changes while waiting</w:t>
+            </w:r>
+          </w:p>
+        </w:tc>
+        <w:tc>
+          <w:tcPr>
+            <w:tcW w:type="dxa" w:w="3672"/>
+            <w:tcBorders>
+              <w:top w:val="single" w:sz="4" w:color="D9D9D9"/>
+              <w:left w:val="single" w:sz="4" w:color="D9D9D9"/>
+              <w:bottom w:val="single" w:sz="4" w:color="D9D9D9"/>
+              <w:right w:val="single" w:sz="4" w:color="D9D9D9"/>
+              <w:insideH w:val="single" w:sz="4" w:color="D9D9D9"/>
+              <w:insideV w:val="single" w:sz="4" w:color="D9D9D9"/>
+            </w:tcBorders>
+            <w:shd w:fill="EAF0F7"/>
+            <w:vAlign w:val="center"/>
+          </w:tcPr>
+          <w:p>
+            <w:r>
+              <w:t>Immutable job selection snapshot</w:t>
+            </w:r>
+          </w:p>
+        </w:tc>
+        <w:tc>
+          <w:tcPr>
+            <w:tcW w:type="dxa" w:w="4104"/>
+            <w:tcBorders>
+              <w:top w:val="single" w:sz="4" w:color="D9D9D9"/>
+              <w:left w:val="single" w:sz="4" w:color="D9D9D9"/>
+              <w:bottom w:val="single" w:sz="4" w:color="D9D9D9"/>
+              <w:right w:val="single" w:sz="4" w:color="D9D9D9"/>
+              <w:insideH w:val="single" w:sz="4" w:color="D9D9D9"/>
+              <w:insideV w:val="single" w:sz="4" w:color="D9D9D9"/>
+            </w:tcBorders>
+            <w:shd w:fill="EAF0F7"/>
+            <w:vAlign w:val="center"/>
+          </w:tcPr>
+          <w:p>
+            <w:r>
+              <w:t>Dispatch only persisted cases</w:t>
+            </w:r>
+          </w:p>
+        </w:tc>
+      </w:tr>
     </w:tbl>
     <w:p/>
     <w:p>
@@ -4455,12 +5168,12 @@
         <w:pStyle w:val="Heading1"/>
       </w:pPr>
       <w:r>
-        <w:t>13 Study Exercises</w:t>
+        <w:t>14 Study Exercises</w:t>
       </w:r>
     </w:p>
     <w:p>
       <w:r>
-        <w:t>Create one ADAS definition and identify its invariants. Then run two required cases, explain the aggregate result, and compare an exact retry after suite archival with a new run request for the archived suite.</w:t>
+        <w:t>Create one ADAS definition and identify its invariants. Then run two required cases, explain the aggregate result, and compare an exact retry after suite archival with a new run request for the archived suite. Schedule the same suite, archive it, and explain why the stored job can still dispatch reproducibly.</w:t>
       </w:r>
     </w:p>
     <w:p>
@@ -4468,12 +5181,12 @@
         <w:pStyle w:val="Heading1"/>
       </w:pPr>
       <w:r>
-        <w:t>14 Next Development</w:t>
+        <w:t>15 Next Development</w:t>
       </w:r>
     </w:p>
     <w:p>
       <w:r>
-        <w:t>VIII-3 will connect scheduled jobs to catalog suites for smoke, sanity, and regression selection while preserving the VIII-2 snapshot.</w:t>
+        <w:t>VIII-4 will add bounded performance and stress profiles, acceptance thresholds, resource budgets, and comparable trend evidence while preserving VIII-3 selection snapshots.</w:t>
       </w:r>
     </w:p>
     <w:sectPr>

</xml_diff>

<commit_message>
feat(test-framework): schedule catalog selections (#93)
</commit_message>
<xml_diff>
--- a/docs/ATEP_Volume_VIII_Test_Framework_Engineering_Workbook.docx
+++ b/docs/ATEP_Volume_VIII_Test_Framework_Engineering_Workbook.docx
@@ -19,12 +19,12 @@
         <w:rPr>
           <w:b/>
         </w:rPr>
-        <w:t>Version 0.2.0   VIII 2 Execution Binding Implemented</w:t>
+        <w:t>Version 0.3.0   VIII 3 Scheduler and Selection Implemented</w:t>
       </w:r>
     </w:p>
     <w:p>
       <w:r>
-        <w:t>This workbook records the catalog and execution-binding baseline for ATEP. Reusable definitions describe test intent, suites preserve reviewed composition, and catalog-backed runs now persist deterministic case results and aggregate outcomes.</w:t>
+        <w:t>This workbook records the catalog, execution-binding, and scheduled-selection baseline for ATEP. Reusable definitions describe test intent, suites preserve reviewed composition, and catalog-backed runs now persist deterministic case results and aggregate outcomes.</w:t>
       </w:r>
     </w:p>
     <w:tbl>
@@ -125,7 +125,7 @@
           </w:tcPr>
           <w:p>
             <w:r>
-              <w:t>VIII-1 and VIII-2 implemented and verified</w:t>
+              <w:t>VIII-1, VIII-2, and VIII-3 implemented and verified</w:t>
             </w:r>
           </w:p>
         </w:tc>
@@ -289,7 +289,7 @@
           </w:tcPr>
           <w:p>
             <w:r>
-              <w:t>VIII-3 scheduler and smoke, sanity, regression selection</w:t>
+              <w:t>VIII-4 performance and stress profiles, thresholds, and trends</w:t>
             </w:r>
           </w:p>
         </w:tc>
@@ -306,7 +306,7 @@
     </w:p>
     <w:p>
       <w:r>
-        <w:t>VIII-1 separates reusable test design from test execution. A definition captures one test's preconditions, actions, inputs, expectations, classification, and resource budget. A suite selects active definitions in an explicit order and freezes their versions. VIII-2 binds that snapshot to a run and records each case outcome.</w:t>
+        <w:t>VIII-1 separates reusable test design from test execution. A definition captures one test's preconditions, actions, inputs, expectations, classification, and resource budget. A suite selects active definitions in an explicit order and freezes their versions. VIII-2 binds that snapshot to a run and records each case outcome. VIII-3 schedules that immutable intent for later smoke, sanity, or regression execution.</w:t>
       </w:r>
     </w:p>
     <w:p>
@@ -330,7 +330,7 @@
         <w:pStyle w:val="ListBullet"/>
       </w:pPr>
       <w:r>
-        <w:t>Scheduling, campaigns, mutation testing, and coverage remain later increments.</w:t>
+        <w:t>Performance, stress, campaigns, mutation testing, and coverage remain later increments.</w:t>
       </w:r>
     </w:p>
     <w:p>
@@ -568,7 +568,7 @@
           </w:tcPr>
           <w:p>
             <w:r>
-              <w:t>Linear migrations 0051 and 0052 with reversible schema changes</w:t>
+              <w:t>Linear migrations 0051 through 0053 with reversible schema changes</w:t>
             </w:r>
           </w:p>
         </w:tc>
@@ -2661,7 +2661,411 @@
         <w:pStyle w:val="Heading1"/>
       </w:pPr>
       <w:r>
-        <w:t>9 Events and Audit</w:t>
+        <w:t>9 Scheduler and Selection</w:t>
+      </w:r>
+    </w:p>
+    <w:p>
+      <w:r>
+        <w:t>A catalog-backed job requires a suite identifier and matching smoke, sanity, or regression policy. Scheduling freezes suite identity, version, type, tags, and ordered composition. Dispatch later creates the run and pending cases from that stored snapshot without re-reading mutable catalog data. Legacy jobs remain supported.</w:t>
+      </w:r>
+    </w:p>
+    <w:tbl>
+      <w:tblPr>
+        <w:tblW w:type="auto" w:w="0"/>
+        <w:tblLayout w:type="fixed"/>
+        <w:tblLook w:firstColumn="1" w:firstRow="1" w:lastColumn="0" w:lastRow="0" w:noHBand="0" w:noVBand="1" w:val="04A0"/>
+      </w:tblPr>
+      <w:tblGrid>
+        <w:gridCol w:w="3312"/>
+        <w:gridCol w:w="3312"/>
+        <w:gridCol w:w="3312"/>
+      </w:tblGrid>
+      <w:tr>
+        <w:trPr>
+          <w:tblHeader/>
+        </w:trPr>
+        <w:tc>
+          <w:tcPr>
+            <w:tcW w:type="dxa" w:w="2232"/>
+            <w:shd w:fill="17365D"/>
+            <w:tcBorders>
+              <w:top w:val="single" w:sz="4" w:color="D9D9D9"/>
+              <w:left w:val="single" w:sz="4" w:color="D9D9D9"/>
+              <w:bottom w:val="single" w:sz="4" w:color="D9D9D9"/>
+              <w:right w:val="single" w:sz="4" w:color="D9D9D9"/>
+              <w:insideH w:val="single" w:sz="4" w:color="D9D9D9"/>
+              <w:insideV w:val="single" w:sz="4" w:color="D9D9D9"/>
+            </w:tcBorders>
+            <w:vAlign w:val="center"/>
+          </w:tcPr>
+          <w:p>
+            <w:r>
+              <w:rPr>
+                <w:b/>
+                <w:color w:val="FFFFFF"/>
+              </w:rPr>
+              <w:t>Selection rule</w:t>
+            </w:r>
+          </w:p>
+        </w:tc>
+        <w:tc>
+          <w:tcPr>
+            <w:tcW w:type="dxa" w:w="3240"/>
+            <w:shd w:fill="17365D"/>
+            <w:tcBorders>
+              <w:top w:val="single" w:sz="4" w:color="D9D9D9"/>
+              <w:left w:val="single" w:sz="4" w:color="D9D9D9"/>
+              <w:bottom w:val="single" w:sz="4" w:color="D9D9D9"/>
+              <w:right w:val="single" w:sz="4" w:color="D9D9D9"/>
+              <w:insideH w:val="single" w:sz="4" w:color="D9D9D9"/>
+              <w:insideV w:val="single" w:sz="4" w:color="D9D9D9"/>
+            </w:tcBorders>
+            <w:vAlign w:val="center"/>
+          </w:tcPr>
+          <w:p>
+            <w:r>
+              <w:rPr>
+                <w:b/>
+                <w:color w:val="FFFFFF"/>
+              </w:rPr>
+              <w:t>Accepted value</w:t>
+            </w:r>
+          </w:p>
+        </w:tc>
+        <w:tc>
+          <w:tcPr>
+            <w:tcW w:type="dxa" w:w="4464"/>
+            <w:shd w:fill="17365D"/>
+            <w:tcBorders>
+              <w:top w:val="single" w:sz="4" w:color="D9D9D9"/>
+              <w:left w:val="single" w:sz="4" w:color="D9D9D9"/>
+              <w:bottom w:val="single" w:sz="4" w:color="D9D9D9"/>
+              <w:right w:val="single" w:sz="4" w:color="D9D9D9"/>
+              <w:insideH w:val="single" w:sz="4" w:color="D9D9D9"/>
+              <w:insideV w:val="single" w:sz="4" w:color="D9D9D9"/>
+            </w:tcBorders>
+            <w:vAlign w:val="center"/>
+          </w:tcPr>
+          <w:p>
+            <w:r>
+              <w:rPr>
+                <w:b/>
+                <w:color w:val="FFFFFF"/>
+              </w:rPr>
+              <w:t>Engineering purpose</w:t>
+            </w:r>
+          </w:p>
+        </w:tc>
+      </w:tr>
+      <w:tr>
+        <w:tc>
+          <w:tcPr>
+            <w:tcW w:type="dxa" w:w="2232"/>
+            <w:tcBorders>
+              <w:top w:val="single" w:sz="4" w:color="D9D9D9"/>
+              <w:left w:val="single" w:sz="4" w:color="D9D9D9"/>
+              <w:bottom w:val="single" w:sz="4" w:color="D9D9D9"/>
+              <w:right w:val="single" w:sz="4" w:color="D9D9D9"/>
+              <w:insideH w:val="single" w:sz="4" w:color="D9D9D9"/>
+              <w:insideV w:val="single" w:sz="4" w:color="D9D9D9"/>
+            </w:tcBorders>
+            <w:vAlign w:val="center"/>
+          </w:tcPr>
+          <w:p>
+            <w:r>
+              <w:t>Policy</w:t>
+            </w:r>
+          </w:p>
+        </w:tc>
+        <w:tc>
+          <w:tcPr>
+            <w:tcW w:type="dxa" w:w="3240"/>
+            <w:tcBorders>
+              <w:top w:val="single" w:sz="4" w:color="D9D9D9"/>
+              <w:left w:val="single" w:sz="4" w:color="D9D9D9"/>
+              <w:bottom w:val="single" w:sz="4" w:color="D9D9D9"/>
+              <w:right w:val="single" w:sz="4" w:color="D9D9D9"/>
+              <w:insideH w:val="single" w:sz="4" w:color="D9D9D9"/>
+              <w:insideV w:val="single" w:sz="4" w:color="D9D9D9"/>
+            </w:tcBorders>
+            <w:vAlign w:val="center"/>
+          </w:tcPr>
+          <w:p>
+            <w:r>
+              <w:t>Smoke, sanity, regression</w:t>
+            </w:r>
+          </w:p>
+        </w:tc>
+        <w:tc>
+          <w:tcPr>
+            <w:tcW w:type="dxa" w:w="4464"/>
+            <w:tcBorders>
+              <w:top w:val="single" w:sz="4" w:color="D9D9D9"/>
+              <w:left w:val="single" w:sz="4" w:color="D9D9D9"/>
+              <w:bottom w:val="single" w:sz="4" w:color="D9D9D9"/>
+              <w:right w:val="single" w:sz="4" w:color="D9D9D9"/>
+              <w:insideH w:val="single" w:sz="4" w:color="D9D9D9"/>
+              <w:insideV w:val="single" w:sz="4" w:color="D9D9D9"/>
+            </w:tcBorders>
+            <w:vAlign w:val="center"/>
+          </w:tcPr>
+          <w:p>
+            <w:r>
+              <w:t>Keep VIII-3 scope explicit</w:t>
+            </w:r>
+          </w:p>
+        </w:tc>
+      </w:tr>
+      <w:tr>
+        <w:tc>
+          <w:tcPr>
+            <w:tcW w:type="dxa" w:w="2232"/>
+            <w:tcBorders>
+              <w:top w:val="single" w:sz="4" w:color="D9D9D9"/>
+              <w:left w:val="single" w:sz="4" w:color="D9D9D9"/>
+              <w:bottom w:val="single" w:sz="4" w:color="D9D9D9"/>
+              <w:right w:val="single" w:sz="4" w:color="D9D9D9"/>
+              <w:insideH w:val="single" w:sz="4" w:color="D9D9D9"/>
+              <w:insideV w:val="single" w:sz="4" w:color="D9D9D9"/>
+            </w:tcBorders>
+            <w:shd w:fill="EAF0F7"/>
+            <w:vAlign w:val="center"/>
+          </w:tcPr>
+          <w:p>
+            <w:r>
+              <w:t>Type match</w:t>
+            </w:r>
+          </w:p>
+        </w:tc>
+        <w:tc>
+          <w:tcPr>
+            <w:tcW w:type="dxa" w:w="3240"/>
+            <w:tcBorders>
+              <w:top w:val="single" w:sz="4" w:color="D9D9D9"/>
+              <w:left w:val="single" w:sz="4" w:color="D9D9D9"/>
+              <w:bottom w:val="single" w:sz="4" w:color="D9D9D9"/>
+              <w:right w:val="single" w:sz="4" w:color="D9D9D9"/>
+              <w:insideH w:val="single" w:sz="4" w:color="D9D9D9"/>
+              <w:insideV w:val="single" w:sz="4" w:color="D9D9D9"/>
+            </w:tcBorders>
+            <w:shd w:fill="EAF0F7"/>
+            <w:vAlign w:val="center"/>
+          </w:tcPr>
+          <w:p>
+            <w:r>
+              <w:t>Run, policy, and suite agree</w:t>
+            </w:r>
+          </w:p>
+        </w:tc>
+        <w:tc>
+          <w:tcPr>
+            <w:tcW w:type="dxa" w:w="4464"/>
+            <w:tcBorders>
+              <w:top w:val="single" w:sz="4" w:color="D9D9D9"/>
+              <w:left w:val="single" w:sz="4" w:color="D9D9D9"/>
+              <w:bottom w:val="single" w:sz="4" w:color="D9D9D9"/>
+              <w:right w:val="single" w:sz="4" w:color="D9D9D9"/>
+              <w:insideH w:val="single" w:sz="4" w:color="D9D9D9"/>
+              <w:insideV w:val="single" w:sz="4" w:color="D9D9D9"/>
+            </w:tcBorders>
+            <w:shd w:fill="EAF0F7"/>
+            <w:vAlign w:val="center"/>
+          </w:tcPr>
+          <w:p>
+            <w:r>
+              <w:t>Prevent misleading execution intent</w:t>
+            </w:r>
+          </w:p>
+        </w:tc>
+      </w:tr>
+      <w:tr>
+        <w:tc>
+          <w:tcPr>
+            <w:tcW w:type="dxa" w:w="2232"/>
+            <w:tcBorders>
+              <w:top w:val="single" w:sz="4" w:color="D9D9D9"/>
+              <w:left w:val="single" w:sz="4" w:color="D9D9D9"/>
+              <w:bottom w:val="single" w:sz="4" w:color="D9D9D9"/>
+              <w:right w:val="single" w:sz="4" w:color="D9D9D9"/>
+              <w:insideH w:val="single" w:sz="4" w:color="D9D9D9"/>
+              <w:insideV w:val="single" w:sz="4" w:color="D9D9D9"/>
+            </w:tcBorders>
+            <w:vAlign w:val="center"/>
+          </w:tcPr>
+          <w:p>
+            <w:r>
+              <w:t>Lifecycle</w:t>
+            </w:r>
+          </w:p>
+        </w:tc>
+        <w:tc>
+          <w:tcPr>
+            <w:tcW w:type="dxa" w:w="3240"/>
+            <w:tcBorders>
+              <w:top w:val="single" w:sz="4" w:color="D9D9D9"/>
+              <w:left w:val="single" w:sz="4" w:color="D9D9D9"/>
+              <w:bottom w:val="single" w:sz="4" w:color="D9D9D9"/>
+              <w:right w:val="single" w:sz="4" w:color="D9D9D9"/>
+              <w:insideH w:val="single" w:sz="4" w:color="D9D9D9"/>
+              <w:insideV w:val="single" w:sz="4" w:color="D9D9D9"/>
+            </w:tcBorders>
+            <w:vAlign w:val="center"/>
+          </w:tcPr>
+          <w:p>
+            <w:r>
+              <w:t>Active suite at scheduling</w:t>
+            </w:r>
+          </w:p>
+        </w:tc>
+        <w:tc>
+          <w:tcPr>
+            <w:tcW w:type="dxa" w:w="4464"/>
+            <w:tcBorders>
+              <w:top w:val="single" w:sz="4" w:color="D9D9D9"/>
+              <w:left w:val="single" w:sz="4" w:color="D9D9D9"/>
+              <w:bottom w:val="single" w:sz="4" w:color="D9D9D9"/>
+              <w:right w:val="single" w:sz="4" w:color="D9D9D9"/>
+              <w:insideH w:val="single" w:sz="4" w:color="D9D9D9"/>
+              <w:insideV w:val="single" w:sz="4" w:color="D9D9D9"/>
+            </w:tcBorders>
+            <w:vAlign w:val="center"/>
+          </w:tcPr>
+          <w:p>
+            <w:r>
+              <w:t>Select reviewed content</w:t>
+            </w:r>
+          </w:p>
+        </w:tc>
+      </w:tr>
+      <w:tr>
+        <w:tc>
+          <w:tcPr>
+            <w:tcW w:type="dxa" w:w="2232"/>
+            <w:tcBorders>
+              <w:top w:val="single" w:sz="4" w:color="D9D9D9"/>
+              <w:left w:val="single" w:sz="4" w:color="D9D9D9"/>
+              <w:bottom w:val="single" w:sz="4" w:color="D9D9D9"/>
+              <w:right w:val="single" w:sz="4" w:color="D9D9D9"/>
+              <w:insideH w:val="single" w:sz="4" w:color="D9D9D9"/>
+              <w:insideV w:val="single" w:sz="4" w:color="D9D9D9"/>
+            </w:tcBorders>
+            <w:shd w:fill="EAF0F7"/>
+            <w:vAlign w:val="center"/>
+          </w:tcPr>
+          <w:p>
+            <w:r>
+              <w:t>Snapshot</w:t>
+            </w:r>
+          </w:p>
+        </w:tc>
+        <w:tc>
+          <w:tcPr>
+            <w:tcW w:type="dxa" w:w="3240"/>
+            <w:tcBorders>
+              <w:top w:val="single" w:sz="4" w:color="D9D9D9"/>
+              <w:left w:val="single" w:sz="4" w:color="D9D9D9"/>
+              <w:bottom w:val="single" w:sz="4" w:color="D9D9D9"/>
+              <w:right w:val="single" w:sz="4" w:color="D9D9D9"/>
+              <w:insideH w:val="single" w:sz="4" w:color="D9D9D9"/>
+              <w:insideV w:val="single" w:sz="4" w:color="D9D9D9"/>
+            </w:tcBorders>
+            <w:shd w:fill="EAF0F7"/>
+            <w:vAlign w:val="center"/>
+          </w:tcPr>
+          <w:p>
+            <w:r>
+              <w:t>Versioned ordered cases</w:t>
+            </w:r>
+          </w:p>
+        </w:tc>
+        <w:tc>
+          <w:tcPr>
+            <w:tcW w:type="dxa" w:w="4464"/>
+            <w:tcBorders>
+              <w:top w:val="single" w:sz="4" w:color="D9D9D9"/>
+              <w:left w:val="single" w:sz="4" w:color="D9D9D9"/>
+              <w:bottom w:val="single" w:sz="4" w:color="D9D9D9"/>
+              <w:right w:val="single" w:sz="4" w:color="D9D9D9"/>
+              <w:insideH w:val="single" w:sz="4" w:color="D9D9D9"/>
+              <w:insideV w:val="single" w:sz="4" w:color="D9D9D9"/>
+            </w:tcBorders>
+            <w:shd w:fill="EAF0F7"/>
+            <w:vAlign w:val="center"/>
+          </w:tcPr>
+          <w:p>
+            <w:r>
+              <w:t>Make delayed execution reproducible</w:t>
+            </w:r>
+          </w:p>
+        </w:tc>
+      </w:tr>
+      <w:tr>
+        <w:tc>
+          <w:tcPr>
+            <w:tcW w:type="dxa" w:w="2232"/>
+            <w:tcBorders>
+              <w:top w:val="single" w:sz="4" w:color="D9D9D9"/>
+              <w:left w:val="single" w:sz="4" w:color="D9D9D9"/>
+              <w:bottom w:val="single" w:sz="4" w:color="D9D9D9"/>
+              <w:right w:val="single" w:sz="4" w:color="D9D9D9"/>
+              <w:insideH w:val="single" w:sz="4" w:color="D9D9D9"/>
+              <w:insideV w:val="single" w:sz="4" w:color="D9D9D9"/>
+            </w:tcBorders>
+            <w:vAlign w:val="center"/>
+          </w:tcPr>
+          <w:p>
+            <w:r>
+              <w:t>Dispatch</w:t>
+            </w:r>
+          </w:p>
+        </w:tc>
+        <w:tc>
+          <w:tcPr>
+            <w:tcW w:type="dxa" w:w="3240"/>
+            <w:tcBorders>
+              <w:top w:val="single" w:sz="4" w:color="D9D9D9"/>
+              <w:left w:val="single" w:sz="4" w:color="D9D9D9"/>
+              <w:bottom w:val="single" w:sz="4" w:color="D9D9D9"/>
+              <w:right w:val="single" w:sz="4" w:color="D9D9D9"/>
+              <w:insideH w:val="single" w:sz="4" w:color="D9D9D9"/>
+              <w:insideV w:val="single" w:sz="4" w:color="D9D9D9"/>
+            </w:tcBorders>
+            <w:vAlign w:val="center"/>
+          </w:tcPr>
+          <w:p>
+            <w:r>
+              <w:t>Stored snapshot only</w:t>
+            </w:r>
+          </w:p>
+        </w:tc>
+        <w:tc>
+          <w:tcPr>
+            <w:tcW w:type="dxa" w:w="4464"/>
+            <w:tcBorders>
+              <w:top w:val="single" w:sz="4" w:color="D9D9D9"/>
+              <w:left w:val="single" w:sz="4" w:color="D9D9D9"/>
+              <w:bottom w:val="single" w:sz="4" w:color="D9D9D9"/>
+              <w:right w:val="single" w:sz="4" w:color="D9D9D9"/>
+              <w:insideH w:val="single" w:sz="4" w:color="D9D9D9"/>
+              <w:insideV w:val="single" w:sz="4" w:color="D9D9D9"/>
+            </w:tcBorders>
+            <w:vAlign w:val="center"/>
+          </w:tcPr>
+          <w:p>
+            <w:r>
+              <w:t>Survive later catalog archival</w:t>
+            </w:r>
+          </w:p>
+        </w:tc>
+      </w:tr>
+    </w:tbl>
+    <w:p/>
+    <w:p>
+      <w:pPr>
+        <w:pStyle w:val="Heading1"/>
+      </w:pPr>
+      <w:r>
+        <w:t>10 Events and Audit</w:t>
       </w:r>
     </w:p>
     <w:tbl>
@@ -3053,6 +3457,127 @@
           </w:p>
         </w:tc>
       </w:tr>
+      <w:tr>
+        <w:tc>
+          <w:tcPr>
+            <w:tcW w:type="dxa" w:w="2376"/>
+            <w:tcBorders>
+              <w:top w:val="single" w:sz="4" w:color="D9D9D9"/>
+              <w:left w:val="single" w:sz="4" w:color="D9D9D9"/>
+              <w:bottom w:val="single" w:sz="4" w:color="D9D9D9"/>
+              <w:right w:val="single" w:sz="4" w:color="D9D9D9"/>
+              <w:insideH w:val="single" w:sz="4" w:color="D9D9D9"/>
+              <w:insideV w:val="single" w:sz="4" w:color="D9D9D9"/>
+            </w:tcBorders>
+            <w:shd w:fill="EAF0F7"/>
+            <w:vAlign w:val="center"/>
+          </w:tcPr>
+          <w:p>
+            <w:r>
+              <w:t>Schedule selection</w:t>
+            </w:r>
+          </w:p>
+        </w:tc>
+        <w:tc>
+          <w:tcPr>
+            <w:tcW w:type="dxa" w:w="4536"/>
+            <w:tcBorders>
+              <w:top w:val="single" w:sz="4" w:color="D9D9D9"/>
+              <w:left w:val="single" w:sz="4" w:color="D9D9D9"/>
+              <w:bottom w:val="single" w:sz="4" w:color="D9D9D9"/>
+              <w:right w:val="single" w:sz="4" w:color="D9D9D9"/>
+              <w:insideH w:val="single" w:sz="4" w:color="D9D9D9"/>
+              <w:insideV w:val="single" w:sz="4" w:color="D9D9D9"/>
+            </w:tcBorders>
+            <w:shd w:fill="EAF0F7"/>
+            <w:vAlign w:val="center"/>
+          </w:tcPr>
+          <w:p>
+            <w:r>
+              <w:t>atep.test_job.scheduled.v1</w:t>
+            </w:r>
+          </w:p>
+        </w:tc>
+        <w:tc>
+          <w:tcPr>
+            <w:tcW w:type="dxa" w:w="3024"/>
+            <w:tcBorders>
+              <w:top w:val="single" w:sz="4" w:color="D9D9D9"/>
+              <w:left w:val="single" w:sz="4" w:color="D9D9D9"/>
+              <w:bottom w:val="single" w:sz="4" w:color="D9D9D9"/>
+              <w:right w:val="single" w:sz="4" w:color="D9D9D9"/>
+              <w:insideH w:val="single" w:sz="4" w:color="D9D9D9"/>
+              <w:insideV w:val="single" w:sz="4" w:color="D9D9D9"/>
+            </w:tcBorders>
+            <w:shd w:fill="EAF0F7"/>
+            <w:vAlign w:val="center"/>
+          </w:tcPr>
+          <w:p>
+            <w:r>
+              <w:t>test_job.scheduled</w:t>
+            </w:r>
+          </w:p>
+        </w:tc>
+      </w:tr>
+      <w:tr>
+        <w:tc>
+          <w:tcPr>
+            <w:tcW w:type="dxa" w:w="2376"/>
+            <w:tcBorders>
+              <w:top w:val="single" w:sz="4" w:color="D9D9D9"/>
+              <w:left w:val="single" w:sz="4" w:color="D9D9D9"/>
+              <w:bottom w:val="single" w:sz="4" w:color="D9D9D9"/>
+              <w:right w:val="single" w:sz="4" w:color="D9D9D9"/>
+              <w:insideH w:val="single" w:sz="4" w:color="D9D9D9"/>
+              <w:insideV w:val="single" w:sz="4" w:color="D9D9D9"/>
+            </w:tcBorders>
+            <w:vAlign w:val="center"/>
+          </w:tcPr>
+          <w:p>
+            <w:r>
+              <w:t>Dispatch selection</w:t>
+            </w:r>
+          </w:p>
+        </w:tc>
+        <w:tc>
+          <w:tcPr>
+            <w:tcW w:type="dxa" w:w="4536"/>
+            <w:tcBorders>
+              <w:top w:val="single" w:sz="4" w:color="D9D9D9"/>
+              <w:left w:val="single" w:sz="4" w:color="D9D9D9"/>
+              <w:bottom w:val="single" w:sz="4" w:color="D9D9D9"/>
+              <w:right w:val="single" w:sz="4" w:color="D9D9D9"/>
+              <w:insideH w:val="single" w:sz="4" w:color="D9D9D9"/>
+              <w:insideV w:val="single" w:sz="4" w:color="D9D9D9"/>
+            </w:tcBorders>
+            <w:vAlign w:val="center"/>
+          </w:tcPr>
+          <w:p>
+            <w:r>
+              <w:t>atep.test_job.dispatched.v1</w:t>
+            </w:r>
+          </w:p>
+        </w:tc>
+        <w:tc>
+          <w:tcPr>
+            <w:tcW w:type="dxa" w:w="3024"/>
+            <w:tcBorders>
+              <w:top w:val="single" w:sz="4" w:color="D9D9D9"/>
+              <w:left w:val="single" w:sz="4" w:color="D9D9D9"/>
+              <w:bottom w:val="single" w:sz="4" w:color="D9D9D9"/>
+              <w:right w:val="single" w:sz="4" w:color="D9D9D9"/>
+              <w:insideH w:val="single" w:sz="4" w:color="D9D9D9"/>
+              <w:insideV w:val="single" w:sz="4" w:color="D9D9D9"/>
+            </w:tcBorders>
+            <w:vAlign w:val="center"/>
+          </w:tcPr>
+          <w:p>
+            <w:r>
+              <w:t>test_job.dispatched</w:t>
+            </w:r>
+          </w:p>
+        </w:tc>
+      </w:tr>
     </w:tbl>
     <w:p/>
     <w:p>
@@ -3061,11 +3586,16 @@
       </w:r>
     </w:p>
     <w:p>
+      <w:r>
+        <w:br w:type="page"/>
+      </w:r>
+    </w:p>
+    <w:p>
       <w:pPr>
         <w:pStyle w:val="Heading1"/>
       </w:pPr>
       <w:r>
-        <w:t>10 Engineering Decisions</w:t>
+        <w:t>11 Engineering Decisions</w:t>
       </w:r>
     </w:p>
     <w:tbl>
@@ -3519,6 +4049,65 @@
           </w:p>
         </w:tc>
       </w:tr>
+      <w:tr>
+        <w:tc>
+          <w:tcPr>
+            <w:tcW w:type="dxa" w:w="2376"/>
+            <w:tcBorders>
+              <w:top w:val="single" w:sz="4" w:color="D9D9D9"/>
+              <w:left w:val="single" w:sz="4" w:color="D9D9D9"/>
+              <w:bottom w:val="single" w:sz="4" w:color="D9D9D9"/>
+              <w:right w:val="single" w:sz="4" w:color="D9D9D9"/>
+              <w:insideH w:val="single" w:sz="4" w:color="D9D9D9"/>
+              <w:insideV w:val="single" w:sz="4" w:color="D9D9D9"/>
+            </w:tcBorders>
+            <w:vAlign w:val="center"/>
+          </w:tcPr>
+          <w:p>
+            <w:r>
+              <w:t>Snapshot when scheduled</w:t>
+            </w:r>
+          </w:p>
+        </w:tc>
+        <w:tc>
+          <w:tcPr>
+            <w:tcW w:type="dxa" w:w="3960"/>
+            <w:tcBorders>
+              <w:top w:val="single" w:sz="4" w:color="D9D9D9"/>
+              <w:left w:val="single" w:sz="4" w:color="D9D9D9"/>
+              <w:bottom w:val="single" w:sz="4" w:color="D9D9D9"/>
+              <w:right w:val="single" w:sz="4" w:color="D9D9D9"/>
+              <w:insideH w:val="single" w:sz="4" w:color="D9D9D9"/>
+              <w:insideV w:val="single" w:sz="4" w:color="D9D9D9"/>
+            </w:tcBorders>
+            <w:vAlign w:val="center"/>
+          </w:tcPr>
+          <w:p>
+            <w:r>
+              <w:t>Protect delayed execution intent</w:t>
+            </w:r>
+          </w:p>
+        </w:tc>
+        <w:tc>
+          <w:tcPr>
+            <w:tcW w:type="dxa" w:w="3600"/>
+            <w:tcBorders>
+              <w:top w:val="single" w:sz="4" w:color="D9D9D9"/>
+              <w:left w:val="single" w:sz="4" w:color="D9D9D9"/>
+              <w:bottom w:val="single" w:sz="4" w:color="D9D9D9"/>
+              <w:right w:val="single" w:sz="4" w:color="D9D9D9"/>
+              <w:insideH w:val="single" w:sz="4" w:color="D9D9D9"/>
+              <w:insideV w:val="single" w:sz="4" w:color="D9D9D9"/>
+            </w:tcBorders>
+            <w:vAlign w:val="center"/>
+          </w:tcPr>
+          <w:p>
+            <w:r>
+              <w:t>Dispatch ignores later catalog drift</w:t>
+            </w:r>
+          </w:p>
+        </w:tc>
+      </w:tr>
     </w:tbl>
     <w:p/>
     <w:p>
@@ -3531,7 +4120,7 @@
         <w:pStyle w:val="Heading1"/>
       </w:pPr>
       <w:r>
-        <w:t>11 Verification Catalogue</w:t>
+        <w:t>12 Verification Catalogue</w:t>
       </w:r>
     </w:p>
     <w:tbl>
@@ -4044,6 +4633,68 @@
           </w:p>
         </w:tc>
       </w:tr>
+      <w:tr>
+        <w:tc>
+          <w:tcPr>
+            <w:tcW w:type="dxa" w:w="2232"/>
+            <w:tcBorders>
+              <w:top w:val="single" w:sz="4" w:color="D9D9D9"/>
+              <w:left w:val="single" w:sz="4" w:color="D9D9D9"/>
+              <w:bottom w:val="single" w:sz="4" w:color="D9D9D9"/>
+              <w:right w:val="single" w:sz="4" w:color="D9D9D9"/>
+              <w:insideH w:val="single" w:sz="4" w:color="D9D9D9"/>
+              <w:insideV w:val="single" w:sz="4" w:color="D9D9D9"/>
+            </w:tcBorders>
+            <w:shd w:fill="EAF0F7"/>
+            <w:vAlign w:val="center"/>
+          </w:tcPr>
+          <w:p>
+            <w:r>
+              <w:t>TF-T-027 to 034</w:t>
+            </w:r>
+          </w:p>
+        </w:tc>
+        <w:tc>
+          <w:tcPr>
+            <w:tcW w:type="dxa" w:w="3528"/>
+            <w:tcBorders>
+              <w:top w:val="single" w:sz="4" w:color="D9D9D9"/>
+              <w:left w:val="single" w:sz="4" w:color="D9D9D9"/>
+              <w:bottom w:val="single" w:sz="4" w:color="D9D9D9"/>
+              <w:right w:val="single" w:sz="4" w:color="D9D9D9"/>
+              <w:insideH w:val="single" w:sz="4" w:color="D9D9D9"/>
+              <w:insideV w:val="single" w:sz="4" w:color="D9D9D9"/>
+            </w:tcBorders>
+            <w:shd w:fill="EAF0F7"/>
+            <w:vAlign w:val="center"/>
+          </w:tcPr>
+          <w:p>
+            <w:r>
+              <w:t>Scheduled selection</w:t>
+            </w:r>
+          </w:p>
+        </w:tc>
+        <w:tc>
+          <w:tcPr>
+            <w:tcW w:type="dxa" w:w="4176"/>
+            <w:tcBorders>
+              <w:top w:val="single" w:sz="4" w:color="D9D9D9"/>
+              <w:left w:val="single" w:sz="4" w:color="D9D9D9"/>
+              <w:bottom w:val="single" w:sz="4" w:color="D9D9D9"/>
+              <w:right w:val="single" w:sz="4" w:color="D9D9D9"/>
+              <w:insideH w:val="single" w:sz="4" w:color="D9D9D9"/>
+              <w:insideV w:val="single" w:sz="4" w:color="D9D9D9"/>
+            </w:tcBorders>
+            <w:shd w:fill="EAF0F7"/>
+            <w:vAlign w:val="center"/>
+          </w:tcPr>
+          <w:p>
+            <w:r>
+              <w:t>Validate policies, snapshots, dispatch, and migration</w:t>
+            </w:r>
+          </w:p>
+        </w:tc>
+      </w:tr>
     </w:tbl>
     <w:p/>
     <w:p>
@@ -4056,7 +4707,7 @@
         <w:pStyle w:val="Heading1"/>
       </w:pPr>
       <w:r>
-        <w:t>12 Risks and Controls</w:t>
+        <w:t>13 Risks and Controls</w:t>
       </w:r>
     </w:p>
     <w:tbl>
@@ -4448,6 +5099,68 @@
           </w:p>
         </w:tc>
       </w:tr>
+      <w:tr>
+        <w:tc>
+          <w:tcPr>
+            <w:tcW w:type="dxa" w:w="2160"/>
+            <w:tcBorders>
+              <w:top w:val="single" w:sz="4" w:color="D9D9D9"/>
+              <w:left w:val="single" w:sz="4" w:color="D9D9D9"/>
+              <w:bottom w:val="single" w:sz="4" w:color="D9D9D9"/>
+              <w:right w:val="single" w:sz="4" w:color="D9D9D9"/>
+              <w:insideH w:val="single" w:sz="4" w:color="D9D9D9"/>
+              <w:insideV w:val="single" w:sz="4" w:color="D9D9D9"/>
+            </w:tcBorders>
+            <w:shd w:fill="EAF0F7"/>
+            <w:vAlign w:val="center"/>
+          </w:tcPr>
+          <w:p>
+            <w:r>
+              <w:t>Catalog changes while waiting</w:t>
+            </w:r>
+          </w:p>
+        </w:tc>
+        <w:tc>
+          <w:tcPr>
+            <w:tcW w:type="dxa" w:w="3672"/>
+            <w:tcBorders>
+              <w:top w:val="single" w:sz="4" w:color="D9D9D9"/>
+              <w:left w:val="single" w:sz="4" w:color="D9D9D9"/>
+              <w:bottom w:val="single" w:sz="4" w:color="D9D9D9"/>
+              <w:right w:val="single" w:sz="4" w:color="D9D9D9"/>
+              <w:insideH w:val="single" w:sz="4" w:color="D9D9D9"/>
+              <w:insideV w:val="single" w:sz="4" w:color="D9D9D9"/>
+            </w:tcBorders>
+            <w:shd w:fill="EAF0F7"/>
+            <w:vAlign w:val="center"/>
+          </w:tcPr>
+          <w:p>
+            <w:r>
+              <w:t>Immutable job selection snapshot</w:t>
+            </w:r>
+          </w:p>
+        </w:tc>
+        <w:tc>
+          <w:tcPr>
+            <w:tcW w:type="dxa" w:w="4104"/>
+            <w:tcBorders>
+              <w:top w:val="single" w:sz="4" w:color="D9D9D9"/>
+              <w:left w:val="single" w:sz="4" w:color="D9D9D9"/>
+              <w:bottom w:val="single" w:sz="4" w:color="D9D9D9"/>
+              <w:right w:val="single" w:sz="4" w:color="D9D9D9"/>
+              <w:insideH w:val="single" w:sz="4" w:color="D9D9D9"/>
+              <w:insideV w:val="single" w:sz="4" w:color="D9D9D9"/>
+            </w:tcBorders>
+            <w:shd w:fill="EAF0F7"/>
+            <w:vAlign w:val="center"/>
+          </w:tcPr>
+          <w:p>
+            <w:r>
+              <w:t>Dispatch only persisted cases</w:t>
+            </w:r>
+          </w:p>
+        </w:tc>
+      </w:tr>
     </w:tbl>
     <w:p/>
     <w:p>
@@ -4455,12 +5168,12 @@
         <w:pStyle w:val="Heading1"/>
       </w:pPr>
       <w:r>
-        <w:t>13 Study Exercises</w:t>
+        <w:t>14 Study Exercises</w:t>
       </w:r>
     </w:p>
     <w:p>
       <w:r>
-        <w:t>Create one ADAS definition and identify its invariants. Then run two required cases, explain the aggregate result, and compare an exact retry after suite archival with a new run request for the archived suite.</w:t>
+        <w:t>Create one ADAS definition and identify its invariants. Then run two required cases, explain the aggregate result, and compare an exact retry after suite archival with a new run request for the archived suite. Schedule the same suite, archive it, and explain why the stored job can still dispatch reproducibly.</w:t>
       </w:r>
     </w:p>
     <w:p>
@@ -4468,12 +5181,12 @@
         <w:pStyle w:val="Heading1"/>
       </w:pPr>
       <w:r>
-        <w:t>14 Next Development</w:t>
+        <w:t>15 Next Development</w:t>
       </w:r>
     </w:p>
     <w:p>
       <w:r>
-        <w:t>VIII-3 will connect scheduled jobs to catalog suites for smoke, sanity, and regression selection while preserving the VIII-2 snapshot.</w:t>
+        <w:t>VIII-4 will add bounded performance and stress profiles, acceptance thresholds, resource budgets, and comparable trend evidence while preserving VIII-3 selection snapshots.</w:t>
       </w:r>
     </w:p>
     <w:sectPr>

</xml_diff>

<commit_message>
feat(test-framework): add fault campaigns
</commit_message>
<xml_diff>
--- a/docs/ATEP_Volume_VIII_Test_Framework_Engineering_Workbook.docx
+++ b/docs/ATEP_Volume_VIII_Test_Framework_Engineering_Workbook.docx
@@ -19,12 +19,12 @@
         <w:rPr>
           <w:b/>
         </w:rPr>
-        <w:t>Version 0.3.0   VIII 3 Scheduler and Selection Implemented</w:t>
+        <w:t>Version 0.4.0   VIII 5 Fault Campaigns Implemented</w:t>
       </w:r>
     </w:p>
     <w:p>
       <w:r>
-        <w:t>This workbook records the catalog, execution-binding, and scheduled-selection baseline for ATEP. Reusable definitions describe test intent, suites preserve reviewed composition, and catalog-backed runs now persist deterministic case results and aggregate outcomes.</w:t>
+        <w:t>This workbook records the catalog, execution-binding, scheduled-selection, and bounded fault-campaign baseline for ATEP. Reusable definitions describe test intent, suites preserve reviewed composition, and catalog-backed runs now persist deterministic case results and aggregate outcomes.</w:t>
       </w:r>
     </w:p>
     <w:tbl>
@@ -125,7 +125,7 @@
           </w:tcPr>
           <w:p>
             <w:r>
-              <w:t>VIII-1, VIII-2, and VIII-3 implemented and verified</w:t>
+              <w:t>VIII-1, VIII-2, VIII-3, and VIII-5 implemented and verified</w:t>
             </w:r>
           </w:p>
         </w:tc>
@@ -289,7 +289,7 @@
           </w:tcPr>
           <w:p>
             <w:r>
-              <w:t>VIII-4 performance and stress profiles, thresholds, and trends</w:t>
+              <w:t>VIII-6 mutation testing and coverage; VIII-4 deferred</w:t>
             </w:r>
           </w:p>
         </w:tc>
@@ -306,7 +306,7 @@
     </w:p>
     <w:p>
       <w:r>
-        <w:t>VIII-1 separates reusable test design from test execution. A definition captures one test's preconditions, actions, inputs, expectations, classification, and resource budget. A suite selects active definitions in an explicit order and freezes their versions. VIII-2 binds that snapshot to a run and records each case outcome. VIII-3 schedules that immutable intent for later smoke, sanity, or regression execution.</w:t>
+        <w:t>VIII-1 separates reusable test design from test execution. A definition captures one test's preconditions, actions, inputs, expectations, classification, and resource budget. A suite selects active definitions in an explicit order and freezes their versions. VIII-2 binds that snapshot to a run and records each case outcome. VIII-3 schedules that immutable intent for later smoke, sanity, or regression execution. VIII-5 adds cross-domain fault campaigns with recovery plans and evidence.</w:t>
       </w:r>
     </w:p>
     <w:p>
@@ -330,7 +330,7 @@
         <w:pStyle w:val="ListBullet"/>
       </w:pPr>
       <w:r>
-        <w:t>Performance, stress, campaigns, mutation testing, and coverage remain later increments.</w:t>
+        <w:t>Performance and stress remain planned but are deferred until near completion; mutation testing and coverage are next.</w:t>
       </w:r>
     </w:p>
     <w:p>
@@ -568,7 +568,7 @@
           </w:tcPr>
           <w:p>
             <w:r>
-              <w:t>Linear migrations 0051 through 0053 with reversible schema changes</w:t>
+              <w:t>Linear migrations 0051 through 0054 with reversible schema changes</w:t>
             </w:r>
           </w:p>
         </w:tc>
@@ -609,6 +609,48 @@
           <w:p>
             <w:r>
               <w:t>Materializes and updates ordered cases without rewriting catalog intent</w:t>
+            </w:r>
+          </w:p>
+        </w:tc>
+      </w:tr>
+      <w:tr>
+        <w:tc>
+          <w:tcPr>
+            <w:tcW w:type="dxa" w:w="2232"/>
+            <w:tcBorders>
+              <w:top w:val="single" w:sz="4" w:color="D9D9D9"/>
+              <w:left w:val="single" w:sz="4" w:color="D9D9D9"/>
+              <w:bottom w:val="single" w:sz="4" w:color="D9D9D9"/>
+              <w:right w:val="single" w:sz="4" w:color="D9D9D9"/>
+              <w:insideH w:val="single" w:sz="4" w:color="D9D9D9"/>
+              <w:insideV w:val="single" w:sz="4" w:color="D9D9D9"/>
+            </w:tcBorders>
+            <w:shd w:fill="EAF0F7"/>
+            <w:vAlign w:val="center"/>
+          </w:tcPr>
+          <w:p>
+            <w:r>
+              <w:t>Fault campaigns</w:t>
+            </w:r>
+          </w:p>
+        </w:tc>
+        <w:tc>
+          <w:tcPr>
+            <w:tcW w:type="dxa" w:w="7704"/>
+            <w:tcBorders>
+              <w:top w:val="single" w:sz="4" w:color="D9D9D9"/>
+              <w:left w:val="single" w:sz="4" w:color="D9D9D9"/>
+              <w:bottom w:val="single" w:sz="4" w:color="D9D9D9"/>
+              <w:right w:val="single" w:sz="4" w:color="D9D9D9"/>
+              <w:insideH w:val="single" w:sz="4" w:color="D9D9D9"/>
+              <w:insideV w:val="single" w:sz="4" w:color="D9D9D9"/>
+            </w:tcBorders>
+            <w:shd w:fill="EAF0F7"/>
+            <w:vAlign w:val="center"/>
+          </w:tcPr>
+          <w:p>
+            <w:r>
+              <w:t>Snapshots bounded injection and recovery intent without arbitrary commands</w:t>
             </w:r>
           </w:p>
         </w:tc>
@@ -1812,6 +1854,127 @@
           <w:p>
             <w:r>
               <w:t>List and detail</w:t>
+            </w:r>
+          </w:p>
+        </w:tc>
+        <w:tc>
+          <w:tcPr>
+            <w:tcW w:type="dxa" w:w="2880"/>
+            <w:tcBorders>
+              <w:top w:val="single" w:sz="4" w:color="D9D9D9"/>
+              <w:left w:val="single" w:sz="4" w:color="D9D9D9"/>
+              <w:bottom w:val="single" w:sz="4" w:color="D9D9D9"/>
+              <w:right w:val="single" w:sz="4" w:color="D9D9D9"/>
+              <w:insideH w:val="single" w:sz="4" w:color="D9D9D9"/>
+              <w:insideV w:val="single" w:sz="4" w:color="D9D9D9"/>
+            </w:tcBorders>
+            <w:shd w:fill="EAF0F7"/>
+            <w:vAlign w:val="center"/>
+          </w:tcPr>
+          <w:p>
+            <w:r>
+              <w:t>test_catalog:read</w:t>
+            </w:r>
+          </w:p>
+        </w:tc>
+      </w:tr>
+      <w:tr>
+        <w:tc>
+          <w:tcPr>
+            <w:tcW w:type="dxa" w:w="2376"/>
+            <w:tcBorders>
+              <w:top w:val="single" w:sz="4" w:color="D9D9D9"/>
+              <w:left w:val="single" w:sz="4" w:color="D9D9D9"/>
+              <w:bottom w:val="single" w:sz="4" w:color="D9D9D9"/>
+              <w:right w:val="single" w:sz="4" w:color="D9D9D9"/>
+              <w:insideH w:val="single" w:sz="4" w:color="D9D9D9"/>
+              <w:insideV w:val="single" w:sz="4" w:color="D9D9D9"/>
+            </w:tcBorders>
+            <w:vAlign w:val="center"/>
+          </w:tcPr>
+          <w:p>
+            <w:r>
+              <w:t>Fault campaigns</w:t>
+            </w:r>
+          </w:p>
+        </w:tc>
+        <w:tc>
+          <w:tcPr>
+            <w:tcW w:type="dxa" w:w="4680"/>
+            <w:tcBorders>
+              <w:top w:val="single" w:sz="4" w:color="D9D9D9"/>
+              <w:left w:val="single" w:sz="4" w:color="D9D9D9"/>
+              <w:bottom w:val="single" w:sz="4" w:color="D9D9D9"/>
+              <w:right w:val="single" w:sz="4" w:color="D9D9D9"/>
+              <w:insideH w:val="single" w:sz="4" w:color="D9D9D9"/>
+              <w:insideV w:val="single" w:sz="4" w:color="D9D9D9"/>
+            </w:tcBorders>
+            <w:vAlign w:val="center"/>
+          </w:tcPr>
+          <w:p>
+            <w:r>
+              <w:t>Create, status, execute, cancel</w:t>
+            </w:r>
+          </w:p>
+        </w:tc>
+        <w:tc>
+          <w:tcPr>
+            <w:tcW w:type="dxa" w:w="2880"/>
+            <w:tcBorders>
+              <w:top w:val="single" w:sz="4" w:color="D9D9D9"/>
+              <w:left w:val="single" w:sz="4" w:color="D9D9D9"/>
+              <w:bottom w:val="single" w:sz="4" w:color="D9D9D9"/>
+              <w:right w:val="single" w:sz="4" w:color="D9D9D9"/>
+              <w:insideH w:val="single" w:sz="4" w:color="D9D9D9"/>
+              <w:insideV w:val="single" w:sz="4" w:color="D9D9D9"/>
+            </w:tcBorders>
+            <w:vAlign w:val="center"/>
+          </w:tcPr>
+          <w:p>
+            <w:r>
+              <w:t>test_catalog:manage</w:t>
+            </w:r>
+          </w:p>
+        </w:tc>
+      </w:tr>
+      <w:tr>
+        <w:tc>
+          <w:tcPr>
+            <w:tcW w:type="dxa" w:w="2376"/>
+            <w:tcBorders>
+              <w:top w:val="single" w:sz="4" w:color="D9D9D9"/>
+              <w:left w:val="single" w:sz="4" w:color="D9D9D9"/>
+              <w:bottom w:val="single" w:sz="4" w:color="D9D9D9"/>
+              <w:right w:val="single" w:sz="4" w:color="D9D9D9"/>
+              <w:insideH w:val="single" w:sz="4" w:color="D9D9D9"/>
+              <w:insideV w:val="single" w:sz="4" w:color="D9D9D9"/>
+            </w:tcBorders>
+            <w:shd w:fill="EAF0F7"/>
+            <w:vAlign w:val="center"/>
+          </w:tcPr>
+          <w:p>
+            <w:r>
+              <w:t>Fault campaigns</w:t>
+            </w:r>
+          </w:p>
+        </w:tc>
+        <w:tc>
+          <w:tcPr>
+            <w:tcW w:type="dxa" w:w="4680"/>
+            <w:tcBorders>
+              <w:top w:val="single" w:sz="4" w:color="D9D9D9"/>
+              <w:left w:val="single" w:sz="4" w:color="D9D9D9"/>
+              <w:bottom w:val="single" w:sz="4" w:color="D9D9D9"/>
+              <w:right w:val="single" w:sz="4" w:color="D9D9D9"/>
+              <w:insideH w:val="single" w:sz="4" w:color="D9D9D9"/>
+              <w:insideV w:val="single" w:sz="4" w:color="D9D9D9"/>
+            </w:tcBorders>
+            <w:shd w:fill="EAF0F7"/>
+            <w:vAlign w:val="center"/>
+          </w:tcPr>
+          <w:p>
+            <w:r>
+              <w:t>List, detail, and results</w:t>
             </w:r>
           </w:p>
         </w:tc>
@@ -3061,11 +3224,492 @@
     </w:tbl>
     <w:p/>
     <w:p>
+      <w:r>
+        <w:br w:type="page"/>
+      </w:r>
+    </w:p>
+    <w:p>
       <w:pPr>
         <w:pStyle w:val="Heading1"/>
       </w:pPr>
       <w:r>
-        <w:t>10 Events and Audit</w:t>
+        <w:t>10 Fault Campaigns</w:t>
+      </w:r>
+    </w:p>
+    <w:p>
+      <w:r>
+        <w:t>VIII-5 defines reusable campaigns across Digital Vehicle, ECU, CAN, diagnostics, Electric Vehicle, and ADAS. Each step selects a domain-specific allowlisted action, declares an expected effect, and includes a mandatory recovery plan. The framework owns intent and evidence; native simulators retain ownership of the actual state mutation.</w:t>
+      </w:r>
+    </w:p>
+    <w:tbl>
+      <w:tblPr>
+        <w:tblW w:type="auto" w:w="0"/>
+        <w:tblLayout w:type="fixed"/>
+        <w:tblLook w:firstColumn="1" w:firstRow="1" w:lastColumn="0" w:lastRow="0" w:noHBand="0" w:noVBand="1" w:val="04A0"/>
+      </w:tblPr>
+      <w:tblGrid>
+        <w:gridCol w:w="3312"/>
+        <w:gridCol w:w="3312"/>
+        <w:gridCol w:w="3312"/>
+      </w:tblGrid>
+      <w:tr>
+        <w:trPr>
+          <w:tblHeader/>
+        </w:trPr>
+        <w:tc>
+          <w:tcPr>
+            <w:tcW w:type="dxa" w:w="2160"/>
+            <w:shd w:fill="17365D"/>
+            <w:tcBorders>
+              <w:top w:val="single" w:sz="4" w:color="D9D9D9"/>
+              <w:left w:val="single" w:sz="4" w:color="D9D9D9"/>
+              <w:bottom w:val="single" w:sz="4" w:color="D9D9D9"/>
+              <w:right w:val="single" w:sz="4" w:color="D9D9D9"/>
+              <w:insideH w:val="single" w:sz="4" w:color="D9D9D9"/>
+              <w:insideV w:val="single" w:sz="4" w:color="D9D9D9"/>
+            </w:tcBorders>
+            <w:vAlign w:val="center"/>
+          </w:tcPr>
+          <w:p>
+            <w:r>
+              <w:rPr>
+                <w:b/>
+                <w:color w:val="FFFFFF"/>
+              </w:rPr>
+              <w:t>Safety control</w:t>
+            </w:r>
+          </w:p>
+        </w:tc>
+        <w:tc>
+          <w:tcPr>
+            <w:tcW w:type="dxa" w:w="3384"/>
+            <w:shd w:fill="17365D"/>
+            <w:tcBorders>
+              <w:top w:val="single" w:sz="4" w:color="D9D9D9"/>
+              <w:left w:val="single" w:sz="4" w:color="D9D9D9"/>
+              <w:bottom w:val="single" w:sz="4" w:color="D9D9D9"/>
+              <w:right w:val="single" w:sz="4" w:color="D9D9D9"/>
+              <w:insideH w:val="single" w:sz="4" w:color="D9D9D9"/>
+              <w:insideV w:val="single" w:sz="4" w:color="D9D9D9"/>
+            </w:tcBorders>
+            <w:vAlign w:val="center"/>
+          </w:tcPr>
+          <w:p>
+            <w:r>
+              <w:rPr>
+                <w:b/>
+                <w:color w:val="FFFFFF"/>
+              </w:rPr>
+              <w:t>Bound</w:t>
+            </w:r>
+          </w:p>
+        </w:tc>
+        <w:tc>
+          <w:tcPr>
+            <w:tcW w:type="dxa" w:w="4392"/>
+            <w:shd w:fill="17365D"/>
+            <w:tcBorders>
+              <w:top w:val="single" w:sz="4" w:color="D9D9D9"/>
+              <w:left w:val="single" w:sz="4" w:color="D9D9D9"/>
+              <w:bottom w:val="single" w:sz="4" w:color="D9D9D9"/>
+              <w:right w:val="single" w:sz="4" w:color="D9D9D9"/>
+              <w:insideH w:val="single" w:sz="4" w:color="D9D9D9"/>
+              <w:insideV w:val="single" w:sz="4" w:color="D9D9D9"/>
+            </w:tcBorders>
+            <w:vAlign w:val="center"/>
+          </w:tcPr>
+          <w:p>
+            <w:r>
+              <w:rPr>
+                <w:b/>
+                <w:color w:val="FFFFFF"/>
+              </w:rPr>
+              <w:t>Engineering purpose</w:t>
+            </w:r>
+          </w:p>
+        </w:tc>
+      </w:tr>
+      <w:tr>
+        <w:tc>
+          <w:tcPr>
+            <w:tcW w:type="dxa" w:w="2160"/>
+            <w:tcBorders>
+              <w:top w:val="single" w:sz="4" w:color="D9D9D9"/>
+              <w:left w:val="single" w:sz="4" w:color="D9D9D9"/>
+              <w:bottom w:val="single" w:sz="4" w:color="D9D9D9"/>
+              <w:right w:val="single" w:sz="4" w:color="D9D9D9"/>
+              <w:insideH w:val="single" w:sz="4" w:color="D9D9D9"/>
+              <w:insideV w:val="single" w:sz="4" w:color="D9D9D9"/>
+            </w:tcBorders>
+            <w:vAlign w:val="center"/>
+          </w:tcPr>
+          <w:p>
+            <w:r>
+              <w:t>Blast radius</w:t>
+            </w:r>
+          </w:p>
+        </w:tc>
+        <w:tc>
+          <w:tcPr>
+            <w:tcW w:type="dxa" w:w="3384"/>
+            <w:tcBorders>
+              <w:top w:val="single" w:sz="4" w:color="D9D9D9"/>
+              <w:left w:val="single" w:sz="4" w:color="D9D9D9"/>
+              <w:bottom w:val="single" w:sz="4" w:color="D9D9D9"/>
+              <w:right w:val="single" w:sz="4" w:color="D9D9D9"/>
+              <w:insideH w:val="single" w:sz="4" w:color="D9D9D9"/>
+              <w:insideV w:val="single" w:sz="4" w:color="D9D9D9"/>
+            </w:tcBorders>
+            <w:vAlign w:val="center"/>
+          </w:tcPr>
+          <w:p>
+            <w:r>
+              <w:t>Component, network, or vehicle</w:t>
+            </w:r>
+          </w:p>
+        </w:tc>
+        <w:tc>
+          <w:tcPr>
+            <w:tcW w:type="dxa" w:w="4392"/>
+            <w:tcBorders>
+              <w:top w:val="single" w:sz="4" w:color="D9D9D9"/>
+              <w:left w:val="single" w:sz="4" w:color="D9D9D9"/>
+              <w:bottom w:val="single" w:sz="4" w:color="D9D9D9"/>
+              <w:right w:val="single" w:sz="4" w:color="D9D9D9"/>
+              <w:insideH w:val="single" w:sz="4" w:color="D9D9D9"/>
+              <w:insideV w:val="single" w:sz="4" w:color="D9D9D9"/>
+            </w:tcBorders>
+            <w:vAlign w:val="center"/>
+          </w:tcPr>
+          <w:p>
+            <w:r>
+              <w:t>Exclude fleet-wide impact</w:t>
+            </w:r>
+          </w:p>
+        </w:tc>
+      </w:tr>
+      <w:tr>
+        <w:tc>
+          <w:tcPr>
+            <w:tcW w:type="dxa" w:w="2160"/>
+            <w:tcBorders>
+              <w:top w:val="single" w:sz="4" w:color="D9D9D9"/>
+              <w:left w:val="single" w:sz="4" w:color="D9D9D9"/>
+              <w:bottom w:val="single" w:sz="4" w:color="D9D9D9"/>
+              <w:right w:val="single" w:sz="4" w:color="D9D9D9"/>
+              <w:insideH w:val="single" w:sz="4" w:color="D9D9D9"/>
+              <w:insideV w:val="single" w:sz="4" w:color="D9D9D9"/>
+            </w:tcBorders>
+            <w:shd w:fill="EAF0F7"/>
+            <w:vAlign w:val="center"/>
+          </w:tcPr>
+          <w:p>
+            <w:r>
+              <w:t>Campaign size</w:t>
+            </w:r>
+          </w:p>
+        </w:tc>
+        <w:tc>
+          <w:tcPr>
+            <w:tcW w:type="dxa" w:w="3384"/>
+            <w:tcBorders>
+              <w:top w:val="single" w:sz="4" w:color="D9D9D9"/>
+              <w:left w:val="single" w:sz="4" w:color="D9D9D9"/>
+              <w:bottom w:val="single" w:sz="4" w:color="D9D9D9"/>
+              <w:right w:val="single" w:sz="4" w:color="D9D9D9"/>
+              <w:insideH w:val="single" w:sz="4" w:color="D9D9D9"/>
+              <w:insideV w:val="single" w:sz="4" w:color="D9D9D9"/>
+            </w:tcBorders>
+            <w:shd w:fill="EAF0F7"/>
+            <w:vAlign w:val="center"/>
+          </w:tcPr>
+          <w:p>
+            <w:r>
+              <w:t>1 to 32 steps</w:t>
+            </w:r>
+          </w:p>
+        </w:tc>
+        <w:tc>
+          <w:tcPr>
+            <w:tcW w:type="dxa" w:w="4392"/>
+            <w:tcBorders>
+              <w:top w:val="single" w:sz="4" w:color="D9D9D9"/>
+              <w:left w:val="single" w:sz="4" w:color="D9D9D9"/>
+              <w:bottom w:val="single" w:sz="4" w:color="D9D9D9"/>
+              <w:right w:val="single" w:sz="4" w:color="D9D9D9"/>
+              <w:insideH w:val="single" w:sz="4" w:color="D9D9D9"/>
+              <w:insideV w:val="single" w:sz="4" w:color="D9D9D9"/>
+            </w:tcBorders>
+            <w:shd w:fill="EAF0F7"/>
+            <w:vAlign w:val="center"/>
+          </w:tcPr>
+          <w:p>
+            <w:r>
+              <w:t>Bound orchestration and persistence</w:t>
+            </w:r>
+          </w:p>
+        </w:tc>
+      </w:tr>
+      <w:tr>
+        <w:tc>
+          <w:tcPr>
+            <w:tcW w:type="dxa" w:w="2160"/>
+            <w:tcBorders>
+              <w:top w:val="single" w:sz="4" w:color="D9D9D9"/>
+              <w:left w:val="single" w:sz="4" w:color="D9D9D9"/>
+              <w:bottom w:val="single" w:sz="4" w:color="D9D9D9"/>
+              <w:right w:val="single" w:sz="4" w:color="D9D9D9"/>
+              <w:insideH w:val="single" w:sz="4" w:color="D9D9D9"/>
+              <w:insideV w:val="single" w:sz="4" w:color="D9D9D9"/>
+            </w:tcBorders>
+            <w:vAlign w:val="center"/>
+          </w:tcPr>
+          <w:p>
+            <w:r>
+              <w:t>Parameters</w:t>
+            </w:r>
+          </w:p>
+        </w:tc>
+        <w:tc>
+          <w:tcPr>
+            <w:tcW w:type="dxa" w:w="3384"/>
+            <w:tcBorders>
+              <w:top w:val="single" w:sz="4" w:color="D9D9D9"/>
+              <w:left w:val="single" w:sz="4" w:color="D9D9D9"/>
+              <w:bottom w:val="single" w:sz="4" w:color="D9D9D9"/>
+              <w:right w:val="single" w:sz="4" w:color="D9D9D9"/>
+              <w:insideH w:val="single" w:sz="4" w:color="D9D9D9"/>
+              <w:insideV w:val="single" w:sz="4" w:color="D9D9D9"/>
+            </w:tcBorders>
+            <w:vAlign w:val="center"/>
+          </w:tcPr>
+          <w:p>
+            <w:r>
+              <w:t>8192 bytes per step</w:t>
+            </w:r>
+          </w:p>
+        </w:tc>
+        <w:tc>
+          <w:tcPr>
+            <w:tcW w:type="dxa" w:w="4392"/>
+            <w:tcBorders>
+              <w:top w:val="single" w:sz="4" w:color="D9D9D9"/>
+              <w:left w:val="single" w:sz="4" w:color="D9D9D9"/>
+              <w:bottom w:val="single" w:sz="4" w:color="D9D9D9"/>
+              <w:right w:val="single" w:sz="4" w:color="D9D9D9"/>
+              <w:insideH w:val="single" w:sz="4" w:color="D9D9D9"/>
+              <w:insideV w:val="single" w:sz="4" w:color="D9D9D9"/>
+            </w:tcBorders>
+            <w:vAlign w:val="center"/>
+          </w:tcPr>
+          <w:p>
+            <w:r>
+              <w:t>Prevent unbounded structured input</w:t>
+            </w:r>
+          </w:p>
+        </w:tc>
+      </w:tr>
+      <w:tr>
+        <w:tc>
+          <w:tcPr>
+            <w:tcW w:type="dxa" w:w="2160"/>
+            <w:tcBorders>
+              <w:top w:val="single" w:sz="4" w:color="D9D9D9"/>
+              <w:left w:val="single" w:sz="4" w:color="D9D9D9"/>
+              <w:bottom w:val="single" w:sz="4" w:color="D9D9D9"/>
+              <w:right w:val="single" w:sz="4" w:color="D9D9D9"/>
+              <w:insideH w:val="single" w:sz="4" w:color="D9D9D9"/>
+              <w:insideV w:val="single" w:sz="4" w:color="D9D9D9"/>
+            </w:tcBorders>
+            <w:shd w:fill="EAF0F7"/>
+            <w:vAlign w:val="center"/>
+          </w:tcPr>
+          <w:p>
+            <w:r>
+              <w:t>Time budget</w:t>
+            </w:r>
+          </w:p>
+        </w:tc>
+        <w:tc>
+          <w:tcPr>
+            <w:tcW w:type="dxa" w:w="3384"/>
+            <w:tcBorders>
+              <w:top w:val="single" w:sz="4" w:color="D9D9D9"/>
+              <w:left w:val="single" w:sz="4" w:color="D9D9D9"/>
+              <w:bottom w:val="single" w:sz="4" w:color="D9D9D9"/>
+              <w:right w:val="single" w:sz="4" w:color="D9D9D9"/>
+              <w:insideH w:val="single" w:sz="4" w:color="D9D9D9"/>
+              <w:insideV w:val="single" w:sz="4" w:color="D9D9D9"/>
+            </w:tcBorders>
+            <w:shd w:fill="EAF0F7"/>
+            <w:vAlign w:val="center"/>
+          </w:tcPr>
+          <w:p>
+            <w:r>
+              <w:t>30 minutes total</w:t>
+            </w:r>
+          </w:p>
+        </w:tc>
+        <w:tc>
+          <w:tcPr>
+            <w:tcW w:type="dxa" w:w="4392"/>
+            <w:tcBorders>
+              <w:top w:val="single" w:sz="4" w:color="D9D9D9"/>
+              <w:left w:val="single" w:sz="4" w:color="D9D9D9"/>
+              <w:bottom w:val="single" w:sz="4" w:color="D9D9D9"/>
+              <w:right w:val="single" w:sz="4" w:color="D9D9D9"/>
+              <w:insideH w:val="single" w:sz="4" w:color="D9D9D9"/>
+              <w:insideV w:val="single" w:sz="4" w:color="D9D9D9"/>
+            </w:tcBorders>
+            <w:shd w:fill="EAF0F7"/>
+            <w:vAlign w:val="center"/>
+          </w:tcPr>
+          <w:p>
+            <w:r>
+              <w:t>Bound injection and recovery exposure</w:t>
+            </w:r>
+          </w:p>
+        </w:tc>
+      </w:tr>
+      <w:tr>
+        <w:tc>
+          <w:tcPr>
+            <w:tcW w:type="dxa" w:w="2160"/>
+            <w:tcBorders>
+              <w:top w:val="single" w:sz="4" w:color="D9D9D9"/>
+              <w:left w:val="single" w:sz="4" w:color="D9D9D9"/>
+              <w:bottom w:val="single" w:sz="4" w:color="D9D9D9"/>
+              <w:right w:val="single" w:sz="4" w:color="D9D9D9"/>
+              <w:insideH w:val="single" w:sz="4" w:color="D9D9D9"/>
+              <w:insideV w:val="single" w:sz="4" w:color="D9D9D9"/>
+            </w:tcBorders>
+            <w:vAlign w:val="center"/>
+          </w:tcPr>
+          <w:p>
+            <w:r>
+              <w:t>Recovery</w:t>
+            </w:r>
+          </w:p>
+        </w:tc>
+        <w:tc>
+          <w:tcPr>
+            <w:tcW w:type="dxa" w:w="3384"/>
+            <w:tcBorders>
+              <w:top w:val="single" w:sz="4" w:color="D9D9D9"/>
+              <w:left w:val="single" w:sz="4" w:color="D9D9D9"/>
+              <w:bottom w:val="single" w:sz="4" w:color="D9D9D9"/>
+              <w:right w:val="single" w:sz="4" w:color="D9D9D9"/>
+              <w:insideH w:val="single" w:sz="4" w:color="D9D9D9"/>
+              <w:insideV w:val="single" w:sz="4" w:color="D9D9D9"/>
+            </w:tcBorders>
+            <w:vAlign w:val="center"/>
+          </w:tcPr>
+          <w:p>
+            <w:r>
+              <w:t>Required for every step</w:t>
+            </w:r>
+          </w:p>
+        </w:tc>
+        <w:tc>
+          <w:tcPr>
+            <w:tcW w:type="dxa" w:w="4392"/>
+            <w:tcBorders>
+              <w:top w:val="single" w:sz="4" w:color="D9D9D9"/>
+              <w:left w:val="single" w:sz="4" w:color="D9D9D9"/>
+              <w:bottom w:val="single" w:sz="4" w:color="D9D9D9"/>
+              <w:right w:val="single" w:sz="4" w:color="D9D9D9"/>
+              <w:insideH w:val="single" w:sz="4" w:color="D9D9D9"/>
+              <w:insideV w:val="single" w:sz="4" w:color="D9D9D9"/>
+            </w:tcBorders>
+            <w:vAlign w:val="center"/>
+          </w:tcPr>
+          <w:p>
+            <w:r>
+              <w:t>Make restoration and proof explicit</w:t>
+            </w:r>
+          </w:p>
+        </w:tc>
+      </w:tr>
+      <w:tr>
+        <w:tc>
+          <w:tcPr>
+            <w:tcW w:type="dxa" w:w="2160"/>
+            <w:tcBorders>
+              <w:top w:val="single" w:sz="4" w:color="D9D9D9"/>
+              <w:left w:val="single" w:sz="4" w:color="D9D9D9"/>
+              <w:bottom w:val="single" w:sz="4" w:color="D9D9D9"/>
+              <w:right w:val="single" w:sz="4" w:color="D9D9D9"/>
+              <w:insideH w:val="single" w:sz="4" w:color="D9D9D9"/>
+              <w:insideV w:val="single" w:sz="4" w:color="D9D9D9"/>
+            </w:tcBorders>
+            <w:shd w:fill="EAF0F7"/>
+            <w:vAlign w:val="center"/>
+          </w:tcPr>
+          <w:p>
+            <w:r>
+              <w:t>Command surface</w:t>
+            </w:r>
+          </w:p>
+        </w:tc>
+        <w:tc>
+          <w:tcPr>
+            <w:tcW w:type="dxa" w:w="3384"/>
+            <w:tcBorders>
+              <w:top w:val="single" w:sz="4" w:color="D9D9D9"/>
+              <w:left w:val="single" w:sz="4" w:color="D9D9D9"/>
+              <w:bottom w:val="single" w:sz="4" w:color="D9D9D9"/>
+              <w:right w:val="single" w:sz="4" w:color="D9D9D9"/>
+              <w:insideH w:val="single" w:sz="4" w:color="D9D9D9"/>
+              <w:insideV w:val="single" w:sz="4" w:color="D9D9D9"/>
+            </w:tcBorders>
+            <w:shd w:fill="EAF0F7"/>
+            <w:vAlign w:val="center"/>
+          </w:tcPr>
+          <w:p>
+            <w:r>
+              <w:t>Allowlisted actions only</w:t>
+            </w:r>
+          </w:p>
+        </w:tc>
+        <w:tc>
+          <w:tcPr>
+            <w:tcW w:type="dxa" w:w="4392"/>
+            <w:tcBorders>
+              <w:top w:val="single" w:sz="4" w:color="D9D9D9"/>
+              <w:left w:val="single" w:sz="4" w:color="D9D9D9"/>
+              <w:bottom w:val="single" w:sz="4" w:color="D9D9D9"/>
+              <w:right w:val="single" w:sz="4" w:color="D9D9D9"/>
+              <w:insideH w:val="single" w:sz="4" w:color="D9D9D9"/>
+              <w:insideV w:val="single" w:sz="4" w:color="D9D9D9"/>
+            </w:tcBorders>
+            <w:shd w:fill="EAF0F7"/>
+            <w:vAlign w:val="center"/>
+          </w:tcPr>
+          <w:p>
+            <w:r>
+              <w:t>Exclude arbitrary command execution</w:t>
+            </w:r>
+          </w:p>
+        </w:tc>
+      </w:tr>
+    </w:tbl>
+    <w:p/>
+    <w:p>
+      <w:r>
+        <w:t>An active campaign creates an immutable execution snapshot and one pending result per ordered step. Results move through injection, observation, recovery, and terminal states using optimistic versions. Required failure or skip fails the completed execution; optional failures remain informative. Exact replay remains valid after campaign archival.</w:t>
+      </w:r>
+    </w:p>
+    <w:p>
+      <w:r>
+        <w:br w:type="page"/>
+      </w:r>
+    </w:p>
+    <w:p>
+      <w:pPr>
+        <w:pStyle w:val="Heading1"/>
+      </w:pPr>
+      <w:r>
+        <w:t>11 Events and Audit</w:t>
       </w:r>
     </w:p>
     <w:tbl>
@@ -3578,6 +4222,310 @@
           </w:p>
         </w:tc>
       </w:tr>
+      <w:tr>
+        <w:tc>
+          <w:tcPr>
+            <w:tcW w:type="dxa" w:w="2376"/>
+            <w:tcBorders>
+              <w:top w:val="single" w:sz="4" w:color="D9D9D9"/>
+              <w:left w:val="single" w:sz="4" w:color="D9D9D9"/>
+              <w:bottom w:val="single" w:sz="4" w:color="D9D9D9"/>
+              <w:right w:val="single" w:sz="4" w:color="D9D9D9"/>
+              <w:insideH w:val="single" w:sz="4" w:color="D9D9D9"/>
+              <w:insideV w:val="single" w:sz="4" w:color="D9D9D9"/>
+            </w:tcBorders>
+            <w:shd w:fill="EAF0F7"/>
+            <w:vAlign w:val="center"/>
+          </w:tcPr>
+          <w:p>
+            <w:r>
+              <w:t>Create fault campaign</w:t>
+            </w:r>
+          </w:p>
+        </w:tc>
+        <w:tc>
+          <w:tcPr>
+            <w:tcW w:type="dxa" w:w="4536"/>
+            <w:tcBorders>
+              <w:top w:val="single" w:sz="4" w:color="D9D9D9"/>
+              <w:left w:val="single" w:sz="4" w:color="D9D9D9"/>
+              <w:bottom w:val="single" w:sz="4" w:color="D9D9D9"/>
+              <w:right w:val="single" w:sz="4" w:color="D9D9D9"/>
+              <w:insideH w:val="single" w:sz="4" w:color="D9D9D9"/>
+              <w:insideV w:val="single" w:sz="4" w:color="D9D9D9"/>
+            </w:tcBorders>
+            <w:shd w:fill="EAF0F7"/>
+            <w:vAlign w:val="center"/>
+          </w:tcPr>
+          <w:p>
+            <w:r>
+              <w:t>atep.fault_campaign.created.v1</w:t>
+            </w:r>
+          </w:p>
+        </w:tc>
+        <w:tc>
+          <w:tcPr>
+            <w:tcW w:type="dxa" w:w="3024"/>
+            <w:tcBorders>
+              <w:top w:val="single" w:sz="4" w:color="D9D9D9"/>
+              <w:left w:val="single" w:sz="4" w:color="D9D9D9"/>
+              <w:bottom w:val="single" w:sz="4" w:color="D9D9D9"/>
+              <w:right w:val="single" w:sz="4" w:color="D9D9D9"/>
+              <w:insideH w:val="single" w:sz="4" w:color="D9D9D9"/>
+              <w:insideV w:val="single" w:sz="4" w:color="D9D9D9"/>
+            </w:tcBorders>
+            <w:shd w:fill="EAF0F7"/>
+            <w:vAlign w:val="center"/>
+          </w:tcPr>
+          <w:p>
+            <w:r>
+              <w:t>fault_campaign.created</w:t>
+            </w:r>
+          </w:p>
+        </w:tc>
+      </w:tr>
+      <w:tr>
+        <w:tc>
+          <w:tcPr>
+            <w:tcW w:type="dxa" w:w="2376"/>
+            <w:tcBorders>
+              <w:top w:val="single" w:sz="4" w:color="D9D9D9"/>
+              <w:left w:val="single" w:sz="4" w:color="D9D9D9"/>
+              <w:bottom w:val="single" w:sz="4" w:color="D9D9D9"/>
+              <w:right w:val="single" w:sz="4" w:color="D9D9D9"/>
+              <w:insideH w:val="single" w:sz="4" w:color="D9D9D9"/>
+              <w:insideV w:val="single" w:sz="4" w:color="D9D9D9"/>
+            </w:tcBorders>
+            <w:vAlign w:val="center"/>
+          </w:tcPr>
+          <w:p>
+            <w:r>
+              <w:t>Change campaign status</w:t>
+            </w:r>
+          </w:p>
+        </w:tc>
+        <w:tc>
+          <w:tcPr>
+            <w:tcW w:type="dxa" w:w="4536"/>
+            <w:tcBorders>
+              <w:top w:val="single" w:sz="4" w:color="D9D9D9"/>
+              <w:left w:val="single" w:sz="4" w:color="D9D9D9"/>
+              <w:bottom w:val="single" w:sz="4" w:color="D9D9D9"/>
+              <w:right w:val="single" w:sz="4" w:color="D9D9D9"/>
+              <w:insideH w:val="single" w:sz="4" w:color="D9D9D9"/>
+              <w:insideV w:val="single" w:sz="4" w:color="D9D9D9"/>
+            </w:tcBorders>
+            <w:vAlign w:val="center"/>
+          </w:tcPr>
+          <w:p>
+            <w:r>
+              <w:t>atep.fault_campaign.status_changed.v1</w:t>
+            </w:r>
+          </w:p>
+        </w:tc>
+        <w:tc>
+          <w:tcPr>
+            <w:tcW w:type="dxa" w:w="3024"/>
+            <w:tcBorders>
+              <w:top w:val="single" w:sz="4" w:color="D9D9D9"/>
+              <w:left w:val="single" w:sz="4" w:color="D9D9D9"/>
+              <w:bottom w:val="single" w:sz="4" w:color="D9D9D9"/>
+              <w:right w:val="single" w:sz="4" w:color="D9D9D9"/>
+              <w:insideH w:val="single" w:sz="4" w:color="D9D9D9"/>
+              <w:insideV w:val="single" w:sz="4" w:color="D9D9D9"/>
+            </w:tcBorders>
+            <w:vAlign w:val="center"/>
+          </w:tcPr>
+          <w:p>
+            <w:r>
+              <w:t>fault_campaign.status_changed</w:t>
+            </w:r>
+          </w:p>
+        </w:tc>
+      </w:tr>
+      <w:tr>
+        <w:tc>
+          <w:tcPr>
+            <w:tcW w:type="dxa" w:w="2376"/>
+            <w:tcBorders>
+              <w:top w:val="single" w:sz="4" w:color="D9D9D9"/>
+              <w:left w:val="single" w:sz="4" w:color="D9D9D9"/>
+              <w:bottom w:val="single" w:sz="4" w:color="D9D9D9"/>
+              <w:right w:val="single" w:sz="4" w:color="D9D9D9"/>
+              <w:insideH w:val="single" w:sz="4" w:color="D9D9D9"/>
+              <w:insideV w:val="single" w:sz="4" w:color="D9D9D9"/>
+            </w:tcBorders>
+            <w:shd w:fill="EAF0F7"/>
+            <w:vAlign w:val="center"/>
+          </w:tcPr>
+          <w:p>
+            <w:r>
+              <w:t>Create fault execution</w:t>
+            </w:r>
+          </w:p>
+        </w:tc>
+        <w:tc>
+          <w:tcPr>
+            <w:tcW w:type="dxa" w:w="4536"/>
+            <w:tcBorders>
+              <w:top w:val="single" w:sz="4" w:color="D9D9D9"/>
+              <w:left w:val="single" w:sz="4" w:color="D9D9D9"/>
+              <w:bottom w:val="single" w:sz="4" w:color="D9D9D9"/>
+              <w:right w:val="single" w:sz="4" w:color="D9D9D9"/>
+              <w:insideH w:val="single" w:sz="4" w:color="D9D9D9"/>
+              <w:insideV w:val="single" w:sz="4" w:color="D9D9D9"/>
+            </w:tcBorders>
+            <w:shd w:fill="EAF0F7"/>
+            <w:vAlign w:val="center"/>
+          </w:tcPr>
+          <w:p>
+            <w:r>
+              <w:t>atep.fault_campaign.execution.requested.v1</w:t>
+            </w:r>
+          </w:p>
+        </w:tc>
+        <w:tc>
+          <w:tcPr>
+            <w:tcW w:type="dxa" w:w="3024"/>
+            <w:tcBorders>
+              <w:top w:val="single" w:sz="4" w:color="D9D9D9"/>
+              <w:left w:val="single" w:sz="4" w:color="D9D9D9"/>
+              <w:bottom w:val="single" w:sz="4" w:color="D9D9D9"/>
+              <w:right w:val="single" w:sz="4" w:color="D9D9D9"/>
+              <w:insideH w:val="single" w:sz="4" w:color="D9D9D9"/>
+              <w:insideV w:val="single" w:sz="4" w:color="D9D9D9"/>
+            </w:tcBorders>
+            <w:shd w:fill="EAF0F7"/>
+            <w:vAlign w:val="center"/>
+          </w:tcPr>
+          <w:p>
+            <w:r>
+              <w:t>fault_campaign.execution_requested</w:t>
+            </w:r>
+          </w:p>
+        </w:tc>
+      </w:tr>
+      <w:tr>
+        <w:tc>
+          <w:tcPr>
+            <w:tcW w:type="dxa" w:w="2376"/>
+            <w:tcBorders>
+              <w:top w:val="single" w:sz="4" w:color="D9D9D9"/>
+              <w:left w:val="single" w:sz="4" w:color="D9D9D9"/>
+              <w:bottom w:val="single" w:sz="4" w:color="D9D9D9"/>
+              <w:right w:val="single" w:sz="4" w:color="D9D9D9"/>
+              <w:insideH w:val="single" w:sz="4" w:color="D9D9D9"/>
+              <w:insideV w:val="single" w:sz="4" w:color="D9D9D9"/>
+            </w:tcBorders>
+            <w:vAlign w:val="center"/>
+          </w:tcPr>
+          <w:p>
+            <w:r>
+              <w:t>Record fault step</w:t>
+            </w:r>
+          </w:p>
+        </w:tc>
+        <w:tc>
+          <w:tcPr>
+            <w:tcW w:type="dxa" w:w="4536"/>
+            <w:tcBorders>
+              <w:top w:val="single" w:sz="4" w:color="D9D9D9"/>
+              <w:left w:val="single" w:sz="4" w:color="D9D9D9"/>
+              <w:bottom w:val="single" w:sz="4" w:color="D9D9D9"/>
+              <w:right w:val="single" w:sz="4" w:color="D9D9D9"/>
+              <w:insideH w:val="single" w:sz="4" w:color="D9D9D9"/>
+              <w:insideV w:val="single" w:sz="4" w:color="D9D9D9"/>
+            </w:tcBorders>
+            <w:vAlign w:val="center"/>
+          </w:tcPr>
+          <w:p>
+            <w:r>
+              <w:t>atep.fault_campaign.step_recorded.v1</w:t>
+            </w:r>
+          </w:p>
+        </w:tc>
+        <w:tc>
+          <w:tcPr>
+            <w:tcW w:type="dxa" w:w="3024"/>
+            <w:tcBorders>
+              <w:top w:val="single" w:sz="4" w:color="D9D9D9"/>
+              <w:left w:val="single" w:sz="4" w:color="D9D9D9"/>
+              <w:bottom w:val="single" w:sz="4" w:color="D9D9D9"/>
+              <w:right w:val="single" w:sz="4" w:color="D9D9D9"/>
+              <w:insideH w:val="single" w:sz="4" w:color="D9D9D9"/>
+              <w:insideV w:val="single" w:sz="4" w:color="D9D9D9"/>
+            </w:tcBorders>
+            <w:vAlign w:val="center"/>
+          </w:tcPr>
+          <w:p>
+            <w:r>
+              <w:t>fault_campaign.step_recorded</w:t>
+            </w:r>
+          </w:p>
+        </w:tc>
+      </w:tr>
+      <w:tr>
+        <w:tc>
+          <w:tcPr>
+            <w:tcW w:type="dxa" w:w="2376"/>
+            <w:tcBorders>
+              <w:top w:val="single" w:sz="4" w:color="D9D9D9"/>
+              <w:left w:val="single" w:sz="4" w:color="D9D9D9"/>
+              <w:bottom w:val="single" w:sz="4" w:color="D9D9D9"/>
+              <w:right w:val="single" w:sz="4" w:color="D9D9D9"/>
+              <w:insideH w:val="single" w:sz="4" w:color="D9D9D9"/>
+              <w:insideV w:val="single" w:sz="4" w:color="D9D9D9"/>
+            </w:tcBorders>
+            <w:shd w:fill="EAF0F7"/>
+            <w:vAlign w:val="center"/>
+          </w:tcPr>
+          <w:p>
+            <w:r>
+              <w:t>Cancel fault execution</w:t>
+            </w:r>
+          </w:p>
+        </w:tc>
+        <w:tc>
+          <w:tcPr>
+            <w:tcW w:type="dxa" w:w="4536"/>
+            <w:tcBorders>
+              <w:top w:val="single" w:sz="4" w:color="D9D9D9"/>
+              <w:left w:val="single" w:sz="4" w:color="D9D9D9"/>
+              <w:bottom w:val="single" w:sz="4" w:color="D9D9D9"/>
+              <w:right w:val="single" w:sz="4" w:color="D9D9D9"/>
+              <w:insideH w:val="single" w:sz="4" w:color="D9D9D9"/>
+              <w:insideV w:val="single" w:sz="4" w:color="D9D9D9"/>
+            </w:tcBorders>
+            <w:shd w:fill="EAF0F7"/>
+            <w:vAlign w:val="center"/>
+          </w:tcPr>
+          <w:p>
+            <w:r>
+              <w:t>atep.fault_campaign.execution.cancelled.v1</w:t>
+            </w:r>
+          </w:p>
+        </w:tc>
+        <w:tc>
+          <w:tcPr>
+            <w:tcW w:type="dxa" w:w="3024"/>
+            <w:tcBorders>
+              <w:top w:val="single" w:sz="4" w:color="D9D9D9"/>
+              <w:left w:val="single" w:sz="4" w:color="D9D9D9"/>
+              <w:bottom w:val="single" w:sz="4" w:color="D9D9D9"/>
+              <w:right w:val="single" w:sz="4" w:color="D9D9D9"/>
+              <w:insideH w:val="single" w:sz="4" w:color="D9D9D9"/>
+              <w:insideV w:val="single" w:sz="4" w:color="D9D9D9"/>
+            </w:tcBorders>
+            <w:shd w:fill="EAF0F7"/>
+            <w:vAlign w:val="center"/>
+          </w:tcPr>
+          <w:p>
+            <w:r>
+              <w:t>fault_campaign.execution_cancelled</w:t>
+            </w:r>
+          </w:p>
+        </w:tc>
+      </w:tr>
     </w:tbl>
     <w:p/>
     <w:p>
@@ -3595,7 +4543,7 @@
         <w:pStyle w:val="Heading1"/>
       </w:pPr>
       <w:r>
-        <w:t>11 Engineering Decisions</w:t>
+        <w:t>12 Engineering Decisions</w:t>
       </w:r>
     </w:p>
     <w:tbl>
@@ -4108,6 +5056,127 @@
           </w:p>
         </w:tc>
       </w:tr>
+      <w:tr>
+        <w:tc>
+          <w:tcPr>
+            <w:tcW w:type="dxa" w:w="2376"/>
+            <w:tcBorders>
+              <w:top w:val="single" w:sz="4" w:color="D9D9D9"/>
+              <w:left w:val="single" w:sz="4" w:color="D9D9D9"/>
+              <w:bottom w:val="single" w:sz="4" w:color="D9D9D9"/>
+              <w:right w:val="single" w:sz="4" w:color="D9D9D9"/>
+              <w:insideH w:val="single" w:sz="4" w:color="D9D9D9"/>
+              <w:insideV w:val="single" w:sz="4" w:color="D9D9D9"/>
+            </w:tcBorders>
+            <w:shd w:fill="EAF0F7"/>
+            <w:vAlign w:val="center"/>
+          </w:tcPr>
+          <w:p>
+            <w:r>
+              <w:t>Keep native mutation in domains</w:t>
+            </w:r>
+          </w:p>
+        </w:tc>
+        <w:tc>
+          <w:tcPr>
+            <w:tcW w:type="dxa" w:w="3960"/>
+            <w:tcBorders>
+              <w:top w:val="single" w:sz="4" w:color="D9D9D9"/>
+              <w:left w:val="single" w:sz="4" w:color="D9D9D9"/>
+              <w:bottom w:val="single" w:sz="4" w:color="D9D9D9"/>
+              <w:right w:val="single" w:sz="4" w:color="D9D9D9"/>
+              <w:insideH w:val="single" w:sz="4" w:color="D9D9D9"/>
+              <w:insideV w:val="single" w:sz="4" w:color="D9D9D9"/>
+            </w:tcBorders>
+            <w:shd w:fill="EAF0F7"/>
+            <w:vAlign w:val="center"/>
+          </w:tcPr>
+          <w:p>
+            <w:r>
+              <w:t>Preserve simulator ownership</w:t>
+            </w:r>
+          </w:p>
+        </w:tc>
+        <w:tc>
+          <w:tcPr>
+            <w:tcW w:type="dxa" w:w="3600"/>
+            <w:tcBorders>
+              <w:top w:val="single" w:sz="4" w:color="D9D9D9"/>
+              <w:left w:val="single" w:sz="4" w:color="D9D9D9"/>
+              <w:bottom w:val="single" w:sz="4" w:color="D9D9D9"/>
+              <w:right w:val="single" w:sz="4" w:color="D9D9D9"/>
+              <w:insideH w:val="single" w:sz="4" w:color="D9D9D9"/>
+              <w:insideV w:val="single" w:sz="4" w:color="D9D9D9"/>
+            </w:tcBorders>
+            <w:shd w:fill="EAF0F7"/>
+            <w:vAlign w:val="center"/>
+          </w:tcPr>
+          <w:p>
+            <w:r>
+              <w:t>Automatic adapters remain VIII-7</w:t>
+            </w:r>
+          </w:p>
+        </w:tc>
+      </w:tr>
+      <w:tr>
+        <w:tc>
+          <w:tcPr>
+            <w:tcW w:type="dxa" w:w="2376"/>
+            <w:tcBorders>
+              <w:top w:val="single" w:sz="4" w:color="D9D9D9"/>
+              <w:left w:val="single" w:sz="4" w:color="D9D9D9"/>
+              <w:bottom w:val="single" w:sz="4" w:color="D9D9D9"/>
+              <w:right w:val="single" w:sz="4" w:color="D9D9D9"/>
+              <w:insideH w:val="single" w:sz="4" w:color="D9D9D9"/>
+              <w:insideV w:val="single" w:sz="4" w:color="D9D9D9"/>
+            </w:tcBorders>
+            <w:vAlign w:val="center"/>
+          </w:tcPr>
+          <w:p>
+            <w:r>
+              <w:t>Require recovery intent</w:t>
+            </w:r>
+          </w:p>
+        </w:tc>
+        <w:tc>
+          <w:tcPr>
+            <w:tcW w:type="dxa" w:w="3960"/>
+            <w:tcBorders>
+              <w:top w:val="single" w:sz="4" w:color="D9D9D9"/>
+              <w:left w:val="single" w:sz="4" w:color="D9D9D9"/>
+              <w:bottom w:val="single" w:sz="4" w:color="D9D9D9"/>
+              <w:right w:val="single" w:sz="4" w:color="D9D9D9"/>
+              <w:insideH w:val="single" w:sz="4" w:color="D9D9D9"/>
+              <w:insideV w:val="single" w:sz="4" w:color="D9D9D9"/>
+            </w:tcBorders>
+            <w:vAlign w:val="center"/>
+          </w:tcPr>
+          <w:p>
+            <w:r>
+              <w:t>Make safe restoration testable</w:t>
+            </w:r>
+          </w:p>
+        </w:tc>
+        <w:tc>
+          <w:tcPr>
+            <w:tcW w:type="dxa" w:w="3600"/>
+            <w:tcBorders>
+              <w:top w:val="single" w:sz="4" w:color="D9D9D9"/>
+              <w:left w:val="single" w:sz="4" w:color="D9D9D9"/>
+              <w:bottom w:val="single" w:sz="4" w:color="D9D9D9"/>
+              <w:right w:val="single" w:sz="4" w:color="D9D9D9"/>
+              <w:insideH w:val="single" w:sz="4" w:color="D9D9D9"/>
+              <w:insideV w:val="single" w:sz="4" w:color="D9D9D9"/>
+            </w:tcBorders>
+            <w:vAlign w:val="center"/>
+          </w:tcPr>
+          <w:p>
+            <w:r>
+              <w:t>Every step has a bounded recovery plan</w:t>
+            </w:r>
+          </w:p>
+        </w:tc>
+      </w:tr>
     </w:tbl>
     <w:p/>
     <w:p>
@@ -4120,7 +5189,7 @@
         <w:pStyle w:val="Heading1"/>
       </w:pPr>
       <w:r>
-        <w:t>12 Verification Catalogue</w:t>
+        <w:t>13 Verification Catalogue</w:t>
       </w:r>
     </w:p>
     <w:tbl>
@@ -4695,6 +5764,65 @@
           </w:p>
         </w:tc>
       </w:tr>
+      <w:tr>
+        <w:tc>
+          <w:tcPr>
+            <w:tcW w:type="dxa" w:w="2232"/>
+            <w:tcBorders>
+              <w:top w:val="single" w:sz="4" w:color="D9D9D9"/>
+              <w:left w:val="single" w:sz="4" w:color="D9D9D9"/>
+              <w:bottom w:val="single" w:sz="4" w:color="D9D9D9"/>
+              <w:right w:val="single" w:sz="4" w:color="D9D9D9"/>
+              <w:insideH w:val="single" w:sz="4" w:color="D9D9D9"/>
+              <w:insideV w:val="single" w:sz="4" w:color="D9D9D9"/>
+            </w:tcBorders>
+            <w:vAlign w:val="center"/>
+          </w:tcPr>
+          <w:p>
+            <w:r>
+              <w:t>TF-T-035 to 048</w:t>
+            </w:r>
+          </w:p>
+        </w:tc>
+        <w:tc>
+          <w:tcPr>
+            <w:tcW w:type="dxa" w:w="3528"/>
+            <w:tcBorders>
+              <w:top w:val="single" w:sz="4" w:color="D9D9D9"/>
+              <w:left w:val="single" w:sz="4" w:color="D9D9D9"/>
+              <w:bottom w:val="single" w:sz="4" w:color="D9D9D9"/>
+              <w:right w:val="single" w:sz="4" w:color="D9D9D9"/>
+              <w:insideH w:val="single" w:sz="4" w:color="D9D9D9"/>
+              <w:insideV w:val="single" w:sz="4" w:color="D9D9D9"/>
+            </w:tcBorders>
+            <w:vAlign w:val="center"/>
+          </w:tcPr>
+          <w:p>
+            <w:r>
+              <w:t>Fault campaigns</w:t>
+            </w:r>
+          </w:p>
+        </w:tc>
+        <w:tc>
+          <w:tcPr>
+            <w:tcW w:type="dxa" w:w="4176"/>
+            <w:tcBorders>
+              <w:top w:val="single" w:sz="4" w:color="D9D9D9"/>
+              <w:left w:val="single" w:sz="4" w:color="D9D9D9"/>
+              <w:bottom w:val="single" w:sz="4" w:color="D9D9D9"/>
+              <w:right w:val="single" w:sz="4" w:color="D9D9D9"/>
+              <w:insideH w:val="single" w:sz="4" w:color="D9D9D9"/>
+              <w:insideV w:val="single" w:sz="4" w:color="D9D9D9"/>
+            </w:tcBorders>
+            <w:vAlign w:val="center"/>
+          </w:tcPr>
+          <w:p>
+            <w:r>
+              <w:t>Validate safety, lifecycle, aggregation, evidence, API, and migration</w:t>
+            </w:r>
+          </w:p>
+        </w:tc>
+      </w:tr>
     </w:tbl>
     <w:p/>
     <w:p>
@@ -4707,7 +5835,7 @@
         <w:pStyle w:val="Heading1"/>
       </w:pPr>
       <w:r>
-        <w:t>13 Risks and Controls</w:t>
+        <w:t>14 Risks and Controls</w:t>
       </w:r>
     </w:p>
     <w:tbl>
@@ -5161,6 +6289,186 @@
           </w:p>
         </w:tc>
       </w:tr>
+      <w:tr>
+        <w:tc>
+          <w:tcPr>
+            <w:tcW w:type="dxa" w:w="2160"/>
+            <w:tcBorders>
+              <w:top w:val="single" w:sz="4" w:color="D9D9D9"/>
+              <w:left w:val="single" w:sz="4" w:color="D9D9D9"/>
+              <w:bottom w:val="single" w:sz="4" w:color="D9D9D9"/>
+              <w:right w:val="single" w:sz="4" w:color="D9D9D9"/>
+              <w:insideH w:val="single" w:sz="4" w:color="D9D9D9"/>
+              <w:insideV w:val="single" w:sz="4" w:color="D9D9D9"/>
+            </w:tcBorders>
+            <w:vAlign w:val="center"/>
+          </w:tcPr>
+          <w:p>
+            <w:r>
+              <w:t>Unsafe injection scope</w:t>
+            </w:r>
+          </w:p>
+        </w:tc>
+        <w:tc>
+          <w:tcPr>
+            <w:tcW w:type="dxa" w:w="3672"/>
+            <w:tcBorders>
+              <w:top w:val="single" w:sz="4" w:color="D9D9D9"/>
+              <w:left w:val="single" w:sz="4" w:color="D9D9D9"/>
+              <w:bottom w:val="single" w:sz="4" w:color="D9D9D9"/>
+              <w:right w:val="single" w:sz="4" w:color="D9D9D9"/>
+              <w:insideH w:val="single" w:sz="4" w:color="D9D9D9"/>
+              <w:insideV w:val="single" w:sz="4" w:color="D9D9D9"/>
+            </w:tcBorders>
+            <w:vAlign w:val="center"/>
+          </w:tcPr>
+          <w:p>
+            <w:r>
+              <w:t>Allowlist, blast radius, and time budget</w:t>
+            </w:r>
+          </w:p>
+        </w:tc>
+        <w:tc>
+          <w:tcPr>
+            <w:tcW w:type="dxa" w:w="4104"/>
+            <w:tcBorders>
+              <w:top w:val="single" w:sz="4" w:color="D9D9D9"/>
+              <w:left w:val="single" w:sz="4" w:color="D9D9D9"/>
+              <w:bottom w:val="single" w:sz="4" w:color="D9D9D9"/>
+              <w:right w:val="single" w:sz="4" w:color="D9D9D9"/>
+              <w:insideH w:val="single" w:sz="4" w:color="D9D9D9"/>
+              <w:insideV w:val="single" w:sz="4" w:color="D9D9D9"/>
+            </w:tcBorders>
+            <w:vAlign w:val="center"/>
+          </w:tcPr>
+          <w:p>
+            <w:r>
+              <w:t>Keep fleet scope excluded</w:t>
+            </w:r>
+          </w:p>
+        </w:tc>
+      </w:tr>
+      <w:tr>
+        <w:tc>
+          <w:tcPr>
+            <w:tcW w:type="dxa" w:w="2160"/>
+            <w:tcBorders>
+              <w:top w:val="single" w:sz="4" w:color="D9D9D9"/>
+              <w:left w:val="single" w:sz="4" w:color="D9D9D9"/>
+              <w:bottom w:val="single" w:sz="4" w:color="D9D9D9"/>
+              <w:right w:val="single" w:sz="4" w:color="D9D9D9"/>
+              <w:insideH w:val="single" w:sz="4" w:color="D9D9D9"/>
+              <w:insideV w:val="single" w:sz="4" w:color="D9D9D9"/>
+            </w:tcBorders>
+            <w:shd w:fill="EAF0F7"/>
+            <w:vAlign w:val="center"/>
+          </w:tcPr>
+          <w:p>
+            <w:r>
+              <w:t>Vehicle state not restored</w:t>
+            </w:r>
+          </w:p>
+        </w:tc>
+        <w:tc>
+          <w:tcPr>
+            <w:tcW w:type="dxa" w:w="3672"/>
+            <w:tcBorders>
+              <w:top w:val="single" w:sz="4" w:color="D9D9D9"/>
+              <w:left w:val="single" w:sz="4" w:color="D9D9D9"/>
+              <w:bottom w:val="single" w:sz="4" w:color="D9D9D9"/>
+              <w:right w:val="single" w:sz="4" w:color="D9D9D9"/>
+              <w:insideH w:val="single" w:sz="4" w:color="D9D9D9"/>
+              <w:insideV w:val="single" w:sz="4" w:color="D9D9D9"/>
+            </w:tcBorders>
+            <w:shd w:fill="EAF0F7"/>
+            <w:vAlign w:val="center"/>
+          </w:tcPr>
+          <w:p>
+            <w:r>
+              <w:t>Required recovery and verification</w:t>
+            </w:r>
+          </w:p>
+        </w:tc>
+        <w:tc>
+          <w:tcPr>
+            <w:tcW w:type="dxa" w:w="4104"/>
+            <w:tcBorders>
+              <w:top w:val="single" w:sz="4" w:color="D9D9D9"/>
+              <w:left w:val="single" w:sz="4" w:color="D9D9D9"/>
+              <w:bottom w:val="single" w:sz="4" w:color="D9D9D9"/>
+              <w:right w:val="single" w:sz="4" w:color="D9D9D9"/>
+              <w:insideH w:val="single" w:sz="4" w:color="D9D9D9"/>
+              <w:insideV w:val="single" w:sz="4" w:color="D9D9D9"/>
+            </w:tcBorders>
+            <w:shd w:fill="EAF0F7"/>
+            <w:vAlign w:val="center"/>
+          </w:tcPr>
+          <w:p>
+            <w:r>
+              <w:t>Adapters report recovery evidence in VIII-7</w:t>
+            </w:r>
+          </w:p>
+        </w:tc>
+      </w:tr>
+      <w:tr>
+        <w:tc>
+          <w:tcPr>
+            <w:tcW w:type="dxa" w:w="2160"/>
+            <w:tcBorders>
+              <w:top w:val="single" w:sz="4" w:color="D9D9D9"/>
+              <w:left w:val="single" w:sz="4" w:color="D9D9D9"/>
+              <w:bottom w:val="single" w:sz="4" w:color="D9D9D9"/>
+              <w:right w:val="single" w:sz="4" w:color="D9D9D9"/>
+              <w:insideH w:val="single" w:sz="4" w:color="D9D9D9"/>
+              <w:insideV w:val="single" w:sz="4" w:color="D9D9D9"/>
+            </w:tcBorders>
+            <w:vAlign w:val="center"/>
+          </w:tcPr>
+          <w:p>
+            <w:r>
+              <w:t>Resource-heavy early benchmarks</w:t>
+            </w:r>
+          </w:p>
+        </w:tc>
+        <w:tc>
+          <w:tcPr>
+            <w:tcW w:type="dxa" w:w="3672"/>
+            <w:tcBorders>
+              <w:top w:val="single" w:sz="4" w:color="D9D9D9"/>
+              <w:left w:val="single" w:sz="4" w:color="D9D9D9"/>
+              <w:bottom w:val="single" w:sz="4" w:color="D9D9D9"/>
+              <w:right w:val="single" w:sz="4" w:color="D9D9D9"/>
+              <w:insideH w:val="single" w:sz="4" w:color="D9D9D9"/>
+              <w:insideV w:val="single" w:sz="4" w:color="D9D9D9"/>
+            </w:tcBorders>
+            <w:vAlign w:val="center"/>
+          </w:tcPr>
+          <w:p>
+            <w:r>
+              <w:t>Defer VIII-4 until stable baselines</w:t>
+            </w:r>
+          </w:p>
+        </w:tc>
+        <w:tc>
+          <w:tcPr>
+            <w:tcW w:type="dxa" w:w="4104"/>
+            <w:tcBorders>
+              <w:top w:val="single" w:sz="4" w:color="D9D9D9"/>
+              <w:left w:val="single" w:sz="4" w:color="D9D9D9"/>
+              <w:bottom w:val="single" w:sz="4" w:color="D9D9D9"/>
+              <w:right w:val="single" w:sz="4" w:color="D9D9D9"/>
+              <w:insideH w:val="single" w:sz="4" w:color="D9D9D9"/>
+              <w:insideV w:val="single" w:sz="4" w:color="D9D9D9"/>
+            </w:tcBorders>
+            <w:vAlign w:val="center"/>
+          </w:tcPr>
+          <w:p>
+            <w:r>
+              <w:t>Run bounded CPU-only functional tests now</w:t>
+            </w:r>
+          </w:p>
+        </w:tc>
+      </w:tr>
     </w:tbl>
     <w:p/>
     <w:p>
@@ -5168,12 +6476,12 @@
         <w:pStyle w:val="Heading1"/>
       </w:pPr>
       <w:r>
-        <w:t>14 Study Exercises</w:t>
+        <w:t>15 Study Exercises</w:t>
       </w:r>
     </w:p>
     <w:p>
       <w:r>
-        <w:t>Create one ADAS definition and identify its invariants. Then run two required cases, explain the aggregate result, and compare an exact retry after suite archival with a new run request for the archived suite. Schedule the same suite, archive it, and explain why the stored job can still dispatch reproducibly.</w:t>
+        <w:t>Create one ADAS definition and identify its invariants. Then run two required cases, explain the aggregate result, and compare an exact retry after suite archival with a new run request for the archived suite. Schedule the same suite, archive it, and explain why the stored job can still dispatch reproducibly. Finally, design one battery-temperature fault with recovery verification and explain why the campaign contract must not expose an arbitrary shell or adapter command.</w:t>
       </w:r>
     </w:p>
     <w:p>
@@ -5181,12 +6489,12 @@
         <w:pStyle w:val="Heading1"/>
       </w:pPr>
       <w:r>
-        <w:t>15 Next Development</w:t>
+        <w:t>16 Next Development</w:t>
       </w:r>
     </w:p>
     <w:p>
       <w:r>
-        <w:t>VIII-4 will add bounded performance and stress profiles, acceptance thresholds, resource budgets, and comparable trend evidence while preserving VIII-3 selection snapshots.</w:t>
+        <w:t>VIII-6 will add mutation operators, kill-rate evidence, requirement coverage, and gap analysis. VIII-4 remains planned near project completion, when stable baselines make performance thresholds and comparable trends meaningful.</w:t>
       </w:r>
     </w:p>
     <w:sectPr>

</xml_diff>

<commit_message>
feat(test-framework): add fault campaigns (#94)
</commit_message>
<xml_diff>
--- a/docs/ATEP_Volume_VIII_Test_Framework_Engineering_Workbook.docx
+++ b/docs/ATEP_Volume_VIII_Test_Framework_Engineering_Workbook.docx
@@ -19,12 +19,12 @@
         <w:rPr>
           <w:b/>
         </w:rPr>
-        <w:t>Version 0.3.0   VIII 3 Scheduler and Selection Implemented</w:t>
+        <w:t>Version 0.4.0   VIII 5 Fault Campaigns Implemented</w:t>
       </w:r>
     </w:p>
     <w:p>
       <w:r>
-        <w:t>This workbook records the catalog, execution-binding, and scheduled-selection baseline for ATEP. Reusable definitions describe test intent, suites preserve reviewed composition, and catalog-backed runs now persist deterministic case results and aggregate outcomes.</w:t>
+        <w:t>This workbook records the catalog, execution-binding, scheduled-selection, and bounded fault-campaign baseline for ATEP. Reusable definitions describe test intent, suites preserve reviewed composition, and catalog-backed runs now persist deterministic case results and aggregate outcomes.</w:t>
       </w:r>
     </w:p>
     <w:tbl>
@@ -125,7 +125,7 @@
           </w:tcPr>
           <w:p>
             <w:r>
-              <w:t>VIII-1, VIII-2, and VIII-3 implemented and verified</w:t>
+              <w:t>VIII-1, VIII-2, VIII-3, and VIII-5 implemented and verified</w:t>
             </w:r>
           </w:p>
         </w:tc>
@@ -289,7 +289,7 @@
           </w:tcPr>
           <w:p>
             <w:r>
-              <w:t>VIII-4 performance and stress profiles, thresholds, and trends</w:t>
+              <w:t>VIII-6 mutation testing and coverage; VIII-4 deferred</w:t>
             </w:r>
           </w:p>
         </w:tc>
@@ -306,7 +306,7 @@
     </w:p>
     <w:p>
       <w:r>
-        <w:t>VIII-1 separates reusable test design from test execution. A definition captures one test's preconditions, actions, inputs, expectations, classification, and resource budget. A suite selects active definitions in an explicit order and freezes their versions. VIII-2 binds that snapshot to a run and records each case outcome. VIII-3 schedules that immutable intent for later smoke, sanity, or regression execution.</w:t>
+        <w:t>VIII-1 separates reusable test design from test execution. A definition captures one test's preconditions, actions, inputs, expectations, classification, and resource budget. A suite selects active definitions in an explicit order and freezes their versions. VIII-2 binds that snapshot to a run and records each case outcome. VIII-3 schedules that immutable intent for later smoke, sanity, or regression execution. VIII-5 adds cross-domain fault campaigns with recovery plans and evidence.</w:t>
       </w:r>
     </w:p>
     <w:p>
@@ -330,7 +330,7 @@
         <w:pStyle w:val="ListBullet"/>
       </w:pPr>
       <w:r>
-        <w:t>Performance, stress, campaigns, mutation testing, and coverage remain later increments.</w:t>
+        <w:t>Performance and stress remain planned but are deferred until near completion; mutation testing and coverage are next.</w:t>
       </w:r>
     </w:p>
     <w:p>
@@ -568,7 +568,7 @@
           </w:tcPr>
           <w:p>
             <w:r>
-              <w:t>Linear migrations 0051 through 0053 with reversible schema changes</w:t>
+              <w:t>Linear migrations 0051 through 0054 with reversible schema changes</w:t>
             </w:r>
           </w:p>
         </w:tc>
@@ -609,6 +609,48 @@
           <w:p>
             <w:r>
               <w:t>Materializes and updates ordered cases without rewriting catalog intent</w:t>
+            </w:r>
+          </w:p>
+        </w:tc>
+      </w:tr>
+      <w:tr>
+        <w:tc>
+          <w:tcPr>
+            <w:tcW w:type="dxa" w:w="2232"/>
+            <w:tcBorders>
+              <w:top w:val="single" w:sz="4" w:color="D9D9D9"/>
+              <w:left w:val="single" w:sz="4" w:color="D9D9D9"/>
+              <w:bottom w:val="single" w:sz="4" w:color="D9D9D9"/>
+              <w:right w:val="single" w:sz="4" w:color="D9D9D9"/>
+              <w:insideH w:val="single" w:sz="4" w:color="D9D9D9"/>
+              <w:insideV w:val="single" w:sz="4" w:color="D9D9D9"/>
+            </w:tcBorders>
+            <w:shd w:fill="EAF0F7"/>
+            <w:vAlign w:val="center"/>
+          </w:tcPr>
+          <w:p>
+            <w:r>
+              <w:t>Fault campaigns</w:t>
+            </w:r>
+          </w:p>
+        </w:tc>
+        <w:tc>
+          <w:tcPr>
+            <w:tcW w:type="dxa" w:w="7704"/>
+            <w:tcBorders>
+              <w:top w:val="single" w:sz="4" w:color="D9D9D9"/>
+              <w:left w:val="single" w:sz="4" w:color="D9D9D9"/>
+              <w:bottom w:val="single" w:sz="4" w:color="D9D9D9"/>
+              <w:right w:val="single" w:sz="4" w:color="D9D9D9"/>
+              <w:insideH w:val="single" w:sz="4" w:color="D9D9D9"/>
+              <w:insideV w:val="single" w:sz="4" w:color="D9D9D9"/>
+            </w:tcBorders>
+            <w:shd w:fill="EAF0F7"/>
+            <w:vAlign w:val="center"/>
+          </w:tcPr>
+          <w:p>
+            <w:r>
+              <w:t>Snapshots bounded injection and recovery intent without arbitrary commands</w:t>
             </w:r>
           </w:p>
         </w:tc>
@@ -1812,6 +1854,127 @@
           <w:p>
             <w:r>
               <w:t>List and detail</w:t>
+            </w:r>
+          </w:p>
+        </w:tc>
+        <w:tc>
+          <w:tcPr>
+            <w:tcW w:type="dxa" w:w="2880"/>
+            <w:tcBorders>
+              <w:top w:val="single" w:sz="4" w:color="D9D9D9"/>
+              <w:left w:val="single" w:sz="4" w:color="D9D9D9"/>
+              <w:bottom w:val="single" w:sz="4" w:color="D9D9D9"/>
+              <w:right w:val="single" w:sz="4" w:color="D9D9D9"/>
+              <w:insideH w:val="single" w:sz="4" w:color="D9D9D9"/>
+              <w:insideV w:val="single" w:sz="4" w:color="D9D9D9"/>
+            </w:tcBorders>
+            <w:shd w:fill="EAF0F7"/>
+            <w:vAlign w:val="center"/>
+          </w:tcPr>
+          <w:p>
+            <w:r>
+              <w:t>test_catalog:read</w:t>
+            </w:r>
+          </w:p>
+        </w:tc>
+      </w:tr>
+      <w:tr>
+        <w:tc>
+          <w:tcPr>
+            <w:tcW w:type="dxa" w:w="2376"/>
+            <w:tcBorders>
+              <w:top w:val="single" w:sz="4" w:color="D9D9D9"/>
+              <w:left w:val="single" w:sz="4" w:color="D9D9D9"/>
+              <w:bottom w:val="single" w:sz="4" w:color="D9D9D9"/>
+              <w:right w:val="single" w:sz="4" w:color="D9D9D9"/>
+              <w:insideH w:val="single" w:sz="4" w:color="D9D9D9"/>
+              <w:insideV w:val="single" w:sz="4" w:color="D9D9D9"/>
+            </w:tcBorders>
+            <w:vAlign w:val="center"/>
+          </w:tcPr>
+          <w:p>
+            <w:r>
+              <w:t>Fault campaigns</w:t>
+            </w:r>
+          </w:p>
+        </w:tc>
+        <w:tc>
+          <w:tcPr>
+            <w:tcW w:type="dxa" w:w="4680"/>
+            <w:tcBorders>
+              <w:top w:val="single" w:sz="4" w:color="D9D9D9"/>
+              <w:left w:val="single" w:sz="4" w:color="D9D9D9"/>
+              <w:bottom w:val="single" w:sz="4" w:color="D9D9D9"/>
+              <w:right w:val="single" w:sz="4" w:color="D9D9D9"/>
+              <w:insideH w:val="single" w:sz="4" w:color="D9D9D9"/>
+              <w:insideV w:val="single" w:sz="4" w:color="D9D9D9"/>
+            </w:tcBorders>
+            <w:vAlign w:val="center"/>
+          </w:tcPr>
+          <w:p>
+            <w:r>
+              <w:t>Create, status, execute, cancel</w:t>
+            </w:r>
+          </w:p>
+        </w:tc>
+        <w:tc>
+          <w:tcPr>
+            <w:tcW w:type="dxa" w:w="2880"/>
+            <w:tcBorders>
+              <w:top w:val="single" w:sz="4" w:color="D9D9D9"/>
+              <w:left w:val="single" w:sz="4" w:color="D9D9D9"/>
+              <w:bottom w:val="single" w:sz="4" w:color="D9D9D9"/>
+              <w:right w:val="single" w:sz="4" w:color="D9D9D9"/>
+              <w:insideH w:val="single" w:sz="4" w:color="D9D9D9"/>
+              <w:insideV w:val="single" w:sz="4" w:color="D9D9D9"/>
+            </w:tcBorders>
+            <w:vAlign w:val="center"/>
+          </w:tcPr>
+          <w:p>
+            <w:r>
+              <w:t>test_catalog:manage</w:t>
+            </w:r>
+          </w:p>
+        </w:tc>
+      </w:tr>
+      <w:tr>
+        <w:tc>
+          <w:tcPr>
+            <w:tcW w:type="dxa" w:w="2376"/>
+            <w:tcBorders>
+              <w:top w:val="single" w:sz="4" w:color="D9D9D9"/>
+              <w:left w:val="single" w:sz="4" w:color="D9D9D9"/>
+              <w:bottom w:val="single" w:sz="4" w:color="D9D9D9"/>
+              <w:right w:val="single" w:sz="4" w:color="D9D9D9"/>
+              <w:insideH w:val="single" w:sz="4" w:color="D9D9D9"/>
+              <w:insideV w:val="single" w:sz="4" w:color="D9D9D9"/>
+            </w:tcBorders>
+            <w:shd w:fill="EAF0F7"/>
+            <w:vAlign w:val="center"/>
+          </w:tcPr>
+          <w:p>
+            <w:r>
+              <w:t>Fault campaigns</w:t>
+            </w:r>
+          </w:p>
+        </w:tc>
+        <w:tc>
+          <w:tcPr>
+            <w:tcW w:type="dxa" w:w="4680"/>
+            <w:tcBorders>
+              <w:top w:val="single" w:sz="4" w:color="D9D9D9"/>
+              <w:left w:val="single" w:sz="4" w:color="D9D9D9"/>
+              <w:bottom w:val="single" w:sz="4" w:color="D9D9D9"/>
+              <w:right w:val="single" w:sz="4" w:color="D9D9D9"/>
+              <w:insideH w:val="single" w:sz="4" w:color="D9D9D9"/>
+              <w:insideV w:val="single" w:sz="4" w:color="D9D9D9"/>
+            </w:tcBorders>
+            <w:shd w:fill="EAF0F7"/>
+            <w:vAlign w:val="center"/>
+          </w:tcPr>
+          <w:p>
+            <w:r>
+              <w:t>List, detail, and results</w:t>
             </w:r>
           </w:p>
         </w:tc>
@@ -3061,11 +3224,492 @@
     </w:tbl>
     <w:p/>
     <w:p>
+      <w:r>
+        <w:br w:type="page"/>
+      </w:r>
+    </w:p>
+    <w:p>
       <w:pPr>
         <w:pStyle w:val="Heading1"/>
       </w:pPr>
       <w:r>
-        <w:t>10 Events and Audit</w:t>
+        <w:t>10 Fault Campaigns</w:t>
+      </w:r>
+    </w:p>
+    <w:p>
+      <w:r>
+        <w:t>VIII-5 defines reusable campaigns across Digital Vehicle, ECU, CAN, diagnostics, Electric Vehicle, and ADAS. Each step selects a domain-specific allowlisted action, declares an expected effect, and includes a mandatory recovery plan. The framework owns intent and evidence; native simulators retain ownership of the actual state mutation.</w:t>
+      </w:r>
+    </w:p>
+    <w:tbl>
+      <w:tblPr>
+        <w:tblW w:type="auto" w:w="0"/>
+        <w:tblLayout w:type="fixed"/>
+        <w:tblLook w:firstColumn="1" w:firstRow="1" w:lastColumn="0" w:lastRow="0" w:noHBand="0" w:noVBand="1" w:val="04A0"/>
+      </w:tblPr>
+      <w:tblGrid>
+        <w:gridCol w:w="3312"/>
+        <w:gridCol w:w="3312"/>
+        <w:gridCol w:w="3312"/>
+      </w:tblGrid>
+      <w:tr>
+        <w:trPr>
+          <w:tblHeader/>
+        </w:trPr>
+        <w:tc>
+          <w:tcPr>
+            <w:tcW w:type="dxa" w:w="2160"/>
+            <w:shd w:fill="17365D"/>
+            <w:tcBorders>
+              <w:top w:val="single" w:sz="4" w:color="D9D9D9"/>
+              <w:left w:val="single" w:sz="4" w:color="D9D9D9"/>
+              <w:bottom w:val="single" w:sz="4" w:color="D9D9D9"/>
+              <w:right w:val="single" w:sz="4" w:color="D9D9D9"/>
+              <w:insideH w:val="single" w:sz="4" w:color="D9D9D9"/>
+              <w:insideV w:val="single" w:sz="4" w:color="D9D9D9"/>
+            </w:tcBorders>
+            <w:vAlign w:val="center"/>
+          </w:tcPr>
+          <w:p>
+            <w:r>
+              <w:rPr>
+                <w:b/>
+                <w:color w:val="FFFFFF"/>
+              </w:rPr>
+              <w:t>Safety control</w:t>
+            </w:r>
+          </w:p>
+        </w:tc>
+        <w:tc>
+          <w:tcPr>
+            <w:tcW w:type="dxa" w:w="3384"/>
+            <w:shd w:fill="17365D"/>
+            <w:tcBorders>
+              <w:top w:val="single" w:sz="4" w:color="D9D9D9"/>
+              <w:left w:val="single" w:sz="4" w:color="D9D9D9"/>
+              <w:bottom w:val="single" w:sz="4" w:color="D9D9D9"/>
+              <w:right w:val="single" w:sz="4" w:color="D9D9D9"/>
+              <w:insideH w:val="single" w:sz="4" w:color="D9D9D9"/>
+              <w:insideV w:val="single" w:sz="4" w:color="D9D9D9"/>
+            </w:tcBorders>
+            <w:vAlign w:val="center"/>
+          </w:tcPr>
+          <w:p>
+            <w:r>
+              <w:rPr>
+                <w:b/>
+                <w:color w:val="FFFFFF"/>
+              </w:rPr>
+              <w:t>Bound</w:t>
+            </w:r>
+          </w:p>
+        </w:tc>
+        <w:tc>
+          <w:tcPr>
+            <w:tcW w:type="dxa" w:w="4392"/>
+            <w:shd w:fill="17365D"/>
+            <w:tcBorders>
+              <w:top w:val="single" w:sz="4" w:color="D9D9D9"/>
+              <w:left w:val="single" w:sz="4" w:color="D9D9D9"/>
+              <w:bottom w:val="single" w:sz="4" w:color="D9D9D9"/>
+              <w:right w:val="single" w:sz="4" w:color="D9D9D9"/>
+              <w:insideH w:val="single" w:sz="4" w:color="D9D9D9"/>
+              <w:insideV w:val="single" w:sz="4" w:color="D9D9D9"/>
+            </w:tcBorders>
+            <w:vAlign w:val="center"/>
+          </w:tcPr>
+          <w:p>
+            <w:r>
+              <w:rPr>
+                <w:b/>
+                <w:color w:val="FFFFFF"/>
+              </w:rPr>
+              <w:t>Engineering purpose</w:t>
+            </w:r>
+          </w:p>
+        </w:tc>
+      </w:tr>
+      <w:tr>
+        <w:tc>
+          <w:tcPr>
+            <w:tcW w:type="dxa" w:w="2160"/>
+            <w:tcBorders>
+              <w:top w:val="single" w:sz="4" w:color="D9D9D9"/>
+              <w:left w:val="single" w:sz="4" w:color="D9D9D9"/>
+              <w:bottom w:val="single" w:sz="4" w:color="D9D9D9"/>
+              <w:right w:val="single" w:sz="4" w:color="D9D9D9"/>
+              <w:insideH w:val="single" w:sz="4" w:color="D9D9D9"/>
+              <w:insideV w:val="single" w:sz="4" w:color="D9D9D9"/>
+            </w:tcBorders>
+            <w:vAlign w:val="center"/>
+          </w:tcPr>
+          <w:p>
+            <w:r>
+              <w:t>Blast radius</w:t>
+            </w:r>
+          </w:p>
+        </w:tc>
+        <w:tc>
+          <w:tcPr>
+            <w:tcW w:type="dxa" w:w="3384"/>
+            <w:tcBorders>
+              <w:top w:val="single" w:sz="4" w:color="D9D9D9"/>
+              <w:left w:val="single" w:sz="4" w:color="D9D9D9"/>
+              <w:bottom w:val="single" w:sz="4" w:color="D9D9D9"/>
+              <w:right w:val="single" w:sz="4" w:color="D9D9D9"/>
+              <w:insideH w:val="single" w:sz="4" w:color="D9D9D9"/>
+              <w:insideV w:val="single" w:sz="4" w:color="D9D9D9"/>
+            </w:tcBorders>
+            <w:vAlign w:val="center"/>
+          </w:tcPr>
+          <w:p>
+            <w:r>
+              <w:t>Component, network, or vehicle</w:t>
+            </w:r>
+          </w:p>
+        </w:tc>
+        <w:tc>
+          <w:tcPr>
+            <w:tcW w:type="dxa" w:w="4392"/>
+            <w:tcBorders>
+              <w:top w:val="single" w:sz="4" w:color="D9D9D9"/>
+              <w:left w:val="single" w:sz="4" w:color="D9D9D9"/>
+              <w:bottom w:val="single" w:sz="4" w:color="D9D9D9"/>
+              <w:right w:val="single" w:sz="4" w:color="D9D9D9"/>
+              <w:insideH w:val="single" w:sz="4" w:color="D9D9D9"/>
+              <w:insideV w:val="single" w:sz="4" w:color="D9D9D9"/>
+            </w:tcBorders>
+            <w:vAlign w:val="center"/>
+          </w:tcPr>
+          <w:p>
+            <w:r>
+              <w:t>Exclude fleet-wide impact</w:t>
+            </w:r>
+          </w:p>
+        </w:tc>
+      </w:tr>
+      <w:tr>
+        <w:tc>
+          <w:tcPr>
+            <w:tcW w:type="dxa" w:w="2160"/>
+            <w:tcBorders>
+              <w:top w:val="single" w:sz="4" w:color="D9D9D9"/>
+              <w:left w:val="single" w:sz="4" w:color="D9D9D9"/>
+              <w:bottom w:val="single" w:sz="4" w:color="D9D9D9"/>
+              <w:right w:val="single" w:sz="4" w:color="D9D9D9"/>
+              <w:insideH w:val="single" w:sz="4" w:color="D9D9D9"/>
+              <w:insideV w:val="single" w:sz="4" w:color="D9D9D9"/>
+            </w:tcBorders>
+            <w:shd w:fill="EAF0F7"/>
+            <w:vAlign w:val="center"/>
+          </w:tcPr>
+          <w:p>
+            <w:r>
+              <w:t>Campaign size</w:t>
+            </w:r>
+          </w:p>
+        </w:tc>
+        <w:tc>
+          <w:tcPr>
+            <w:tcW w:type="dxa" w:w="3384"/>
+            <w:tcBorders>
+              <w:top w:val="single" w:sz="4" w:color="D9D9D9"/>
+              <w:left w:val="single" w:sz="4" w:color="D9D9D9"/>
+              <w:bottom w:val="single" w:sz="4" w:color="D9D9D9"/>
+              <w:right w:val="single" w:sz="4" w:color="D9D9D9"/>
+              <w:insideH w:val="single" w:sz="4" w:color="D9D9D9"/>
+              <w:insideV w:val="single" w:sz="4" w:color="D9D9D9"/>
+            </w:tcBorders>
+            <w:shd w:fill="EAF0F7"/>
+            <w:vAlign w:val="center"/>
+          </w:tcPr>
+          <w:p>
+            <w:r>
+              <w:t>1 to 32 steps</w:t>
+            </w:r>
+          </w:p>
+        </w:tc>
+        <w:tc>
+          <w:tcPr>
+            <w:tcW w:type="dxa" w:w="4392"/>
+            <w:tcBorders>
+              <w:top w:val="single" w:sz="4" w:color="D9D9D9"/>
+              <w:left w:val="single" w:sz="4" w:color="D9D9D9"/>
+              <w:bottom w:val="single" w:sz="4" w:color="D9D9D9"/>
+              <w:right w:val="single" w:sz="4" w:color="D9D9D9"/>
+              <w:insideH w:val="single" w:sz="4" w:color="D9D9D9"/>
+              <w:insideV w:val="single" w:sz="4" w:color="D9D9D9"/>
+            </w:tcBorders>
+            <w:shd w:fill="EAF0F7"/>
+            <w:vAlign w:val="center"/>
+          </w:tcPr>
+          <w:p>
+            <w:r>
+              <w:t>Bound orchestration and persistence</w:t>
+            </w:r>
+          </w:p>
+        </w:tc>
+      </w:tr>
+      <w:tr>
+        <w:tc>
+          <w:tcPr>
+            <w:tcW w:type="dxa" w:w="2160"/>
+            <w:tcBorders>
+              <w:top w:val="single" w:sz="4" w:color="D9D9D9"/>
+              <w:left w:val="single" w:sz="4" w:color="D9D9D9"/>
+              <w:bottom w:val="single" w:sz="4" w:color="D9D9D9"/>
+              <w:right w:val="single" w:sz="4" w:color="D9D9D9"/>
+              <w:insideH w:val="single" w:sz="4" w:color="D9D9D9"/>
+              <w:insideV w:val="single" w:sz="4" w:color="D9D9D9"/>
+            </w:tcBorders>
+            <w:vAlign w:val="center"/>
+          </w:tcPr>
+          <w:p>
+            <w:r>
+              <w:t>Parameters</w:t>
+            </w:r>
+          </w:p>
+        </w:tc>
+        <w:tc>
+          <w:tcPr>
+            <w:tcW w:type="dxa" w:w="3384"/>
+            <w:tcBorders>
+              <w:top w:val="single" w:sz="4" w:color="D9D9D9"/>
+              <w:left w:val="single" w:sz="4" w:color="D9D9D9"/>
+              <w:bottom w:val="single" w:sz="4" w:color="D9D9D9"/>
+              <w:right w:val="single" w:sz="4" w:color="D9D9D9"/>
+              <w:insideH w:val="single" w:sz="4" w:color="D9D9D9"/>
+              <w:insideV w:val="single" w:sz="4" w:color="D9D9D9"/>
+            </w:tcBorders>
+            <w:vAlign w:val="center"/>
+          </w:tcPr>
+          <w:p>
+            <w:r>
+              <w:t>8192 bytes per step</w:t>
+            </w:r>
+          </w:p>
+        </w:tc>
+        <w:tc>
+          <w:tcPr>
+            <w:tcW w:type="dxa" w:w="4392"/>
+            <w:tcBorders>
+              <w:top w:val="single" w:sz="4" w:color="D9D9D9"/>
+              <w:left w:val="single" w:sz="4" w:color="D9D9D9"/>
+              <w:bottom w:val="single" w:sz="4" w:color="D9D9D9"/>
+              <w:right w:val="single" w:sz="4" w:color="D9D9D9"/>
+              <w:insideH w:val="single" w:sz="4" w:color="D9D9D9"/>
+              <w:insideV w:val="single" w:sz="4" w:color="D9D9D9"/>
+            </w:tcBorders>
+            <w:vAlign w:val="center"/>
+          </w:tcPr>
+          <w:p>
+            <w:r>
+              <w:t>Prevent unbounded structured input</w:t>
+            </w:r>
+          </w:p>
+        </w:tc>
+      </w:tr>
+      <w:tr>
+        <w:tc>
+          <w:tcPr>
+            <w:tcW w:type="dxa" w:w="2160"/>
+            <w:tcBorders>
+              <w:top w:val="single" w:sz="4" w:color="D9D9D9"/>
+              <w:left w:val="single" w:sz="4" w:color="D9D9D9"/>
+              <w:bottom w:val="single" w:sz="4" w:color="D9D9D9"/>
+              <w:right w:val="single" w:sz="4" w:color="D9D9D9"/>
+              <w:insideH w:val="single" w:sz="4" w:color="D9D9D9"/>
+              <w:insideV w:val="single" w:sz="4" w:color="D9D9D9"/>
+            </w:tcBorders>
+            <w:shd w:fill="EAF0F7"/>
+            <w:vAlign w:val="center"/>
+          </w:tcPr>
+          <w:p>
+            <w:r>
+              <w:t>Time budget</w:t>
+            </w:r>
+          </w:p>
+        </w:tc>
+        <w:tc>
+          <w:tcPr>
+            <w:tcW w:type="dxa" w:w="3384"/>
+            <w:tcBorders>
+              <w:top w:val="single" w:sz="4" w:color="D9D9D9"/>
+              <w:left w:val="single" w:sz="4" w:color="D9D9D9"/>
+              <w:bottom w:val="single" w:sz="4" w:color="D9D9D9"/>
+              <w:right w:val="single" w:sz="4" w:color="D9D9D9"/>
+              <w:insideH w:val="single" w:sz="4" w:color="D9D9D9"/>
+              <w:insideV w:val="single" w:sz="4" w:color="D9D9D9"/>
+            </w:tcBorders>
+            <w:shd w:fill="EAF0F7"/>
+            <w:vAlign w:val="center"/>
+          </w:tcPr>
+          <w:p>
+            <w:r>
+              <w:t>30 minutes total</w:t>
+            </w:r>
+          </w:p>
+        </w:tc>
+        <w:tc>
+          <w:tcPr>
+            <w:tcW w:type="dxa" w:w="4392"/>
+            <w:tcBorders>
+              <w:top w:val="single" w:sz="4" w:color="D9D9D9"/>
+              <w:left w:val="single" w:sz="4" w:color="D9D9D9"/>
+              <w:bottom w:val="single" w:sz="4" w:color="D9D9D9"/>
+              <w:right w:val="single" w:sz="4" w:color="D9D9D9"/>
+              <w:insideH w:val="single" w:sz="4" w:color="D9D9D9"/>
+              <w:insideV w:val="single" w:sz="4" w:color="D9D9D9"/>
+            </w:tcBorders>
+            <w:shd w:fill="EAF0F7"/>
+            <w:vAlign w:val="center"/>
+          </w:tcPr>
+          <w:p>
+            <w:r>
+              <w:t>Bound injection and recovery exposure</w:t>
+            </w:r>
+          </w:p>
+        </w:tc>
+      </w:tr>
+      <w:tr>
+        <w:tc>
+          <w:tcPr>
+            <w:tcW w:type="dxa" w:w="2160"/>
+            <w:tcBorders>
+              <w:top w:val="single" w:sz="4" w:color="D9D9D9"/>
+              <w:left w:val="single" w:sz="4" w:color="D9D9D9"/>
+              <w:bottom w:val="single" w:sz="4" w:color="D9D9D9"/>
+              <w:right w:val="single" w:sz="4" w:color="D9D9D9"/>
+              <w:insideH w:val="single" w:sz="4" w:color="D9D9D9"/>
+              <w:insideV w:val="single" w:sz="4" w:color="D9D9D9"/>
+            </w:tcBorders>
+            <w:vAlign w:val="center"/>
+          </w:tcPr>
+          <w:p>
+            <w:r>
+              <w:t>Recovery</w:t>
+            </w:r>
+          </w:p>
+        </w:tc>
+        <w:tc>
+          <w:tcPr>
+            <w:tcW w:type="dxa" w:w="3384"/>
+            <w:tcBorders>
+              <w:top w:val="single" w:sz="4" w:color="D9D9D9"/>
+              <w:left w:val="single" w:sz="4" w:color="D9D9D9"/>
+              <w:bottom w:val="single" w:sz="4" w:color="D9D9D9"/>
+              <w:right w:val="single" w:sz="4" w:color="D9D9D9"/>
+              <w:insideH w:val="single" w:sz="4" w:color="D9D9D9"/>
+              <w:insideV w:val="single" w:sz="4" w:color="D9D9D9"/>
+            </w:tcBorders>
+            <w:vAlign w:val="center"/>
+          </w:tcPr>
+          <w:p>
+            <w:r>
+              <w:t>Required for every step</w:t>
+            </w:r>
+          </w:p>
+        </w:tc>
+        <w:tc>
+          <w:tcPr>
+            <w:tcW w:type="dxa" w:w="4392"/>
+            <w:tcBorders>
+              <w:top w:val="single" w:sz="4" w:color="D9D9D9"/>
+              <w:left w:val="single" w:sz="4" w:color="D9D9D9"/>
+              <w:bottom w:val="single" w:sz="4" w:color="D9D9D9"/>
+              <w:right w:val="single" w:sz="4" w:color="D9D9D9"/>
+              <w:insideH w:val="single" w:sz="4" w:color="D9D9D9"/>
+              <w:insideV w:val="single" w:sz="4" w:color="D9D9D9"/>
+            </w:tcBorders>
+            <w:vAlign w:val="center"/>
+          </w:tcPr>
+          <w:p>
+            <w:r>
+              <w:t>Make restoration and proof explicit</w:t>
+            </w:r>
+          </w:p>
+        </w:tc>
+      </w:tr>
+      <w:tr>
+        <w:tc>
+          <w:tcPr>
+            <w:tcW w:type="dxa" w:w="2160"/>
+            <w:tcBorders>
+              <w:top w:val="single" w:sz="4" w:color="D9D9D9"/>
+              <w:left w:val="single" w:sz="4" w:color="D9D9D9"/>
+              <w:bottom w:val="single" w:sz="4" w:color="D9D9D9"/>
+              <w:right w:val="single" w:sz="4" w:color="D9D9D9"/>
+              <w:insideH w:val="single" w:sz="4" w:color="D9D9D9"/>
+              <w:insideV w:val="single" w:sz="4" w:color="D9D9D9"/>
+            </w:tcBorders>
+            <w:shd w:fill="EAF0F7"/>
+            <w:vAlign w:val="center"/>
+          </w:tcPr>
+          <w:p>
+            <w:r>
+              <w:t>Command surface</w:t>
+            </w:r>
+          </w:p>
+        </w:tc>
+        <w:tc>
+          <w:tcPr>
+            <w:tcW w:type="dxa" w:w="3384"/>
+            <w:tcBorders>
+              <w:top w:val="single" w:sz="4" w:color="D9D9D9"/>
+              <w:left w:val="single" w:sz="4" w:color="D9D9D9"/>
+              <w:bottom w:val="single" w:sz="4" w:color="D9D9D9"/>
+              <w:right w:val="single" w:sz="4" w:color="D9D9D9"/>
+              <w:insideH w:val="single" w:sz="4" w:color="D9D9D9"/>
+              <w:insideV w:val="single" w:sz="4" w:color="D9D9D9"/>
+            </w:tcBorders>
+            <w:shd w:fill="EAF0F7"/>
+            <w:vAlign w:val="center"/>
+          </w:tcPr>
+          <w:p>
+            <w:r>
+              <w:t>Allowlisted actions only</w:t>
+            </w:r>
+          </w:p>
+        </w:tc>
+        <w:tc>
+          <w:tcPr>
+            <w:tcW w:type="dxa" w:w="4392"/>
+            <w:tcBorders>
+              <w:top w:val="single" w:sz="4" w:color="D9D9D9"/>
+              <w:left w:val="single" w:sz="4" w:color="D9D9D9"/>
+              <w:bottom w:val="single" w:sz="4" w:color="D9D9D9"/>
+              <w:right w:val="single" w:sz="4" w:color="D9D9D9"/>
+              <w:insideH w:val="single" w:sz="4" w:color="D9D9D9"/>
+              <w:insideV w:val="single" w:sz="4" w:color="D9D9D9"/>
+            </w:tcBorders>
+            <w:shd w:fill="EAF0F7"/>
+            <w:vAlign w:val="center"/>
+          </w:tcPr>
+          <w:p>
+            <w:r>
+              <w:t>Exclude arbitrary command execution</w:t>
+            </w:r>
+          </w:p>
+        </w:tc>
+      </w:tr>
+    </w:tbl>
+    <w:p/>
+    <w:p>
+      <w:r>
+        <w:t>An active campaign creates an immutable execution snapshot and one pending result per ordered step. Results move through injection, observation, recovery, and terminal states using optimistic versions. Required failure or skip fails the completed execution; optional failures remain informative. Exact replay remains valid after campaign archival.</w:t>
+      </w:r>
+    </w:p>
+    <w:p>
+      <w:r>
+        <w:br w:type="page"/>
+      </w:r>
+    </w:p>
+    <w:p>
+      <w:pPr>
+        <w:pStyle w:val="Heading1"/>
+      </w:pPr>
+      <w:r>
+        <w:t>11 Events and Audit</w:t>
       </w:r>
     </w:p>
     <w:tbl>
@@ -3578,6 +4222,310 @@
           </w:p>
         </w:tc>
       </w:tr>
+      <w:tr>
+        <w:tc>
+          <w:tcPr>
+            <w:tcW w:type="dxa" w:w="2376"/>
+            <w:tcBorders>
+              <w:top w:val="single" w:sz="4" w:color="D9D9D9"/>
+              <w:left w:val="single" w:sz="4" w:color="D9D9D9"/>
+              <w:bottom w:val="single" w:sz="4" w:color="D9D9D9"/>
+              <w:right w:val="single" w:sz="4" w:color="D9D9D9"/>
+              <w:insideH w:val="single" w:sz="4" w:color="D9D9D9"/>
+              <w:insideV w:val="single" w:sz="4" w:color="D9D9D9"/>
+            </w:tcBorders>
+            <w:shd w:fill="EAF0F7"/>
+            <w:vAlign w:val="center"/>
+          </w:tcPr>
+          <w:p>
+            <w:r>
+              <w:t>Create fault campaign</w:t>
+            </w:r>
+          </w:p>
+        </w:tc>
+        <w:tc>
+          <w:tcPr>
+            <w:tcW w:type="dxa" w:w="4536"/>
+            <w:tcBorders>
+              <w:top w:val="single" w:sz="4" w:color="D9D9D9"/>
+              <w:left w:val="single" w:sz="4" w:color="D9D9D9"/>
+              <w:bottom w:val="single" w:sz="4" w:color="D9D9D9"/>
+              <w:right w:val="single" w:sz="4" w:color="D9D9D9"/>
+              <w:insideH w:val="single" w:sz="4" w:color="D9D9D9"/>
+              <w:insideV w:val="single" w:sz="4" w:color="D9D9D9"/>
+            </w:tcBorders>
+            <w:shd w:fill="EAF0F7"/>
+            <w:vAlign w:val="center"/>
+          </w:tcPr>
+          <w:p>
+            <w:r>
+              <w:t>atep.fault_campaign.created.v1</w:t>
+            </w:r>
+          </w:p>
+        </w:tc>
+        <w:tc>
+          <w:tcPr>
+            <w:tcW w:type="dxa" w:w="3024"/>
+            <w:tcBorders>
+              <w:top w:val="single" w:sz="4" w:color="D9D9D9"/>
+              <w:left w:val="single" w:sz="4" w:color="D9D9D9"/>
+              <w:bottom w:val="single" w:sz="4" w:color="D9D9D9"/>
+              <w:right w:val="single" w:sz="4" w:color="D9D9D9"/>
+              <w:insideH w:val="single" w:sz="4" w:color="D9D9D9"/>
+              <w:insideV w:val="single" w:sz="4" w:color="D9D9D9"/>
+            </w:tcBorders>
+            <w:shd w:fill="EAF0F7"/>
+            <w:vAlign w:val="center"/>
+          </w:tcPr>
+          <w:p>
+            <w:r>
+              <w:t>fault_campaign.created</w:t>
+            </w:r>
+          </w:p>
+        </w:tc>
+      </w:tr>
+      <w:tr>
+        <w:tc>
+          <w:tcPr>
+            <w:tcW w:type="dxa" w:w="2376"/>
+            <w:tcBorders>
+              <w:top w:val="single" w:sz="4" w:color="D9D9D9"/>
+              <w:left w:val="single" w:sz="4" w:color="D9D9D9"/>
+              <w:bottom w:val="single" w:sz="4" w:color="D9D9D9"/>
+              <w:right w:val="single" w:sz="4" w:color="D9D9D9"/>
+              <w:insideH w:val="single" w:sz="4" w:color="D9D9D9"/>
+              <w:insideV w:val="single" w:sz="4" w:color="D9D9D9"/>
+            </w:tcBorders>
+            <w:vAlign w:val="center"/>
+          </w:tcPr>
+          <w:p>
+            <w:r>
+              <w:t>Change campaign status</w:t>
+            </w:r>
+          </w:p>
+        </w:tc>
+        <w:tc>
+          <w:tcPr>
+            <w:tcW w:type="dxa" w:w="4536"/>
+            <w:tcBorders>
+              <w:top w:val="single" w:sz="4" w:color="D9D9D9"/>
+              <w:left w:val="single" w:sz="4" w:color="D9D9D9"/>
+              <w:bottom w:val="single" w:sz="4" w:color="D9D9D9"/>
+              <w:right w:val="single" w:sz="4" w:color="D9D9D9"/>
+              <w:insideH w:val="single" w:sz="4" w:color="D9D9D9"/>
+              <w:insideV w:val="single" w:sz="4" w:color="D9D9D9"/>
+            </w:tcBorders>
+            <w:vAlign w:val="center"/>
+          </w:tcPr>
+          <w:p>
+            <w:r>
+              <w:t>atep.fault_campaign.status_changed.v1</w:t>
+            </w:r>
+          </w:p>
+        </w:tc>
+        <w:tc>
+          <w:tcPr>
+            <w:tcW w:type="dxa" w:w="3024"/>
+            <w:tcBorders>
+              <w:top w:val="single" w:sz="4" w:color="D9D9D9"/>
+              <w:left w:val="single" w:sz="4" w:color="D9D9D9"/>
+              <w:bottom w:val="single" w:sz="4" w:color="D9D9D9"/>
+              <w:right w:val="single" w:sz="4" w:color="D9D9D9"/>
+              <w:insideH w:val="single" w:sz="4" w:color="D9D9D9"/>
+              <w:insideV w:val="single" w:sz="4" w:color="D9D9D9"/>
+            </w:tcBorders>
+            <w:vAlign w:val="center"/>
+          </w:tcPr>
+          <w:p>
+            <w:r>
+              <w:t>fault_campaign.status_changed</w:t>
+            </w:r>
+          </w:p>
+        </w:tc>
+      </w:tr>
+      <w:tr>
+        <w:tc>
+          <w:tcPr>
+            <w:tcW w:type="dxa" w:w="2376"/>
+            <w:tcBorders>
+              <w:top w:val="single" w:sz="4" w:color="D9D9D9"/>
+              <w:left w:val="single" w:sz="4" w:color="D9D9D9"/>
+              <w:bottom w:val="single" w:sz="4" w:color="D9D9D9"/>
+              <w:right w:val="single" w:sz="4" w:color="D9D9D9"/>
+              <w:insideH w:val="single" w:sz="4" w:color="D9D9D9"/>
+              <w:insideV w:val="single" w:sz="4" w:color="D9D9D9"/>
+            </w:tcBorders>
+            <w:shd w:fill="EAF0F7"/>
+            <w:vAlign w:val="center"/>
+          </w:tcPr>
+          <w:p>
+            <w:r>
+              <w:t>Create fault execution</w:t>
+            </w:r>
+          </w:p>
+        </w:tc>
+        <w:tc>
+          <w:tcPr>
+            <w:tcW w:type="dxa" w:w="4536"/>
+            <w:tcBorders>
+              <w:top w:val="single" w:sz="4" w:color="D9D9D9"/>
+              <w:left w:val="single" w:sz="4" w:color="D9D9D9"/>
+              <w:bottom w:val="single" w:sz="4" w:color="D9D9D9"/>
+              <w:right w:val="single" w:sz="4" w:color="D9D9D9"/>
+              <w:insideH w:val="single" w:sz="4" w:color="D9D9D9"/>
+              <w:insideV w:val="single" w:sz="4" w:color="D9D9D9"/>
+            </w:tcBorders>
+            <w:shd w:fill="EAF0F7"/>
+            <w:vAlign w:val="center"/>
+          </w:tcPr>
+          <w:p>
+            <w:r>
+              <w:t>atep.fault_campaign.execution.requested.v1</w:t>
+            </w:r>
+          </w:p>
+        </w:tc>
+        <w:tc>
+          <w:tcPr>
+            <w:tcW w:type="dxa" w:w="3024"/>
+            <w:tcBorders>
+              <w:top w:val="single" w:sz="4" w:color="D9D9D9"/>
+              <w:left w:val="single" w:sz="4" w:color="D9D9D9"/>
+              <w:bottom w:val="single" w:sz="4" w:color="D9D9D9"/>
+              <w:right w:val="single" w:sz="4" w:color="D9D9D9"/>
+              <w:insideH w:val="single" w:sz="4" w:color="D9D9D9"/>
+              <w:insideV w:val="single" w:sz="4" w:color="D9D9D9"/>
+            </w:tcBorders>
+            <w:shd w:fill="EAF0F7"/>
+            <w:vAlign w:val="center"/>
+          </w:tcPr>
+          <w:p>
+            <w:r>
+              <w:t>fault_campaign.execution_requested</w:t>
+            </w:r>
+          </w:p>
+        </w:tc>
+      </w:tr>
+      <w:tr>
+        <w:tc>
+          <w:tcPr>
+            <w:tcW w:type="dxa" w:w="2376"/>
+            <w:tcBorders>
+              <w:top w:val="single" w:sz="4" w:color="D9D9D9"/>
+              <w:left w:val="single" w:sz="4" w:color="D9D9D9"/>
+              <w:bottom w:val="single" w:sz="4" w:color="D9D9D9"/>
+              <w:right w:val="single" w:sz="4" w:color="D9D9D9"/>
+              <w:insideH w:val="single" w:sz="4" w:color="D9D9D9"/>
+              <w:insideV w:val="single" w:sz="4" w:color="D9D9D9"/>
+            </w:tcBorders>
+            <w:vAlign w:val="center"/>
+          </w:tcPr>
+          <w:p>
+            <w:r>
+              <w:t>Record fault step</w:t>
+            </w:r>
+          </w:p>
+        </w:tc>
+        <w:tc>
+          <w:tcPr>
+            <w:tcW w:type="dxa" w:w="4536"/>
+            <w:tcBorders>
+              <w:top w:val="single" w:sz="4" w:color="D9D9D9"/>
+              <w:left w:val="single" w:sz="4" w:color="D9D9D9"/>
+              <w:bottom w:val="single" w:sz="4" w:color="D9D9D9"/>
+              <w:right w:val="single" w:sz="4" w:color="D9D9D9"/>
+              <w:insideH w:val="single" w:sz="4" w:color="D9D9D9"/>
+              <w:insideV w:val="single" w:sz="4" w:color="D9D9D9"/>
+            </w:tcBorders>
+            <w:vAlign w:val="center"/>
+          </w:tcPr>
+          <w:p>
+            <w:r>
+              <w:t>atep.fault_campaign.step_recorded.v1</w:t>
+            </w:r>
+          </w:p>
+        </w:tc>
+        <w:tc>
+          <w:tcPr>
+            <w:tcW w:type="dxa" w:w="3024"/>
+            <w:tcBorders>
+              <w:top w:val="single" w:sz="4" w:color="D9D9D9"/>
+              <w:left w:val="single" w:sz="4" w:color="D9D9D9"/>
+              <w:bottom w:val="single" w:sz="4" w:color="D9D9D9"/>
+              <w:right w:val="single" w:sz="4" w:color="D9D9D9"/>
+              <w:insideH w:val="single" w:sz="4" w:color="D9D9D9"/>
+              <w:insideV w:val="single" w:sz="4" w:color="D9D9D9"/>
+            </w:tcBorders>
+            <w:vAlign w:val="center"/>
+          </w:tcPr>
+          <w:p>
+            <w:r>
+              <w:t>fault_campaign.step_recorded</w:t>
+            </w:r>
+          </w:p>
+        </w:tc>
+      </w:tr>
+      <w:tr>
+        <w:tc>
+          <w:tcPr>
+            <w:tcW w:type="dxa" w:w="2376"/>
+            <w:tcBorders>
+              <w:top w:val="single" w:sz="4" w:color="D9D9D9"/>
+              <w:left w:val="single" w:sz="4" w:color="D9D9D9"/>
+              <w:bottom w:val="single" w:sz="4" w:color="D9D9D9"/>
+              <w:right w:val="single" w:sz="4" w:color="D9D9D9"/>
+              <w:insideH w:val="single" w:sz="4" w:color="D9D9D9"/>
+              <w:insideV w:val="single" w:sz="4" w:color="D9D9D9"/>
+            </w:tcBorders>
+            <w:shd w:fill="EAF0F7"/>
+            <w:vAlign w:val="center"/>
+          </w:tcPr>
+          <w:p>
+            <w:r>
+              <w:t>Cancel fault execution</w:t>
+            </w:r>
+          </w:p>
+        </w:tc>
+        <w:tc>
+          <w:tcPr>
+            <w:tcW w:type="dxa" w:w="4536"/>
+            <w:tcBorders>
+              <w:top w:val="single" w:sz="4" w:color="D9D9D9"/>
+              <w:left w:val="single" w:sz="4" w:color="D9D9D9"/>
+              <w:bottom w:val="single" w:sz="4" w:color="D9D9D9"/>
+              <w:right w:val="single" w:sz="4" w:color="D9D9D9"/>
+              <w:insideH w:val="single" w:sz="4" w:color="D9D9D9"/>
+              <w:insideV w:val="single" w:sz="4" w:color="D9D9D9"/>
+            </w:tcBorders>
+            <w:shd w:fill="EAF0F7"/>
+            <w:vAlign w:val="center"/>
+          </w:tcPr>
+          <w:p>
+            <w:r>
+              <w:t>atep.fault_campaign.execution.cancelled.v1</w:t>
+            </w:r>
+          </w:p>
+        </w:tc>
+        <w:tc>
+          <w:tcPr>
+            <w:tcW w:type="dxa" w:w="3024"/>
+            <w:tcBorders>
+              <w:top w:val="single" w:sz="4" w:color="D9D9D9"/>
+              <w:left w:val="single" w:sz="4" w:color="D9D9D9"/>
+              <w:bottom w:val="single" w:sz="4" w:color="D9D9D9"/>
+              <w:right w:val="single" w:sz="4" w:color="D9D9D9"/>
+              <w:insideH w:val="single" w:sz="4" w:color="D9D9D9"/>
+              <w:insideV w:val="single" w:sz="4" w:color="D9D9D9"/>
+            </w:tcBorders>
+            <w:shd w:fill="EAF0F7"/>
+            <w:vAlign w:val="center"/>
+          </w:tcPr>
+          <w:p>
+            <w:r>
+              <w:t>fault_campaign.execution_cancelled</w:t>
+            </w:r>
+          </w:p>
+        </w:tc>
+      </w:tr>
     </w:tbl>
     <w:p/>
     <w:p>
@@ -3595,7 +4543,7 @@
         <w:pStyle w:val="Heading1"/>
       </w:pPr>
       <w:r>
-        <w:t>11 Engineering Decisions</w:t>
+        <w:t>12 Engineering Decisions</w:t>
       </w:r>
     </w:p>
     <w:tbl>
@@ -4108,6 +5056,127 @@
           </w:p>
         </w:tc>
       </w:tr>
+      <w:tr>
+        <w:tc>
+          <w:tcPr>
+            <w:tcW w:type="dxa" w:w="2376"/>
+            <w:tcBorders>
+              <w:top w:val="single" w:sz="4" w:color="D9D9D9"/>
+              <w:left w:val="single" w:sz="4" w:color="D9D9D9"/>
+              <w:bottom w:val="single" w:sz="4" w:color="D9D9D9"/>
+              <w:right w:val="single" w:sz="4" w:color="D9D9D9"/>
+              <w:insideH w:val="single" w:sz="4" w:color="D9D9D9"/>
+              <w:insideV w:val="single" w:sz="4" w:color="D9D9D9"/>
+            </w:tcBorders>
+            <w:shd w:fill="EAF0F7"/>
+            <w:vAlign w:val="center"/>
+          </w:tcPr>
+          <w:p>
+            <w:r>
+              <w:t>Keep native mutation in domains</w:t>
+            </w:r>
+          </w:p>
+        </w:tc>
+        <w:tc>
+          <w:tcPr>
+            <w:tcW w:type="dxa" w:w="3960"/>
+            <w:tcBorders>
+              <w:top w:val="single" w:sz="4" w:color="D9D9D9"/>
+              <w:left w:val="single" w:sz="4" w:color="D9D9D9"/>
+              <w:bottom w:val="single" w:sz="4" w:color="D9D9D9"/>
+              <w:right w:val="single" w:sz="4" w:color="D9D9D9"/>
+              <w:insideH w:val="single" w:sz="4" w:color="D9D9D9"/>
+              <w:insideV w:val="single" w:sz="4" w:color="D9D9D9"/>
+            </w:tcBorders>
+            <w:shd w:fill="EAF0F7"/>
+            <w:vAlign w:val="center"/>
+          </w:tcPr>
+          <w:p>
+            <w:r>
+              <w:t>Preserve simulator ownership</w:t>
+            </w:r>
+          </w:p>
+        </w:tc>
+        <w:tc>
+          <w:tcPr>
+            <w:tcW w:type="dxa" w:w="3600"/>
+            <w:tcBorders>
+              <w:top w:val="single" w:sz="4" w:color="D9D9D9"/>
+              <w:left w:val="single" w:sz="4" w:color="D9D9D9"/>
+              <w:bottom w:val="single" w:sz="4" w:color="D9D9D9"/>
+              <w:right w:val="single" w:sz="4" w:color="D9D9D9"/>
+              <w:insideH w:val="single" w:sz="4" w:color="D9D9D9"/>
+              <w:insideV w:val="single" w:sz="4" w:color="D9D9D9"/>
+            </w:tcBorders>
+            <w:shd w:fill="EAF0F7"/>
+            <w:vAlign w:val="center"/>
+          </w:tcPr>
+          <w:p>
+            <w:r>
+              <w:t>Automatic adapters remain VIII-7</w:t>
+            </w:r>
+          </w:p>
+        </w:tc>
+      </w:tr>
+      <w:tr>
+        <w:tc>
+          <w:tcPr>
+            <w:tcW w:type="dxa" w:w="2376"/>
+            <w:tcBorders>
+              <w:top w:val="single" w:sz="4" w:color="D9D9D9"/>
+              <w:left w:val="single" w:sz="4" w:color="D9D9D9"/>
+              <w:bottom w:val="single" w:sz="4" w:color="D9D9D9"/>
+              <w:right w:val="single" w:sz="4" w:color="D9D9D9"/>
+              <w:insideH w:val="single" w:sz="4" w:color="D9D9D9"/>
+              <w:insideV w:val="single" w:sz="4" w:color="D9D9D9"/>
+            </w:tcBorders>
+            <w:vAlign w:val="center"/>
+          </w:tcPr>
+          <w:p>
+            <w:r>
+              <w:t>Require recovery intent</w:t>
+            </w:r>
+          </w:p>
+        </w:tc>
+        <w:tc>
+          <w:tcPr>
+            <w:tcW w:type="dxa" w:w="3960"/>
+            <w:tcBorders>
+              <w:top w:val="single" w:sz="4" w:color="D9D9D9"/>
+              <w:left w:val="single" w:sz="4" w:color="D9D9D9"/>
+              <w:bottom w:val="single" w:sz="4" w:color="D9D9D9"/>
+              <w:right w:val="single" w:sz="4" w:color="D9D9D9"/>
+              <w:insideH w:val="single" w:sz="4" w:color="D9D9D9"/>
+              <w:insideV w:val="single" w:sz="4" w:color="D9D9D9"/>
+            </w:tcBorders>
+            <w:vAlign w:val="center"/>
+          </w:tcPr>
+          <w:p>
+            <w:r>
+              <w:t>Make safe restoration testable</w:t>
+            </w:r>
+          </w:p>
+        </w:tc>
+        <w:tc>
+          <w:tcPr>
+            <w:tcW w:type="dxa" w:w="3600"/>
+            <w:tcBorders>
+              <w:top w:val="single" w:sz="4" w:color="D9D9D9"/>
+              <w:left w:val="single" w:sz="4" w:color="D9D9D9"/>
+              <w:bottom w:val="single" w:sz="4" w:color="D9D9D9"/>
+              <w:right w:val="single" w:sz="4" w:color="D9D9D9"/>
+              <w:insideH w:val="single" w:sz="4" w:color="D9D9D9"/>
+              <w:insideV w:val="single" w:sz="4" w:color="D9D9D9"/>
+            </w:tcBorders>
+            <w:vAlign w:val="center"/>
+          </w:tcPr>
+          <w:p>
+            <w:r>
+              <w:t>Every step has a bounded recovery plan</w:t>
+            </w:r>
+          </w:p>
+        </w:tc>
+      </w:tr>
     </w:tbl>
     <w:p/>
     <w:p>
@@ -4120,7 +5189,7 @@
         <w:pStyle w:val="Heading1"/>
       </w:pPr>
       <w:r>
-        <w:t>12 Verification Catalogue</w:t>
+        <w:t>13 Verification Catalogue</w:t>
       </w:r>
     </w:p>
     <w:tbl>
@@ -4695,6 +5764,65 @@
           </w:p>
         </w:tc>
       </w:tr>
+      <w:tr>
+        <w:tc>
+          <w:tcPr>
+            <w:tcW w:type="dxa" w:w="2232"/>
+            <w:tcBorders>
+              <w:top w:val="single" w:sz="4" w:color="D9D9D9"/>
+              <w:left w:val="single" w:sz="4" w:color="D9D9D9"/>
+              <w:bottom w:val="single" w:sz="4" w:color="D9D9D9"/>
+              <w:right w:val="single" w:sz="4" w:color="D9D9D9"/>
+              <w:insideH w:val="single" w:sz="4" w:color="D9D9D9"/>
+              <w:insideV w:val="single" w:sz="4" w:color="D9D9D9"/>
+            </w:tcBorders>
+            <w:vAlign w:val="center"/>
+          </w:tcPr>
+          <w:p>
+            <w:r>
+              <w:t>TF-T-035 to 048</w:t>
+            </w:r>
+          </w:p>
+        </w:tc>
+        <w:tc>
+          <w:tcPr>
+            <w:tcW w:type="dxa" w:w="3528"/>
+            <w:tcBorders>
+              <w:top w:val="single" w:sz="4" w:color="D9D9D9"/>
+              <w:left w:val="single" w:sz="4" w:color="D9D9D9"/>
+              <w:bottom w:val="single" w:sz="4" w:color="D9D9D9"/>
+              <w:right w:val="single" w:sz="4" w:color="D9D9D9"/>
+              <w:insideH w:val="single" w:sz="4" w:color="D9D9D9"/>
+              <w:insideV w:val="single" w:sz="4" w:color="D9D9D9"/>
+            </w:tcBorders>
+            <w:vAlign w:val="center"/>
+          </w:tcPr>
+          <w:p>
+            <w:r>
+              <w:t>Fault campaigns</w:t>
+            </w:r>
+          </w:p>
+        </w:tc>
+        <w:tc>
+          <w:tcPr>
+            <w:tcW w:type="dxa" w:w="4176"/>
+            <w:tcBorders>
+              <w:top w:val="single" w:sz="4" w:color="D9D9D9"/>
+              <w:left w:val="single" w:sz="4" w:color="D9D9D9"/>
+              <w:bottom w:val="single" w:sz="4" w:color="D9D9D9"/>
+              <w:right w:val="single" w:sz="4" w:color="D9D9D9"/>
+              <w:insideH w:val="single" w:sz="4" w:color="D9D9D9"/>
+              <w:insideV w:val="single" w:sz="4" w:color="D9D9D9"/>
+            </w:tcBorders>
+            <w:vAlign w:val="center"/>
+          </w:tcPr>
+          <w:p>
+            <w:r>
+              <w:t>Validate safety, lifecycle, aggregation, evidence, API, and migration</w:t>
+            </w:r>
+          </w:p>
+        </w:tc>
+      </w:tr>
     </w:tbl>
     <w:p/>
     <w:p>
@@ -4707,7 +5835,7 @@
         <w:pStyle w:val="Heading1"/>
       </w:pPr>
       <w:r>
-        <w:t>13 Risks and Controls</w:t>
+        <w:t>14 Risks and Controls</w:t>
       </w:r>
     </w:p>
     <w:tbl>
@@ -5161,6 +6289,186 @@
           </w:p>
         </w:tc>
       </w:tr>
+      <w:tr>
+        <w:tc>
+          <w:tcPr>
+            <w:tcW w:type="dxa" w:w="2160"/>
+            <w:tcBorders>
+              <w:top w:val="single" w:sz="4" w:color="D9D9D9"/>
+              <w:left w:val="single" w:sz="4" w:color="D9D9D9"/>
+              <w:bottom w:val="single" w:sz="4" w:color="D9D9D9"/>
+              <w:right w:val="single" w:sz="4" w:color="D9D9D9"/>
+              <w:insideH w:val="single" w:sz="4" w:color="D9D9D9"/>
+              <w:insideV w:val="single" w:sz="4" w:color="D9D9D9"/>
+            </w:tcBorders>
+            <w:vAlign w:val="center"/>
+          </w:tcPr>
+          <w:p>
+            <w:r>
+              <w:t>Unsafe injection scope</w:t>
+            </w:r>
+          </w:p>
+        </w:tc>
+        <w:tc>
+          <w:tcPr>
+            <w:tcW w:type="dxa" w:w="3672"/>
+            <w:tcBorders>
+              <w:top w:val="single" w:sz="4" w:color="D9D9D9"/>
+              <w:left w:val="single" w:sz="4" w:color="D9D9D9"/>
+              <w:bottom w:val="single" w:sz="4" w:color="D9D9D9"/>
+              <w:right w:val="single" w:sz="4" w:color="D9D9D9"/>
+              <w:insideH w:val="single" w:sz="4" w:color="D9D9D9"/>
+              <w:insideV w:val="single" w:sz="4" w:color="D9D9D9"/>
+            </w:tcBorders>
+            <w:vAlign w:val="center"/>
+          </w:tcPr>
+          <w:p>
+            <w:r>
+              <w:t>Allowlist, blast radius, and time budget</w:t>
+            </w:r>
+          </w:p>
+        </w:tc>
+        <w:tc>
+          <w:tcPr>
+            <w:tcW w:type="dxa" w:w="4104"/>
+            <w:tcBorders>
+              <w:top w:val="single" w:sz="4" w:color="D9D9D9"/>
+              <w:left w:val="single" w:sz="4" w:color="D9D9D9"/>
+              <w:bottom w:val="single" w:sz="4" w:color="D9D9D9"/>
+              <w:right w:val="single" w:sz="4" w:color="D9D9D9"/>
+              <w:insideH w:val="single" w:sz="4" w:color="D9D9D9"/>
+              <w:insideV w:val="single" w:sz="4" w:color="D9D9D9"/>
+            </w:tcBorders>
+            <w:vAlign w:val="center"/>
+          </w:tcPr>
+          <w:p>
+            <w:r>
+              <w:t>Keep fleet scope excluded</w:t>
+            </w:r>
+          </w:p>
+        </w:tc>
+      </w:tr>
+      <w:tr>
+        <w:tc>
+          <w:tcPr>
+            <w:tcW w:type="dxa" w:w="2160"/>
+            <w:tcBorders>
+              <w:top w:val="single" w:sz="4" w:color="D9D9D9"/>
+              <w:left w:val="single" w:sz="4" w:color="D9D9D9"/>
+              <w:bottom w:val="single" w:sz="4" w:color="D9D9D9"/>
+              <w:right w:val="single" w:sz="4" w:color="D9D9D9"/>
+              <w:insideH w:val="single" w:sz="4" w:color="D9D9D9"/>
+              <w:insideV w:val="single" w:sz="4" w:color="D9D9D9"/>
+            </w:tcBorders>
+            <w:shd w:fill="EAF0F7"/>
+            <w:vAlign w:val="center"/>
+          </w:tcPr>
+          <w:p>
+            <w:r>
+              <w:t>Vehicle state not restored</w:t>
+            </w:r>
+          </w:p>
+        </w:tc>
+        <w:tc>
+          <w:tcPr>
+            <w:tcW w:type="dxa" w:w="3672"/>
+            <w:tcBorders>
+              <w:top w:val="single" w:sz="4" w:color="D9D9D9"/>
+              <w:left w:val="single" w:sz="4" w:color="D9D9D9"/>
+              <w:bottom w:val="single" w:sz="4" w:color="D9D9D9"/>
+              <w:right w:val="single" w:sz="4" w:color="D9D9D9"/>
+              <w:insideH w:val="single" w:sz="4" w:color="D9D9D9"/>
+              <w:insideV w:val="single" w:sz="4" w:color="D9D9D9"/>
+            </w:tcBorders>
+            <w:shd w:fill="EAF0F7"/>
+            <w:vAlign w:val="center"/>
+          </w:tcPr>
+          <w:p>
+            <w:r>
+              <w:t>Required recovery and verification</w:t>
+            </w:r>
+          </w:p>
+        </w:tc>
+        <w:tc>
+          <w:tcPr>
+            <w:tcW w:type="dxa" w:w="4104"/>
+            <w:tcBorders>
+              <w:top w:val="single" w:sz="4" w:color="D9D9D9"/>
+              <w:left w:val="single" w:sz="4" w:color="D9D9D9"/>
+              <w:bottom w:val="single" w:sz="4" w:color="D9D9D9"/>
+              <w:right w:val="single" w:sz="4" w:color="D9D9D9"/>
+              <w:insideH w:val="single" w:sz="4" w:color="D9D9D9"/>
+              <w:insideV w:val="single" w:sz="4" w:color="D9D9D9"/>
+            </w:tcBorders>
+            <w:shd w:fill="EAF0F7"/>
+            <w:vAlign w:val="center"/>
+          </w:tcPr>
+          <w:p>
+            <w:r>
+              <w:t>Adapters report recovery evidence in VIII-7</w:t>
+            </w:r>
+          </w:p>
+        </w:tc>
+      </w:tr>
+      <w:tr>
+        <w:tc>
+          <w:tcPr>
+            <w:tcW w:type="dxa" w:w="2160"/>
+            <w:tcBorders>
+              <w:top w:val="single" w:sz="4" w:color="D9D9D9"/>
+              <w:left w:val="single" w:sz="4" w:color="D9D9D9"/>
+              <w:bottom w:val="single" w:sz="4" w:color="D9D9D9"/>
+              <w:right w:val="single" w:sz="4" w:color="D9D9D9"/>
+              <w:insideH w:val="single" w:sz="4" w:color="D9D9D9"/>
+              <w:insideV w:val="single" w:sz="4" w:color="D9D9D9"/>
+            </w:tcBorders>
+            <w:vAlign w:val="center"/>
+          </w:tcPr>
+          <w:p>
+            <w:r>
+              <w:t>Resource-heavy early benchmarks</w:t>
+            </w:r>
+          </w:p>
+        </w:tc>
+        <w:tc>
+          <w:tcPr>
+            <w:tcW w:type="dxa" w:w="3672"/>
+            <w:tcBorders>
+              <w:top w:val="single" w:sz="4" w:color="D9D9D9"/>
+              <w:left w:val="single" w:sz="4" w:color="D9D9D9"/>
+              <w:bottom w:val="single" w:sz="4" w:color="D9D9D9"/>
+              <w:right w:val="single" w:sz="4" w:color="D9D9D9"/>
+              <w:insideH w:val="single" w:sz="4" w:color="D9D9D9"/>
+              <w:insideV w:val="single" w:sz="4" w:color="D9D9D9"/>
+            </w:tcBorders>
+            <w:vAlign w:val="center"/>
+          </w:tcPr>
+          <w:p>
+            <w:r>
+              <w:t>Defer VIII-4 until stable baselines</w:t>
+            </w:r>
+          </w:p>
+        </w:tc>
+        <w:tc>
+          <w:tcPr>
+            <w:tcW w:type="dxa" w:w="4104"/>
+            <w:tcBorders>
+              <w:top w:val="single" w:sz="4" w:color="D9D9D9"/>
+              <w:left w:val="single" w:sz="4" w:color="D9D9D9"/>
+              <w:bottom w:val="single" w:sz="4" w:color="D9D9D9"/>
+              <w:right w:val="single" w:sz="4" w:color="D9D9D9"/>
+              <w:insideH w:val="single" w:sz="4" w:color="D9D9D9"/>
+              <w:insideV w:val="single" w:sz="4" w:color="D9D9D9"/>
+            </w:tcBorders>
+            <w:vAlign w:val="center"/>
+          </w:tcPr>
+          <w:p>
+            <w:r>
+              <w:t>Run bounded CPU-only functional tests now</w:t>
+            </w:r>
+          </w:p>
+        </w:tc>
+      </w:tr>
     </w:tbl>
     <w:p/>
     <w:p>
@@ -5168,12 +6476,12 @@
         <w:pStyle w:val="Heading1"/>
       </w:pPr>
       <w:r>
-        <w:t>14 Study Exercises</w:t>
+        <w:t>15 Study Exercises</w:t>
       </w:r>
     </w:p>
     <w:p>
       <w:r>
-        <w:t>Create one ADAS definition and identify its invariants. Then run two required cases, explain the aggregate result, and compare an exact retry after suite archival with a new run request for the archived suite. Schedule the same suite, archive it, and explain why the stored job can still dispatch reproducibly.</w:t>
+        <w:t>Create one ADAS definition and identify its invariants. Then run two required cases, explain the aggregate result, and compare an exact retry after suite archival with a new run request for the archived suite. Schedule the same suite, archive it, and explain why the stored job can still dispatch reproducibly. Finally, design one battery-temperature fault with recovery verification and explain why the campaign contract must not expose an arbitrary shell or adapter command.</w:t>
       </w:r>
     </w:p>
     <w:p>
@@ -5181,12 +6489,12 @@
         <w:pStyle w:val="Heading1"/>
       </w:pPr>
       <w:r>
-        <w:t>15 Next Development</w:t>
+        <w:t>16 Next Development</w:t>
       </w:r>
     </w:p>
     <w:p>
       <w:r>
-        <w:t>VIII-4 will add bounded performance and stress profiles, acceptance thresholds, resource budgets, and comparable trend evidence while preserving VIII-3 selection snapshots.</w:t>
+        <w:t>VIII-6 will add mutation operators, kill-rate evidence, requirement coverage, and gap analysis. VIII-4 remains planned near project completion, when stable baselines make performance thresholds and comparable trends meaningful.</w:t>
       </w:r>
     </w:p>
     <w:sectPr>

</xml_diff>

<commit_message>
feat(test-framework): add mutation analysis
</commit_message>
<xml_diff>
--- a/docs/ATEP_Volume_VIII_Test_Framework_Engineering_Workbook.docx
+++ b/docs/ATEP_Volume_VIII_Test_Framework_Engineering_Workbook.docx
@@ -19,12 +19,12 @@
         <w:rPr>
           <w:b/>
         </w:rPr>
-        <w:t>Version 0.4.0   VIII 5 Fault Campaigns Implemented</w:t>
+        <w:t>Version 0.5.0   VIII 6 Mutation and Coverage Implemented</w:t>
       </w:r>
     </w:p>
     <w:p>
       <w:r>
-        <w:t>This workbook records the catalog, execution-binding, scheduled-selection, and bounded fault-campaign baseline for ATEP. Reusable definitions describe test intent, suites preserve reviewed composition, and catalog-backed runs now persist deterministic case results and aggregate outcomes.</w:t>
+        <w:t>This workbook records the catalog, execution-binding, scheduled-selection, and bounded fault-campaign and mutation-quality baseline for ATEP. Reusable definitions describe test intent, suites preserve reviewed composition, and catalog-backed runs now persist deterministic case results and aggregate outcomes.</w:t>
       </w:r>
     </w:p>
     <w:tbl>
@@ -125,7 +125,7 @@
           </w:tcPr>
           <w:p>
             <w:r>
-              <w:t>VIII-1, VIII-2, VIII-3, and VIII-5 implemented and verified</w:t>
+              <w:t>VIII-1, VIII-2, VIII-3, VIII-5, and VIII-6 implemented and verified</w:t>
             </w:r>
           </w:p>
         </w:tc>
@@ -289,7 +289,7 @@
           </w:tcPr>
           <w:p>
             <w:r>
-              <w:t>VIII-6 mutation testing and coverage; VIII-4 deferred</w:t>
+              <w:t>VIII-7 cross-platform automation; VIII-4 deferred</w:t>
             </w:r>
           </w:p>
         </w:tc>
@@ -306,7 +306,7 @@
     </w:p>
     <w:p>
       <w:r>
-        <w:t>VIII-1 separates reusable test design from test execution. A definition captures one test's preconditions, actions, inputs, expectations, classification, and resource budget. A suite selects active definitions in an explicit order and freezes their versions. VIII-2 binds that snapshot to a run and records each case outcome. VIII-3 schedules that immutable intent for later smoke, sanity, or regression execution. VIII-5 adds cross-domain fault campaigns with recovery plans and evidence.</w:t>
+        <w:t>VIII-1 separates reusable test design from test execution. A definition captures one test's preconditions, actions, inputs, expectations, classification, and resource budget. A suite selects active definitions in an explicit order and freezes their versions. VIII-2 binds that snapshot to a run and records each case outcome. VIII-3 schedules that immutable intent for later smoke, sanity, or regression execution. VIII-5 adds cross-domain fault campaigns with recovery plans and evidence. VIII-6 adds bounded mutation scoring and explicit requirement coverage gaps.</w:t>
       </w:r>
     </w:p>
     <w:p>
@@ -330,7 +330,7 @@
         <w:pStyle w:val="ListBullet"/>
       </w:pPr>
       <w:r>
-        <w:t>Performance and stress remain planned but are deferred until near completion; mutation testing and coverage are next.</w:t>
+        <w:t>Performance and stress remain planned but are deferred until near completion; cross-platform automation is next.</w:t>
       </w:r>
     </w:p>
     <w:p>
@@ -568,7 +568,7 @@
           </w:tcPr>
           <w:p>
             <w:r>
-              <w:t>Linear migrations 0051 through 0054 with reversible schema changes</w:t>
+              <w:t>Linear migrations 0051 through 0055 with reversible schema changes</w:t>
             </w:r>
           </w:p>
         </w:tc>
@@ -1955,6 +1955,127 @@
           <w:p>
             <w:r>
               <w:t>Fault campaigns</w:t>
+            </w:r>
+          </w:p>
+        </w:tc>
+        <w:tc>
+          <w:tcPr>
+            <w:tcW w:type="dxa" w:w="4680"/>
+            <w:tcBorders>
+              <w:top w:val="single" w:sz="4" w:color="D9D9D9"/>
+              <w:left w:val="single" w:sz="4" w:color="D9D9D9"/>
+              <w:bottom w:val="single" w:sz="4" w:color="D9D9D9"/>
+              <w:right w:val="single" w:sz="4" w:color="D9D9D9"/>
+              <w:insideH w:val="single" w:sz="4" w:color="D9D9D9"/>
+              <w:insideV w:val="single" w:sz="4" w:color="D9D9D9"/>
+            </w:tcBorders>
+            <w:shd w:fill="EAF0F7"/>
+            <w:vAlign w:val="center"/>
+          </w:tcPr>
+          <w:p>
+            <w:r>
+              <w:t>List, detail, and results</w:t>
+            </w:r>
+          </w:p>
+        </w:tc>
+        <w:tc>
+          <w:tcPr>
+            <w:tcW w:type="dxa" w:w="2880"/>
+            <w:tcBorders>
+              <w:top w:val="single" w:sz="4" w:color="D9D9D9"/>
+              <w:left w:val="single" w:sz="4" w:color="D9D9D9"/>
+              <w:bottom w:val="single" w:sz="4" w:color="D9D9D9"/>
+              <w:right w:val="single" w:sz="4" w:color="D9D9D9"/>
+              <w:insideH w:val="single" w:sz="4" w:color="D9D9D9"/>
+              <w:insideV w:val="single" w:sz="4" w:color="D9D9D9"/>
+            </w:tcBorders>
+            <w:shd w:fill="EAF0F7"/>
+            <w:vAlign w:val="center"/>
+          </w:tcPr>
+          <w:p>
+            <w:r>
+              <w:t>test_catalog:read</w:t>
+            </w:r>
+          </w:p>
+        </w:tc>
+      </w:tr>
+      <w:tr>
+        <w:tc>
+          <w:tcPr>
+            <w:tcW w:type="dxa" w:w="2376"/>
+            <w:tcBorders>
+              <w:top w:val="single" w:sz="4" w:color="D9D9D9"/>
+              <w:left w:val="single" w:sz="4" w:color="D9D9D9"/>
+              <w:bottom w:val="single" w:sz="4" w:color="D9D9D9"/>
+              <w:right w:val="single" w:sz="4" w:color="D9D9D9"/>
+              <w:insideH w:val="single" w:sz="4" w:color="D9D9D9"/>
+              <w:insideV w:val="single" w:sz="4" w:color="D9D9D9"/>
+            </w:tcBorders>
+            <w:vAlign w:val="center"/>
+          </w:tcPr>
+          <w:p>
+            <w:r>
+              <w:t>Mutation and coverage</w:t>
+            </w:r>
+          </w:p>
+        </w:tc>
+        <w:tc>
+          <w:tcPr>
+            <w:tcW w:type="dxa" w:w="4680"/>
+            <w:tcBorders>
+              <w:top w:val="single" w:sz="4" w:color="D9D9D9"/>
+              <w:left w:val="single" w:sz="4" w:color="D9D9D9"/>
+              <w:bottom w:val="single" w:sz="4" w:color="D9D9D9"/>
+              <w:right w:val="single" w:sz="4" w:color="D9D9D9"/>
+              <w:insideH w:val="single" w:sz="4" w:color="D9D9D9"/>
+              <w:insideV w:val="single" w:sz="4" w:color="D9D9D9"/>
+            </w:tcBorders>
+            <w:vAlign w:val="center"/>
+          </w:tcPr>
+          <w:p>
+            <w:r>
+              <w:t>Create, status, execute, update</w:t>
+            </w:r>
+          </w:p>
+        </w:tc>
+        <w:tc>
+          <w:tcPr>
+            <w:tcW w:type="dxa" w:w="2880"/>
+            <w:tcBorders>
+              <w:top w:val="single" w:sz="4" w:color="D9D9D9"/>
+              <w:left w:val="single" w:sz="4" w:color="D9D9D9"/>
+              <w:bottom w:val="single" w:sz="4" w:color="D9D9D9"/>
+              <w:right w:val="single" w:sz="4" w:color="D9D9D9"/>
+              <w:insideH w:val="single" w:sz="4" w:color="D9D9D9"/>
+              <w:insideV w:val="single" w:sz="4" w:color="D9D9D9"/>
+            </w:tcBorders>
+            <w:vAlign w:val="center"/>
+          </w:tcPr>
+          <w:p>
+            <w:r>
+              <w:t>test_catalog:manage</w:t>
+            </w:r>
+          </w:p>
+        </w:tc>
+      </w:tr>
+      <w:tr>
+        <w:tc>
+          <w:tcPr>
+            <w:tcW w:type="dxa" w:w="2376"/>
+            <w:tcBorders>
+              <w:top w:val="single" w:sz="4" w:color="D9D9D9"/>
+              <w:left w:val="single" w:sz="4" w:color="D9D9D9"/>
+              <w:bottom w:val="single" w:sz="4" w:color="D9D9D9"/>
+              <w:right w:val="single" w:sz="4" w:color="D9D9D9"/>
+              <w:insideH w:val="single" w:sz="4" w:color="D9D9D9"/>
+              <w:insideV w:val="single" w:sz="4" w:color="D9D9D9"/>
+            </w:tcBorders>
+            <w:shd w:fill="EAF0F7"/>
+            <w:vAlign w:val="center"/>
+          </w:tcPr>
+          <w:p>
+            <w:r>
+              <w:t>Mutation and coverage</w:t>
             </w:r>
           </w:p>
         </w:tc>
@@ -3709,7 +3830,12 @@
         <w:pStyle w:val="Heading1"/>
       </w:pPr>
       <w:r>
-        <w:t>11 Events and Audit</w:t>
+        <w:t>11 Mutation Testing and Coverage</w:t>
+      </w:r>
+    </w:p>
+    <w:p>
+      <w:r>
+        <w:t>VIII-6 binds an active catalog suite to a reviewed mutation campaign. Each campaign preserves the suite snapshot and contains up to five hundred uniquely ordered mutants using seven explicit operators. Execution materializes pending results atomically and never exposes arbitrary source or shell execution through the API.</w:t>
       </w:r>
     </w:p>
     <w:tbl>
@@ -3729,6 +3855,477 @@
         </w:trPr>
         <w:tc>
           <w:tcPr>
+            <w:tcW w:type="dxa" w:w="2160"/>
+            <w:shd w:fill="17365D"/>
+            <w:tcBorders>
+              <w:top w:val="single" w:sz="4" w:color="D9D9D9"/>
+              <w:left w:val="single" w:sz="4" w:color="D9D9D9"/>
+              <w:bottom w:val="single" w:sz="4" w:color="D9D9D9"/>
+              <w:right w:val="single" w:sz="4" w:color="D9D9D9"/>
+              <w:insideH w:val="single" w:sz="4" w:color="D9D9D9"/>
+              <w:insideV w:val="single" w:sz="4" w:color="D9D9D9"/>
+            </w:tcBorders>
+            <w:vAlign w:val="center"/>
+          </w:tcPr>
+          <w:p>
+            <w:r>
+              <w:rPr>
+                <w:b/>
+                <w:color w:val="FFFFFF"/>
+              </w:rPr>
+              <w:t>Control</w:t>
+            </w:r>
+          </w:p>
+        </w:tc>
+        <w:tc>
+          <w:tcPr>
+            <w:tcW w:type="dxa" w:w="3600"/>
+            <w:shd w:fill="17365D"/>
+            <w:tcBorders>
+              <w:top w:val="single" w:sz="4" w:color="D9D9D9"/>
+              <w:left w:val="single" w:sz="4" w:color="D9D9D9"/>
+              <w:bottom w:val="single" w:sz="4" w:color="D9D9D9"/>
+              <w:right w:val="single" w:sz="4" w:color="D9D9D9"/>
+              <w:insideH w:val="single" w:sz="4" w:color="D9D9D9"/>
+              <w:insideV w:val="single" w:sz="4" w:color="D9D9D9"/>
+            </w:tcBorders>
+            <w:vAlign w:val="center"/>
+          </w:tcPr>
+          <w:p>
+            <w:r>
+              <w:rPr>
+                <w:b/>
+                <w:color w:val="FFFFFF"/>
+              </w:rPr>
+              <w:t>Rule</w:t>
+            </w:r>
+          </w:p>
+        </w:tc>
+        <w:tc>
+          <w:tcPr>
+            <w:tcW w:type="dxa" w:w="4176"/>
+            <w:shd w:fill="17365D"/>
+            <w:tcBorders>
+              <w:top w:val="single" w:sz="4" w:color="D9D9D9"/>
+              <w:left w:val="single" w:sz="4" w:color="D9D9D9"/>
+              <w:bottom w:val="single" w:sz="4" w:color="D9D9D9"/>
+              <w:right w:val="single" w:sz="4" w:color="D9D9D9"/>
+              <w:insideH w:val="single" w:sz="4" w:color="D9D9D9"/>
+              <w:insideV w:val="single" w:sz="4" w:color="D9D9D9"/>
+            </w:tcBorders>
+            <w:vAlign w:val="center"/>
+          </w:tcPr>
+          <w:p>
+            <w:r>
+              <w:rPr>
+                <w:b/>
+                <w:color w:val="FFFFFF"/>
+              </w:rPr>
+              <w:t>Engineering purpose</w:t>
+            </w:r>
+          </w:p>
+        </w:tc>
+      </w:tr>
+      <w:tr>
+        <w:tc>
+          <w:tcPr>
+            <w:tcW w:type="dxa" w:w="2160"/>
+            <w:tcBorders>
+              <w:top w:val="single" w:sz="4" w:color="D9D9D9"/>
+              <w:left w:val="single" w:sz="4" w:color="D9D9D9"/>
+              <w:bottom w:val="single" w:sz="4" w:color="D9D9D9"/>
+              <w:right w:val="single" w:sz="4" w:color="D9D9D9"/>
+              <w:insideH w:val="single" w:sz="4" w:color="D9D9D9"/>
+              <w:insideV w:val="single" w:sz="4" w:color="D9D9D9"/>
+            </w:tcBorders>
+            <w:vAlign w:val="center"/>
+          </w:tcPr>
+          <w:p>
+            <w:r>
+              <w:t>Operators</w:t>
+            </w:r>
+          </w:p>
+        </w:tc>
+        <w:tc>
+          <w:tcPr>
+            <w:tcW w:type="dxa" w:w="3600"/>
+            <w:tcBorders>
+              <w:top w:val="single" w:sz="4" w:color="D9D9D9"/>
+              <w:left w:val="single" w:sz="4" w:color="D9D9D9"/>
+              <w:bottom w:val="single" w:sz="4" w:color="D9D9D9"/>
+              <w:right w:val="single" w:sz="4" w:color="D9D9D9"/>
+              <w:insideH w:val="single" w:sz="4" w:color="D9D9D9"/>
+              <w:insideV w:val="single" w:sz="4" w:color="D9D9D9"/>
+            </w:tcBorders>
+            <w:vAlign w:val="center"/>
+          </w:tcPr>
+          <w:p>
+            <w:r>
+              <w:t>Seven allowlisted values</w:t>
+            </w:r>
+          </w:p>
+        </w:tc>
+        <w:tc>
+          <w:tcPr>
+            <w:tcW w:type="dxa" w:w="4176"/>
+            <w:tcBorders>
+              <w:top w:val="single" w:sz="4" w:color="D9D9D9"/>
+              <w:left w:val="single" w:sz="4" w:color="D9D9D9"/>
+              <w:bottom w:val="single" w:sz="4" w:color="D9D9D9"/>
+              <w:right w:val="single" w:sz="4" w:color="D9D9D9"/>
+              <w:insideH w:val="single" w:sz="4" w:color="D9D9D9"/>
+              <w:insideV w:val="single" w:sz="4" w:color="D9D9D9"/>
+            </w:tcBorders>
+            <w:vAlign w:val="center"/>
+          </w:tcPr>
+          <w:p>
+            <w:r>
+              <w:t>Keep adapters portable and reviewable</w:t>
+            </w:r>
+          </w:p>
+        </w:tc>
+      </w:tr>
+      <w:tr>
+        <w:tc>
+          <w:tcPr>
+            <w:tcW w:type="dxa" w:w="2160"/>
+            <w:tcBorders>
+              <w:top w:val="single" w:sz="4" w:color="D9D9D9"/>
+              <w:left w:val="single" w:sz="4" w:color="D9D9D9"/>
+              <w:bottom w:val="single" w:sz="4" w:color="D9D9D9"/>
+              <w:right w:val="single" w:sz="4" w:color="D9D9D9"/>
+              <w:insideH w:val="single" w:sz="4" w:color="D9D9D9"/>
+              <w:insideV w:val="single" w:sz="4" w:color="D9D9D9"/>
+            </w:tcBorders>
+            <w:shd w:fill="EAF0F7"/>
+            <w:vAlign w:val="center"/>
+          </w:tcPr>
+          <w:p>
+            <w:r>
+              <w:t>Parameters</w:t>
+            </w:r>
+          </w:p>
+        </w:tc>
+        <w:tc>
+          <w:tcPr>
+            <w:tcW w:type="dxa" w:w="3600"/>
+            <w:tcBorders>
+              <w:top w:val="single" w:sz="4" w:color="D9D9D9"/>
+              <w:left w:val="single" w:sz="4" w:color="D9D9D9"/>
+              <w:bottom w:val="single" w:sz="4" w:color="D9D9D9"/>
+              <w:right w:val="single" w:sz="4" w:color="D9D9D9"/>
+              <w:insideH w:val="single" w:sz="4" w:color="D9D9D9"/>
+              <w:insideV w:val="single" w:sz="4" w:color="D9D9D9"/>
+            </w:tcBorders>
+            <w:shd w:fill="EAF0F7"/>
+            <w:vAlign w:val="center"/>
+          </w:tcPr>
+          <w:p>
+            <w:r>
+              <w:t>8192 bytes per mutant</w:t>
+            </w:r>
+          </w:p>
+        </w:tc>
+        <w:tc>
+          <w:tcPr>
+            <w:tcW w:type="dxa" w:w="4176"/>
+            <w:tcBorders>
+              <w:top w:val="single" w:sz="4" w:color="D9D9D9"/>
+              <w:left w:val="single" w:sz="4" w:color="D9D9D9"/>
+              <w:bottom w:val="single" w:sz="4" w:color="D9D9D9"/>
+              <w:right w:val="single" w:sz="4" w:color="D9D9D9"/>
+              <w:insideH w:val="single" w:sz="4" w:color="D9D9D9"/>
+              <w:insideV w:val="single" w:sz="4" w:color="D9D9D9"/>
+            </w:tcBorders>
+            <w:shd w:fill="EAF0F7"/>
+            <w:vAlign w:val="center"/>
+          </w:tcPr>
+          <w:p>
+            <w:r>
+              <w:t>Bound structured orchestration intent</w:t>
+            </w:r>
+          </w:p>
+        </w:tc>
+      </w:tr>
+      <w:tr>
+        <w:tc>
+          <w:tcPr>
+            <w:tcW w:type="dxa" w:w="2160"/>
+            <w:tcBorders>
+              <w:top w:val="single" w:sz="4" w:color="D9D9D9"/>
+              <w:left w:val="single" w:sz="4" w:color="D9D9D9"/>
+              <w:bottom w:val="single" w:sz="4" w:color="D9D9D9"/>
+              <w:right w:val="single" w:sz="4" w:color="D9D9D9"/>
+              <w:insideH w:val="single" w:sz="4" w:color="D9D9D9"/>
+              <w:insideV w:val="single" w:sz="4" w:color="D9D9D9"/>
+            </w:tcBorders>
+            <w:vAlign w:val="center"/>
+          </w:tcPr>
+          <w:p>
+            <w:r>
+              <w:t>Killed result</w:t>
+            </w:r>
+          </w:p>
+        </w:tc>
+        <w:tc>
+          <w:tcPr>
+            <w:tcW w:type="dxa" w:w="3600"/>
+            <w:tcBorders>
+              <w:top w:val="single" w:sz="4" w:color="D9D9D9"/>
+              <w:left w:val="single" w:sz="4" w:color="D9D9D9"/>
+              <w:bottom w:val="single" w:sz="4" w:color="D9D9D9"/>
+              <w:right w:val="single" w:sz="4" w:color="D9D9D9"/>
+              <w:insideH w:val="single" w:sz="4" w:color="D9D9D9"/>
+              <w:insideV w:val="single" w:sz="4" w:color="D9D9D9"/>
+            </w:tcBorders>
+            <w:vAlign w:val="center"/>
+          </w:tcPr>
+          <w:p>
+            <w:r>
+              <w:t>At least one detecting test</w:t>
+            </w:r>
+          </w:p>
+        </w:tc>
+        <w:tc>
+          <w:tcPr>
+            <w:tcW w:type="dxa" w:w="4176"/>
+            <w:tcBorders>
+              <w:top w:val="single" w:sz="4" w:color="D9D9D9"/>
+              <w:left w:val="single" w:sz="4" w:color="D9D9D9"/>
+              <w:bottom w:val="single" w:sz="4" w:color="D9D9D9"/>
+              <w:right w:val="single" w:sz="4" w:color="D9D9D9"/>
+              <w:insideH w:val="single" w:sz="4" w:color="D9D9D9"/>
+              <w:insideV w:val="single" w:sz="4" w:color="D9D9D9"/>
+            </w:tcBorders>
+            <w:vAlign w:val="center"/>
+          </w:tcPr>
+          <w:p>
+            <w:r>
+              <w:t>Make detection evidence explicit</w:t>
+            </w:r>
+          </w:p>
+        </w:tc>
+      </w:tr>
+      <w:tr>
+        <w:tc>
+          <w:tcPr>
+            <w:tcW w:type="dxa" w:w="2160"/>
+            <w:tcBorders>
+              <w:top w:val="single" w:sz="4" w:color="D9D9D9"/>
+              <w:left w:val="single" w:sz="4" w:color="D9D9D9"/>
+              <w:bottom w:val="single" w:sz="4" w:color="D9D9D9"/>
+              <w:right w:val="single" w:sz="4" w:color="D9D9D9"/>
+              <w:insideH w:val="single" w:sz="4" w:color="D9D9D9"/>
+              <w:insideV w:val="single" w:sz="4" w:color="D9D9D9"/>
+            </w:tcBorders>
+            <w:shd w:fill="EAF0F7"/>
+            <w:vAlign w:val="center"/>
+          </w:tcPr>
+          <w:p>
+            <w:r>
+              <w:t>Mutation score</w:t>
+            </w:r>
+          </w:p>
+        </w:tc>
+        <w:tc>
+          <w:tcPr>
+            <w:tcW w:type="dxa" w:w="3600"/>
+            <w:tcBorders>
+              <w:top w:val="single" w:sz="4" w:color="D9D9D9"/>
+              <w:left w:val="single" w:sz="4" w:color="D9D9D9"/>
+              <w:bottom w:val="single" w:sz="4" w:color="D9D9D9"/>
+              <w:right w:val="single" w:sz="4" w:color="D9D9D9"/>
+              <w:insideH w:val="single" w:sz="4" w:color="D9D9D9"/>
+              <w:insideV w:val="single" w:sz="4" w:color="D9D9D9"/>
+            </w:tcBorders>
+            <w:shd w:fill="EAF0F7"/>
+            <w:vAlign w:val="center"/>
+          </w:tcPr>
+          <w:p>
+            <w:r>
+              <w:t>Killed divided by killed plus survived</w:t>
+            </w:r>
+          </w:p>
+        </w:tc>
+        <w:tc>
+          <w:tcPr>
+            <w:tcW w:type="dxa" w:w="4176"/>
+            <w:tcBorders>
+              <w:top w:val="single" w:sz="4" w:color="D9D9D9"/>
+              <w:left w:val="single" w:sz="4" w:color="D9D9D9"/>
+              <w:bottom w:val="single" w:sz="4" w:color="D9D9D9"/>
+              <w:right w:val="single" w:sz="4" w:color="D9D9D9"/>
+              <w:insideH w:val="single" w:sz="4" w:color="D9D9D9"/>
+              <w:insideV w:val="single" w:sz="4" w:color="D9D9D9"/>
+            </w:tcBorders>
+            <w:shd w:fill="EAF0F7"/>
+            <w:vAlign w:val="center"/>
+          </w:tcPr>
+          <w:p>
+            <w:r>
+              <w:t>Avoid distortion by errors</w:t>
+            </w:r>
+          </w:p>
+        </w:tc>
+      </w:tr>
+      <w:tr>
+        <w:tc>
+          <w:tcPr>
+            <w:tcW w:type="dxa" w:w="2160"/>
+            <w:tcBorders>
+              <w:top w:val="single" w:sz="4" w:color="D9D9D9"/>
+              <w:left w:val="single" w:sz="4" w:color="D9D9D9"/>
+              <w:bottom w:val="single" w:sz="4" w:color="D9D9D9"/>
+              <w:right w:val="single" w:sz="4" w:color="D9D9D9"/>
+              <w:insideH w:val="single" w:sz="4" w:color="D9D9D9"/>
+              <w:insideV w:val="single" w:sz="4" w:color="D9D9D9"/>
+            </w:tcBorders>
+            <w:vAlign w:val="center"/>
+          </w:tcPr>
+          <w:p>
+            <w:r>
+              <w:t>Required outcome</w:t>
+            </w:r>
+          </w:p>
+        </w:tc>
+        <w:tc>
+          <w:tcPr>
+            <w:tcW w:type="dxa" w:w="3600"/>
+            <w:tcBorders>
+              <w:top w:val="single" w:sz="4" w:color="D9D9D9"/>
+              <w:left w:val="single" w:sz="4" w:color="D9D9D9"/>
+              <w:bottom w:val="single" w:sz="4" w:color="D9D9D9"/>
+              <w:right w:val="single" w:sz="4" w:color="D9D9D9"/>
+              <w:insideH w:val="single" w:sz="4" w:color="D9D9D9"/>
+              <w:insideV w:val="single" w:sz="4" w:color="D9D9D9"/>
+            </w:tcBorders>
+            <w:vAlign w:val="center"/>
+          </w:tcPr>
+          <w:p>
+            <w:r>
+              <w:t>Survived, error, or skip fails</w:t>
+            </w:r>
+          </w:p>
+        </w:tc>
+        <w:tc>
+          <w:tcPr>
+            <w:tcW w:type="dxa" w:w="4176"/>
+            <w:tcBorders>
+              <w:top w:val="single" w:sz="4" w:color="D9D9D9"/>
+              <w:left w:val="single" w:sz="4" w:color="D9D9D9"/>
+              <w:bottom w:val="single" w:sz="4" w:color="D9D9D9"/>
+              <w:right w:val="single" w:sz="4" w:color="D9D9D9"/>
+              <w:insideH w:val="single" w:sz="4" w:color="D9D9D9"/>
+              <w:insideV w:val="single" w:sz="4" w:color="D9D9D9"/>
+            </w:tcBorders>
+            <w:vAlign w:val="center"/>
+          </w:tcPr>
+          <w:p>
+            <w:r>
+              <w:t>Protect reviewed acceptance intent</w:t>
+            </w:r>
+          </w:p>
+        </w:tc>
+      </w:tr>
+      <w:tr>
+        <w:tc>
+          <w:tcPr>
+            <w:tcW w:type="dxa" w:w="2160"/>
+            <w:tcBorders>
+              <w:top w:val="single" w:sz="4" w:color="D9D9D9"/>
+              <w:left w:val="single" w:sz="4" w:color="D9D9D9"/>
+              <w:bottom w:val="single" w:sz="4" w:color="D9D9D9"/>
+              <w:right w:val="single" w:sz="4" w:color="D9D9D9"/>
+              <w:insideH w:val="single" w:sz="4" w:color="D9D9D9"/>
+              <w:insideV w:val="single" w:sz="4" w:color="D9D9D9"/>
+            </w:tcBorders>
+            <w:shd w:fill="EAF0F7"/>
+            <w:vAlign w:val="center"/>
+          </w:tcPr>
+          <w:p>
+            <w:r>
+              <w:t>Evidence</w:t>
+            </w:r>
+          </w:p>
+        </w:tc>
+        <w:tc>
+          <w:tcPr>
+            <w:tcW w:type="dxa" w:w="3600"/>
+            <w:tcBorders>
+              <w:top w:val="single" w:sz="4" w:color="D9D9D9"/>
+              <w:left w:val="single" w:sz="4" w:color="D9D9D9"/>
+              <w:bottom w:val="single" w:sz="4" w:color="D9D9D9"/>
+              <w:right w:val="single" w:sz="4" w:color="D9D9D9"/>
+              <w:insideH w:val="single" w:sz="4" w:color="D9D9D9"/>
+              <w:insideV w:val="single" w:sz="4" w:color="D9D9D9"/>
+            </w:tcBorders>
+            <w:shd w:fill="EAF0F7"/>
+            <w:vAlign w:val="center"/>
+          </w:tcPr>
+          <w:p>
+            <w:r>
+              <w:t>At most 20 references</w:t>
+            </w:r>
+          </w:p>
+        </w:tc>
+        <w:tc>
+          <w:tcPr>
+            <w:tcW w:type="dxa" w:w="4176"/>
+            <w:tcBorders>
+              <w:top w:val="single" w:sz="4" w:color="D9D9D9"/>
+              <w:left w:val="single" w:sz="4" w:color="D9D9D9"/>
+              <w:bottom w:val="single" w:sz="4" w:color="D9D9D9"/>
+              <w:right w:val="single" w:sz="4" w:color="D9D9D9"/>
+              <w:insideH w:val="single" w:sz="4" w:color="D9D9D9"/>
+              <w:insideV w:val="single" w:sz="4" w:color="D9D9D9"/>
+            </w:tcBorders>
+            <w:shd w:fill="EAF0F7"/>
+            <w:vAlign w:val="center"/>
+          </w:tcPr>
+          <w:p>
+            <w:r>
+              <w:t>Link artifacts without copying content</w:t>
+            </w:r>
+          </w:p>
+        </w:tc>
+      </w:tr>
+    </w:tbl>
+    <w:p/>
+    <w:p>
+      <w:r>
+        <w:t>Requirement records reference known catalog definitions and external evidence. Both present means covered, only one present means partial, and neither means gap. Collection responses include totals for each state so dashboards and quality gates can expose missing tests or missing evidence directly.</w:t>
+      </w:r>
+    </w:p>
+    <w:p>
+      <w:r>
+        <w:br w:type="page"/>
+      </w:r>
+    </w:p>
+    <w:p>
+      <w:pPr>
+        <w:pStyle w:val="Heading1"/>
+      </w:pPr>
+      <w:r>
+        <w:t>12 Events and Audit</w:t>
+      </w:r>
+    </w:p>
+    <w:tbl>
+      <w:tblPr>
+        <w:tblW w:type="auto" w:w="0"/>
+        <w:tblLayout w:type="fixed"/>
+        <w:tblLook w:firstColumn="1" w:firstRow="1" w:lastColumn="0" w:lastRow="0" w:noHBand="0" w:noVBand="1" w:val="04A0"/>
+      </w:tblPr>
+      <w:tblGrid>
+        <w:gridCol w:w="3312"/>
+        <w:gridCol w:w="3312"/>
+        <w:gridCol w:w="3312"/>
+      </w:tblGrid>
+      <w:tr>
+        <w:trPr>
+          <w:tblHeader/>
+        </w:trPr>
+        <w:tc>
+          <w:tcPr>
             <w:tcW w:type="dxa" w:w="2376"/>
             <w:shd w:fill="17365D"/>
             <w:tcBorders>
@@ -4522,6 +5119,248 @@
           <w:p>
             <w:r>
               <w:t>fault_campaign.execution_cancelled</w:t>
+            </w:r>
+          </w:p>
+        </w:tc>
+      </w:tr>
+      <w:tr>
+        <w:tc>
+          <w:tcPr>
+            <w:tcW w:type="dxa" w:w="2376"/>
+            <w:tcBorders>
+              <w:top w:val="single" w:sz="4" w:color="D9D9D9"/>
+              <w:left w:val="single" w:sz="4" w:color="D9D9D9"/>
+              <w:bottom w:val="single" w:sz="4" w:color="D9D9D9"/>
+              <w:right w:val="single" w:sz="4" w:color="D9D9D9"/>
+              <w:insideH w:val="single" w:sz="4" w:color="D9D9D9"/>
+              <w:insideV w:val="single" w:sz="4" w:color="D9D9D9"/>
+            </w:tcBorders>
+            <w:vAlign w:val="center"/>
+          </w:tcPr>
+          <w:p>
+            <w:r>
+              <w:t>Create mutation campaign</w:t>
+            </w:r>
+          </w:p>
+        </w:tc>
+        <w:tc>
+          <w:tcPr>
+            <w:tcW w:type="dxa" w:w="4536"/>
+            <w:tcBorders>
+              <w:top w:val="single" w:sz="4" w:color="D9D9D9"/>
+              <w:left w:val="single" w:sz="4" w:color="D9D9D9"/>
+              <w:bottom w:val="single" w:sz="4" w:color="D9D9D9"/>
+              <w:right w:val="single" w:sz="4" w:color="D9D9D9"/>
+              <w:insideH w:val="single" w:sz="4" w:color="D9D9D9"/>
+              <w:insideV w:val="single" w:sz="4" w:color="D9D9D9"/>
+            </w:tcBorders>
+            <w:vAlign w:val="center"/>
+          </w:tcPr>
+          <w:p>
+            <w:r>
+              <w:t>atep.mutation_campaign.created.v1</w:t>
+            </w:r>
+          </w:p>
+        </w:tc>
+        <w:tc>
+          <w:tcPr>
+            <w:tcW w:type="dxa" w:w="3024"/>
+            <w:tcBorders>
+              <w:top w:val="single" w:sz="4" w:color="D9D9D9"/>
+              <w:left w:val="single" w:sz="4" w:color="D9D9D9"/>
+              <w:bottom w:val="single" w:sz="4" w:color="D9D9D9"/>
+              <w:right w:val="single" w:sz="4" w:color="D9D9D9"/>
+              <w:insideH w:val="single" w:sz="4" w:color="D9D9D9"/>
+              <w:insideV w:val="single" w:sz="4" w:color="D9D9D9"/>
+            </w:tcBorders>
+            <w:vAlign w:val="center"/>
+          </w:tcPr>
+          <w:p>
+            <w:r>
+              <w:t>mutation_campaign.created</w:t>
+            </w:r>
+          </w:p>
+        </w:tc>
+      </w:tr>
+      <w:tr>
+        <w:tc>
+          <w:tcPr>
+            <w:tcW w:type="dxa" w:w="2376"/>
+            <w:tcBorders>
+              <w:top w:val="single" w:sz="4" w:color="D9D9D9"/>
+              <w:left w:val="single" w:sz="4" w:color="D9D9D9"/>
+              <w:bottom w:val="single" w:sz="4" w:color="D9D9D9"/>
+              <w:right w:val="single" w:sz="4" w:color="D9D9D9"/>
+              <w:insideH w:val="single" w:sz="4" w:color="D9D9D9"/>
+              <w:insideV w:val="single" w:sz="4" w:color="D9D9D9"/>
+            </w:tcBorders>
+            <w:shd w:fill="EAF0F7"/>
+            <w:vAlign w:val="center"/>
+          </w:tcPr>
+          <w:p>
+            <w:r>
+              <w:t>Create mutation execution</w:t>
+            </w:r>
+          </w:p>
+        </w:tc>
+        <w:tc>
+          <w:tcPr>
+            <w:tcW w:type="dxa" w:w="4536"/>
+            <w:tcBorders>
+              <w:top w:val="single" w:sz="4" w:color="D9D9D9"/>
+              <w:left w:val="single" w:sz="4" w:color="D9D9D9"/>
+              <w:bottom w:val="single" w:sz="4" w:color="D9D9D9"/>
+              <w:right w:val="single" w:sz="4" w:color="D9D9D9"/>
+              <w:insideH w:val="single" w:sz="4" w:color="D9D9D9"/>
+              <w:insideV w:val="single" w:sz="4" w:color="D9D9D9"/>
+            </w:tcBorders>
+            <w:shd w:fill="EAF0F7"/>
+            <w:vAlign w:val="center"/>
+          </w:tcPr>
+          <w:p>
+            <w:r>
+              <w:t>atep.mutation_execution.created.v1</w:t>
+            </w:r>
+          </w:p>
+        </w:tc>
+        <w:tc>
+          <w:tcPr>
+            <w:tcW w:type="dxa" w:w="3024"/>
+            <w:tcBorders>
+              <w:top w:val="single" w:sz="4" w:color="D9D9D9"/>
+              <w:left w:val="single" w:sz="4" w:color="D9D9D9"/>
+              <w:bottom w:val="single" w:sz="4" w:color="D9D9D9"/>
+              <w:right w:val="single" w:sz="4" w:color="D9D9D9"/>
+              <w:insideH w:val="single" w:sz="4" w:color="D9D9D9"/>
+              <w:insideV w:val="single" w:sz="4" w:color="D9D9D9"/>
+            </w:tcBorders>
+            <w:shd w:fill="EAF0F7"/>
+            <w:vAlign w:val="center"/>
+          </w:tcPr>
+          <w:p>
+            <w:r>
+              <w:t>mutation_execution.created</w:t>
+            </w:r>
+          </w:p>
+        </w:tc>
+      </w:tr>
+      <w:tr>
+        <w:tc>
+          <w:tcPr>
+            <w:tcW w:type="dxa" w:w="2376"/>
+            <w:tcBorders>
+              <w:top w:val="single" w:sz="4" w:color="D9D9D9"/>
+              <w:left w:val="single" w:sz="4" w:color="D9D9D9"/>
+              <w:bottom w:val="single" w:sz="4" w:color="D9D9D9"/>
+              <w:right w:val="single" w:sz="4" w:color="D9D9D9"/>
+              <w:insideH w:val="single" w:sz="4" w:color="D9D9D9"/>
+              <w:insideV w:val="single" w:sz="4" w:color="D9D9D9"/>
+            </w:tcBorders>
+            <w:vAlign w:val="center"/>
+          </w:tcPr>
+          <w:p>
+            <w:r>
+              <w:t>Record mutant result</w:t>
+            </w:r>
+          </w:p>
+        </w:tc>
+        <w:tc>
+          <w:tcPr>
+            <w:tcW w:type="dxa" w:w="4536"/>
+            <w:tcBorders>
+              <w:top w:val="single" w:sz="4" w:color="D9D9D9"/>
+              <w:left w:val="single" w:sz="4" w:color="D9D9D9"/>
+              <w:bottom w:val="single" w:sz="4" w:color="D9D9D9"/>
+              <w:right w:val="single" w:sz="4" w:color="D9D9D9"/>
+              <w:insideH w:val="single" w:sz="4" w:color="D9D9D9"/>
+              <w:insideV w:val="single" w:sz="4" w:color="D9D9D9"/>
+            </w:tcBorders>
+            <w:vAlign w:val="center"/>
+          </w:tcPr>
+          <w:p>
+            <w:r>
+              <w:t>atep.mutant_result.recorded.v1</w:t>
+            </w:r>
+          </w:p>
+        </w:tc>
+        <w:tc>
+          <w:tcPr>
+            <w:tcW w:type="dxa" w:w="3024"/>
+            <w:tcBorders>
+              <w:top w:val="single" w:sz="4" w:color="D9D9D9"/>
+              <w:left w:val="single" w:sz="4" w:color="D9D9D9"/>
+              <w:bottom w:val="single" w:sz="4" w:color="D9D9D9"/>
+              <w:right w:val="single" w:sz="4" w:color="D9D9D9"/>
+              <w:insideH w:val="single" w:sz="4" w:color="D9D9D9"/>
+              <w:insideV w:val="single" w:sz="4" w:color="D9D9D9"/>
+            </w:tcBorders>
+            <w:vAlign w:val="center"/>
+          </w:tcPr>
+          <w:p>
+            <w:r>
+              <w:t>mutant_result.recorded</w:t>
+            </w:r>
+          </w:p>
+        </w:tc>
+      </w:tr>
+      <w:tr>
+        <w:tc>
+          <w:tcPr>
+            <w:tcW w:type="dxa" w:w="2376"/>
+            <w:tcBorders>
+              <w:top w:val="single" w:sz="4" w:color="D9D9D9"/>
+              <w:left w:val="single" w:sz="4" w:color="D9D9D9"/>
+              <w:bottom w:val="single" w:sz="4" w:color="D9D9D9"/>
+              <w:right w:val="single" w:sz="4" w:color="D9D9D9"/>
+              <w:insideH w:val="single" w:sz="4" w:color="D9D9D9"/>
+              <w:insideV w:val="single" w:sz="4" w:color="D9D9D9"/>
+            </w:tcBorders>
+            <w:shd w:fill="EAF0F7"/>
+            <w:vAlign w:val="center"/>
+          </w:tcPr>
+          <w:p>
+            <w:r>
+              <w:t>Update requirement</w:t>
+            </w:r>
+          </w:p>
+        </w:tc>
+        <w:tc>
+          <w:tcPr>
+            <w:tcW w:type="dxa" w:w="4536"/>
+            <w:tcBorders>
+              <w:top w:val="single" w:sz="4" w:color="D9D9D9"/>
+              <w:left w:val="single" w:sz="4" w:color="D9D9D9"/>
+              <w:bottom w:val="single" w:sz="4" w:color="D9D9D9"/>
+              <w:right w:val="single" w:sz="4" w:color="D9D9D9"/>
+              <w:insideH w:val="single" w:sz="4" w:color="D9D9D9"/>
+              <w:insideV w:val="single" w:sz="4" w:color="D9D9D9"/>
+            </w:tcBorders>
+            <w:shd w:fill="EAF0F7"/>
+            <w:vAlign w:val="center"/>
+          </w:tcPr>
+          <w:p>
+            <w:r>
+              <w:t>atep.requirement_coverage.updated.v1</w:t>
+            </w:r>
+          </w:p>
+        </w:tc>
+        <w:tc>
+          <w:tcPr>
+            <w:tcW w:type="dxa" w:w="3024"/>
+            <w:tcBorders>
+              <w:top w:val="single" w:sz="4" w:color="D9D9D9"/>
+              <w:left w:val="single" w:sz="4" w:color="D9D9D9"/>
+              <w:bottom w:val="single" w:sz="4" w:color="D9D9D9"/>
+              <w:right w:val="single" w:sz="4" w:color="D9D9D9"/>
+              <w:insideH w:val="single" w:sz="4" w:color="D9D9D9"/>
+              <w:insideV w:val="single" w:sz="4" w:color="D9D9D9"/>
+            </w:tcBorders>
+            <w:shd w:fill="EAF0F7"/>
+            <w:vAlign w:val="center"/>
+          </w:tcPr>
+          <w:p>
+            <w:r>
+              <w:t>requirement_coverage.updated</w:t>
             </w:r>
           </w:p>
         </w:tc>
@@ -4543,7 +5382,7 @@
         <w:pStyle w:val="Heading1"/>
       </w:pPr>
       <w:r>
-        <w:t>12 Engineering Decisions</w:t>
+        <w:t>13 Engineering Decisions</w:t>
       </w:r>
     </w:p>
     <w:tbl>
@@ -5177,6 +6016,127 @@
           </w:p>
         </w:tc>
       </w:tr>
+      <w:tr>
+        <w:tc>
+          <w:tcPr>
+            <w:tcW w:type="dxa" w:w="2376"/>
+            <w:tcBorders>
+              <w:top w:val="single" w:sz="4" w:color="D9D9D9"/>
+              <w:left w:val="single" w:sz="4" w:color="D9D9D9"/>
+              <w:bottom w:val="single" w:sz="4" w:color="D9D9D9"/>
+              <w:right w:val="single" w:sz="4" w:color="D9D9D9"/>
+              <w:insideH w:val="single" w:sz="4" w:color="D9D9D9"/>
+              <w:insideV w:val="single" w:sz="4" w:color="D9D9D9"/>
+            </w:tcBorders>
+            <w:shd w:fill="EAF0F7"/>
+            <w:vAlign w:val="center"/>
+          </w:tcPr>
+          <w:p>
+            <w:r>
+              <w:t>Allowlist mutation operators</w:t>
+            </w:r>
+          </w:p>
+        </w:tc>
+        <w:tc>
+          <w:tcPr>
+            <w:tcW w:type="dxa" w:w="3960"/>
+            <w:tcBorders>
+              <w:top w:val="single" w:sz="4" w:color="D9D9D9"/>
+              <w:left w:val="single" w:sz="4" w:color="D9D9D9"/>
+              <w:bottom w:val="single" w:sz="4" w:color="D9D9D9"/>
+              <w:right w:val="single" w:sz="4" w:color="D9D9D9"/>
+              <w:insideH w:val="single" w:sz="4" w:color="D9D9D9"/>
+              <w:insideV w:val="single" w:sz="4" w:color="D9D9D9"/>
+            </w:tcBorders>
+            <w:shd w:fill="EAF0F7"/>
+            <w:vAlign w:val="center"/>
+          </w:tcPr>
+          <w:p>
+            <w:r>
+              <w:t>Exclude arbitrary execution</w:t>
+            </w:r>
+          </w:p>
+        </w:tc>
+        <w:tc>
+          <w:tcPr>
+            <w:tcW w:type="dxa" w:w="3600"/>
+            <w:tcBorders>
+              <w:top w:val="single" w:sz="4" w:color="D9D9D9"/>
+              <w:left w:val="single" w:sz="4" w:color="D9D9D9"/>
+              <w:bottom w:val="single" w:sz="4" w:color="D9D9D9"/>
+              <w:right w:val="single" w:sz="4" w:color="D9D9D9"/>
+              <w:insideH w:val="single" w:sz="4" w:color="D9D9D9"/>
+              <w:insideV w:val="single" w:sz="4" w:color="D9D9D9"/>
+            </w:tcBorders>
+            <w:shd w:fill="EAF0F7"/>
+            <w:vAlign w:val="center"/>
+          </w:tcPr>
+          <w:p>
+            <w:r>
+              <w:t>Native adapters remain isolated in VIII-7</w:t>
+            </w:r>
+          </w:p>
+        </w:tc>
+      </w:tr>
+      <w:tr>
+        <w:tc>
+          <w:tcPr>
+            <w:tcW w:type="dxa" w:w="2376"/>
+            <w:tcBorders>
+              <w:top w:val="single" w:sz="4" w:color="D9D9D9"/>
+              <w:left w:val="single" w:sz="4" w:color="D9D9D9"/>
+              <w:bottom w:val="single" w:sz="4" w:color="D9D9D9"/>
+              <w:right w:val="single" w:sz="4" w:color="D9D9D9"/>
+              <w:insideH w:val="single" w:sz="4" w:color="D9D9D9"/>
+              <w:insideV w:val="single" w:sz="4" w:color="D9D9D9"/>
+            </w:tcBorders>
+            <w:vAlign w:val="center"/>
+          </w:tcPr>
+          <w:p>
+            <w:r>
+              <w:t>Derive coverage state</w:t>
+            </w:r>
+          </w:p>
+        </w:tc>
+        <w:tc>
+          <w:tcPr>
+            <w:tcW w:type="dxa" w:w="3960"/>
+            <w:tcBorders>
+              <w:top w:val="single" w:sz="4" w:color="D9D9D9"/>
+              <w:left w:val="single" w:sz="4" w:color="D9D9D9"/>
+              <w:bottom w:val="single" w:sz="4" w:color="D9D9D9"/>
+              <w:right w:val="single" w:sz="4" w:color="D9D9D9"/>
+              <w:insideH w:val="single" w:sz="4" w:color="D9D9D9"/>
+              <w:insideV w:val="single" w:sz="4" w:color="D9D9D9"/>
+            </w:tcBorders>
+            <w:vAlign w:val="center"/>
+          </w:tcPr>
+          <w:p>
+            <w:r>
+              <w:t>Make gaps deterministic</w:t>
+            </w:r>
+          </w:p>
+        </w:tc>
+        <w:tc>
+          <w:tcPr>
+            <w:tcW w:type="dxa" w:w="3600"/>
+            <w:tcBorders>
+              <w:top w:val="single" w:sz="4" w:color="D9D9D9"/>
+              <w:left w:val="single" w:sz="4" w:color="D9D9D9"/>
+              <w:bottom w:val="single" w:sz="4" w:color="D9D9D9"/>
+              <w:right w:val="single" w:sz="4" w:color="D9D9D9"/>
+              <w:insideH w:val="single" w:sz="4" w:color="D9D9D9"/>
+              <w:insideV w:val="single" w:sz="4" w:color="D9D9D9"/>
+            </w:tcBorders>
+            <w:vAlign w:val="center"/>
+          </w:tcPr>
+          <w:p>
+            <w:r>
+              <w:t>Dashboard consumers use stable totals</w:t>
+            </w:r>
+          </w:p>
+        </w:tc>
+      </w:tr>
     </w:tbl>
     <w:p/>
     <w:p>
@@ -5189,7 +6149,7 @@
         <w:pStyle w:val="Heading1"/>
       </w:pPr>
       <w:r>
-        <w:t>13 Verification Catalogue</w:t>
+        <w:t>14 Verification Catalogue</w:t>
       </w:r>
     </w:p>
     <w:tbl>
@@ -5823,6 +6783,68 @@
           </w:p>
         </w:tc>
       </w:tr>
+      <w:tr>
+        <w:tc>
+          <w:tcPr>
+            <w:tcW w:type="dxa" w:w="2232"/>
+            <w:tcBorders>
+              <w:top w:val="single" w:sz="4" w:color="D9D9D9"/>
+              <w:left w:val="single" w:sz="4" w:color="D9D9D9"/>
+              <w:bottom w:val="single" w:sz="4" w:color="D9D9D9"/>
+              <w:right w:val="single" w:sz="4" w:color="D9D9D9"/>
+              <w:insideH w:val="single" w:sz="4" w:color="D9D9D9"/>
+              <w:insideV w:val="single" w:sz="4" w:color="D9D9D9"/>
+            </w:tcBorders>
+            <w:shd w:fill="EAF0F7"/>
+            <w:vAlign w:val="center"/>
+          </w:tcPr>
+          <w:p>
+            <w:r>
+              <w:t>TF-T-049 to 059</w:t>
+            </w:r>
+          </w:p>
+        </w:tc>
+        <w:tc>
+          <w:tcPr>
+            <w:tcW w:type="dxa" w:w="3528"/>
+            <w:tcBorders>
+              <w:top w:val="single" w:sz="4" w:color="D9D9D9"/>
+              <w:left w:val="single" w:sz="4" w:color="D9D9D9"/>
+              <w:bottom w:val="single" w:sz="4" w:color="D9D9D9"/>
+              <w:right w:val="single" w:sz="4" w:color="D9D9D9"/>
+              <w:insideH w:val="single" w:sz="4" w:color="D9D9D9"/>
+              <w:insideV w:val="single" w:sz="4" w:color="D9D9D9"/>
+            </w:tcBorders>
+            <w:shd w:fill="EAF0F7"/>
+            <w:vAlign w:val="center"/>
+          </w:tcPr>
+          <w:p>
+            <w:r>
+              <w:t>Mutation and coverage</w:t>
+            </w:r>
+          </w:p>
+        </w:tc>
+        <w:tc>
+          <w:tcPr>
+            <w:tcW w:type="dxa" w:w="4176"/>
+            <w:tcBorders>
+              <w:top w:val="single" w:sz="4" w:color="D9D9D9"/>
+              <w:left w:val="single" w:sz="4" w:color="D9D9D9"/>
+              <w:bottom w:val="single" w:sz="4" w:color="D9D9D9"/>
+              <w:right w:val="single" w:sz="4" w:color="D9D9D9"/>
+              <w:insideH w:val="single" w:sz="4" w:color="D9D9D9"/>
+              <w:insideV w:val="single" w:sz="4" w:color="D9D9D9"/>
+            </w:tcBorders>
+            <w:shd w:fill="EAF0F7"/>
+            <w:vAlign w:val="center"/>
+          </w:tcPr>
+          <w:p>
+            <w:r>
+              <w:t>Validate scoring, traceability, safety, RBAC, integration, and migration</w:t>
+            </w:r>
+          </w:p>
+        </w:tc>
+      </w:tr>
     </w:tbl>
     <w:p/>
     <w:p>
@@ -5835,7 +6857,7 @@
         <w:pStyle w:val="Heading1"/>
       </w:pPr>
       <w:r>
-        <w:t>14 Risks and Controls</w:t>
+        <w:t>15 Risks and Controls</w:t>
       </w:r>
     </w:p>
     <w:tbl>
@@ -6469,6 +7491,127 @@
           </w:p>
         </w:tc>
       </w:tr>
+      <w:tr>
+        <w:tc>
+          <w:tcPr>
+            <w:tcW w:type="dxa" w:w="2160"/>
+            <w:tcBorders>
+              <w:top w:val="single" w:sz="4" w:color="D9D9D9"/>
+              <w:left w:val="single" w:sz="4" w:color="D9D9D9"/>
+              <w:bottom w:val="single" w:sz="4" w:color="D9D9D9"/>
+              <w:right w:val="single" w:sz="4" w:color="D9D9D9"/>
+              <w:insideH w:val="single" w:sz="4" w:color="D9D9D9"/>
+              <w:insideV w:val="single" w:sz="4" w:color="D9D9D9"/>
+            </w:tcBorders>
+            <w:shd w:fill="EAF0F7"/>
+            <w:vAlign w:val="center"/>
+          </w:tcPr>
+          <w:p>
+            <w:r>
+              <w:t>Unsafe mutation execution</w:t>
+            </w:r>
+          </w:p>
+        </w:tc>
+        <w:tc>
+          <w:tcPr>
+            <w:tcW w:type="dxa" w:w="3672"/>
+            <w:tcBorders>
+              <w:top w:val="single" w:sz="4" w:color="D9D9D9"/>
+              <w:left w:val="single" w:sz="4" w:color="D9D9D9"/>
+              <w:bottom w:val="single" w:sz="4" w:color="D9D9D9"/>
+              <w:right w:val="single" w:sz="4" w:color="D9D9D9"/>
+              <w:insideH w:val="single" w:sz="4" w:color="D9D9D9"/>
+              <w:insideV w:val="single" w:sz="4" w:color="D9D9D9"/>
+            </w:tcBorders>
+            <w:shd w:fill="EAF0F7"/>
+            <w:vAlign w:val="center"/>
+          </w:tcPr>
+          <w:p>
+            <w:r>
+              <w:t>Structured allowlist and no generic runner</w:t>
+            </w:r>
+          </w:p>
+        </w:tc>
+        <w:tc>
+          <w:tcPr>
+            <w:tcW w:type="dxa" w:w="4104"/>
+            <w:tcBorders>
+              <w:top w:val="single" w:sz="4" w:color="D9D9D9"/>
+              <w:left w:val="single" w:sz="4" w:color="D9D9D9"/>
+              <w:bottom w:val="single" w:sz="4" w:color="D9D9D9"/>
+              <w:right w:val="single" w:sz="4" w:color="D9D9D9"/>
+              <w:insideH w:val="single" w:sz="4" w:color="D9D9D9"/>
+              <w:insideV w:val="single" w:sz="4" w:color="D9D9D9"/>
+            </w:tcBorders>
+            <w:shd w:fill="EAF0F7"/>
+            <w:vAlign w:val="center"/>
+          </w:tcPr>
+          <w:p>
+            <w:r>
+              <w:t>Isolate native adapters in VIII-7</w:t>
+            </w:r>
+          </w:p>
+        </w:tc>
+      </w:tr>
+      <w:tr>
+        <w:tc>
+          <w:tcPr>
+            <w:tcW w:type="dxa" w:w="2160"/>
+            <w:tcBorders>
+              <w:top w:val="single" w:sz="4" w:color="D9D9D9"/>
+              <w:left w:val="single" w:sz="4" w:color="D9D9D9"/>
+              <w:bottom w:val="single" w:sz="4" w:color="D9D9D9"/>
+              <w:right w:val="single" w:sz="4" w:color="D9D9D9"/>
+              <w:insideH w:val="single" w:sz="4" w:color="D9D9D9"/>
+              <w:insideV w:val="single" w:sz="4" w:color="D9D9D9"/>
+            </w:tcBorders>
+            <w:vAlign w:val="center"/>
+          </w:tcPr>
+          <w:p>
+            <w:r>
+              <w:t>False coverage confidence</w:t>
+            </w:r>
+          </w:p>
+        </w:tc>
+        <w:tc>
+          <w:tcPr>
+            <w:tcW w:type="dxa" w:w="3672"/>
+            <w:tcBorders>
+              <w:top w:val="single" w:sz="4" w:color="D9D9D9"/>
+              <w:left w:val="single" w:sz="4" w:color="D9D9D9"/>
+              <w:bottom w:val="single" w:sz="4" w:color="D9D9D9"/>
+              <w:right w:val="single" w:sz="4" w:color="D9D9D9"/>
+              <w:insideH w:val="single" w:sz="4" w:color="D9D9D9"/>
+              <w:insideV w:val="single" w:sz="4" w:color="D9D9D9"/>
+            </w:tcBorders>
+            <w:vAlign w:val="center"/>
+          </w:tcPr>
+          <w:p>
+            <w:r>
+              <w:t>Separate test links from evidence links</w:t>
+            </w:r>
+          </w:p>
+        </w:tc>
+        <w:tc>
+          <w:tcPr>
+            <w:tcW w:type="dxa" w:w="4104"/>
+            <w:tcBorders>
+              <w:top w:val="single" w:sz="4" w:color="D9D9D9"/>
+              <w:left w:val="single" w:sz="4" w:color="D9D9D9"/>
+              <w:bottom w:val="single" w:sz="4" w:color="D9D9D9"/>
+              <w:right w:val="single" w:sz="4" w:color="D9D9D9"/>
+              <w:insideH w:val="single" w:sz="4" w:color="D9D9D9"/>
+              <w:insideV w:val="single" w:sz="4" w:color="D9D9D9"/>
+            </w:tcBorders>
+            <w:vAlign w:val="center"/>
+          </w:tcPr>
+          <w:p>
+            <w:r>
+              <w:t>Track partial and gap totals</w:t>
+            </w:r>
+          </w:p>
+        </w:tc>
+      </w:tr>
     </w:tbl>
     <w:p/>
     <w:p>
@@ -6476,12 +7619,12 @@
         <w:pStyle w:val="Heading1"/>
       </w:pPr>
       <w:r>
-        <w:t>15 Study Exercises</w:t>
+        <w:t>16 Study Exercises</w:t>
       </w:r>
     </w:p>
     <w:p>
       <w:r>
-        <w:t>Create one ADAS definition and identify its invariants. Then run two required cases, explain the aggregate result, and compare an exact retry after suite archival with a new run request for the archived suite. Schedule the same suite, archive it, and explain why the stored job can still dispatch reproducibly. Finally, design one battery-temperature fault with recovery verification and explain why the campaign contract must not expose an arbitrary shell or adapter command.</w:t>
+        <w:t>Create one ADAS definition and identify its invariants. Then run two required cases, explain the aggregate result, and compare an exact retry after suite archival with a new run request for the archived suite. Schedule the same suite, archive it, and explain why the stored job can still dispatch reproducibly. Finally, design one battery-temperature fault with recovery verification and explain why the campaign contract must not expose an arbitrary shell or adapter command. Create two mutants, calculate a fifty percent score, and explain why a requirement with a test but no evidence is only partially covered.</w:t>
       </w:r>
     </w:p>
     <w:p>
@@ -6489,12 +7632,12 @@
         <w:pStyle w:val="Heading1"/>
       </w:pPr>
       <w:r>
-        <w:t>16 Next Development</w:t>
+        <w:t>17 Next Development</w:t>
       </w:r>
     </w:p>
     <w:p>
       <w:r>
-        <w:t>VIII-6 will add mutation operators, kill-rate evidence, requirement coverage, and gap analysis. VIII-4 remains planned near project completion, when stable baselines make performance thresholds and comparable trends meaningful.</w:t>
+        <w:t>VIII-7 will connect Gateway and CarSystemUI orchestration to the catalog, execution, fault, mutation, and evidence contracts. VIII-4 remains planned near project completion, when stable baselines make performance thresholds and comparable trends meaningful.</w:t>
       </w:r>
     </w:p>
     <w:sectPr>

</xml_diff>

<commit_message>
feat(test-framework): add mutation analysis (#95)
</commit_message>
<xml_diff>
--- a/docs/ATEP_Volume_VIII_Test_Framework_Engineering_Workbook.docx
+++ b/docs/ATEP_Volume_VIII_Test_Framework_Engineering_Workbook.docx
@@ -19,12 +19,12 @@
         <w:rPr>
           <w:b/>
         </w:rPr>
-        <w:t>Version 0.4.0   VIII 5 Fault Campaigns Implemented</w:t>
+        <w:t>Version 0.5.0   VIII 6 Mutation and Coverage Implemented</w:t>
       </w:r>
     </w:p>
     <w:p>
       <w:r>
-        <w:t>This workbook records the catalog, execution-binding, scheduled-selection, and bounded fault-campaign baseline for ATEP. Reusable definitions describe test intent, suites preserve reviewed composition, and catalog-backed runs now persist deterministic case results and aggregate outcomes.</w:t>
+        <w:t>This workbook records the catalog, execution-binding, scheduled-selection, and bounded fault-campaign and mutation-quality baseline for ATEP. Reusable definitions describe test intent, suites preserve reviewed composition, and catalog-backed runs now persist deterministic case results and aggregate outcomes.</w:t>
       </w:r>
     </w:p>
     <w:tbl>
@@ -125,7 +125,7 @@
           </w:tcPr>
           <w:p>
             <w:r>
-              <w:t>VIII-1, VIII-2, VIII-3, and VIII-5 implemented and verified</w:t>
+              <w:t>VIII-1, VIII-2, VIII-3, VIII-5, and VIII-6 implemented and verified</w:t>
             </w:r>
           </w:p>
         </w:tc>
@@ -289,7 +289,7 @@
           </w:tcPr>
           <w:p>
             <w:r>
-              <w:t>VIII-6 mutation testing and coverage; VIII-4 deferred</w:t>
+              <w:t>VIII-7 cross-platform automation; VIII-4 deferred</w:t>
             </w:r>
           </w:p>
         </w:tc>
@@ -306,7 +306,7 @@
     </w:p>
     <w:p>
       <w:r>
-        <w:t>VIII-1 separates reusable test design from test execution. A definition captures one test's preconditions, actions, inputs, expectations, classification, and resource budget. A suite selects active definitions in an explicit order and freezes their versions. VIII-2 binds that snapshot to a run and records each case outcome. VIII-3 schedules that immutable intent for later smoke, sanity, or regression execution. VIII-5 adds cross-domain fault campaigns with recovery plans and evidence.</w:t>
+        <w:t>VIII-1 separates reusable test design from test execution. A definition captures one test's preconditions, actions, inputs, expectations, classification, and resource budget. A suite selects active definitions in an explicit order and freezes their versions. VIII-2 binds that snapshot to a run and records each case outcome. VIII-3 schedules that immutable intent for later smoke, sanity, or regression execution. VIII-5 adds cross-domain fault campaigns with recovery plans and evidence. VIII-6 adds bounded mutation scoring and explicit requirement coverage gaps.</w:t>
       </w:r>
     </w:p>
     <w:p>
@@ -330,7 +330,7 @@
         <w:pStyle w:val="ListBullet"/>
       </w:pPr>
       <w:r>
-        <w:t>Performance and stress remain planned but are deferred until near completion; mutation testing and coverage are next.</w:t>
+        <w:t>Performance and stress remain planned but are deferred until near completion; cross-platform automation is next.</w:t>
       </w:r>
     </w:p>
     <w:p>
@@ -568,7 +568,7 @@
           </w:tcPr>
           <w:p>
             <w:r>
-              <w:t>Linear migrations 0051 through 0054 with reversible schema changes</w:t>
+              <w:t>Linear migrations 0051 through 0055 with reversible schema changes</w:t>
             </w:r>
           </w:p>
         </w:tc>
@@ -1955,6 +1955,127 @@
           <w:p>
             <w:r>
               <w:t>Fault campaigns</w:t>
+            </w:r>
+          </w:p>
+        </w:tc>
+        <w:tc>
+          <w:tcPr>
+            <w:tcW w:type="dxa" w:w="4680"/>
+            <w:tcBorders>
+              <w:top w:val="single" w:sz="4" w:color="D9D9D9"/>
+              <w:left w:val="single" w:sz="4" w:color="D9D9D9"/>
+              <w:bottom w:val="single" w:sz="4" w:color="D9D9D9"/>
+              <w:right w:val="single" w:sz="4" w:color="D9D9D9"/>
+              <w:insideH w:val="single" w:sz="4" w:color="D9D9D9"/>
+              <w:insideV w:val="single" w:sz="4" w:color="D9D9D9"/>
+            </w:tcBorders>
+            <w:shd w:fill="EAF0F7"/>
+            <w:vAlign w:val="center"/>
+          </w:tcPr>
+          <w:p>
+            <w:r>
+              <w:t>List, detail, and results</w:t>
+            </w:r>
+          </w:p>
+        </w:tc>
+        <w:tc>
+          <w:tcPr>
+            <w:tcW w:type="dxa" w:w="2880"/>
+            <w:tcBorders>
+              <w:top w:val="single" w:sz="4" w:color="D9D9D9"/>
+              <w:left w:val="single" w:sz="4" w:color="D9D9D9"/>
+              <w:bottom w:val="single" w:sz="4" w:color="D9D9D9"/>
+              <w:right w:val="single" w:sz="4" w:color="D9D9D9"/>
+              <w:insideH w:val="single" w:sz="4" w:color="D9D9D9"/>
+              <w:insideV w:val="single" w:sz="4" w:color="D9D9D9"/>
+            </w:tcBorders>
+            <w:shd w:fill="EAF0F7"/>
+            <w:vAlign w:val="center"/>
+          </w:tcPr>
+          <w:p>
+            <w:r>
+              <w:t>test_catalog:read</w:t>
+            </w:r>
+          </w:p>
+        </w:tc>
+      </w:tr>
+      <w:tr>
+        <w:tc>
+          <w:tcPr>
+            <w:tcW w:type="dxa" w:w="2376"/>
+            <w:tcBorders>
+              <w:top w:val="single" w:sz="4" w:color="D9D9D9"/>
+              <w:left w:val="single" w:sz="4" w:color="D9D9D9"/>
+              <w:bottom w:val="single" w:sz="4" w:color="D9D9D9"/>
+              <w:right w:val="single" w:sz="4" w:color="D9D9D9"/>
+              <w:insideH w:val="single" w:sz="4" w:color="D9D9D9"/>
+              <w:insideV w:val="single" w:sz="4" w:color="D9D9D9"/>
+            </w:tcBorders>
+            <w:vAlign w:val="center"/>
+          </w:tcPr>
+          <w:p>
+            <w:r>
+              <w:t>Mutation and coverage</w:t>
+            </w:r>
+          </w:p>
+        </w:tc>
+        <w:tc>
+          <w:tcPr>
+            <w:tcW w:type="dxa" w:w="4680"/>
+            <w:tcBorders>
+              <w:top w:val="single" w:sz="4" w:color="D9D9D9"/>
+              <w:left w:val="single" w:sz="4" w:color="D9D9D9"/>
+              <w:bottom w:val="single" w:sz="4" w:color="D9D9D9"/>
+              <w:right w:val="single" w:sz="4" w:color="D9D9D9"/>
+              <w:insideH w:val="single" w:sz="4" w:color="D9D9D9"/>
+              <w:insideV w:val="single" w:sz="4" w:color="D9D9D9"/>
+            </w:tcBorders>
+            <w:vAlign w:val="center"/>
+          </w:tcPr>
+          <w:p>
+            <w:r>
+              <w:t>Create, status, execute, update</w:t>
+            </w:r>
+          </w:p>
+        </w:tc>
+        <w:tc>
+          <w:tcPr>
+            <w:tcW w:type="dxa" w:w="2880"/>
+            <w:tcBorders>
+              <w:top w:val="single" w:sz="4" w:color="D9D9D9"/>
+              <w:left w:val="single" w:sz="4" w:color="D9D9D9"/>
+              <w:bottom w:val="single" w:sz="4" w:color="D9D9D9"/>
+              <w:right w:val="single" w:sz="4" w:color="D9D9D9"/>
+              <w:insideH w:val="single" w:sz="4" w:color="D9D9D9"/>
+              <w:insideV w:val="single" w:sz="4" w:color="D9D9D9"/>
+            </w:tcBorders>
+            <w:vAlign w:val="center"/>
+          </w:tcPr>
+          <w:p>
+            <w:r>
+              <w:t>test_catalog:manage</w:t>
+            </w:r>
+          </w:p>
+        </w:tc>
+      </w:tr>
+      <w:tr>
+        <w:tc>
+          <w:tcPr>
+            <w:tcW w:type="dxa" w:w="2376"/>
+            <w:tcBorders>
+              <w:top w:val="single" w:sz="4" w:color="D9D9D9"/>
+              <w:left w:val="single" w:sz="4" w:color="D9D9D9"/>
+              <w:bottom w:val="single" w:sz="4" w:color="D9D9D9"/>
+              <w:right w:val="single" w:sz="4" w:color="D9D9D9"/>
+              <w:insideH w:val="single" w:sz="4" w:color="D9D9D9"/>
+              <w:insideV w:val="single" w:sz="4" w:color="D9D9D9"/>
+            </w:tcBorders>
+            <w:shd w:fill="EAF0F7"/>
+            <w:vAlign w:val="center"/>
+          </w:tcPr>
+          <w:p>
+            <w:r>
+              <w:t>Mutation and coverage</w:t>
             </w:r>
           </w:p>
         </w:tc>
@@ -3709,7 +3830,12 @@
         <w:pStyle w:val="Heading1"/>
       </w:pPr>
       <w:r>
-        <w:t>11 Events and Audit</w:t>
+        <w:t>11 Mutation Testing and Coverage</w:t>
+      </w:r>
+    </w:p>
+    <w:p>
+      <w:r>
+        <w:t>VIII-6 binds an active catalog suite to a reviewed mutation campaign. Each campaign preserves the suite snapshot and contains up to five hundred uniquely ordered mutants using seven explicit operators. Execution materializes pending results atomically and never exposes arbitrary source or shell execution through the API.</w:t>
       </w:r>
     </w:p>
     <w:tbl>
@@ -3729,6 +3855,477 @@
         </w:trPr>
         <w:tc>
           <w:tcPr>
+            <w:tcW w:type="dxa" w:w="2160"/>
+            <w:shd w:fill="17365D"/>
+            <w:tcBorders>
+              <w:top w:val="single" w:sz="4" w:color="D9D9D9"/>
+              <w:left w:val="single" w:sz="4" w:color="D9D9D9"/>
+              <w:bottom w:val="single" w:sz="4" w:color="D9D9D9"/>
+              <w:right w:val="single" w:sz="4" w:color="D9D9D9"/>
+              <w:insideH w:val="single" w:sz="4" w:color="D9D9D9"/>
+              <w:insideV w:val="single" w:sz="4" w:color="D9D9D9"/>
+            </w:tcBorders>
+            <w:vAlign w:val="center"/>
+          </w:tcPr>
+          <w:p>
+            <w:r>
+              <w:rPr>
+                <w:b/>
+                <w:color w:val="FFFFFF"/>
+              </w:rPr>
+              <w:t>Control</w:t>
+            </w:r>
+          </w:p>
+        </w:tc>
+        <w:tc>
+          <w:tcPr>
+            <w:tcW w:type="dxa" w:w="3600"/>
+            <w:shd w:fill="17365D"/>
+            <w:tcBorders>
+              <w:top w:val="single" w:sz="4" w:color="D9D9D9"/>
+              <w:left w:val="single" w:sz="4" w:color="D9D9D9"/>
+              <w:bottom w:val="single" w:sz="4" w:color="D9D9D9"/>
+              <w:right w:val="single" w:sz="4" w:color="D9D9D9"/>
+              <w:insideH w:val="single" w:sz="4" w:color="D9D9D9"/>
+              <w:insideV w:val="single" w:sz="4" w:color="D9D9D9"/>
+            </w:tcBorders>
+            <w:vAlign w:val="center"/>
+          </w:tcPr>
+          <w:p>
+            <w:r>
+              <w:rPr>
+                <w:b/>
+                <w:color w:val="FFFFFF"/>
+              </w:rPr>
+              <w:t>Rule</w:t>
+            </w:r>
+          </w:p>
+        </w:tc>
+        <w:tc>
+          <w:tcPr>
+            <w:tcW w:type="dxa" w:w="4176"/>
+            <w:shd w:fill="17365D"/>
+            <w:tcBorders>
+              <w:top w:val="single" w:sz="4" w:color="D9D9D9"/>
+              <w:left w:val="single" w:sz="4" w:color="D9D9D9"/>
+              <w:bottom w:val="single" w:sz="4" w:color="D9D9D9"/>
+              <w:right w:val="single" w:sz="4" w:color="D9D9D9"/>
+              <w:insideH w:val="single" w:sz="4" w:color="D9D9D9"/>
+              <w:insideV w:val="single" w:sz="4" w:color="D9D9D9"/>
+            </w:tcBorders>
+            <w:vAlign w:val="center"/>
+          </w:tcPr>
+          <w:p>
+            <w:r>
+              <w:rPr>
+                <w:b/>
+                <w:color w:val="FFFFFF"/>
+              </w:rPr>
+              <w:t>Engineering purpose</w:t>
+            </w:r>
+          </w:p>
+        </w:tc>
+      </w:tr>
+      <w:tr>
+        <w:tc>
+          <w:tcPr>
+            <w:tcW w:type="dxa" w:w="2160"/>
+            <w:tcBorders>
+              <w:top w:val="single" w:sz="4" w:color="D9D9D9"/>
+              <w:left w:val="single" w:sz="4" w:color="D9D9D9"/>
+              <w:bottom w:val="single" w:sz="4" w:color="D9D9D9"/>
+              <w:right w:val="single" w:sz="4" w:color="D9D9D9"/>
+              <w:insideH w:val="single" w:sz="4" w:color="D9D9D9"/>
+              <w:insideV w:val="single" w:sz="4" w:color="D9D9D9"/>
+            </w:tcBorders>
+            <w:vAlign w:val="center"/>
+          </w:tcPr>
+          <w:p>
+            <w:r>
+              <w:t>Operators</w:t>
+            </w:r>
+          </w:p>
+        </w:tc>
+        <w:tc>
+          <w:tcPr>
+            <w:tcW w:type="dxa" w:w="3600"/>
+            <w:tcBorders>
+              <w:top w:val="single" w:sz="4" w:color="D9D9D9"/>
+              <w:left w:val="single" w:sz="4" w:color="D9D9D9"/>
+              <w:bottom w:val="single" w:sz="4" w:color="D9D9D9"/>
+              <w:right w:val="single" w:sz="4" w:color="D9D9D9"/>
+              <w:insideH w:val="single" w:sz="4" w:color="D9D9D9"/>
+              <w:insideV w:val="single" w:sz="4" w:color="D9D9D9"/>
+            </w:tcBorders>
+            <w:vAlign w:val="center"/>
+          </w:tcPr>
+          <w:p>
+            <w:r>
+              <w:t>Seven allowlisted values</w:t>
+            </w:r>
+          </w:p>
+        </w:tc>
+        <w:tc>
+          <w:tcPr>
+            <w:tcW w:type="dxa" w:w="4176"/>
+            <w:tcBorders>
+              <w:top w:val="single" w:sz="4" w:color="D9D9D9"/>
+              <w:left w:val="single" w:sz="4" w:color="D9D9D9"/>
+              <w:bottom w:val="single" w:sz="4" w:color="D9D9D9"/>
+              <w:right w:val="single" w:sz="4" w:color="D9D9D9"/>
+              <w:insideH w:val="single" w:sz="4" w:color="D9D9D9"/>
+              <w:insideV w:val="single" w:sz="4" w:color="D9D9D9"/>
+            </w:tcBorders>
+            <w:vAlign w:val="center"/>
+          </w:tcPr>
+          <w:p>
+            <w:r>
+              <w:t>Keep adapters portable and reviewable</w:t>
+            </w:r>
+          </w:p>
+        </w:tc>
+      </w:tr>
+      <w:tr>
+        <w:tc>
+          <w:tcPr>
+            <w:tcW w:type="dxa" w:w="2160"/>
+            <w:tcBorders>
+              <w:top w:val="single" w:sz="4" w:color="D9D9D9"/>
+              <w:left w:val="single" w:sz="4" w:color="D9D9D9"/>
+              <w:bottom w:val="single" w:sz="4" w:color="D9D9D9"/>
+              <w:right w:val="single" w:sz="4" w:color="D9D9D9"/>
+              <w:insideH w:val="single" w:sz="4" w:color="D9D9D9"/>
+              <w:insideV w:val="single" w:sz="4" w:color="D9D9D9"/>
+            </w:tcBorders>
+            <w:shd w:fill="EAF0F7"/>
+            <w:vAlign w:val="center"/>
+          </w:tcPr>
+          <w:p>
+            <w:r>
+              <w:t>Parameters</w:t>
+            </w:r>
+          </w:p>
+        </w:tc>
+        <w:tc>
+          <w:tcPr>
+            <w:tcW w:type="dxa" w:w="3600"/>
+            <w:tcBorders>
+              <w:top w:val="single" w:sz="4" w:color="D9D9D9"/>
+              <w:left w:val="single" w:sz="4" w:color="D9D9D9"/>
+              <w:bottom w:val="single" w:sz="4" w:color="D9D9D9"/>
+              <w:right w:val="single" w:sz="4" w:color="D9D9D9"/>
+              <w:insideH w:val="single" w:sz="4" w:color="D9D9D9"/>
+              <w:insideV w:val="single" w:sz="4" w:color="D9D9D9"/>
+            </w:tcBorders>
+            <w:shd w:fill="EAF0F7"/>
+            <w:vAlign w:val="center"/>
+          </w:tcPr>
+          <w:p>
+            <w:r>
+              <w:t>8192 bytes per mutant</w:t>
+            </w:r>
+          </w:p>
+        </w:tc>
+        <w:tc>
+          <w:tcPr>
+            <w:tcW w:type="dxa" w:w="4176"/>
+            <w:tcBorders>
+              <w:top w:val="single" w:sz="4" w:color="D9D9D9"/>
+              <w:left w:val="single" w:sz="4" w:color="D9D9D9"/>
+              <w:bottom w:val="single" w:sz="4" w:color="D9D9D9"/>
+              <w:right w:val="single" w:sz="4" w:color="D9D9D9"/>
+              <w:insideH w:val="single" w:sz="4" w:color="D9D9D9"/>
+              <w:insideV w:val="single" w:sz="4" w:color="D9D9D9"/>
+            </w:tcBorders>
+            <w:shd w:fill="EAF0F7"/>
+            <w:vAlign w:val="center"/>
+          </w:tcPr>
+          <w:p>
+            <w:r>
+              <w:t>Bound structured orchestration intent</w:t>
+            </w:r>
+          </w:p>
+        </w:tc>
+      </w:tr>
+      <w:tr>
+        <w:tc>
+          <w:tcPr>
+            <w:tcW w:type="dxa" w:w="2160"/>
+            <w:tcBorders>
+              <w:top w:val="single" w:sz="4" w:color="D9D9D9"/>
+              <w:left w:val="single" w:sz="4" w:color="D9D9D9"/>
+              <w:bottom w:val="single" w:sz="4" w:color="D9D9D9"/>
+              <w:right w:val="single" w:sz="4" w:color="D9D9D9"/>
+              <w:insideH w:val="single" w:sz="4" w:color="D9D9D9"/>
+              <w:insideV w:val="single" w:sz="4" w:color="D9D9D9"/>
+            </w:tcBorders>
+            <w:vAlign w:val="center"/>
+          </w:tcPr>
+          <w:p>
+            <w:r>
+              <w:t>Killed result</w:t>
+            </w:r>
+          </w:p>
+        </w:tc>
+        <w:tc>
+          <w:tcPr>
+            <w:tcW w:type="dxa" w:w="3600"/>
+            <w:tcBorders>
+              <w:top w:val="single" w:sz="4" w:color="D9D9D9"/>
+              <w:left w:val="single" w:sz="4" w:color="D9D9D9"/>
+              <w:bottom w:val="single" w:sz="4" w:color="D9D9D9"/>
+              <w:right w:val="single" w:sz="4" w:color="D9D9D9"/>
+              <w:insideH w:val="single" w:sz="4" w:color="D9D9D9"/>
+              <w:insideV w:val="single" w:sz="4" w:color="D9D9D9"/>
+            </w:tcBorders>
+            <w:vAlign w:val="center"/>
+          </w:tcPr>
+          <w:p>
+            <w:r>
+              <w:t>At least one detecting test</w:t>
+            </w:r>
+          </w:p>
+        </w:tc>
+        <w:tc>
+          <w:tcPr>
+            <w:tcW w:type="dxa" w:w="4176"/>
+            <w:tcBorders>
+              <w:top w:val="single" w:sz="4" w:color="D9D9D9"/>
+              <w:left w:val="single" w:sz="4" w:color="D9D9D9"/>
+              <w:bottom w:val="single" w:sz="4" w:color="D9D9D9"/>
+              <w:right w:val="single" w:sz="4" w:color="D9D9D9"/>
+              <w:insideH w:val="single" w:sz="4" w:color="D9D9D9"/>
+              <w:insideV w:val="single" w:sz="4" w:color="D9D9D9"/>
+            </w:tcBorders>
+            <w:vAlign w:val="center"/>
+          </w:tcPr>
+          <w:p>
+            <w:r>
+              <w:t>Make detection evidence explicit</w:t>
+            </w:r>
+          </w:p>
+        </w:tc>
+      </w:tr>
+      <w:tr>
+        <w:tc>
+          <w:tcPr>
+            <w:tcW w:type="dxa" w:w="2160"/>
+            <w:tcBorders>
+              <w:top w:val="single" w:sz="4" w:color="D9D9D9"/>
+              <w:left w:val="single" w:sz="4" w:color="D9D9D9"/>
+              <w:bottom w:val="single" w:sz="4" w:color="D9D9D9"/>
+              <w:right w:val="single" w:sz="4" w:color="D9D9D9"/>
+              <w:insideH w:val="single" w:sz="4" w:color="D9D9D9"/>
+              <w:insideV w:val="single" w:sz="4" w:color="D9D9D9"/>
+            </w:tcBorders>
+            <w:shd w:fill="EAF0F7"/>
+            <w:vAlign w:val="center"/>
+          </w:tcPr>
+          <w:p>
+            <w:r>
+              <w:t>Mutation score</w:t>
+            </w:r>
+          </w:p>
+        </w:tc>
+        <w:tc>
+          <w:tcPr>
+            <w:tcW w:type="dxa" w:w="3600"/>
+            <w:tcBorders>
+              <w:top w:val="single" w:sz="4" w:color="D9D9D9"/>
+              <w:left w:val="single" w:sz="4" w:color="D9D9D9"/>
+              <w:bottom w:val="single" w:sz="4" w:color="D9D9D9"/>
+              <w:right w:val="single" w:sz="4" w:color="D9D9D9"/>
+              <w:insideH w:val="single" w:sz="4" w:color="D9D9D9"/>
+              <w:insideV w:val="single" w:sz="4" w:color="D9D9D9"/>
+            </w:tcBorders>
+            <w:shd w:fill="EAF0F7"/>
+            <w:vAlign w:val="center"/>
+          </w:tcPr>
+          <w:p>
+            <w:r>
+              <w:t>Killed divided by killed plus survived</w:t>
+            </w:r>
+          </w:p>
+        </w:tc>
+        <w:tc>
+          <w:tcPr>
+            <w:tcW w:type="dxa" w:w="4176"/>
+            <w:tcBorders>
+              <w:top w:val="single" w:sz="4" w:color="D9D9D9"/>
+              <w:left w:val="single" w:sz="4" w:color="D9D9D9"/>
+              <w:bottom w:val="single" w:sz="4" w:color="D9D9D9"/>
+              <w:right w:val="single" w:sz="4" w:color="D9D9D9"/>
+              <w:insideH w:val="single" w:sz="4" w:color="D9D9D9"/>
+              <w:insideV w:val="single" w:sz="4" w:color="D9D9D9"/>
+            </w:tcBorders>
+            <w:shd w:fill="EAF0F7"/>
+            <w:vAlign w:val="center"/>
+          </w:tcPr>
+          <w:p>
+            <w:r>
+              <w:t>Avoid distortion by errors</w:t>
+            </w:r>
+          </w:p>
+        </w:tc>
+      </w:tr>
+      <w:tr>
+        <w:tc>
+          <w:tcPr>
+            <w:tcW w:type="dxa" w:w="2160"/>
+            <w:tcBorders>
+              <w:top w:val="single" w:sz="4" w:color="D9D9D9"/>
+              <w:left w:val="single" w:sz="4" w:color="D9D9D9"/>
+              <w:bottom w:val="single" w:sz="4" w:color="D9D9D9"/>
+              <w:right w:val="single" w:sz="4" w:color="D9D9D9"/>
+              <w:insideH w:val="single" w:sz="4" w:color="D9D9D9"/>
+              <w:insideV w:val="single" w:sz="4" w:color="D9D9D9"/>
+            </w:tcBorders>
+            <w:vAlign w:val="center"/>
+          </w:tcPr>
+          <w:p>
+            <w:r>
+              <w:t>Required outcome</w:t>
+            </w:r>
+          </w:p>
+        </w:tc>
+        <w:tc>
+          <w:tcPr>
+            <w:tcW w:type="dxa" w:w="3600"/>
+            <w:tcBorders>
+              <w:top w:val="single" w:sz="4" w:color="D9D9D9"/>
+              <w:left w:val="single" w:sz="4" w:color="D9D9D9"/>
+              <w:bottom w:val="single" w:sz="4" w:color="D9D9D9"/>
+              <w:right w:val="single" w:sz="4" w:color="D9D9D9"/>
+              <w:insideH w:val="single" w:sz="4" w:color="D9D9D9"/>
+              <w:insideV w:val="single" w:sz="4" w:color="D9D9D9"/>
+            </w:tcBorders>
+            <w:vAlign w:val="center"/>
+          </w:tcPr>
+          <w:p>
+            <w:r>
+              <w:t>Survived, error, or skip fails</w:t>
+            </w:r>
+          </w:p>
+        </w:tc>
+        <w:tc>
+          <w:tcPr>
+            <w:tcW w:type="dxa" w:w="4176"/>
+            <w:tcBorders>
+              <w:top w:val="single" w:sz="4" w:color="D9D9D9"/>
+              <w:left w:val="single" w:sz="4" w:color="D9D9D9"/>
+              <w:bottom w:val="single" w:sz="4" w:color="D9D9D9"/>
+              <w:right w:val="single" w:sz="4" w:color="D9D9D9"/>
+              <w:insideH w:val="single" w:sz="4" w:color="D9D9D9"/>
+              <w:insideV w:val="single" w:sz="4" w:color="D9D9D9"/>
+            </w:tcBorders>
+            <w:vAlign w:val="center"/>
+          </w:tcPr>
+          <w:p>
+            <w:r>
+              <w:t>Protect reviewed acceptance intent</w:t>
+            </w:r>
+          </w:p>
+        </w:tc>
+      </w:tr>
+      <w:tr>
+        <w:tc>
+          <w:tcPr>
+            <w:tcW w:type="dxa" w:w="2160"/>
+            <w:tcBorders>
+              <w:top w:val="single" w:sz="4" w:color="D9D9D9"/>
+              <w:left w:val="single" w:sz="4" w:color="D9D9D9"/>
+              <w:bottom w:val="single" w:sz="4" w:color="D9D9D9"/>
+              <w:right w:val="single" w:sz="4" w:color="D9D9D9"/>
+              <w:insideH w:val="single" w:sz="4" w:color="D9D9D9"/>
+              <w:insideV w:val="single" w:sz="4" w:color="D9D9D9"/>
+            </w:tcBorders>
+            <w:shd w:fill="EAF0F7"/>
+            <w:vAlign w:val="center"/>
+          </w:tcPr>
+          <w:p>
+            <w:r>
+              <w:t>Evidence</w:t>
+            </w:r>
+          </w:p>
+        </w:tc>
+        <w:tc>
+          <w:tcPr>
+            <w:tcW w:type="dxa" w:w="3600"/>
+            <w:tcBorders>
+              <w:top w:val="single" w:sz="4" w:color="D9D9D9"/>
+              <w:left w:val="single" w:sz="4" w:color="D9D9D9"/>
+              <w:bottom w:val="single" w:sz="4" w:color="D9D9D9"/>
+              <w:right w:val="single" w:sz="4" w:color="D9D9D9"/>
+              <w:insideH w:val="single" w:sz="4" w:color="D9D9D9"/>
+              <w:insideV w:val="single" w:sz="4" w:color="D9D9D9"/>
+            </w:tcBorders>
+            <w:shd w:fill="EAF0F7"/>
+            <w:vAlign w:val="center"/>
+          </w:tcPr>
+          <w:p>
+            <w:r>
+              <w:t>At most 20 references</w:t>
+            </w:r>
+          </w:p>
+        </w:tc>
+        <w:tc>
+          <w:tcPr>
+            <w:tcW w:type="dxa" w:w="4176"/>
+            <w:tcBorders>
+              <w:top w:val="single" w:sz="4" w:color="D9D9D9"/>
+              <w:left w:val="single" w:sz="4" w:color="D9D9D9"/>
+              <w:bottom w:val="single" w:sz="4" w:color="D9D9D9"/>
+              <w:right w:val="single" w:sz="4" w:color="D9D9D9"/>
+              <w:insideH w:val="single" w:sz="4" w:color="D9D9D9"/>
+              <w:insideV w:val="single" w:sz="4" w:color="D9D9D9"/>
+            </w:tcBorders>
+            <w:shd w:fill="EAF0F7"/>
+            <w:vAlign w:val="center"/>
+          </w:tcPr>
+          <w:p>
+            <w:r>
+              <w:t>Link artifacts without copying content</w:t>
+            </w:r>
+          </w:p>
+        </w:tc>
+      </w:tr>
+    </w:tbl>
+    <w:p/>
+    <w:p>
+      <w:r>
+        <w:t>Requirement records reference known catalog definitions and external evidence. Both present means covered, only one present means partial, and neither means gap. Collection responses include totals for each state so dashboards and quality gates can expose missing tests or missing evidence directly.</w:t>
+      </w:r>
+    </w:p>
+    <w:p>
+      <w:r>
+        <w:br w:type="page"/>
+      </w:r>
+    </w:p>
+    <w:p>
+      <w:pPr>
+        <w:pStyle w:val="Heading1"/>
+      </w:pPr>
+      <w:r>
+        <w:t>12 Events and Audit</w:t>
+      </w:r>
+    </w:p>
+    <w:tbl>
+      <w:tblPr>
+        <w:tblW w:type="auto" w:w="0"/>
+        <w:tblLayout w:type="fixed"/>
+        <w:tblLook w:firstColumn="1" w:firstRow="1" w:lastColumn="0" w:lastRow="0" w:noHBand="0" w:noVBand="1" w:val="04A0"/>
+      </w:tblPr>
+      <w:tblGrid>
+        <w:gridCol w:w="3312"/>
+        <w:gridCol w:w="3312"/>
+        <w:gridCol w:w="3312"/>
+      </w:tblGrid>
+      <w:tr>
+        <w:trPr>
+          <w:tblHeader/>
+        </w:trPr>
+        <w:tc>
+          <w:tcPr>
             <w:tcW w:type="dxa" w:w="2376"/>
             <w:shd w:fill="17365D"/>
             <w:tcBorders>
@@ -4522,6 +5119,248 @@
           <w:p>
             <w:r>
               <w:t>fault_campaign.execution_cancelled</w:t>
+            </w:r>
+          </w:p>
+        </w:tc>
+      </w:tr>
+      <w:tr>
+        <w:tc>
+          <w:tcPr>
+            <w:tcW w:type="dxa" w:w="2376"/>
+            <w:tcBorders>
+              <w:top w:val="single" w:sz="4" w:color="D9D9D9"/>
+              <w:left w:val="single" w:sz="4" w:color="D9D9D9"/>
+              <w:bottom w:val="single" w:sz="4" w:color="D9D9D9"/>
+              <w:right w:val="single" w:sz="4" w:color="D9D9D9"/>
+              <w:insideH w:val="single" w:sz="4" w:color="D9D9D9"/>
+              <w:insideV w:val="single" w:sz="4" w:color="D9D9D9"/>
+            </w:tcBorders>
+            <w:vAlign w:val="center"/>
+          </w:tcPr>
+          <w:p>
+            <w:r>
+              <w:t>Create mutation campaign</w:t>
+            </w:r>
+          </w:p>
+        </w:tc>
+        <w:tc>
+          <w:tcPr>
+            <w:tcW w:type="dxa" w:w="4536"/>
+            <w:tcBorders>
+              <w:top w:val="single" w:sz="4" w:color="D9D9D9"/>
+              <w:left w:val="single" w:sz="4" w:color="D9D9D9"/>
+              <w:bottom w:val="single" w:sz="4" w:color="D9D9D9"/>
+              <w:right w:val="single" w:sz="4" w:color="D9D9D9"/>
+              <w:insideH w:val="single" w:sz="4" w:color="D9D9D9"/>
+              <w:insideV w:val="single" w:sz="4" w:color="D9D9D9"/>
+            </w:tcBorders>
+            <w:vAlign w:val="center"/>
+          </w:tcPr>
+          <w:p>
+            <w:r>
+              <w:t>atep.mutation_campaign.created.v1</w:t>
+            </w:r>
+          </w:p>
+        </w:tc>
+        <w:tc>
+          <w:tcPr>
+            <w:tcW w:type="dxa" w:w="3024"/>
+            <w:tcBorders>
+              <w:top w:val="single" w:sz="4" w:color="D9D9D9"/>
+              <w:left w:val="single" w:sz="4" w:color="D9D9D9"/>
+              <w:bottom w:val="single" w:sz="4" w:color="D9D9D9"/>
+              <w:right w:val="single" w:sz="4" w:color="D9D9D9"/>
+              <w:insideH w:val="single" w:sz="4" w:color="D9D9D9"/>
+              <w:insideV w:val="single" w:sz="4" w:color="D9D9D9"/>
+            </w:tcBorders>
+            <w:vAlign w:val="center"/>
+          </w:tcPr>
+          <w:p>
+            <w:r>
+              <w:t>mutation_campaign.created</w:t>
+            </w:r>
+          </w:p>
+        </w:tc>
+      </w:tr>
+      <w:tr>
+        <w:tc>
+          <w:tcPr>
+            <w:tcW w:type="dxa" w:w="2376"/>
+            <w:tcBorders>
+              <w:top w:val="single" w:sz="4" w:color="D9D9D9"/>
+              <w:left w:val="single" w:sz="4" w:color="D9D9D9"/>
+              <w:bottom w:val="single" w:sz="4" w:color="D9D9D9"/>
+              <w:right w:val="single" w:sz="4" w:color="D9D9D9"/>
+              <w:insideH w:val="single" w:sz="4" w:color="D9D9D9"/>
+              <w:insideV w:val="single" w:sz="4" w:color="D9D9D9"/>
+            </w:tcBorders>
+            <w:shd w:fill="EAF0F7"/>
+            <w:vAlign w:val="center"/>
+          </w:tcPr>
+          <w:p>
+            <w:r>
+              <w:t>Create mutation execution</w:t>
+            </w:r>
+          </w:p>
+        </w:tc>
+        <w:tc>
+          <w:tcPr>
+            <w:tcW w:type="dxa" w:w="4536"/>
+            <w:tcBorders>
+              <w:top w:val="single" w:sz="4" w:color="D9D9D9"/>
+              <w:left w:val="single" w:sz="4" w:color="D9D9D9"/>
+              <w:bottom w:val="single" w:sz="4" w:color="D9D9D9"/>
+              <w:right w:val="single" w:sz="4" w:color="D9D9D9"/>
+              <w:insideH w:val="single" w:sz="4" w:color="D9D9D9"/>
+              <w:insideV w:val="single" w:sz="4" w:color="D9D9D9"/>
+            </w:tcBorders>
+            <w:shd w:fill="EAF0F7"/>
+            <w:vAlign w:val="center"/>
+          </w:tcPr>
+          <w:p>
+            <w:r>
+              <w:t>atep.mutation_execution.created.v1</w:t>
+            </w:r>
+          </w:p>
+        </w:tc>
+        <w:tc>
+          <w:tcPr>
+            <w:tcW w:type="dxa" w:w="3024"/>
+            <w:tcBorders>
+              <w:top w:val="single" w:sz="4" w:color="D9D9D9"/>
+              <w:left w:val="single" w:sz="4" w:color="D9D9D9"/>
+              <w:bottom w:val="single" w:sz="4" w:color="D9D9D9"/>
+              <w:right w:val="single" w:sz="4" w:color="D9D9D9"/>
+              <w:insideH w:val="single" w:sz="4" w:color="D9D9D9"/>
+              <w:insideV w:val="single" w:sz="4" w:color="D9D9D9"/>
+            </w:tcBorders>
+            <w:shd w:fill="EAF0F7"/>
+            <w:vAlign w:val="center"/>
+          </w:tcPr>
+          <w:p>
+            <w:r>
+              <w:t>mutation_execution.created</w:t>
+            </w:r>
+          </w:p>
+        </w:tc>
+      </w:tr>
+      <w:tr>
+        <w:tc>
+          <w:tcPr>
+            <w:tcW w:type="dxa" w:w="2376"/>
+            <w:tcBorders>
+              <w:top w:val="single" w:sz="4" w:color="D9D9D9"/>
+              <w:left w:val="single" w:sz="4" w:color="D9D9D9"/>
+              <w:bottom w:val="single" w:sz="4" w:color="D9D9D9"/>
+              <w:right w:val="single" w:sz="4" w:color="D9D9D9"/>
+              <w:insideH w:val="single" w:sz="4" w:color="D9D9D9"/>
+              <w:insideV w:val="single" w:sz="4" w:color="D9D9D9"/>
+            </w:tcBorders>
+            <w:vAlign w:val="center"/>
+          </w:tcPr>
+          <w:p>
+            <w:r>
+              <w:t>Record mutant result</w:t>
+            </w:r>
+          </w:p>
+        </w:tc>
+        <w:tc>
+          <w:tcPr>
+            <w:tcW w:type="dxa" w:w="4536"/>
+            <w:tcBorders>
+              <w:top w:val="single" w:sz="4" w:color="D9D9D9"/>
+              <w:left w:val="single" w:sz="4" w:color="D9D9D9"/>
+              <w:bottom w:val="single" w:sz="4" w:color="D9D9D9"/>
+              <w:right w:val="single" w:sz="4" w:color="D9D9D9"/>
+              <w:insideH w:val="single" w:sz="4" w:color="D9D9D9"/>
+              <w:insideV w:val="single" w:sz="4" w:color="D9D9D9"/>
+            </w:tcBorders>
+            <w:vAlign w:val="center"/>
+          </w:tcPr>
+          <w:p>
+            <w:r>
+              <w:t>atep.mutant_result.recorded.v1</w:t>
+            </w:r>
+          </w:p>
+        </w:tc>
+        <w:tc>
+          <w:tcPr>
+            <w:tcW w:type="dxa" w:w="3024"/>
+            <w:tcBorders>
+              <w:top w:val="single" w:sz="4" w:color="D9D9D9"/>
+              <w:left w:val="single" w:sz="4" w:color="D9D9D9"/>
+              <w:bottom w:val="single" w:sz="4" w:color="D9D9D9"/>
+              <w:right w:val="single" w:sz="4" w:color="D9D9D9"/>
+              <w:insideH w:val="single" w:sz="4" w:color="D9D9D9"/>
+              <w:insideV w:val="single" w:sz="4" w:color="D9D9D9"/>
+            </w:tcBorders>
+            <w:vAlign w:val="center"/>
+          </w:tcPr>
+          <w:p>
+            <w:r>
+              <w:t>mutant_result.recorded</w:t>
+            </w:r>
+          </w:p>
+        </w:tc>
+      </w:tr>
+      <w:tr>
+        <w:tc>
+          <w:tcPr>
+            <w:tcW w:type="dxa" w:w="2376"/>
+            <w:tcBorders>
+              <w:top w:val="single" w:sz="4" w:color="D9D9D9"/>
+              <w:left w:val="single" w:sz="4" w:color="D9D9D9"/>
+              <w:bottom w:val="single" w:sz="4" w:color="D9D9D9"/>
+              <w:right w:val="single" w:sz="4" w:color="D9D9D9"/>
+              <w:insideH w:val="single" w:sz="4" w:color="D9D9D9"/>
+              <w:insideV w:val="single" w:sz="4" w:color="D9D9D9"/>
+            </w:tcBorders>
+            <w:shd w:fill="EAF0F7"/>
+            <w:vAlign w:val="center"/>
+          </w:tcPr>
+          <w:p>
+            <w:r>
+              <w:t>Update requirement</w:t>
+            </w:r>
+          </w:p>
+        </w:tc>
+        <w:tc>
+          <w:tcPr>
+            <w:tcW w:type="dxa" w:w="4536"/>
+            <w:tcBorders>
+              <w:top w:val="single" w:sz="4" w:color="D9D9D9"/>
+              <w:left w:val="single" w:sz="4" w:color="D9D9D9"/>
+              <w:bottom w:val="single" w:sz="4" w:color="D9D9D9"/>
+              <w:right w:val="single" w:sz="4" w:color="D9D9D9"/>
+              <w:insideH w:val="single" w:sz="4" w:color="D9D9D9"/>
+              <w:insideV w:val="single" w:sz="4" w:color="D9D9D9"/>
+            </w:tcBorders>
+            <w:shd w:fill="EAF0F7"/>
+            <w:vAlign w:val="center"/>
+          </w:tcPr>
+          <w:p>
+            <w:r>
+              <w:t>atep.requirement_coverage.updated.v1</w:t>
+            </w:r>
+          </w:p>
+        </w:tc>
+        <w:tc>
+          <w:tcPr>
+            <w:tcW w:type="dxa" w:w="3024"/>
+            <w:tcBorders>
+              <w:top w:val="single" w:sz="4" w:color="D9D9D9"/>
+              <w:left w:val="single" w:sz="4" w:color="D9D9D9"/>
+              <w:bottom w:val="single" w:sz="4" w:color="D9D9D9"/>
+              <w:right w:val="single" w:sz="4" w:color="D9D9D9"/>
+              <w:insideH w:val="single" w:sz="4" w:color="D9D9D9"/>
+              <w:insideV w:val="single" w:sz="4" w:color="D9D9D9"/>
+            </w:tcBorders>
+            <w:shd w:fill="EAF0F7"/>
+            <w:vAlign w:val="center"/>
+          </w:tcPr>
+          <w:p>
+            <w:r>
+              <w:t>requirement_coverage.updated</w:t>
             </w:r>
           </w:p>
         </w:tc>
@@ -4543,7 +5382,7 @@
         <w:pStyle w:val="Heading1"/>
       </w:pPr>
       <w:r>
-        <w:t>12 Engineering Decisions</w:t>
+        <w:t>13 Engineering Decisions</w:t>
       </w:r>
     </w:p>
     <w:tbl>
@@ -5177,6 +6016,127 @@
           </w:p>
         </w:tc>
       </w:tr>
+      <w:tr>
+        <w:tc>
+          <w:tcPr>
+            <w:tcW w:type="dxa" w:w="2376"/>
+            <w:tcBorders>
+              <w:top w:val="single" w:sz="4" w:color="D9D9D9"/>
+              <w:left w:val="single" w:sz="4" w:color="D9D9D9"/>
+              <w:bottom w:val="single" w:sz="4" w:color="D9D9D9"/>
+              <w:right w:val="single" w:sz="4" w:color="D9D9D9"/>
+              <w:insideH w:val="single" w:sz="4" w:color="D9D9D9"/>
+              <w:insideV w:val="single" w:sz="4" w:color="D9D9D9"/>
+            </w:tcBorders>
+            <w:shd w:fill="EAF0F7"/>
+            <w:vAlign w:val="center"/>
+          </w:tcPr>
+          <w:p>
+            <w:r>
+              <w:t>Allowlist mutation operators</w:t>
+            </w:r>
+          </w:p>
+        </w:tc>
+        <w:tc>
+          <w:tcPr>
+            <w:tcW w:type="dxa" w:w="3960"/>
+            <w:tcBorders>
+              <w:top w:val="single" w:sz="4" w:color="D9D9D9"/>
+              <w:left w:val="single" w:sz="4" w:color="D9D9D9"/>
+              <w:bottom w:val="single" w:sz="4" w:color="D9D9D9"/>
+              <w:right w:val="single" w:sz="4" w:color="D9D9D9"/>
+              <w:insideH w:val="single" w:sz="4" w:color="D9D9D9"/>
+              <w:insideV w:val="single" w:sz="4" w:color="D9D9D9"/>
+            </w:tcBorders>
+            <w:shd w:fill="EAF0F7"/>
+            <w:vAlign w:val="center"/>
+          </w:tcPr>
+          <w:p>
+            <w:r>
+              <w:t>Exclude arbitrary execution</w:t>
+            </w:r>
+          </w:p>
+        </w:tc>
+        <w:tc>
+          <w:tcPr>
+            <w:tcW w:type="dxa" w:w="3600"/>
+            <w:tcBorders>
+              <w:top w:val="single" w:sz="4" w:color="D9D9D9"/>
+              <w:left w:val="single" w:sz="4" w:color="D9D9D9"/>
+              <w:bottom w:val="single" w:sz="4" w:color="D9D9D9"/>
+              <w:right w:val="single" w:sz="4" w:color="D9D9D9"/>
+              <w:insideH w:val="single" w:sz="4" w:color="D9D9D9"/>
+              <w:insideV w:val="single" w:sz="4" w:color="D9D9D9"/>
+            </w:tcBorders>
+            <w:shd w:fill="EAF0F7"/>
+            <w:vAlign w:val="center"/>
+          </w:tcPr>
+          <w:p>
+            <w:r>
+              <w:t>Native adapters remain isolated in VIII-7</w:t>
+            </w:r>
+          </w:p>
+        </w:tc>
+      </w:tr>
+      <w:tr>
+        <w:tc>
+          <w:tcPr>
+            <w:tcW w:type="dxa" w:w="2376"/>
+            <w:tcBorders>
+              <w:top w:val="single" w:sz="4" w:color="D9D9D9"/>
+              <w:left w:val="single" w:sz="4" w:color="D9D9D9"/>
+              <w:bottom w:val="single" w:sz="4" w:color="D9D9D9"/>
+              <w:right w:val="single" w:sz="4" w:color="D9D9D9"/>
+              <w:insideH w:val="single" w:sz="4" w:color="D9D9D9"/>
+              <w:insideV w:val="single" w:sz="4" w:color="D9D9D9"/>
+            </w:tcBorders>
+            <w:vAlign w:val="center"/>
+          </w:tcPr>
+          <w:p>
+            <w:r>
+              <w:t>Derive coverage state</w:t>
+            </w:r>
+          </w:p>
+        </w:tc>
+        <w:tc>
+          <w:tcPr>
+            <w:tcW w:type="dxa" w:w="3960"/>
+            <w:tcBorders>
+              <w:top w:val="single" w:sz="4" w:color="D9D9D9"/>
+              <w:left w:val="single" w:sz="4" w:color="D9D9D9"/>
+              <w:bottom w:val="single" w:sz="4" w:color="D9D9D9"/>
+              <w:right w:val="single" w:sz="4" w:color="D9D9D9"/>
+              <w:insideH w:val="single" w:sz="4" w:color="D9D9D9"/>
+              <w:insideV w:val="single" w:sz="4" w:color="D9D9D9"/>
+            </w:tcBorders>
+            <w:vAlign w:val="center"/>
+          </w:tcPr>
+          <w:p>
+            <w:r>
+              <w:t>Make gaps deterministic</w:t>
+            </w:r>
+          </w:p>
+        </w:tc>
+        <w:tc>
+          <w:tcPr>
+            <w:tcW w:type="dxa" w:w="3600"/>
+            <w:tcBorders>
+              <w:top w:val="single" w:sz="4" w:color="D9D9D9"/>
+              <w:left w:val="single" w:sz="4" w:color="D9D9D9"/>
+              <w:bottom w:val="single" w:sz="4" w:color="D9D9D9"/>
+              <w:right w:val="single" w:sz="4" w:color="D9D9D9"/>
+              <w:insideH w:val="single" w:sz="4" w:color="D9D9D9"/>
+              <w:insideV w:val="single" w:sz="4" w:color="D9D9D9"/>
+            </w:tcBorders>
+            <w:vAlign w:val="center"/>
+          </w:tcPr>
+          <w:p>
+            <w:r>
+              <w:t>Dashboard consumers use stable totals</w:t>
+            </w:r>
+          </w:p>
+        </w:tc>
+      </w:tr>
     </w:tbl>
     <w:p/>
     <w:p>
@@ -5189,7 +6149,7 @@
         <w:pStyle w:val="Heading1"/>
       </w:pPr>
       <w:r>
-        <w:t>13 Verification Catalogue</w:t>
+        <w:t>14 Verification Catalogue</w:t>
       </w:r>
     </w:p>
     <w:tbl>
@@ -5823,6 +6783,68 @@
           </w:p>
         </w:tc>
       </w:tr>
+      <w:tr>
+        <w:tc>
+          <w:tcPr>
+            <w:tcW w:type="dxa" w:w="2232"/>
+            <w:tcBorders>
+              <w:top w:val="single" w:sz="4" w:color="D9D9D9"/>
+              <w:left w:val="single" w:sz="4" w:color="D9D9D9"/>
+              <w:bottom w:val="single" w:sz="4" w:color="D9D9D9"/>
+              <w:right w:val="single" w:sz="4" w:color="D9D9D9"/>
+              <w:insideH w:val="single" w:sz="4" w:color="D9D9D9"/>
+              <w:insideV w:val="single" w:sz="4" w:color="D9D9D9"/>
+            </w:tcBorders>
+            <w:shd w:fill="EAF0F7"/>
+            <w:vAlign w:val="center"/>
+          </w:tcPr>
+          <w:p>
+            <w:r>
+              <w:t>TF-T-049 to 059</w:t>
+            </w:r>
+          </w:p>
+        </w:tc>
+        <w:tc>
+          <w:tcPr>
+            <w:tcW w:type="dxa" w:w="3528"/>
+            <w:tcBorders>
+              <w:top w:val="single" w:sz="4" w:color="D9D9D9"/>
+              <w:left w:val="single" w:sz="4" w:color="D9D9D9"/>
+              <w:bottom w:val="single" w:sz="4" w:color="D9D9D9"/>
+              <w:right w:val="single" w:sz="4" w:color="D9D9D9"/>
+              <w:insideH w:val="single" w:sz="4" w:color="D9D9D9"/>
+              <w:insideV w:val="single" w:sz="4" w:color="D9D9D9"/>
+            </w:tcBorders>
+            <w:shd w:fill="EAF0F7"/>
+            <w:vAlign w:val="center"/>
+          </w:tcPr>
+          <w:p>
+            <w:r>
+              <w:t>Mutation and coverage</w:t>
+            </w:r>
+          </w:p>
+        </w:tc>
+        <w:tc>
+          <w:tcPr>
+            <w:tcW w:type="dxa" w:w="4176"/>
+            <w:tcBorders>
+              <w:top w:val="single" w:sz="4" w:color="D9D9D9"/>
+              <w:left w:val="single" w:sz="4" w:color="D9D9D9"/>
+              <w:bottom w:val="single" w:sz="4" w:color="D9D9D9"/>
+              <w:right w:val="single" w:sz="4" w:color="D9D9D9"/>
+              <w:insideH w:val="single" w:sz="4" w:color="D9D9D9"/>
+              <w:insideV w:val="single" w:sz="4" w:color="D9D9D9"/>
+            </w:tcBorders>
+            <w:shd w:fill="EAF0F7"/>
+            <w:vAlign w:val="center"/>
+          </w:tcPr>
+          <w:p>
+            <w:r>
+              <w:t>Validate scoring, traceability, safety, RBAC, integration, and migration</w:t>
+            </w:r>
+          </w:p>
+        </w:tc>
+      </w:tr>
     </w:tbl>
     <w:p/>
     <w:p>
@@ -5835,7 +6857,7 @@
         <w:pStyle w:val="Heading1"/>
       </w:pPr>
       <w:r>
-        <w:t>14 Risks and Controls</w:t>
+        <w:t>15 Risks and Controls</w:t>
       </w:r>
     </w:p>
     <w:tbl>
@@ -6469,6 +7491,127 @@
           </w:p>
         </w:tc>
       </w:tr>
+      <w:tr>
+        <w:tc>
+          <w:tcPr>
+            <w:tcW w:type="dxa" w:w="2160"/>
+            <w:tcBorders>
+              <w:top w:val="single" w:sz="4" w:color="D9D9D9"/>
+              <w:left w:val="single" w:sz="4" w:color="D9D9D9"/>
+              <w:bottom w:val="single" w:sz="4" w:color="D9D9D9"/>
+              <w:right w:val="single" w:sz="4" w:color="D9D9D9"/>
+              <w:insideH w:val="single" w:sz="4" w:color="D9D9D9"/>
+              <w:insideV w:val="single" w:sz="4" w:color="D9D9D9"/>
+            </w:tcBorders>
+            <w:shd w:fill="EAF0F7"/>
+            <w:vAlign w:val="center"/>
+          </w:tcPr>
+          <w:p>
+            <w:r>
+              <w:t>Unsafe mutation execution</w:t>
+            </w:r>
+          </w:p>
+        </w:tc>
+        <w:tc>
+          <w:tcPr>
+            <w:tcW w:type="dxa" w:w="3672"/>
+            <w:tcBorders>
+              <w:top w:val="single" w:sz="4" w:color="D9D9D9"/>
+              <w:left w:val="single" w:sz="4" w:color="D9D9D9"/>
+              <w:bottom w:val="single" w:sz="4" w:color="D9D9D9"/>
+              <w:right w:val="single" w:sz="4" w:color="D9D9D9"/>
+              <w:insideH w:val="single" w:sz="4" w:color="D9D9D9"/>
+              <w:insideV w:val="single" w:sz="4" w:color="D9D9D9"/>
+            </w:tcBorders>
+            <w:shd w:fill="EAF0F7"/>
+            <w:vAlign w:val="center"/>
+          </w:tcPr>
+          <w:p>
+            <w:r>
+              <w:t>Structured allowlist and no generic runner</w:t>
+            </w:r>
+          </w:p>
+        </w:tc>
+        <w:tc>
+          <w:tcPr>
+            <w:tcW w:type="dxa" w:w="4104"/>
+            <w:tcBorders>
+              <w:top w:val="single" w:sz="4" w:color="D9D9D9"/>
+              <w:left w:val="single" w:sz="4" w:color="D9D9D9"/>
+              <w:bottom w:val="single" w:sz="4" w:color="D9D9D9"/>
+              <w:right w:val="single" w:sz="4" w:color="D9D9D9"/>
+              <w:insideH w:val="single" w:sz="4" w:color="D9D9D9"/>
+              <w:insideV w:val="single" w:sz="4" w:color="D9D9D9"/>
+            </w:tcBorders>
+            <w:shd w:fill="EAF0F7"/>
+            <w:vAlign w:val="center"/>
+          </w:tcPr>
+          <w:p>
+            <w:r>
+              <w:t>Isolate native adapters in VIII-7</w:t>
+            </w:r>
+          </w:p>
+        </w:tc>
+      </w:tr>
+      <w:tr>
+        <w:tc>
+          <w:tcPr>
+            <w:tcW w:type="dxa" w:w="2160"/>
+            <w:tcBorders>
+              <w:top w:val="single" w:sz="4" w:color="D9D9D9"/>
+              <w:left w:val="single" w:sz="4" w:color="D9D9D9"/>
+              <w:bottom w:val="single" w:sz="4" w:color="D9D9D9"/>
+              <w:right w:val="single" w:sz="4" w:color="D9D9D9"/>
+              <w:insideH w:val="single" w:sz="4" w:color="D9D9D9"/>
+              <w:insideV w:val="single" w:sz="4" w:color="D9D9D9"/>
+            </w:tcBorders>
+            <w:vAlign w:val="center"/>
+          </w:tcPr>
+          <w:p>
+            <w:r>
+              <w:t>False coverage confidence</w:t>
+            </w:r>
+          </w:p>
+        </w:tc>
+        <w:tc>
+          <w:tcPr>
+            <w:tcW w:type="dxa" w:w="3672"/>
+            <w:tcBorders>
+              <w:top w:val="single" w:sz="4" w:color="D9D9D9"/>
+              <w:left w:val="single" w:sz="4" w:color="D9D9D9"/>
+              <w:bottom w:val="single" w:sz="4" w:color="D9D9D9"/>
+              <w:right w:val="single" w:sz="4" w:color="D9D9D9"/>
+              <w:insideH w:val="single" w:sz="4" w:color="D9D9D9"/>
+              <w:insideV w:val="single" w:sz="4" w:color="D9D9D9"/>
+            </w:tcBorders>
+            <w:vAlign w:val="center"/>
+          </w:tcPr>
+          <w:p>
+            <w:r>
+              <w:t>Separate test links from evidence links</w:t>
+            </w:r>
+          </w:p>
+        </w:tc>
+        <w:tc>
+          <w:tcPr>
+            <w:tcW w:type="dxa" w:w="4104"/>
+            <w:tcBorders>
+              <w:top w:val="single" w:sz="4" w:color="D9D9D9"/>
+              <w:left w:val="single" w:sz="4" w:color="D9D9D9"/>
+              <w:bottom w:val="single" w:sz="4" w:color="D9D9D9"/>
+              <w:right w:val="single" w:sz="4" w:color="D9D9D9"/>
+              <w:insideH w:val="single" w:sz="4" w:color="D9D9D9"/>
+              <w:insideV w:val="single" w:sz="4" w:color="D9D9D9"/>
+            </w:tcBorders>
+            <w:vAlign w:val="center"/>
+          </w:tcPr>
+          <w:p>
+            <w:r>
+              <w:t>Track partial and gap totals</w:t>
+            </w:r>
+          </w:p>
+        </w:tc>
+      </w:tr>
     </w:tbl>
     <w:p/>
     <w:p>
@@ -6476,12 +7619,12 @@
         <w:pStyle w:val="Heading1"/>
       </w:pPr>
       <w:r>
-        <w:t>15 Study Exercises</w:t>
+        <w:t>16 Study Exercises</w:t>
       </w:r>
     </w:p>
     <w:p>
       <w:r>
-        <w:t>Create one ADAS definition and identify its invariants. Then run two required cases, explain the aggregate result, and compare an exact retry after suite archival with a new run request for the archived suite. Schedule the same suite, archive it, and explain why the stored job can still dispatch reproducibly. Finally, design one battery-temperature fault with recovery verification and explain why the campaign contract must not expose an arbitrary shell or adapter command.</w:t>
+        <w:t>Create one ADAS definition and identify its invariants. Then run two required cases, explain the aggregate result, and compare an exact retry after suite archival with a new run request for the archived suite. Schedule the same suite, archive it, and explain why the stored job can still dispatch reproducibly. Finally, design one battery-temperature fault with recovery verification and explain why the campaign contract must not expose an arbitrary shell or adapter command. Create two mutants, calculate a fifty percent score, and explain why a requirement with a test but no evidence is only partially covered.</w:t>
       </w:r>
     </w:p>
     <w:p>
@@ -6489,12 +7632,12 @@
         <w:pStyle w:val="Heading1"/>
       </w:pPr>
       <w:r>
-        <w:t>16 Next Development</w:t>
+        <w:t>17 Next Development</w:t>
       </w:r>
     </w:p>
     <w:p>
       <w:r>
-        <w:t>VIII-6 will add mutation operators, kill-rate evidence, requirement coverage, and gap analysis. VIII-4 remains planned near project completion, when stable baselines make performance thresholds and comparable trends meaningful.</w:t>
+        <w:t>VIII-7 will connect Gateway and CarSystemUI orchestration to the catalog, execution, fault, mutation, and evidence contracts. VIII-4 remains planned near project completion, when stable baselines make performance thresholds and comparable trends meaningful.</w:t>
       </w:r>
     </w:p>
     <w:sectPr>

</xml_diff>

<commit_message>
feat(test-framework): add cross-platform reports
</commit_message>
<xml_diff>
--- a/docs/ATEP_Volume_VIII_Test_Framework_Engineering_Workbook.docx
+++ b/docs/ATEP_Volume_VIII_Test_Framework_Engineering_Workbook.docx
@@ -19,7 +19,7 @@
         <w:rPr>
           <w:b/>
         </w:rPr>
-        <w:t>Version 0.5.0   VIII 6 Mutation and Coverage Implemented</w:t>
+        <w:t>Version 0.6.0   Functional Volume VIII Baseline Complete</w:t>
       </w:r>
     </w:p>
     <w:p>
@@ -125,7 +125,7 @@
           </w:tcPr>
           <w:p>
             <w:r>
-              <w:t>VIII-1, VIII-2, VIII-3, VIII-5, and VIII-6 implemented and verified</w:t>
+              <w:t>Functional VIII-1, VIII-2, VIII-3, VIII-5, VIII-6, and VIII-7 complete</w:t>
             </w:r>
           </w:p>
         </w:tc>
@@ -289,7 +289,7 @@
           </w:tcPr>
           <w:p>
             <w:r>
-              <w:t>VIII-7 cross-platform automation; VIII-4 deferred</w:t>
+              <w:t>VIII-4 performance and stress near project completion</w:t>
             </w:r>
           </w:p>
         </w:tc>
@@ -330,7 +330,7 @@
         <w:pStyle w:val="ListBullet"/>
       </w:pPr>
       <w:r>
-        <w:t>Performance and stress remain planned but are deferred until near completion; cross-platform automation is next.</w:t>
+        <w:t>Performance and stress remain planned but are deferred until near completion; the functional Volume VIII baseline is complete.</w:t>
       </w:r>
     </w:p>
     <w:p>
@@ -568,7 +568,7 @@
           </w:tcPr>
           <w:p>
             <w:r>
-              <w:t>Linear migrations 0051 through 0055 with reversible schema changes</w:t>
+              <w:t>Linear migrations 0051 through 0056 with reversible schema changes</w:t>
             </w:r>
           </w:p>
         </w:tc>
@@ -4306,7 +4306,12 @@
         <w:pStyle w:val="Heading1"/>
       </w:pPr>
       <w:r>
-        <w:t>12 Events and Audit</w:t>
+        <w:t>12 Cross Platform Automation Reporting</w:t>
+      </w:r>
+    </w:p>
+    <w:p>
+      <w:r>
+        <w:t>VIII-7 closes the functional baseline with one immutable report per terminal test run. The report correlates the authoritative vehicle and run with Vehicle Gateway telemetry and commands, optional fault and mutation executions, and the status and version that CarSystemUI displayed. Existing REST, WebSocket, workload identity, lease, and evidence contracts remain authoritative.</w:t>
       </w:r>
     </w:p>
     <w:tbl>
@@ -4326,6 +4331,477 @@
         </w:trPr>
         <w:tc>
           <w:tcPr>
+            <w:tcW w:type="dxa" w:w="2304"/>
+            <w:shd w:fill="17365D"/>
+            <w:tcBorders>
+              <w:top w:val="single" w:sz="4" w:color="D9D9D9"/>
+              <w:left w:val="single" w:sz="4" w:color="D9D9D9"/>
+              <w:bottom w:val="single" w:sz="4" w:color="D9D9D9"/>
+              <w:right w:val="single" w:sz="4" w:color="D9D9D9"/>
+              <w:insideH w:val="single" w:sz="4" w:color="D9D9D9"/>
+              <w:insideV w:val="single" w:sz="4" w:color="D9D9D9"/>
+            </w:tcBorders>
+            <w:vAlign w:val="center"/>
+          </w:tcPr>
+          <w:p>
+            <w:r>
+              <w:rPr>
+                <w:b/>
+                <w:color w:val="FFFFFF"/>
+              </w:rPr>
+              <w:t>Evidence</w:t>
+            </w:r>
+          </w:p>
+        </w:tc>
+        <w:tc>
+          <w:tcPr>
+            <w:tcW w:type="dxa" w:w="5328"/>
+            <w:shd w:fill="17365D"/>
+            <w:tcBorders>
+              <w:top w:val="single" w:sz="4" w:color="D9D9D9"/>
+              <w:left w:val="single" w:sz="4" w:color="D9D9D9"/>
+              <w:bottom w:val="single" w:sz="4" w:color="D9D9D9"/>
+              <w:right w:val="single" w:sz="4" w:color="D9D9D9"/>
+              <w:insideH w:val="single" w:sz="4" w:color="D9D9D9"/>
+              <w:insideV w:val="single" w:sz="4" w:color="D9D9D9"/>
+            </w:tcBorders>
+            <w:vAlign w:val="center"/>
+          </w:tcPr>
+          <w:p>
+            <w:r>
+              <w:rPr>
+                <w:b/>
+                <w:color w:val="FFFFFF"/>
+              </w:rPr>
+              <w:t>Consistency rule</w:t>
+            </w:r>
+          </w:p>
+        </w:tc>
+        <w:tc>
+          <w:tcPr>
+            <w:tcW w:type="dxa" w:w="2304"/>
+            <w:shd w:fill="17365D"/>
+            <w:tcBorders>
+              <w:top w:val="single" w:sz="4" w:color="D9D9D9"/>
+              <w:left w:val="single" w:sz="4" w:color="D9D9D9"/>
+              <w:bottom w:val="single" w:sz="4" w:color="D9D9D9"/>
+              <w:right w:val="single" w:sz="4" w:color="D9D9D9"/>
+              <w:insideH w:val="single" w:sz="4" w:color="D9D9D9"/>
+              <w:insideV w:val="single" w:sz="4" w:color="D9D9D9"/>
+            </w:tcBorders>
+            <w:vAlign w:val="center"/>
+          </w:tcPr>
+          <w:p>
+            <w:r>
+              <w:rPr>
+                <w:b/>
+                <w:color w:val="FFFFFF"/>
+              </w:rPr>
+              <w:t>Bound</w:t>
+            </w:r>
+          </w:p>
+        </w:tc>
+      </w:tr>
+      <w:tr>
+        <w:tc>
+          <w:tcPr>
+            <w:tcW w:type="dxa" w:w="2304"/>
+            <w:tcBorders>
+              <w:top w:val="single" w:sz="4" w:color="D9D9D9"/>
+              <w:left w:val="single" w:sz="4" w:color="D9D9D9"/>
+              <w:bottom w:val="single" w:sz="4" w:color="D9D9D9"/>
+              <w:right w:val="single" w:sz="4" w:color="D9D9D9"/>
+              <w:insideH w:val="single" w:sz="4" w:color="D9D9D9"/>
+              <w:insideV w:val="single" w:sz="4" w:color="D9D9D9"/>
+            </w:tcBorders>
+            <w:vAlign w:val="center"/>
+          </w:tcPr>
+          <w:p>
+            <w:r>
+              <w:t>Test run</w:t>
+            </w:r>
+          </w:p>
+        </w:tc>
+        <w:tc>
+          <w:tcPr>
+            <w:tcW w:type="dxa" w:w="5328"/>
+            <w:tcBorders>
+              <w:top w:val="single" w:sz="4" w:color="D9D9D9"/>
+              <w:left w:val="single" w:sz="4" w:color="D9D9D9"/>
+              <w:bottom w:val="single" w:sz="4" w:color="D9D9D9"/>
+              <w:right w:val="single" w:sz="4" w:color="D9D9D9"/>
+              <w:insideH w:val="single" w:sz="4" w:color="D9D9D9"/>
+              <w:insideV w:val="single" w:sz="4" w:color="D9D9D9"/>
+            </w:tcBorders>
+            <w:vAlign w:val="center"/>
+          </w:tcPr>
+          <w:p>
+            <w:r>
+              <w:t>Terminal and owned by the vehicle</w:t>
+            </w:r>
+          </w:p>
+        </w:tc>
+        <w:tc>
+          <w:tcPr>
+            <w:tcW w:type="dxa" w:w="2304"/>
+            <w:tcBorders>
+              <w:top w:val="single" w:sz="4" w:color="D9D9D9"/>
+              <w:left w:val="single" w:sz="4" w:color="D9D9D9"/>
+              <w:bottom w:val="single" w:sz="4" w:color="D9D9D9"/>
+              <w:right w:val="single" w:sz="4" w:color="D9D9D9"/>
+              <w:insideH w:val="single" w:sz="4" w:color="D9D9D9"/>
+              <w:insideV w:val="single" w:sz="4" w:color="D9D9D9"/>
+            </w:tcBorders>
+            <w:vAlign w:val="center"/>
+          </w:tcPr>
+          <w:p>
+            <w:r>
+              <w:t>One report per run</w:t>
+            </w:r>
+          </w:p>
+        </w:tc>
+      </w:tr>
+      <w:tr>
+        <w:tc>
+          <w:tcPr>
+            <w:tcW w:type="dxa" w:w="2304"/>
+            <w:tcBorders>
+              <w:top w:val="single" w:sz="4" w:color="D9D9D9"/>
+              <w:left w:val="single" w:sz="4" w:color="D9D9D9"/>
+              <w:bottom w:val="single" w:sz="4" w:color="D9D9D9"/>
+              <w:right w:val="single" w:sz="4" w:color="D9D9D9"/>
+              <w:insideH w:val="single" w:sz="4" w:color="D9D9D9"/>
+              <w:insideV w:val="single" w:sz="4" w:color="D9D9D9"/>
+            </w:tcBorders>
+            <w:shd w:fill="EAF0F7"/>
+            <w:vAlign w:val="center"/>
+          </w:tcPr>
+          <w:p>
+            <w:r>
+              <w:t>Gateway</w:t>
+            </w:r>
+          </w:p>
+        </w:tc>
+        <w:tc>
+          <w:tcPr>
+            <w:tcW w:type="dxa" w:w="5328"/>
+            <w:tcBorders>
+              <w:top w:val="single" w:sz="4" w:color="D9D9D9"/>
+              <w:left w:val="single" w:sz="4" w:color="D9D9D9"/>
+              <w:bottom w:val="single" w:sz="4" w:color="D9D9D9"/>
+              <w:right w:val="single" w:sz="4" w:color="D9D9D9"/>
+              <w:insideH w:val="single" w:sz="4" w:color="D9D9D9"/>
+              <w:insideV w:val="single" w:sz="4" w:color="D9D9D9"/>
+            </w:tcBorders>
+            <w:shd w:fill="EAF0F7"/>
+            <w:vAlign w:val="center"/>
+          </w:tcPr>
+          <w:p>
+            <w:r>
+              <w:t>Telemetry publisher and command consumer</w:t>
+            </w:r>
+          </w:p>
+        </w:tc>
+        <w:tc>
+          <w:tcPr>
+            <w:tcW w:type="dxa" w:w="2304"/>
+            <w:tcBorders>
+              <w:top w:val="single" w:sz="4" w:color="D9D9D9"/>
+              <w:left w:val="single" w:sz="4" w:color="D9D9D9"/>
+              <w:bottom w:val="single" w:sz="4" w:color="D9D9D9"/>
+              <w:right w:val="single" w:sz="4" w:color="D9D9D9"/>
+              <w:insideH w:val="single" w:sz="4" w:color="D9D9D9"/>
+              <w:insideV w:val="single" w:sz="4" w:color="D9D9D9"/>
+            </w:tcBorders>
+            <w:shd w:fill="EAF0F7"/>
+            <w:vAlign w:val="center"/>
+          </w:tcPr>
+          <w:p>
+            <w:r>
+              <w:t>One selected module</w:t>
+            </w:r>
+          </w:p>
+        </w:tc>
+      </w:tr>
+      <w:tr>
+        <w:tc>
+          <w:tcPr>
+            <w:tcW w:type="dxa" w:w="2304"/>
+            <w:tcBorders>
+              <w:top w:val="single" w:sz="4" w:color="D9D9D9"/>
+              <w:left w:val="single" w:sz="4" w:color="D9D9D9"/>
+              <w:bottom w:val="single" w:sz="4" w:color="D9D9D9"/>
+              <w:right w:val="single" w:sz="4" w:color="D9D9D9"/>
+              <w:insideH w:val="single" w:sz="4" w:color="D9D9D9"/>
+              <w:insideV w:val="single" w:sz="4" w:color="D9D9D9"/>
+            </w:tcBorders>
+            <w:vAlign w:val="center"/>
+          </w:tcPr>
+          <w:p>
+            <w:r>
+              <w:t>Telemetry</w:t>
+            </w:r>
+          </w:p>
+        </w:tc>
+        <w:tc>
+          <w:tcPr>
+            <w:tcW w:type="dxa" w:w="5328"/>
+            <w:tcBorders>
+              <w:top w:val="single" w:sz="4" w:color="D9D9D9"/>
+              <w:left w:val="single" w:sz="4" w:color="D9D9D9"/>
+              <w:bottom w:val="single" w:sz="4" w:color="D9D9D9"/>
+              <w:right w:val="single" w:sz="4" w:color="D9D9D9"/>
+              <w:insideH w:val="single" w:sz="4" w:color="D9D9D9"/>
+              <w:insideV w:val="single" w:sz="4" w:color="D9D9D9"/>
+            </w:tcBorders>
+            <w:vAlign w:val="center"/>
+          </w:tcPr>
+          <w:p>
+            <w:r>
+              <w:t>Same vehicle and source gateway</w:t>
+            </w:r>
+          </w:p>
+        </w:tc>
+        <w:tc>
+          <w:tcPr>
+            <w:tcW w:type="dxa" w:w="2304"/>
+            <w:tcBorders>
+              <w:top w:val="single" w:sz="4" w:color="D9D9D9"/>
+              <w:left w:val="single" w:sz="4" w:color="D9D9D9"/>
+              <w:bottom w:val="single" w:sz="4" w:color="D9D9D9"/>
+              <w:right w:val="single" w:sz="4" w:color="D9D9D9"/>
+              <w:insideH w:val="single" w:sz="4" w:color="D9D9D9"/>
+              <w:insideV w:val="single" w:sz="4" w:color="D9D9D9"/>
+            </w:tcBorders>
+            <w:vAlign w:val="center"/>
+          </w:tcPr>
+          <w:p>
+            <w:r>
+              <w:t>100 identifiers</w:t>
+            </w:r>
+          </w:p>
+        </w:tc>
+      </w:tr>
+      <w:tr>
+        <w:tc>
+          <w:tcPr>
+            <w:tcW w:type="dxa" w:w="2304"/>
+            <w:tcBorders>
+              <w:top w:val="single" w:sz="4" w:color="D9D9D9"/>
+              <w:left w:val="single" w:sz="4" w:color="D9D9D9"/>
+              <w:bottom w:val="single" w:sz="4" w:color="D9D9D9"/>
+              <w:right w:val="single" w:sz="4" w:color="D9D9D9"/>
+              <w:insideH w:val="single" w:sz="4" w:color="D9D9D9"/>
+              <w:insideV w:val="single" w:sz="4" w:color="D9D9D9"/>
+            </w:tcBorders>
+            <w:shd w:fill="EAF0F7"/>
+            <w:vAlign w:val="center"/>
+          </w:tcPr>
+          <w:p>
+            <w:r>
+              <w:t>Commands</w:t>
+            </w:r>
+          </w:p>
+        </w:tc>
+        <w:tc>
+          <w:tcPr>
+            <w:tcW w:type="dxa" w:w="5328"/>
+            <w:tcBorders>
+              <w:top w:val="single" w:sz="4" w:color="D9D9D9"/>
+              <w:left w:val="single" w:sz="4" w:color="D9D9D9"/>
+              <w:bottom w:val="single" w:sz="4" w:color="D9D9D9"/>
+              <w:right w:val="single" w:sz="4" w:color="D9D9D9"/>
+              <w:insideH w:val="single" w:sz="4" w:color="D9D9D9"/>
+              <w:insideV w:val="single" w:sz="4" w:color="D9D9D9"/>
+            </w:tcBorders>
+            <w:shd w:fill="EAF0F7"/>
+            <w:vAlign w:val="center"/>
+          </w:tcPr>
+          <w:p>
+            <w:r>
+              <w:t>Terminal and same vehicle, gateway, and run</w:t>
+            </w:r>
+          </w:p>
+        </w:tc>
+        <w:tc>
+          <w:tcPr>
+            <w:tcW w:type="dxa" w:w="2304"/>
+            <w:tcBorders>
+              <w:top w:val="single" w:sz="4" w:color="D9D9D9"/>
+              <w:left w:val="single" w:sz="4" w:color="D9D9D9"/>
+              <w:bottom w:val="single" w:sz="4" w:color="D9D9D9"/>
+              <w:right w:val="single" w:sz="4" w:color="D9D9D9"/>
+              <w:insideH w:val="single" w:sz="4" w:color="D9D9D9"/>
+              <w:insideV w:val="single" w:sz="4" w:color="D9D9D9"/>
+            </w:tcBorders>
+            <w:shd w:fill="EAF0F7"/>
+            <w:vAlign w:val="center"/>
+          </w:tcPr>
+          <w:p>
+            <w:r>
+              <w:t>100 identifiers</w:t>
+            </w:r>
+          </w:p>
+        </w:tc>
+      </w:tr>
+      <w:tr>
+        <w:tc>
+          <w:tcPr>
+            <w:tcW w:type="dxa" w:w="2304"/>
+            <w:tcBorders>
+              <w:top w:val="single" w:sz="4" w:color="D9D9D9"/>
+              <w:left w:val="single" w:sz="4" w:color="D9D9D9"/>
+              <w:bottom w:val="single" w:sz="4" w:color="D9D9D9"/>
+              <w:right w:val="single" w:sz="4" w:color="D9D9D9"/>
+              <w:insideH w:val="single" w:sz="4" w:color="D9D9D9"/>
+              <w:insideV w:val="single" w:sz="4" w:color="D9D9D9"/>
+            </w:tcBorders>
+            <w:vAlign w:val="center"/>
+          </w:tcPr>
+          <w:p>
+            <w:r>
+              <w:t>Fault and mutation</w:t>
+            </w:r>
+          </w:p>
+        </w:tc>
+        <w:tc>
+          <w:tcPr>
+            <w:tcW w:type="dxa" w:w="5328"/>
+            <w:tcBorders>
+              <w:top w:val="single" w:sz="4" w:color="D9D9D9"/>
+              <w:left w:val="single" w:sz="4" w:color="D9D9D9"/>
+              <w:bottom w:val="single" w:sz="4" w:color="D9D9D9"/>
+              <w:right w:val="single" w:sz="4" w:color="D9D9D9"/>
+              <w:insideH w:val="single" w:sz="4" w:color="D9D9D9"/>
+              <w:insideV w:val="single" w:sz="4" w:color="D9D9D9"/>
+            </w:tcBorders>
+            <w:vAlign w:val="center"/>
+          </w:tcPr>
+          <w:p>
+            <w:r>
+              <w:t>Terminal and same vehicle and run</w:t>
+            </w:r>
+          </w:p>
+        </w:tc>
+        <w:tc>
+          <w:tcPr>
+            <w:tcW w:type="dxa" w:w="2304"/>
+            <w:tcBorders>
+              <w:top w:val="single" w:sz="4" w:color="D9D9D9"/>
+              <w:left w:val="single" w:sz="4" w:color="D9D9D9"/>
+              <w:bottom w:val="single" w:sz="4" w:color="D9D9D9"/>
+              <w:right w:val="single" w:sz="4" w:color="D9D9D9"/>
+              <w:insideH w:val="single" w:sz="4" w:color="D9D9D9"/>
+              <w:insideV w:val="single" w:sz="4" w:color="D9D9D9"/>
+            </w:tcBorders>
+            <w:vAlign w:val="center"/>
+          </w:tcPr>
+          <w:p>
+            <w:r>
+              <w:t>One execution each</w:t>
+            </w:r>
+          </w:p>
+        </w:tc>
+      </w:tr>
+      <w:tr>
+        <w:tc>
+          <w:tcPr>
+            <w:tcW w:type="dxa" w:w="2304"/>
+            <w:tcBorders>
+              <w:top w:val="single" w:sz="4" w:color="D9D9D9"/>
+              <w:left w:val="single" w:sz="4" w:color="D9D9D9"/>
+              <w:bottom w:val="single" w:sz="4" w:color="D9D9D9"/>
+              <w:right w:val="single" w:sz="4" w:color="D9D9D9"/>
+              <w:insideH w:val="single" w:sz="4" w:color="D9D9D9"/>
+              <w:insideV w:val="single" w:sz="4" w:color="D9D9D9"/>
+            </w:tcBorders>
+            <w:shd w:fill="EAF0F7"/>
+            <w:vAlign w:val="center"/>
+          </w:tcPr>
+          <w:p>
+            <w:r>
+              <w:t>CarSystemUI</w:t>
+            </w:r>
+          </w:p>
+        </w:tc>
+        <w:tc>
+          <w:tcPr>
+            <w:tcW w:type="dxa" w:w="5328"/>
+            <w:tcBorders>
+              <w:top w:val="single" w:sz="4" w:color="D9D9D9"/>
+              <w:left w:val="single" w:sz="4" w:color="D9D9D9"/>
+              <w:bottom w:val="single" w:sz="4" w:color="D9D9D9"/>
+              <w:right w:val="single" w:sz="4" w:color="D9D9D9"/>
+              <w:insideH w:val="single" w:sz="4" w:color="D9D9D9"/>
+              <w:insideV w:val="single" w:sz="4" w:color="D9D9D9"/>
+            </w:tcBorders>
+            <w:shd w:fill="EAF0F7"/>
+            <w:vAlign w:val="center"/>
+          </w:tcPr>
+          <w:p>
+            <w:r>
+              <w:t>Displayed status and version match the run</w:t>
+            </w:r>
+          </w:p>
+        </w:tc>
+        <w:tc>
+          <w:tcPr>
+            <w:tcW w:type="dxa" w:w="2304"/>
+            <w:tcBorders>
+              <w:top w:val="single" w:sz="4" w:color="D9D9D9"/>
+              <w:left w:val="single" w:sz="4" w:color="D9D9D9"/>
+              <w:bottom w:val="single" w:sz="4" w:color="D9D9D9"/>
+              <w:right w:val="single" w:sz="4" w:color="D9D9D9"/>
+              <w:insideH w:val="single" w:sz="4" w:color="D9D9D9"/>
+              <w:insideV w:val="single" w:sz="4" w:color="D9D9D9"/>
+            </w:tcBorders>
+            <w:shd w:fill="EAF0F7"/>
+            <w:vAlign w:val="center"/>
+          </w:tcPr>
+          <w:p>
+            <w:r>
+              <w:t>50 observations</w:t>
+            </w:r>
+          </w:p>
+        </w:tc>
+      </w:tr>
+    </w:tbl>
+    <w:p/>
+    <w:p>
+      <w:r>
+        <w:t>A failed correlated component makes the report failed. If nothing failed but one component was cancelled, the report is cancelled; otherwise it passes. Exact retries return the original report. Audit and outbox evidence retains identities, outcome, and counts without copying raw telemetry, commands, or UI observations.</w:t>
+      </w:r>
+    </w:p>
+    <w:p>
+      <w:r>
+        <w:br w:type="page"/>
+      </w:r>
+    </w:p>
+    <w:p>
+      <w:pPr>
+        <w:pStyle w:val="Heading1"/>
+      </w:pPr>
+      <w:r>
+        <w:t>13 Events and Audit</w:t>
+      </w:r>
+    </w:p>
+    <w:tbl>
+      <w:tblPr>
+        <w:tblW w:type="auto" w:w="0"/>
+        <w:tblLayout w:type="fixed"/>
+        <w:tblLook w:firstColumn="1" w:firstRow="1" w:lastColumn="0" w:lastRow="0" w:noHBand="0" w:noVBand="1" w:val="04A0"/>
+      </w:tblPr>
+      <w:tblGrid>
+        <w:gridCol w:w="3312"/>
+        <w:gridCol w:w="3312"/>
+        <w:gridCol w:w="3312"/>
+      </w:tblGrid>
+      <w:tr>
+        <w:trPr>
+          <w:tblHeader/>
+        </w:trPr>
+        <w:tc>
+          <w:tcPr>
             <w:tcW w:type="dxa" w:w="2376"/>
             <w:shd w:fill="17365D"/>
             <w:tcBorders>
@@ -5361,6 +5837,65 @@
           <w:p>
             <w:r>
               <w:t>requirement_coverage.updated</w:t>
+            </w:r>
+          </w:p>
+        </w:tc>
+      </w:tr>
+      <w:tr>
+        <w:tc>
+          <w:tcPr>
+            <w:tcW w:type="dxa" w:w="2376"/>
+            <w:tcBorders>
+              <w:top w:val="single" w:sz="4" w:color="D9D9D9"/>
+              <w:left w:val="single" w:sz="4" w:color="D9D9D9"/>
+              <w:bottom w:val="single" w:sz="4" w:color="D9D9D9"/>
+              <w:right w:val="single" w:sz="4" w:color="D9D9D9"/>
+              <w:insideH w:val="single" w:sz="4" w:color="D9D9D9"/>
+              <w:insideV w:val="single" w:sz="4" w:color="D9D9D9"/>
+            </w:tcBorders>
+            <w:vAlign w:val="center"/>
+          </w:tcPr>
+          <w:p>
+            <w:r>
+              <w:t>Create automation report</w:t>
+            </w:r>
+          </w:p>
+        </w:tc>
+        <w:tc>
+          <w:tcPr>
+            <w:tcW w:type="dxa" w:w="4536"/>
+            <w:tcBorders>
+              <w:top w:val="single" w:sz="4" w:color="D9D9D9"/>
+              <w:left w:val="single" w:sz="4" w:color="D9D9D9"/>
+              <w:bottom w:val="single" w:sz="4" w:color="D9D9D9"/>
+              <w:right w:val="single" w:sz="4" w:color="D9D9D9"/>
+              <w:insideH w:val="single" w:sz="4" w:color="D9D9D9"/>
+              <w:insideV w:val="single" w:sz="4" w:color="D9D9D9"/>
+            </w:tcBorders>
+            <w:vAlign w:val="center"/>
+          </w:tcPr>
+          <w:p>
+            <w:r>
+              <w:t>atep.cross_platform_automation.report.created.v1</w:t>
+            </w:r>
+          </w:p>
+        </w:tc>
+        <w:tc>
+          <w:tcPr>
+            <w:tcW w:type="dxa" w:w="3024"/>
+            <w:tcBorders>
+              <w:top w:val="single" w:sz="4" w:color="D9D9D9"/>
+              <w:left w:val="single" w:sz="4" w:color="D9D9D9"/>
+              <w:bottom w:val="single" w:sz="4" w:color="D9D9D9"/>
+              <w:right w:val="single" w:sz="4" w:color="D9D9D9"/>
+              <w:insideH w:val="single" w:sz="4" w:color="D9D9D9"/>
+              <w:insideV w:val="single" w:sz="4" w:color="D9D9D9"/>
+            </w:tcBorders>
+            <w:vAlign w:val="center"/>
+          </w:tcPr>
+          <w:p>
+            <w:r>
+              <w:t>cross_platform_automation.report_created</w:t>
             </w:r>
           </w:p>
         </w:tc>
@@ -5382,7 +5917,7 @@
         <w:pStyle w:val="Heading1"/>
       </w:pPr>
       <w:r>
-        <w:t>13 Engineering Decisions</w:t>
+        <w:t>14 Engineering Decisions</w:t>
       </w:r>
     </w:p>
     <w:tbl>
@@ -5952,7 +6487,7 @@
           </w:tcPr>
           <w:p>
             <w:r>
-              <w:t>Automatic adapters remain VIII-7</w:t>
+              <w:t>The API remains orchestration-only</w:t>
             </w:r>
           </w:p>
         </w:tc>
@@ -6073,7 +6608,7 @@
           </w:tcPr>
           <w:p>
             <w:r>
-              <w:t>Native adapters remain isolated in VIII-7</w:t>
+              <w:t>Native adapters require isolated execution</w:t>
             </w:r>
           </w:p>
         </w:tc>
@@ -6133,6 +6668,127 @@
           <w:p>
             <w:r>
               <w:t>Dashboard consumers use stable totals</w:t>
+            </w:r>
+          </w:p>
+        </w:tc>
+      </w:tr>
+      <w:tr>
+        <w:tc>
+          <w:tcPr>
+            <w:tcW w:type="dxa" w:w="2376"/>
+            <w:tcBorders>
+              <w:top w:val="single" w:sz="4" w:color="D9D9D9"/>
+              <w:left w:val="single" w:sz="4" w:color="D9D9D9"/>
+              <w:bottom w:val="single" w:sz="4" w:color="D9D9D9"/>
+              <w:right w:val="single" w:sz="4" w:color="D9D9D9"/>
+              <w:insideH w:val="single" w:sz="4" w:color="D9D9D9"/>
+              <w:insideV w:val="single" w:sz="4" w:color="D9D9D9"/>
+            </w:tcBorders>
+            <w:shd w:fill="EAF0F7"/>
+            <w:vAlign w:val="center"/>
+          </w:tcPr>
+          <w:p>
+            <w:r>
+              <w:t>One report per test run</w:t>
+            </w:r>
+          </w:p>
+        </w:tc>
+        <w:tc>
+          <w:tcPr>
+            <w:tcW w:type="dxa" w:w="3960"/>
+            <w:tcBorders>
+              <w:top w:val="single" w:sz="4" w:color="D9D9D9"/>
+              <w:left w:val="single" w:sz="4" w:color="D9D9D9"/>
+              <w:bottom w:val="single" w:sz="4" w:color="D9D9D9"/>
+              <w:right w:val="single" w:sz="4" w:color="D9D9D9"/>
+              <w:insideH w:val="single" w:sz="4" w:color="D9D9D9"/>
+              <w:insideV w:val="single" w:sz="4" w:color="D9D9D9"/>
+            </w:tcBorders>
+            <w:shd w:fill="EAF0F7"/>
+            <w:vAlign w:val="center"/>
+          </w:tcPr>
+          <w:p>
+            <w:r>
+              <w:t>Prevent contradictory final evidence</w:t>
+            </w:r>
+          </w:p>
+        </w:tc>
+        <w:tc>
+          <w:tcPr>
+            <w:tcW w:type="dxa" w:w="3600"/>
+            <w:tcBorders>
+              <w:top w:val="single" w:sz="4" w:color="D9D9D9"/>
+              <w:left w:val="single" w:sz="4" w:color="D9D9D9"/>
+              <w:bottom w:val="single" w:sz="4" w:color="D9D9D9"/>
+              <w:right w:val="single" w:sz="4" w:color="D9D9D9"/>
+              <w:insideH w:val="single" w:sz="4" w:color="D9D9D9"/>
+              <w:insideV w:val="single" w:sz="4" w:color="D9D9D9"/>
+            </w:tcBorders>
+            <w:shd w:fill="EAF0F7"/>
+            <w:vAlign w:val="center"/>
+          </w:tcPr>
+          <w:p>
+            <w:r>
+              <w:t>Exact replay is idempotent</w:t>
+            </w:r>
+          </w:p>
+        </w:tc>
+      </w:tr>
+      <w:tr>
+        <w:tc>
+          <w:tcPr>
+            <w:tcW w:type="dxa" w:w="2376"/>
+            <w:tcBorders>
+              <w:top w:val="single" w:sz="4" w:color="D9D9D9"/>
+              <w:left w:val="single" w:sz="4" w:color="D9D9D9"/>
+              <w:bottom w:val="single" w:sz="4" w:color="D9D9D9"/>
+              <w:right w:val="single" w:sz="4" w:color="D9D9D9"/>
+              <w:insideH w:val="single" w:sz="4" w:color="D9D9D9"/>
+              <w:insideV w:val="single" w:sz="4" w:color="D9D9D9"/>
+            </w:tcBorders>
+            <w:vAlign w:val="center"/>
+          </w:tcPr>
+          <w:p>
+            <w:r>
+              <w:t>Validate UI version</w:t>
+            </w:r>
+          </w:p>
+        </w:tc>
+        <w:tc>
+          <w:tcPr>
+            <w:tcW w:type="dxa" w:w="3960"/>
+            <w:tcBorders>
+              <w:top w:val="single" w:sz="4" w:color="D9D9D9"/>
+              <w:left w:val="single" w:sz="4" w:color="D9D9D9"/>
+              <w:bottom w:val="single" w:sz="4" w:color="D9D9D9"/>
+              <w:right w:val="single" w:sz="4" w:color="D9D9D9"/>
+              <w:insideH w:val="single" w:sz="4" w:color="D9D9D9"/>
+              <w:insideV w:val="single" w:sz="4" w:color="D9D9D9"/>
+            </w:tcBorders>
+            <w:vAlign w:val="center"/>
+          </w:tcPr>
+          <w:p>
+            <w:r>
+              <w:t>Reject stale displayed results</w:t>
+            </w:r>
+          </w:p>
+        </w:tc>
+        <w:tc>
+          <w:tcPr>
+            <w:tcW w:type="dxa" w:w="3600"/>
+            <w:tcBorders>
+              <w:top w:val="single" w:sz="4" w:color="D9D9D9"/>
+              <w:left w:val="single" w:sz="4" w:color="D9D9D9"/>
+              <w:bottom w:val="single" w:sz="4" w:color="D9D9D9"/>
+              <w:right w:val="single" w:sz="4" w:color="D9D9D9"/>
+              <w:insideH w:val="single" w:sz="4" w:color="D9D9D9"/>
+              <w:insideV w:val="single" w:sz="4" w:color="D9D9D9"/>
+            </w:tcBorders>
+            <w:vAlign w:val="center"/>
+          </w:tcPr>
+          <w:p>
+            <w:r>
+              <w:t>Persistent run remains authoritative</w:t>
             </w:r>
           </w:p>
         </w:tc>
@@ -6149,7 +6805,7 @@
         <w:pStyle w:val="Heading1"/>
       </w:pPr>
       <w:r>
-        <w:t>14 Verification Catalogue</w:t>
+        <w:t>15 Verification Catalogue</w:t>
       </w:r>
     </w:p>
     <w:tbl>
@@ -6845,6 +7501,65 @@
           </w:p>
         </w:tc>
       </w:tr>
+      <w:tr>
+        <w:tc>
+          <w:tcPr>
+            <w:tcW w:type="dxa" w:w="2232"/>
+            <w:tcBorders>
+              <w:top w:val="single" w:sz="4" w:color="D9D9D9"/>
+              <w:left w:val="single" w:sz="4" w:color="D9D9D9"/>
+              <w:bottom w:val="single" w:sz="4" w:color="D9D9D9"/>
+              <w:right w:val="single" w:sz="4" w:color="D9D9D9"/>
+              <w:insideH w:val="single" w:sz="4" w:color="D9D9D9"/>
+              <w:insideV w:val="single" w:sz="4" w:color="D9D9D9"/>
+            </w:tcBorders>
+            <w:vAlign w:val="center"/>
+          </w:tcPr>
+          <w:p>
+            <w:r>
+              <w:t>TF-T-060 to 068</w:t>
+            </w:r>
+          </w:p>
+        </w:tc>
+        <w:tc>
+          <w:tcPr>
+            <w:tcW w:type="dxa" w:w="3528"/>
+            <w:tcBorders>
+              <w:top w:val="single" w:sz="4" w:color="D9D9D9"/>
+              <w:left w:val="single" w:sz="4" w:color="D9D9D9"/>
+              <w:bottom w:val="single" w:sz="4" w:color="D9D9D9"/>
+              <w:right w:val="single" w:sz="4" w:color="D9D9D9"/>
+              <w:insideH w:val="single" w:sz="4" w:color="D9D9D9"/>
+              <w:insideV w:val="single" w:sz="4" w:color="D9D9D9"/>
+            </w:tcBorders>
+            <w:vAlign w:val="center"/>
+          </w:tcPr>
+          <w:p>
+            <w:r>
+              <w:t>Cross-platform reports</w:t>
+            </w:r>
+          </w:p>
+        </w:tc>
+        <w:tc>
+          <w:tcPr>
+            <w:tcW w:type="dxa" w:w="4176"/>
+            <w:tcBorders>
+              <w:top w:val="single" w:sz="4" w:color="D9D9D9"/>
+              <w:left w:val="single" w:sz="4" w:color="D9D9D9"/>
+              <w:bottom w:val="single" w:sz="4" w:color="D9D9D9"/>
+              <w:right w:val="single" w:sz="4" w:color="D9D9D9"/>
+              <w:insideH w:val="single" w:sz="4" w:color="D9D9D9"/>
+              <w:insideV w:val="single" w:sz="4" w:color="D9D9D9"/>
+            </w:tcBorders>
+            <w:vAlign w:val="center"/>
+          </w:tcPr>
+          <w:p>
+            <w:r>
+              <w:t>Validate correlation, outcome, replay, safety, RBAC, and integration</w:t>
+            </w:r>
+          </w:p>
+        </w:tc>
+      </w:tr>
     </w:tbl>
     <w:p/>
     <w:p>
@@ -6857,7 +7572,7 @@
         <w:pStyle w:val="Heading1"/>
       </w:pPr>
       <w:r>
-        <w:t>15 Risks and Controls</w:t>
+        <w:t>16 Risks and Controls</w:t>
       </w:r>
     </w:p>
     <w:tbl>
@@ -7427,7 +8142,7 @@
           </w:tcPr>
           <w:p>
             <w:r>
-              <w:t>Adapters report recovery evidence in VIII-7</w:t>
+              <w:t>Reports retain recovery evidence</w:t>
             </w:r>
           </w:p>
         </w:tc>
@@ -7548,7 +8263,7 @@
           </w:tcPr>
           <w:p>
             <w:r>
-              <w:t>Isolate native adapters in VIII-7</w:t>
+              <w:t>Require isolated native adapters</w:t>
             </w:r>
           </w:p>
         </w:tc>
@@ -7608,6 +8323,127 @@
           <w:p>
             <w:r>
               <w:t>Track partial and gap totals</w:t>
+            </w:r>
+          </w:p>
+        </w:tc>
+      </w:tr>
+      <w:tr>
+        <w:tc>
+          <w:tcPr>
+            <w:tcW w:type="dxa" w:w="2160"/>
+            <w:tcBorders>
+              <w:top w:val="single" w:sz="4" w:color="D9D9D9"/>
+              <w:left w:val="single" w:sz="4" w:color="D9D9D9"/>
+              <w:bottom w:val="single" w:sz="4" w:color="D9D9D9"/>
+              <w:right w:val="single" w:sz="4" w:color="D9D9D9"/>
+              <w:insideH w:val="single" w:sz="4" w:color="D9D9D9"/>
+              <w:insideV w:val="single" w:sz="4" w:color="D9D9D9"/>
+            </w:tcBorders>
+            <w:shd w:fill="EAF0F7"/>
+            <w:vAlign w:val="center"/>
+          </w:tcPr>
+          <w:p>
+            <w:r>
+              <w:t>Stale cockpit evidence</w:t>
+            </w:r>
+          </w:p>
+        </w:tc>
+        <w:tc>
+          <w:tcPr>
+            <w:tcW w:type="dxa" w:w="3672"/>
+            <w:tcBorders>
+              <w:top w:val="single" w:sz="4" w:color="D9D9D9"/>
+              <w:left w:val="single" w:sz="4" w:color="D9D9D9"/>
+              <w:bottom w:val="single" w:sz="4" w:color="D9D9D9"/>
+              <w:right w:val="single" w:sz="4" w:color="D9D9D9"/>
+              <w:insideH w:val="single" w:sz="4" w:color="D9D9D9"/>
+              <w:insideV w:val="single" w:sz="4" w:color="D9D9D9"/>
+            </w:tcBorders>
+            <w:shd w:fill="EAF0F7"/>
+            <w:vAlign w:val="center"/>
+          </w:tcPr>
+          <w:p>
+            <w:r>
+              <w:t>Match persisted run status and version</w:t>
+            </w:r>
+          </w:p>
+        </w:tc>
+        <w:tc>
+          <w:tcPr>
+            <w:tcW w:type="dxa" w:w="4104"/>
+            <w:tcBorders>
+              <w:top w:val="single" w:sz="4" w:color="D9D9D9"/>
+              <w:left w:val="single" w:sz="4" w:color="D9D9D9"/>
+              <w:bottom w:val="single" w:sz="4" w:color="D9D9D9"/>
+              <w:right w:val="single" w:sz="4" w:color="D9D9D9"/>
+              <w:insideH w:val="single" w:sz="4" w:color="D9D9D9"/>
+              <w:insideV w:val="single" w:sz="4" w:color="D9D9D9"/>
+            </w:tcBorders>
+            <w:shd w:fill="EAF0F7"/>
+            <w:vAlign w:val="center"/>
+          </w:tcPr>
+          <w:p>
+            <w:r>
+              <w:t>Reject inconsistent reports</w:t>
+            </w:r>
+          </w:p>
+        </w:tc>
+      </w:tr>
+      <w:tr>
+        <w:tc>
+          <w:tcPr>
+            <w:tcW w:type="dxa" w:w="2160"/>
+            <w:tcBorders>
+              <w:top w:val="single" w:sz="4" w:color="D9D9D9"/>
+              <w:left w:val="single" w:sz="4" w:color="D9D9D9"/>
+              <w:bottom w:val="single" w:sz="4" w:color="D9D9D9"/>
+              <w:right w:val="single" w:sz="4" w:color="D9D9D9"/>
+              <w:insideH w:val="single" w:sz="4" w:color="D9D9D9"/>
+              <w:insideV w:val="single" w:sz="4" w:color="D9D9D9"/>
+            </w:tcBorders>
+            <w:vAlign w:val="center"/>
+          </w:tcPr>
+          <w:p>
+            <w:r>
+              <w:t>Cross-vehicle correlation</w:t>
+            </w:r>
+          </w:p>
+        </w:tc>
+        <w:tc>
+          <w:tcPr>
+            <w:tcW w:type="dxa" w:w="3672"/>
+            <w:tcBorders>
+              <w:top w:val="single" w:sz="4" w:color="D9D9D9"/>
+              <w:left w:val="single" w:sz="4" w:color="D9D9D9"/>
+              <w:bottom w:val="single" w:sz="4" w:color="D9D9D9"/>
+              <w:right w:val="single" w:sz="4" w:color="D9D9D9"/>
+              <w:insideH w:val="single" w:sz="4" w:color="D9D9D9"/>
+              <w:insideV w:val="single" w:sz="4" w:color="D9D9D9"/>
+            </w:tcBorders>
+            <w:vAlign w:val="center"/>
+          </w:tcPr>
+          <w:p>
+            <w:r>
+              <w:t>Validate every reference before commit</w:t>
+            </w:r>
+          </w:p>
+        </w:tc>
+        <w:tc>
+          <w:tcPr>
+            <w:tcW w:type="dxa" w:w="4104"/>
+            <w:tcBorders>
+              <w:top w:val="single" w:sz="4" w:color="D9D9D9"/>
+              <w:left w:val="single" w:sz="4" w:color="D9D9D9"/>
+              <w:bottom w:val="single" w:sz="4" w:color="D9D9D9"/>
+              <w:right w:val="single" w:sz="4" w:color="D9D9D9"/>
+              <w:insideH w:val="single" w:sz="4" w:color="D9D9D9"/>
+              <w:insideV w:val="single" w:sz="4" w:color="D9D9D9"/>
+            </w:tcBorders>
+            <w:vAlign w:val="center"/>
+          </w:tcPr>
+          <w:p>
+            <w:r>
+              <w:t>Keep one authoritative vehicle context</w:t>
             </w:r>
           </w:p>
         </w:tc>
@@ -7619,12 +8455,12 @@
         <w:pStyle w:val="Heading1"/>
       </w:pPr>
       <w:r>
-        <w:t>16 Study Exercises</w:t>
+        <w:t>17 Study Exercises</w:t>
       </w:r>
     </w:p>
     <w:p>
       <w:r>
-        <w:t>Create one ADAS definition and identify its invariants. Then run two required cases, explain the aggregate result, and compare an exact retry after suite archival with a new run request for the archived suite. Schedule the same suite, archive it, and explain why the stored job can still dispatch reproducibly. Finally, design one battery-temperature fault with recovery verification and explain why the campaign contract must not expose an arbitrary shell or adapter command. Create two mutants, calculate a fifty percent score, and explain why a requirement with a test but no evidence is only partially covered.</w:t>
+        <w:t>Create one ADAS definition and identify its invariants. Then run two required cases, explain the aggregate result, and compare an exact retry after suite archival with a new run request for the archived suite. Schedule the same suite, archive it, and explain why the stored job can still dispatch reproducibly. Finally, design one battery-temperature fault with recovery verification and explain why the campaign contract must not expose an arbitrary shell or adapter command. Create two mutants, calculate a fifty percent score, and explain why a requirement with a test but no evidence is only partially covered. Build a final report and identify which reference would be rejected if it came from another gateway or displayed an older run version.</w:t>
       </w:r>
     </w:p>
     <w:p>
@@ -7632,12 +8468,12 @@
         <w:pStyle w:val="Heading1"/>
       </w:pPr>
       <w:r>
-        <w:t>17 Next Development</w:t>
+        <w:t>18 Volume Completion</w:t>
       </w:r>
     </w:p>
     <w:p>
       <w:r>
-        <w:t>VIII-7 will connect Gateway and CarSystemUI orchestration to the catalog, execution, fault, mutation, and evidence contracts. VIII-4 remains planned near project completion, when stable baselines make performance thresholds and comparable trends meaningful.</w:t>
+        <w:t>The functional Volume VIII baseline is complete. VIII-4 remains planned near project completion, when stable baselines make performance thresholds and comparable trends meaningful without unnecessary CPU or GPU use during active architecture changes.</w:t>
       </w:r>
     </w:p>
     <w:sectPr>

</xml_diff>

<commit_message>
feat(test-framework): add cross-platform reports (#96)
</commit_message>
<xml_diff>
--- a/docs/ATEP_Volume_VIII_Test_Framework_Engineering_Workbook.docx
+++ b/docs/ATEP_Volume_VIII_Test_Framework_Engineering_Workbook.docx
@@ -19,7 +19,7 @@
         <w:rPr>
           <w:b/>
         </w:rPr>
-        <w:t>Version 0.5.0   VIII 6 Mutation and Coverage Implemented</w:t>
+        <w:t>Version 0.6.0   Functional Volume VIII Baseline Complete</w:t>
       </w:r>
     </w:p>
     <w:p>
@@ -125,7 +125,7 @@
           </w:tcPr>
           <w:p>
             <w:r>
-              <w:t>VIII-1, VIII-2, VIII-3, VIII-5, and VIII-6 implemented and verified</w:t>
+              <w:t>Functional VIII-1, VIII-2, VIII-3, VIII-5, VIII-6, and VIII-7 complete</w:t>
             </w:r>
           </w:p>
         </w:tc>
@@ -289,7 +289,7 @@
           </w:tcPr>
           <w:p>
             <w:r>
-              <w:t>VIII-7 cross-platform automation; VIII-4 deferred</w:t>
+              <w:t>VIII-4 performance and stress near project completion</w:t>
             </w:r>
           </w:p>
         </w:tc>
@@ -330,7 +330,7 @@
         <w:pStyle w:val="ListBullet"/>
       </w:pPr>
       <w:r>
-        <w:t>Performance and stress remain planned but are deferred until near completion; cross-platform automation is next.</w:t>
+        <w:t>Performance and stress remain planned but are deferred until near completion; the functional Volume VIII baseline is complete.</w:t>
       </w:r>
     </w:p>
     <w:p>
@@ -568,7 +568,7 @@
           </w:tcPr>
           <w:p>
             <w:r>
-              <w:t>Linear migrations 0051 through 0055 with reversible schema changes</w:t>
+              <w:t>Linear migrations 0051 through 0056 with reversible schema changes</w:t>
             </w:r>
           </w:p>
         </w:tc>
@@ -4306,7 +4306,12 @@
         <w:pStyle w:val="Heading1"/>
       </w:pPr>
       <w:r>
-        <w:t>12 Events and Audit</w:t>
+        <w:t>12 Cross Platform Automation Reporting</w:t>
+      </w:r>
+    </w:p>
+    <w:p>
+      <w:r>
+        <w:t>VIII-7 closes the functional baseline with one immutable report per terminal test run. The report correlates the authoritative vehicle and run with Vehicle Gateway telemetry and commands, optional fault and mutation executions, and the status and version that CarSystemUI displayed. Existing REST, WebSocket, workload identity, lease, and evidence contracts remain authoritative.</w:t>
       </w:r>
     </w:p>
     <w:tbl>
@@ -4326,6 +4331,477 @@
         </w:trPr>
         <w:tc>
           <w:tcPr>
+            <w:tcW w:type="dxa" w:w="2304"/>
+            <w:shd w:fill="17365D"/>
+            <w:tcBorders>
+              <w:top w:val="single" w:sz="4" w:color="D9D9D9"/>
+              <w:left w:val="single" w:sz="4" w:color="D9D9D9"/>
+              <w:bottom w:val="single" w:sz="4" w:color="D9D9D9"/>
+              <w:right w:val="single" w:sz="4" w:color="D9D9D9"/>
+              <w:insideH w:val="single" w:sz="4" w:color="D9D9D9"/>
+              <w:insideV w:val="single" w:sz="4" w:color="D9D9D9"/>
+            </w:tcBorders>
+            <w:vAlign w:val="center"/>
+          </w:tcPr>
+          <w:p>
+            <w:r>
+              <w:rPr>
+                <w:b/>
+                <w:color w:val="FFFFFF"/>
+              </w:rPr>
+              <w:t>Evidence</w:t>
+            </w:r>
+          </w:p>
+        </w:tc>
+        <w:tc>
+          <w:tcPr>
+            <w:tcW w:type="dxa" w:w="5328"/>
+            <w:shd w:fill="17365D"/>
+            <w:tcBorders>
+              <w:top w:val="single" w:sz="4" w:color="D9D9D9"/>
+              <w:left w:val="single" w:sz="4" w:color="D9D9D9"/>
+              <w:bottom w:val="single" w:sz="4" w:color="D9D9D9"/>
+              <w:right w:val="single" w:sz="4" w:color="D9D9D9"/>
+              <w:insideH w:val="single" w:sz="4" w:color="D9D9D9"/>
+              <w:insideV w:val="single" w:sz="4" w:color="D9D9D9"/>
+            </w:tcBorders>
+            <w:vAlign w:val="center"/>
+          </w:tcPr>
+          <w:p>
+            <w:r>
+              <w:rPr>
+                <w:b/>
+                <w:color w:val="FFFFFF"/>
+              </w:rPr>
+              <w:t>Consistency rule</w:t>
+            </w:r>
+          </w:p>
+        </w:tc>
+        <w:tc>
+          <w:tcPr>
+            <w:tcW w:type="dxa" w:w="2304"/>
+            <w:shd w:fill="17365D"/>
+            <w:tcBorders>
+              <w:top w:val="single" w:sz="4" w:color="D9D9D9"/>
+              <w:left w:val="single" w:sz="4" w:color="D9D9D9"/>
+              <w:bottom w:val="single" w:sz="4" w:color="D9D9D9"/>
+              <w:right w:val="single" w:sz="4" w:color="D9D9D9"/>
+              <w:insideH w:val="single" w:sz="4" w:color="D9D9D9"/>
+              <w:insideV w:val="single" w:sz="4" w:color="D9D9D9"/>
+            </w:tcBorders>
+            <w:vAlign w:val="center"/>
+          </w:tcPr>
+          <w:p>
+            <w:r>
+              <w:rPr>
+                <w:b/>
+                <w:color w:val="FFFFFF"/>
+              </w:rPr>
+              <w:t>Bound</w:t>
+            </w:r>
+          </w:p>
+        </w:tc>
+      </w:tr>
+      <w:tr>
+        <w:tc>
+          <w:tcPr>
+            <w:tcW w:type="dxa" w:w="2304"/>
+            <w:tcBorders>
+              <w:top w:val="single" w:sz="4" w:color="D9D9D9"/>
+              <w:left w:val="single" w:sz="4" w:color="D9D9D9"/>
+              <w:bottom w:val="single" w:sz="4" w:color="D9D9D9"/>
+              <w:right w:val="single" w:sz="4" w:color="D9D9D9"/>
+              <w:insideH w:val="single" w:sz="4" w:color="D9D9D9"/>
+              <w:insideV w:val="single" w:sz="4" w:color="D9D9D9"/>
+            </w:tcBorders>
+            <w:vAlign w:val="center"/>
+          </w:tcPr>
+          <w:p>
+            <w:r>
+              <w:t>Test run</w:t>
+            </w:r>
+          </w:p>
+        </w:tc>
+        <w:tc>
+          <w:tcPr>
+            <w:tcW w:type="dxa" w:w="5328"/>
+            <w:tcBorders>
+              <w:top w:val="single" w:sz="4" w:color="D9D9D9"/>
+              <w:left w:val="single" w:sz="4" w:color="D9D9D9"/>
+              <w:bottom w:val="single" w:sz="4" w:color="D9D9D9"/>
+              <w:right w:val="single" w:sz="4" w:color="D9D9D9"/>
+              <w:insideH w:val="single" w:sz="4" w:color="D9D9D9"/>
+              <w:insideV w:val="single" w:sz="4" w:color="D9D9D9"/>
+            </w:tcBorders>
+            <w:vAlign w:val="center"/>
+          </w:tcPr>
+          <w:p>
+            <w:r>
+              <w:t>Terminal and owned by the vehicle</w:t>
+            </w:r>
+          </w:p>
+        </w:tc>
+        <w:tc>
+          <w:tcPr>
+            <w:tcW w:type="dxa" w:w="2304"/>
+            <w:tcBorders>
+              <w:top w:val="single" w:sz="4" w:color="D9D9D9"/>
+              <w:left w:val="single" w:sz="4" w:color="D9D9D9"/>
+              <w:bottom w:val="single" w:sz="4" w:color="D9D9D9"/>
+              <w:right w:val="single" w:sz="4" w:color="D9D9D9"/>
+              <w:insideH w:val="single" w:sz="4" w:color="D9D9D9"/>
+              <w:insideV w:val="single" w:sz="4" w:color="D9D9D9"/>
+            </w:tcBorders>
+            <w:vAlign w:val="center"/>
+          </w:tcPr>
+          <w:p>
+            <w:r>
+              <w:t>One report per run</w:t>
+            </w:r>
+          </w:p>
+        </w:tc>
+      </w:tr>
+      <w:tr>
+        <w:tc>
+          <w:tcPr>
+            <w:tcW w:type="dxa" w:w="2304"/>
+            <w:tcBorders>
+              <w:top w:val="single" w:sz="4" w:color="D9D9D9"/>
+              <w:left w:val="single" w:sz="4" w:color="D9D9D9"/>
+              <w:bottom w:val="single" w:sz="4" w:color="D9D9D9"/>
+              <w:right w:val="single" w:sz="4" w:color="D9D9D9"/>
+              <w:insideH w:val="single" w:sz="4" w:color="D9D9D9"/>
+              <w:insideV w:val="single" w:sz="4" w:color="D9D9D9"/>
+            </w:tcBorders>
+            <w:shd w:fill="EAF0F7"/>
+            <w:vAlign w:val="center"/>
+          </w:tcPr>
+          <w:p>
+            <w:r>
+              <w:t>Gateway</w:t>
+            </w:r>
+          </w:p>
+        </w:tc>
+        <w:tc>
+          <w:tcPr>
+            <w:tcW w:type="dxa" w:w="5328"/>
+            <w:tcBorders>
+              <w:top w:val="single" w:sz="4" w:color="D9D9D9"/>
+              <w:left w:val="single" w:sz="4" w:color="D9D9D9"/>
+              <w:bottom w:val="single" w:sz="4" w:color="D9D9D9"/>
+              <w:right w:val="single" w:sz="4" w:color="D9D9D9"/>
+              <w:insideH w:val="single" w:sz="4" w:color="D9D9D9"/>
+              <w:insideV w:val="single" w:sz="4" w:color="D9D9D9"/>
+            </w:tcBorders>
+            <w:shd w:fill="EAF0F7"/>
+            <w:vAlign w:val="center"/>
+          </w:tcPr>
+          <w:p>
+            <w:r>
+              <w:t>Telemetry publisher and command consumer</w:t>
+            </w:r>
+          </w:p>
+        </w:tc>
+        <w:tc>
+          <w:tcPr>
+            <w:tcW w:type="dxa" w:w="2304"/>
+            <w:tcBorders>
+              <w:top w:val="single" w:sz="4" w:color="D9D9D9"/>
+              <w:left w:val="single" w:sz="4" w:color="D9D9D9"/>
+              <w:bottom w:val="single" w:sz="4" w:color="D9D9D9"/>
+              <w:right w:val="single" w:sz="4" w:color="D9D9D9"/>
+              <w:insideH w:val="single" w:sz="4" w:color="D9D9D9"/>
+              <w:insideV w:val="single" w:sz="4" w:color="D9D9D9"/>
+            </w:tcBorders>
+            <w:shd w:fill="EAF0F7"/>
+            <w:vAlign w:val="center"/>
+          </w:tcPr>
+          <w:p>
+            <w:r>
+              <w:t>One selected module</w:t>
+            </w:r>
+          </w:p>
+        </w:tc>
+      </w:tr>
+      <w:tr>
+        <w:tc>
+          <w:tcPr>
+            <w:tcW w:type="dxa" w:w="2304"/>
+            <w:tcBorders>
+              <w:top w:val="single" w:sz="4" w:color="D9D9D9"/>
+              <w:left w:val="single" w:sz="4" w:color="D9D9D9"/>
+              <w:bottom w:val="single" w:sz="4" w:color="D9D9D9"/>
+              <w:right w:val="single" w:sz="4" w:color="D9D9D9"/>
+              <w:insideH w:val="single" w:sz="4" w:color="D9D9D9"/>
+              <w:insideV w:val="single" w:sz="4" w:color="D9D9D9"/>
+            </w:tcBorders>
+            <w:vAlign w:val="center"/>
+          </w:tcPr>
+          <w:p>
+            <w:r>
+              <w:t>Telemetry</w:t>
+            </w:r>
+          </w:p>
+        </w:tc>
+        <w:tc>
+          <w:tcPr>
+            <w:tcW w:type="dxa" w:w="5328"/>
+            <w:tcBorders>
+              <w:top w:val="single" w:sz="4" w:color="D9D9D9"/>
+              <w:left w:val="single" w:sz="4" w:color="D9D9D9"/>
+              <w:bottom w:val="single" w:sz="4" w:color="D9D9D9"/>
+              <w:right w:val="single" w:sz="4" w:color="D9D9D9"/>
+              <w:insideH w:val="single" w:sz="4" w:color="D9D9D9"/>
+              <w:insideV w:val="single" w:sz="4" w:color="D9D9D9"/>
+            </w:tcBorders>
+            <w:vAlign w:val="center"/>
+          </w:tcPr>
+          <w:p>
+            <w:r>
+              <w:t>Same vehicle and source gateway</w:t>
+            </w:r>
+          </w:p>
+        </w:tc>
+        <w:tc>
+          <w:tcPr>
+            <w:tcW w:type="dxa" w:w="2304"/>
+            <w:tcBorders>
+              <w:top w:val="single" w:sz="4" w:color="D9D9D9"/>
+              <w:left w:val="single" w:sz="4" w:color="D9D9D9"/>
+              <w:bottom w:val="single" w:sz="4" w:color="D9D9D9"/>
+              <w:right w:val="single" w:sz="4" w:color="D9D9D9"/>
+              <w:insideH w:val="single" w:sz="4" w:color="D9D9D9"/>
+              <w:insideV w:val="single" w:sz="4" w:color="D9D9D9"/>
+            </w:tcBorders>
+            <w:vAlign w:val="center"/>
+          </w:tcPr>
+          <w:p>
+            <w:r>
+              <w:t>100 identifiers</w:t>
+            </w:r>
+          </w:p>
+        </w:tc>
+      </w:tr>
+      <w:tr>
+        <w:tc>
+          <w:tcPr>
+            <w:tcW w:type="dxa" w:w="2304"/>
+            <w:tcBorders>
+              <w:top w:val="single" w:sz="4" w:color="D9D9D9"/>
+              <w:left w:val="single" w:sz="4" w:color="D9D9D9"/>
+              <w:bottom w:val="single" w:sz="4" w:color="D9D9D9"/>
+              <w:right w:val="single" w:sz="4" w:color="D9D9D9"/>
+              <w:insideH w:val="single" w:sz="4" w:color="D9D9D9"/>
+              <w:insideV w:val="single" w:sz="4" w:color="D9D9D9"/>
+            </w:tcBorders>
+            <w:shd w:fill="EAF0F7"/>
+            <w:vAlign w:val="center"/>
+          </w:tcPr>
+          <w:p>
+            <w:r>
+              <w:t>Commands</w:t>
+            </w:r>
+          </w:p>
+        </w:tc>
+        <w:tc>
+          <w:tcPr>
+            <w:tcW w:type="dxa" w:w="5328"/>
+            <w:tcBorders>
+              <w:top w:val="single" w:sz="4" w:color="D9D9D9"/>
+              <w:left w:val="single" w:sz="4" w:color="D9D9D9"/>
+              <w:bottom w:val="single" w:sz="4" w:color="D9D9D9"/>
+              <w:right w:val="single" w:sz="4" w:color="D9D9D9"/>
+              <w:insideH w:val="single" w:sz="4" w:color="D9D9D9"/>
+              <w:insideV w:val="single" w:sz="4" w:color="D9D9D9"/>
+            </w:tcBorders>
+            <w:shd w:fill="EAF0F7"/>
+            <w:vAlign w:val="center"/>
+          </w:tcPr>
+          <w:p>
+            <w:r>
+              <w:t>Terminal and same vehicle, gateway, and run</w:t>
+            </w:r>
+          </w:p>
+        </w:tc>
+        <w:tc>
+          <w:tcPr>
+            <w:tcW w:type="dxa" w:w="2304"/>
+            <w:tcBorders>
+              <w:top w:val="single" w:sz="4" w:color="D9D9D9"/>
+              <w:left w:val="single" w:sz="4" w:color="D9D9D9"/>
+              <w:bottom w:val="single" w:sz="4" w:color="D9D9D9"/>
+              <w:right w:val="single" w:sz="4" w:color="D9D9D9"/>
+              <w:insideH w:val="single" w:sz="4" w:color="D9D9D9"/>
+              <w:insideV w:val="single" w:sz="4" w:color="D9D9D9"/>
+            </w:tcBorders>
+            <w:shd w:fill="EAF0F7"/>
+            <w:vAlign w:val="center"/>
+          </w:tcPr>
+          <w:p>
+            <w:r>
+              <w:t>100 identifiers</w:t>
+            </w:r>
+          </w:p>
+        </w:tc>
+      </w:tr>
+      <w:tr>
+        <w:tc>
+          <w:tcPr>
+            <w:tcW w:type="dxa" w:w="2304"/>
+            <w:tcBorders>
+              <w:top w:val="single" w:sz="4" w:color="D9D9D9"/>
+              <w:left w:val="single" w:sz="4" w:color="D9D9D9"/>
+              <w:bottom w:val="single" w:sz="4" w:color="D9D9D9"/>
+              <w:right w:val="single" w:sz="4" w:color="D9D9D9"/>
+              <w:insideH w:val="single" w:sz="4" w:color="D9D9D9"/>
+              <w:insideV w:val="single" w:sz="4" w:color="D9D9D9"/>
+            </w:tcBorders>
+            <w:vAlign w:val="center"/>
+          </w:tcPr>
+          <w:p>
+            <w:r>
+              <w:t>Fault and mutation</w:t>
+            </w:r>
+          </w:p>
+        </w:tc>
+        <w:tc>
+          <w:tcPr>
+            <w:tcW w:type="dxa" w:w="5328"/>
+            <w:tcBorders>
+              <w:top w:val="single" w:sz="4" w:color="D9D9D9"/>
+              <w:left w:val="single" w:sz="4" w:color="D9D9D9"/>
+              <w:bottom w:val="single" w:sz="4" w:color="D9D9D9"/>
+              <w:right w:val="single" w:sz="4" w:color="D9D9D9"/>
+              <w:insideH w:val="single" w:sz="4" w:color="D9D9D9"/>
+              <w:insideV w:val="single" w:sz="4" w:color="D9D9D9"/>
+            </w:tcBorders>
+            <w:vAlign w:val="center"/>
+          </w:tcPr>
+          <w:p>
+            <w:r>
+              <w:t>Terminal and same vehicle and run</w:t>
+            </w:r>
+          </w:p>
+        </w:tc>
+        <w:tc>
+          <w:tcPr>
+            <w:tcW w:type="dxa" w:w="2304"/>
+            <w:tcBorders>
+              <w:top w:val="single" w:sz="4" w:color="D9D9D9"/>
+              <w:left w:val="single" w:sz="4" w:color="D9D9D9"/>
+              <w:bottom w:val="single" w:sz="4" w:color="D9D9D9"/>
+              <w:right w:val="single" w:sz="4" w:color="D9D9D9"/>
+              <w:insideH w:val="single" w:sz="4" w:color="D9D9D9"/>
+              <w:insideV w:val="single" w:sz="4" w:color="D9D9D9"/>
+            </w:tcBorders>
+            <w:vAlign w:val="center"/>
+          </w:tcPr>
+          <w:p>
+            <w:r>
+              <w:t>One execution each</w:t>
+            </w:r>
+          </w:p>
+        </w:tc>
+      </w:tr>
+      <w:tr>
+        <w:tc>
+          <w:tcPr>
+            <w:tcW w:type="dxa" w:w="2304"/>
+            <w:tcBorders>
+              <w:top w:val="single" w:sz="4" w:color="D9D9D9"/>
+              <w:left w:val="single" w:sz="4" w:color="D9D9D9"/>
+              <w:bottom w:val="single" w:sz="4" w:color="D9D9D9"/>
+              <w:right w:val="single" w:sz="4" w:color="D9D9D9"/>
+              <w:insideH w:val="single" w:sz="4" w:color="D9D9D9"/>
+              <w:insideV w:val="single" w:sz="4" w:color="D9D9D9"/>
+            </w:tcBorders>
+            <w:shd w:fill="EAF0F7"/>
+            <w:vAlign w:val="center"/>
+          </w:tcPr>
+          <w:p>
+            <w:r>
+              <w:t>CarSystemUI</w:t>
+            </w:r>
+          </w:p>
+        </w:tc>
+        <w:tc>
+          <w:tcPr>
+            <w:tcW w:type="dxa" w:w="5328"/>
+            <w:tcBorders>
+              <w:top w:val="single" w:sz="4" w:color="D9D9D9"/>
+              <w:left w:val="single" w:sz="4" w:color="D9D9D9"/>
+              <w:bottom w:val="single" w:sz="4" w:color="D9D9D9"/>
+              <w:right w:val="single" w:sz="4" w:color="D9D9D9"/>
+              <w:insideH w:val="single" w:sz="4" w:color="D9D9D9"/>
+              <w:insideV w:val="single" w:sz="4" w:color="D9D9D9"/>
+            </w:tcBorders>
+            <w:shd w:fill="EAF0F7"/>
+            <w:vAlign w:val="center"/>
+          </w:tcPr>
+          <w:p>
+            <w:r>
+              <w:t>Displayed status and version match the run</w:t>
+            </w:r>
+          </w:p>
+        </w:tc>
+        <w:tc>
+          <w:tcPr>
+            <w:tcW w:type="dxa" w:w="2304"/>
+            <w:tcBorders>
+              <w:top w:val="single" w:sz="4" w:color="D9D9D9"/>
+              <w:left w:val="single" w:sz="4" w:color="D9D9D9"/>
+              <w:bottom w:val="single" w:sz="4" w:color="D9D9D9"/>
+              <w:right w:val="single" w:sz="4" w:color="D9D9D9"/>
+              <w:insideH w:val="single" w:sz="4" w:color="D9D9D9"/>
+              <w:insideV w:val="single" w:sz="4" w:color="D9D9D9"/>
+            </w:tcBorders>
+            <w:shd w:fill="EAF0F7"/>
+            <w:vAlign w:val="center"/>
+          </w:tcPr>
+          <w:p>
+            <w:r>
+              <w:t>50 observations</w:t>
+            </w:r>
+          </w:p>
+        </w:tc>
+      </w:tr>
+    </w:tbl>
+    <w:p/>
+    <w:p>
+      <w:r>
+        <w:t>A failed correlated component makes the report failed. If nothing failed but one component was cancelled, the report is cancelled; otherwise it passes. Exact retries return the original report. Audit and outbox evidence retains identities, outcome, and counts without copying raw telemetry, commands, or UI observations.</w:t>
+      </w:r>
+    </w:p>
+    <w:p>
+      <w:r>
+        <w:br w:type="page"/>
+      </w:r>
+    </w:p>
+    <w:p>
+      <w:pPr>
+        <w:pStyle w:val="Heading1"/>
+      </w:pPr>
+      <w:r>
+        <w:t>13 Events and Audit</w:t>
+      </w:r>
+    </w:p>
+    <w:tbl>
+      <w:tblPr>
+        <w:tblW w:type="auto" w:w="0"/>
+        <w:tblLayout w:type="fixed"/>
+        <w:tblLook w:firstColumn="1" w:firstRow="1" w:lastColumn="0" w:lastRow="0" w:noHBand="0" w:noVBand="1" w:val="04A0"/>
+      </w:tblPr>
+      <w:tblGrid>
+        <w:gridCol w:w="3312"/>
+        <w:gridCol w:w="3312"/>
+        <w:gridCol w:w="3312"/>
+      </w:tblGrid>
+      <w:tr>
+        <w:trPr>
+          <w:tblHeader/>
+        </w:trPr>
+        <w:tc>
+          <w:tcPr>
             <w:tcW w:type="dxa" w:w="2376"/>
             <w:shd w:fill="17365D"/>
             <w:tcBorders>
@@ -5361,6 +5837,65 @@
           <w:p>
             <w:r>
               <w:t>requirement_coverage.updated</w:t>
+            </w:r>
+          </w:p>
+        </w:tc>
+      </w:tr>
+      <w:tr>
+        <w:tc>
+          <w:tcPr>
+            <w:tcW w:type="dxa" w:w="2376"/>
+            <w:tcBorders>
+              <w:top w:val="single" w:sz="4" w:color="D9D9D9"/>
+              <w:left w:val="single" w:sz="4" w:color="D9D9D9"/>
+              <w:bottom w:val="single" w:sz="4" w:color="D9D9D9"/>
+              <w:right w:val="single" w:sz="4" w:color="D9D9D9"/>
+              <w:insideH w:val="single" w:sz="4" w:color="D9D9D9"/>
+              <w:insideV w:val="single" w:sz="4" w:color="D9D9D9"/>
+            </w:tcBorders>
+            <w:vAlign w:val="center"/>
+          </w:tcPr>
+          <w:p>
+            <w:r>
+              <w:t>Create automation report</w:t>
+            </w:r>
+          </w:p>
+        </w:tc>
+        <w:tc>
+          <w:tcPr>
+            <w:tcW w:type="dxa" w:w="4536"/>
+            <w:tcBorders>
+              <w:top w:val="single" w:sz="4" w:color="D9D9D9"/>
+              <w:left w:val="single" w:sz="4" w:color="D9D9D9"/>
+              <w:bottom w:val="single" w:sz="4" w:color="D9D9D9"/>
+              <w:right w:val="single" w:sz="4" w:color="D9D9D9"/>
+              <w:insideH w:val="single" w:sz="4" w:color="D9D9D9"/>
+              <w:insideV w:val="single" w:sz="4" w:color="D9D9D9"/>
+            </w:tcBorders>
+            <w:vAlign w:val="center"/>
+          </w:tcPr>
+          <w:p>
+            <w:r>
+              <w:t>atep.cross_platform_automation.report.created.v1</w:t>
+            </w:r>
+          </w:p>
+        </w:tc>
+        <w:tc>
+          <w:tcPr>
+            <w:tcW w:type="dxa" w:w="3024"/>
+            <w:tcBorders>
+              <w:top w:val="single" w:sz="4" w:color="D9D9D9"/>
+              <w:left w:val="single" w:sz="4" w:color="D9D9D9"/>
+              <w:bottom w:val="single" w:sz="4" w:color="D9D9D9"/>
+              <w:right w:val="single" w:sz="4" w:color="D9D9D9"/>
+              <w:insideH w:val="single" w:sz="4" w:color="D9D9D9"/>
+              <w:insideV w:val="single" w:sz="4" w:color="D9D9D9"/>
+            </w:tcBorders>
+            <w:vAlign w:val="center"/>
+          </w:tcPr>
+          <w:p>
+            <w:r>
+              <w:t>cross_platform_automation.report_created</w:t>
             </w:r>
           </w:p>
         </w:tc>
@@ -5382,7 +5917,7 @@
         <w:pStyle w:val="Heading1"/>
       </w:pPr>
       <w:r>
-        <w:t>13 Engineering Decisions</w:t>
+        <w:t>14 Engineering Decisions</w:t>
       </w:r>
     </w:p>
     <w:tbl>
@@ -5952,7 +6487,7 @@
           </w:tcPr>
           <w:p>
             <w:r>
-              <w:t>Automatic adapters remain VIII-7</w:t>
+              <w:t>The API remains orchestration-only</w:t>
             </w:r>
           </w:p>
         </w:tc>
@@ -6073,7 +6608,7 @@
           </w:tcPr>
           <w:p>
             <w:r>
-              <w:t>Native adapters remain isolated in VIII-7</w:t>
+              <w:t>Native adapters require isolated execution</w:t>
             </w:r>
           </w:p>
         </w:tc>
@@ -6133,6 +6668,127 @@
           <w:p>
             <w:r>
               <w:t>Dashboard consumers use stable totals</w:t>
+            </w:r>
+          </w:p>
+        </w:tc>
+      </w:tr>
+      <w:tr>
+        <w:tc>
+          <w:tcPr>
+            <w:tcW w:type="dxa" w:w="2376"/>
+            <w:tcBorders>
+              <w:top w:val="single" w:sz="4" w:color="D9D9D9"/>
+              <w:left w:val="single" w:sz="4" w:color="D9D9D9"/>
+              <w:bottom w:val="single" w:sz="4" w:color="D9D9D9"/>
+              <w:right w:val="single" w:sz="4" w:color="D9D9D9"/>
+              <w:insideH w:val="single" w:sz="4" w:color="D9D9D9"/>
+              <w:insideV w:val="single" w:sz="4" w:color="D9D9D9"/>
+            </w:tcBorders>
+            <w:shd w:fill="EAF0F7"/>
+            <w:vAlign w:val="center"/>
+          </w:tcPr>
+          <w:p>
+            <w:r>
+              <w:t>One report per test run</w:t>
+            </w:r>
+          </w:p>
+        </w:tc>
+        <w:tc>
+          <w:tcPr>
+            <w:tcW w:type="dxa" w:w="3960"/>
+            <w:tcBorders>
+              <w:top w:val="single" w:sz="4" w:color="D9D9D9"/>
+              <w:left w:val="single" w:sz="4" w:color="D9D9D9"/>
+              <w:bottom w:val="single" w:sz="4" w:color="D9D9D9"/>
+              <w:right w:val="single" w:sz="4" w:color="D9D9D9"/>
+              <w:insideH w:val="single" w:sz="4" w:color="D9D9D9"/>
+              <w:insideV w:val="single" w:sz="4" w:color="D9D9D9"/>
+            </w:tcBorders>
+            <w:shd w:fill="EAF0F7"/>
+            <w:vAlign w:val="center"/>
+          </w:tcPr>
+          <w:p>
+            <w:r>
+              <w:t>Prevent contradictory final evidence</w:t>
+            </w:r>
+          </w:p>
+        </w:tc>
+        <w:tc>
+          <w:tcPr>
+            <w:tcW w:type="dxa" w:w="3600"/>
+            <w:tcBorders>
+              <w:top w:val="single" w:sz="4" w:color="D9D9D9"/>
+              <w:left w:val="single" w:sz="4" w:color="D9D9D9"/>
+              <w:bottom w:val="single" w:sz="4" w:color="D9D9D9"/>
+              <w:right w:val="single" w:sz="4" w:color="D9D9D9"/>
+              <w:insideH w:val="single" w:sz="4" w:color="D9D9D9"/>
+              <w:insideV w:val="single" w:sz="4" w:color="D9D9D9"/>
+            </w:tcBorders>
+            <w:shd w:fill="EAF0F7"/>
+            <w:vAlign w:val="center"/>
+          </w:tcPr>
+          <w:p>
+            <w:r>
+              <w:t>Exact replay is idempotent</w:t>
+            </w:r>
+          </w:p>
+        </w:tc>
+      </w:tr>
+      <w:tr>
+        <w:tc>
+          <w:tcPr>
+            <w:tcW w:type="dxa" w:w="2376"/>
+            <w:tcBorders>
+              <w:top w:val="single" w:sz="4" w:color="D9D9D9"/>
+              <w:left w:val="single" w:sz="4" w:color="D9D9D9"/>
+              <w:bottom w:val="single" w:sz="4" w:color="D9D9D9"/>
+              <w:right w:val="single" w:sz="4" w:color="D9D9D9"/>
+              <w:insideH w:val="single" w:sz="4" w:color="D9D9D9"/>
+              <w:insideV w:val="single" w:sz="4" w:color="D9D9D9"/>
+            </w:tcBorders>
+            <w:vAlign w:val="center"/>
+          </w:tcPr>
+          <w:p>
+            <w:r>
+              <w:t>Validate UI version</w:t>
+            </w:r>
+          </w:p>
+        </w:tc>
+        <w:tc>
+          <w:tcPr>
+            <w:tcW w:type="dxa" w:w="3960"/>
+            <w:tcBorders>
+              <w:top w:val="single" w:sz="4" w:color="D9D9D9"/>
+              <w:left w:val="single" w:sz="4" w:color="D9D9D9"/>
+              <w:bottom w:val="single" w:sz="4" w:color="D9D9D9"/>
+              <w:right w:val="single" w:sz="4" w:color="D9D9D9"/>
+              <w:insideH w:val="single" w:sz="4" w:color="D9D9D9"/>
+              <w:insideV w:val="single" w:sz="4" w:color="D9D9D9"/>
+            </w:tcBorders>
+            <w:vAlign w:val="center"/>
+          </w:tcPr>
+          <w:p>
+            <w:r>
+              <w:t>Reject stale displayed results</w:t>
+            </w:r>
+          </w:p>
+        </w:tc>
+        <w:tc>
+          <w:tcPr>
+            <w:tcW w:type="dxa" w:w="3600"/>
+            <w:tcBorders>
+              <w:top w:val="single" w:sz="4" w:color="D9D9D9"/>
+              <w:left w:val="single" w:sz="4" w:color="D9D9D9"/>
+              <w:bottom w:val="single" w:sz="4" w:color="D9D9D9"/>
+              <w:right w:val="single" w:sz="4" w:color="D9D9D9"/>
+              <w:insideH w:val="single" w:sz="4" w:color="D9D9D9"/>
+              <w:insideV w:val="single" w:sz="4" w:color="D9D9D9"/>
+            </w:tcBorders>
+            <w:vAlign w:val="center"/>
+          </w:tcPr>
+          <w:p>
+            <w:r>
+              <w:t>Persistent run remains authoritative</w:t>
             </w:r>
           </w:p>
         </w:tc>
@@ -6149,7 +6805,7 @@
         <w:pStyle w:val="Heading1"/>
       </w:pPr>
       <w:r>
-        <w:t>14 Verification Catalogue</w:t>
+        <w:t>15 Verification Catalogue</w:t>
       </w:r>
     </w:p>
     <w:tbl>
@@ -6845,6 +7501,65 @@
           </w:p>
         </w:tc>
       </w:tr>
+      <w:tr>
+        <w:tc>
+          <w:tcPr>
+            <w:tcW w:type="dxa" w:w="2232"/>
+            <w:tcBorders>
+              <w:top w:val="single" w:sz="4" w:color="D9D9D9"/>
+              <w:left w:val="single" w:sz="4" w:color="D9D9D9"/>
+              <w:bottom w:val="single" w:sz="4" w:color="D9D9D9"/>
+              <w:right w:val="single" w:sz="4" w:color="D9D9D9"/>
+              <w:insideH w:val="single" w:sz="4" w:color="D9D9D9"/>
+              <w:insideV w:val="single" w:sz="4" w:color="D9D9D9"/>
+            </w:tcBorders>
+            <w:vAlign w:val="center"/>
+          </w:tcPr>
+          <w:p>
+            <w:r>
+              <w:t>TF-T-060 to 068</w:t>
+            </w:r>
+          </w:p>
+        </w:tc>
+        <w:tc>
+          <w:tcPr>
+            <w:tcW w:type="dxa" w:w="3528"/>
+            <w:tcBorders>
+              <w:top w:val="single" w:sz="4" w:color="D9D9D9"/>
+              <w:left w:val="single" w:sz="4" w:color="D9D9D9"/>
+              <w:bottom w:val="single" w:sz="4" w:color="D9D9D9"/>
+              <w:right w:val="single" w:sz="4" w:color="D9D9D9"/>
+              <w:insideH w:val="single" w:sz="4" w:color="D9D9D9"/>
+              <w:insideV w:val="single" w:sz="4" w:color="D9D9D9"/>
+            </w:tcBorders>
+            <w:vAlign w:val="center"/>
+          </w:tcPr>
+          <w:p>
+            <w:r>
+              <w:t>Cross-platform reports</w:t>
+            </w:r>
+          </w:p>
+        </w:tc>
+        <w:tc>
+          <w:tcPr>
+            <w:tcW w:type="dxa" w:w="4176"/>
+            <w:tcBorders>
+              <w:top w:val="single" w:sz="4" w:color="D9D9D9"/>
+              <w:left w:val="single" w:sz="4" w:color="D9D9D9"/>
+              <w:bottom w:val="single" w:sz="4" w:color="D9D9D9"/>
+              <w:right w:val="single" w:sz="4" w:color="D9D9D9"/>
+              <w:insideH w:val="single" w:sz="4" w:color="D9D9D9"/>
+              <w:insideV w:val="single" w:sz="4" w:color="D9D9D9"/>
+            </w:tcBorders>
+            <w:vAlign w:val="center"/>
+          </w:tcPr>
+          <w:p>
+            <w:r>
+              <w:t>Validate correlation, outcome, replay, safety, RBAC, and integration</w:t>
+            </w:r>
+          </w:p>
+        </w:tc>
+      </w:tr>
     </w:tbl>
     <w:p/>
     <w:p>
@@ -6857,7 +7572,7 @@
         <w:pStyle w:val="Heading1"/>
       </w:pPr>
       <w:r>
-        <w:t>15 Risks and Controls</w:t>
+        <w:t>16 Risks and Controls</w:t>
       </w:r>
     </w:p>
     <w:tbl>
@@ -7427,7 +8142,7 @@
           </w:tcPr>
           <w:p>
             <w:r>
-              <w:t>Adapters report recovery evidence in VIII-7</w:t>
+              <w:t>Reports retain recovery evidence</w:t>
             </w:r>
           </w:p>
         </w:tc>
@@ -7548,7 +8263,7 @@
           </w:tcPr>
           <w:p>
             <w:r>
-              <w:t>Isolate native adapters in VIII-7</w:t>
+              <w:t>Require isolated native adapters</w:t>
             </w:r>
           </w:p>
         </w:tc>
@@ -7608,6 +8323,127 @@
           <w:p>
             <w:r>
               <w:t>Track partial and gap totals</w:t>
+            </w:r>
+          </w:p>
+        </w:tc>
+      </w:tr>
+      <w:tr>
+        <w:tc>
+          <w:tcPr>
+            <w:tcW w:type="dxa" w:w="2160"/>
+            <w:tcBorders>
+              <w:top w:val="single" w:sz="4" w:color="D9D9D9"/>
+              <w:left w:val="single" w:sz="4" w:color="D9D9D9"/>
+              <w:bottom w:val="single" w:sz="4" w:color="D9D9D9"/>
+              <w:right w:val="single" w:sz="4" w:color="D9D9D9"/>
+              <w:insideH w:val="single" w:sz="4" w:color="D9D9D9"/>
+              <w:insideV w:val="single" w:sz="4" w:color="D9D9D9"/>
+            </w:tcBorders>
+            <w:shd w:fill="EAF0F7"/>
+            <w:vAlign w:val="center"/>
+          </w:tcPr>
+          <w:p>
+            <w:r>
+              <w:t>Stale cockpit evidence</w:t>
+            </w:r>
+          </w:p>
+        </w:tc>
+        <w:tc>
+          <w:tcPr>
+            <w:tcW w:type="dxa" w:w="3672"/>
+            <w:tcBorders>
+              <w:top w:val="single" w:sz="4" w:color="D9D9D9"/>
+              <w:left w:val="single" w:sz="4" w:color="D9D9D9"/>
+              <w:bottom w:val="single" w:sz="4" w:color="D9D9D9"/>
+              <w:right w:val="single" w:sz="4" w:color="D9D9D9"/>
+              <w:insideH w:val="single" w:sz="4" w:color="D9D9D9"/>
+              <w:insideV w:val="single" w:sz="4" w:color="D9D9D9"/>
+            </w:tcBorders>
+            <w:shd w:fill="EAF0F7"/>
+            <w:vAlign w:val="center"/>
+          </w:tcPr>
+          <w:p>
+            <w:r>
+              <w:t>Match persisted run status and version</w:t>
+            </w:r>
+          </w:p>
+        </w:tc>
+        <w:tc>
+          <w:tcPr>
+            <w:tcW w:type="dxa" w:w="4104"/>
+            <w:tcBorders>
+              <w:top w:val="single" w:sz="4" w:color="D9D9D9"/>
+              <w:left w:val="single" w:sz="4" w:color="D9D9D9"/>
+              <w:bottom w:val="single" w:sz="4" w:color="D9D9D9"/>
+              <w:right w:val="single" w:sz="4" w:color="D9D9D9"/>
+              <w:insideH w:val="single" w:sz="4" w:color="D9D9D9"/>
+              <w:insideV w:val="single" w:sz="4" w:color="D9D9D9"/>
+            </w:tcBorders>
+            <w:shd w:fill="EAF0F7"/>
+            <w:vAlign w:val="center"/>
+          </w:tcPr>
+          <w:p>
+            <w:r>
+              <w:t>Reject inconsistent reports</w:t>
+            </w:r>
+          </w:p>
+        </w:tc>
+      </w:tr>
+      <w:tr>
+        <w:tc>
+          <w:tcPr>
+            <w:tcW w:type="dxa" w:w="2160"/>
+            <w:tcBorders>
+              <w:top w:val="single" w:sz="4" w:color="D9D9D9"/>
+              <w:left w:val="single" w:sz="4" w:color="D9D9D9"/>
+              <w:bottom w:val="single" w:sz="4" w:color="D9D9D9"/>
+              <w:right w:val="single" w:sz="4" w:color="D9D9D9"/>
+              <w:insideH w:val="single" w:sz="4" w:color="D9D9D9"/>
+              <w:insideV w:val="single" w:sz="4" w:color="D9D9D9"/>
+            </w:tcBorders>
+            <w:vAlign w:val="center"/>
+          </w:tcPr>
+          <w:p>
+            <w:r>
+              <w:t>Cross-vehicle correlation</w:t>
+            </w:r>
+          </w:p>
+        </w:tc>
+        <w:tc>
+          <w:tcPr>
+            <w:tcW w:type="dxa" w:w="3672"/>
+            <w:tcBorders>
+              <w:top w:val="single" w:sz="4" w:color="D9D9D9"/>
+              <w:left w:val="single" w:sz="4" w:color="D9D9D9"/>
+              <w:bottom w:val="single" w:sz="4" w:color="D9D9D9"/>
+              <w:right w:val="single" w:sz="4" w:color="D9D9D9"/>
+              <w:insideH w:val="single" w:sz="4" w:color="D9D9D9"/>
+              <w:insideV w:val="single" w:sz="4" w:color="D9D9D9"/>
+            </w:tcBorders>
+            <w:vAlign w:val="center"/>
+          </w:tcPr>
+          <w:p>
+            <w:r>
+              <w:t>Validate every reference before commit</w:t>
+            </w:r>
+          </w:p>
+        </w:tc>
+        <w:tc>
+          <w:tcPr>
+            <w:tcW w:type="dxa" w:w="4104"/>
+            <w:tcBorders>
+              <w:top w:val="single" w:sz="4" w:color="D9D9D9"/>
+              <w:left w:val="single" w:sz="4" w:color="D9D9D9"/>
+              <w:bottom w:val="single" w:sz="4" w:color="D9D9D9"/>
+              <w:right w:val="single" w:sz="4" w:color="D9D9D9"/>
+              <w:insideH w:val="single" w:sz="4" w:color="D9D9D9"/>
+              <w:insideV w:val="single" w:sz="4" w:color="D9D9D9"/>
+            </w:tcBorders>
+            <w:vAlign w:val="center"/>
+          </w:tcPr>
+          <w:p>
+            <w:r>
+              <w:t>Keep one authoritative vehicle context</w:t>
             </w:r>
           </w:p>
         </w:tc>
@@ -7619,12 +8455,12 @@
         <w:pStyle w:val="Heading1"/>
       </w:pPr>
       <w:r>
-        <w:t>16 Study Exercises</w:t>
+        <w:t>17 Study Exercises</w:t>
       </w:r>
     </w:p>
     <w:p>
       <w:r>
-        <w:t>Create one ADAS definition and identify its invariants. Then run two required cases, explain the aggregate result, and compare an exact retry after suite archival with a new run request for the archived suite. Schedule the same suite, archive it, and explain why the stored job can still dispatch reproducibly. Finally, design one battery-temperature fault with recovery verification and explain why the campaign contract must not expose an arbitrary shell or adapter command. Create two mutants, calculate a fifty percent score, and explain why a requirement with a test but no evidence is only partially covered.</w:t>
+        <w:t>Create one ADAS definition and identify its invariants. Then run two required cases, explain the aggregate result, and compare an exact retry after suite archival with a new run request for the archived suite. Schedule the same suite, archive it, and explain why the stored job can still dispatch reproducibly. Finally, design one battery-temperature fault with recovery verification and explain why the campaign contract must not expose an arbitrary shell or adapter command. Create two mutants, calculate a fifty percent score, and explain why a requirement with a test but no evidence is only partially covered. Build a final report and identify which reference would be rejected if it came from another gateway or displayed an older run version.</w:t>
       </w:r>
     </w:p>
     <w:p>
@@ -7632,12 +8468,12 @@
         <w:pStyle w:val="Heading1"/>
       </w:pPr>
       <w:r>
-        <w:t>17 Next Development</w:t>
+        <w:t>18 Volume Completion</w:t>
       </w:r>
     </w:p>
     <w:p>
       <w:r>
-        <w:t>VIII-7 will connect Gateway and CarSystemUI orchestration to the catalog, execution, fault, mutation, and evidence contracts. VIII-4 remains planned near project completion, when stable baselines make performance thresholds and comparable trends meaningful.</w:t>
+        <w:t>The functional Volume VIII baseline is complete. VIII-4 remains planned near project completion, when stable baselines make performance thresholds and comparable trends meaningful without unnecessary CPU or GPU use during active architecture changes.</w:t>
       </w:r>
     </w:p>
     <w:sectPr>

</xml_diff>

<commit_message>
feat(test-framework): add performance stress evidence
</commit_message>
<xml_diff>
--- a/docs/ATEP_Volume_VIII_Test_Framework_Engineering_Workbook.docx
+++ b/docs/ATEP_Volume_VIII_Test_Framework_Engineering_Workbook.docx
@@ -19,12 +19,12 @@
         <w:rPr>
           <w:b/>
         </w:rPr>
-        <w:t>Version 0.6.0   Functional Volume VIII Baseline Complete</w:t>
+        <w:t>Version 0.7.0   Complete Volume VIII Baseline</w:t>
       </w:r>
     </w:p>
     <w:p>
       <w:r>
-        <w:t>This workbook records the catalog, execution-binding, scheduled-selection, and bounded fault-campaign and mutation-quality baseline for ATEP. Reusable definitions describe test intent, suites preserve reviewed composition, and catalog-backed runs now persist deterministic case results and aggregate outcomes.</w:t>
+        <w:t>This workbook records the catalog, execution-binding, scheduled-selection, bounded performance evidence, fault-campaign, and mutation-quality baseline for ATEP. Reusable definitions describe test intent, suites preserve reviewed composition, and catalog-backed runs now persist deterministic case results and aggregate outcomes.</w:t>
       </w:r>
     </w:p>
     <w:tbl>
@@ -125,7 +125,7 @@
           </w:tcPr>
           <w:p>
             <w:r>
-              <w:t>Functional VIII-1, VIII-2, VIII-3, VIII-5, VIII-6, and VIII-7 complete</w:t>
+              <w:t>VIII-1 through VIII-7 complete</w:t>
             </w:r>
           </w:p>
         </w:tc>
@@ -289,7 +289,7 @@
           </w:tcPr>
           <w:p>
             <w:r>
-              <w:t>VIII-4 performance and stress near project completion</w:t>
+              <w:t>Volume IX AI Test Engineer increments</w:t>
             </w:r>
           </w:p>
         </w:tc>
@@ -306,7 +306,7 @@
     </w:p>
     <w:p>
       <w:r>
-        <w:t>VIII-1 separates reusable test design from test execution. A definition captures one test's preconditions, actions, inputs, expectations, classification, and resource budget. A suite selects active definitions in an explicit order and freezes their versions. VIII-2 binds that snapshot to a run and records each case outcome. VIII-3 schedules that immutable intent for later smoke, sanity, or regression execution. VIII-5 adds cross-domain fault campaigns with recovery plans and evidence. VIII-6 adds bounded mutation scoring and explicit requirement coverage gaps.</w:t>
+        <w:t>VIII-1 separates reusable test design from test execution. A definition captures one test's preconditions, actions, inputs, expectations, classification, and resource budget. A suite selects active definitions in an explicit order and freezes their versions. VIII-2 binds that snapshot to a run and records each case outcome. VIII-3 schedules that immutable intent for later smoke, sanity, or regression execution. VIII-4 adds bounded performance and stress evidence with historical comparison. VIII-5 adds cross-domain fault campaigns with recovery plans and evidence. VIII-6 adds bounded mutation scoring and explicit requirement coverage gaps.</w:t>
       </w:r>
     </w:p>
     <w:p>
@@ -330,7 +330,7 @@
         <w:pStyle w:val="ListBullet"/>
       </w:pPr>
       <w:r>
-        <w:t>Performance and stress remain planned but are deferred until near completion; the functional Volume VIII baseline is complete.</w:t>
+        <w:t>Performance and stress now use bounded profiles, deterministic thresholds, and comparable evidence; the complete Volume VIII baseline is implemented.</w:t>
       </w:r>
     </w:p>
     <w:p>
@@ -568,7 +568,7 @@
           </w:tcPr>
           <w:p>
             <w:r>
-              <w:t>Linear migrations 0051 through 0056 with reversible schema changes</w:t>
+              <w:t>Linear migrations 0051 through 0058 with reversible schema changes</w:t>
             </w:r>
           </w:p>
         </w:tc>
@@ -651,6 +651,46 @@
           <w:p>
             <w:r>
               <w:t>Snapshots bounded injection and recovery intent without arbitrary commands</w:t>
+            </w:r>
+          </w:p>
+        </w:tc>
+      </w:tr>
+      <w:tr>
+        <w:tc>
+          <w:tcPr>
+            <w:tcW w:type="dxa" w:w="2232"/>
+            <w:tcBorders>
+              <w:top w:val="single" w:sz="4" w:color="D9D9D9"/>
+              <w:left w:val="single" w:sz="4" w:color="D9D9D9"/>
+              <w:bottom w:val="single" w:sz="4" w:color="D9D9D9"/>
+              <w:right w:val="single" w:sz="4" w:color="D9D9D9"/>
+              <w:insideH w:val="single" w:sz="4" w:color="D9D9D9"/>
+              <w:insideV w:val="single" w:sz="4" w:color="D9D9D9"/>
+            </w:tcBorders>
+            <w:vAlign w:val="center"/>
+          </w:tcPr>
+          <w:p>
+            <w:r>
+              <w:t>Performance evidence</w:t>
+            </w:r>
+          </w:p>
+        </w:tc>
+        <w:tc>
+          <w:tcPr>
+            <w:tcW w:type="dxa" w:w="7704"/>
+            <w:tcBorders>
+              <w:top w:val="single" w:sz="4" w:color="D9D9D9"/>
+              <w:left w:val="single" w:sz="4" w:color="D9D9D9"/>
+              <w:bottom w:val="single" w:sz="4" w:color="D9D9D9"/>
+              <w:right w:val="single" w:sz="4" w:color="D9D9D9"/>
+              <w:insideH w:val="single" w:sz="4" w:color="D9D9D9"/>
+              <w:insideV w:val="single" w:sz="4" w:color="D9D9D9"/>
+            </w:tcBorders>
+            <w:vAlign w:val="center"/>
+          </w:tcPr>
+          <w:p>
+            <w:r>
+              <w:t>Stores bounded profiles, deterministic thresholds, and historical comparisons</w:t>
             </w:r>
           </w:p>
         </w:tc>
@@ -3354,7 +3394,478 @@
         <w:pStyle w:val="Heading1"/>
       </w:pPr>
       <w:r>
-        <w:t>10 Fault Campaigns</w:t>
+        <w:t>10 Performance and Stress</w:t>
+      </w:r>
+    </w:p>
+    <w:p>
+      <w:r>
+        <w:t>VIII-4 stores bounded workload profiles and immutable measured evidence without running a load generator in FastAPI. Every execution links to a terminal test run and passes only when all configured minimum and maximum thresholds pass.</w:t>
+      </w:r>
+    </w:p>
+    <w:tbl>
+      <w:tblPr>
+        <w:tblW w:type="auto" w:w="0"/>
+        <w:tblLayout w:type="fixed"/>
+        <w:tblLook w:firstColumn="1" w:firstRow="1" w:lastColumn="0" w:lastRow="0" w:noHBand="0" w:noVBand="1" w:val="04A0"/>
+      </w:tblPr>
+      <w:tblGrid>
+        <w:gridCol w:w="3312"/>
+        <w:gridCol w:w="3312"/>
+        <w:gridCol w:w="3312"/>
+      </w:tblGrid>
+      <w:tr>
+        <w:trPr>
+          <w:tblHeader/>
+        </w:trPr>
+        <w:tc>
+          <w:tcPr>
+            <w:tcW w:type="dxa" w:w="2304"/>
+            <w:shd w:fill="17365D"/>
+            <w:tcBorders>
+              <w:top w:val="single" w:sz="4" w:color="D9D9D9"/>
+              <w:left w:val="single" w:sz="4" w:color="D9D9D9"/>
+              <w:bottom w:val="single" w:sz="4" w:color="D9D9D9"/>
+              <w:right w:val="single" w:sz="4" w:color="D9D9D9"/>
+              <w:insideH w:val="single" w:sz="4" w:color="D9D9D9"/>
+              <w:insideV w:val="single" w:sz="4" w:color="D9D9D9"/>
+            </w:tcBorders>
+            <w:vAlign w:val="center"/>
+          </w:tcPr>
+          <w:p>
+            <w:r>
+              <w:rPr>
+                <w:b/>
+                <w:color w:val="FFFFFF"/>
+              </w:rPr>
+              <w:t>Control</w:t>
+            </w:r>
+          </w:p>
+        </w:tc>
+        <w:tc>
+          <w:tcPr>
+            <w:tcW w:type="dxa" w:w="2880"/>
+            <w:shd w:fill="17365D"/>
+            <w:tcBorders>
+              <w:top w:val="single" w:sz="4" w:color="D9D9D9"/>
+              <w:left w:val="single" w:sz="4" w:color="D9D9D9"/>
+              <w:bottom w:val="single" w:sz="4" w:color="D9D9D9"/>
+              <w:right w:val="single" w:sz="4" w:color="D9D9D9"/>
+              <w:insideH w:val="single" w:sz="4" w:color="D9D9D9"/>
+              <w:insideV w:val="single" w:sz="4" w:color="D9D9D9"/>
+            </w:tcBorders>
+            <w:vAlign w:val="center"/>
+          </w:tcPr>
+          <w:p>
+            <w:r>
+              <w:rPr>
+                <w:b/>
+                <w:color w:val="FFFFFF"/>
+              </w:rPr>
+              <w:t>Bound</w:t>
+            </w:r>
+          </w:p>
+        </w:tc>
+        <w:tc>
+          <w:tcPr>
+            <w:tcW w:type="dxa" w:w="4752"/>
+            <w:shd w:fill="17365D"/>
+            <w:tcBorders>
+              <w:top w:val="single" w:sz="4" w:color="D9D9D9"/>
+              <w:left w:val="single" w:sz="4" w:color="D9D9D9"/>
+              <w:bottom w:val="single" w:sz="4" w:color="D9D9D9"/>
+              <w:right w:val="single" w:sz="4" w:color="D9D9D9"/>
+              <w:insideH w:val="single" w:sz="4" w:color="D9D9D9"/>
+              <w:insideV w:val="single" w:sz="4" w:color="D9D9D9"/>
+            </w:tcBorders>
+            <w:vAlign w:val="center"/>
+          </w:tcPr>
+          <w:p>
+            <w:r>
+              <w:rPr>
+                <w:b/>
+                <w:color w:val="FFFFFF"/>
+              </w:rPr>
+              <w:t>Purpose</w:t>
+            </w:r>
+          </w:p>
+        </w:tc>
+      </w:tr>
+      <w:tr>
+        <w:tc>
+          <w:tcPr>
+            <w:tcW w:type="dxa" w:w="2304"/>
+            <w:tcBorders>
+              <w:top w:val="single" w:sz="4" w:color="D9D9D9"/>
+              <w:left w:val="single" w:sz="4" w:color="D9D9D9"/>
+              <w:bottom w:val="single" w:sz="4" w:color="D9D9D9"/>
+              <w:right w:val="single" w:sz="4" w:color="D9D9D9"/>
+              <w:insideH w:val="single" w:sz="4" w:color="D9D9D9"/>
+              <w:insideV w:val="single" w:sz="4" w:color="D9D9D9"/>
+            </w:tcBorders>
+            <w:vAlign w:val="center"/>
+          </w:tcPr>
+          <w:p>
+            <w:r>
+              <w:t>Duration</w:t>
+            </w:r>
+          </w:p>
+        </w:tc>
+        <w:tc>
+          <w:tcPr>
+            <w:tcW w:type="dxa" w:w="2880"/>
+            <w:tcBorders>
+              <w:top w:val="single" w:sz="4" w:color="D9D9D9"/>
+              <w:left w:val="single" w:sz="4" w:color="D9D9D9"/>
+              <w:bottom w:val="single" w:sz="4" w:color="D9D9D9"/>
+              <w:right w:val="single" w:sz="4" w:color="D9D9D9"/>
+              <w:insideH w:val="single" w:sz="4" w:color="D9D9D9"/>
+              <w:insideV w:val="single" w:sz="4" w:color="D9D9D9"/>
+            </w:tcBorders>
+            <w:vAlign w:val="center"/>
+          </w:tcPr>
+          <w:p>
+            <w:r>
+              <w:t>3600 seconds total</w:t>
+            </w:r>
+          </w:p>
+        </w:tc>
+        <w:tc>
+          <w:tcPr>
+            <w:tcW w:type="dxa" w:w="4752"/>
+            <w:tcBorders>
+              <w:top w:val="single" w:sz="4" w:color="D9D9D9"/>
+              <w:left w:val="single" w:sz="4" w:color="D9D9D9"/>
+              <w:bottom w:val="single" w:sz="4" w:color="D9D9D9"/>
+              <w:right w:val="single" w:sz="4" w:color="D9D9D9"/>
+              <w:insideH w:val="single" w:sz="4" w:color="D9D9D9"/>
+              <w:insideV w:val="single" w:sz="4" w:color="D9D9D9"/>
+            </w:tcBorders>
+            <w:vAlign w:val="center"/>
+          </w:tcPr>
+          <w:p>
+            <w:r>
+              <w:t>Bound execution exposure</w:t>
+            </w:r>
+          </w:p>
+        </w:tc>
+      </w:tr>
+      <w:tr>
+        <w:tc>
+          <w:tcPr>
+            <w:tcW w:type="dxa" w:w="2304"/>
+            <w:tcBorders>
+              <w:top w:val="single" w:sz="4" w:color="D9D9D9"/>
+              <w:left w:val="single" w:sz="4" w:color="D9D9D9"/>
+              <w:bottom w:val="single" w:sz="4" w:color="D9D9D9"/>
+              <w:right w:val="single" w:sz="4" w:color="D9D9D9"/>
+              <w:insideH w:val="single" w:sz="4" w:color="D9D9D9"/>
+              <w:insideV w:val="single" w:sz="4" w:color="D9D9D9"/>
+            </w:tcBorders>
+            <w:shd w:fill="EAF0F7"/>
+            <w:vAlign w:val="center"/>
+          </w:tcPr>
+          <w:p>
+            <w:r>
+              <w:t>Virtual users</w:t>
+            </w:r>
+          </w:p>
+        </w:tc>
+        <w:tc>
+          <w:tcPr>
+            <w:tcW w:type="dxa" w:w="2880"/>
+            <w:tcBorders>
+              <w:top w:val="single" w:sz="4" w:color="D9D9D9"/>
+              <w:left w:val="single" w:sz="4" w:color="D9D9D9"/>
+              <w:bottom w:val="single" w:sz="4" w:color="D9D9D9"/>
+              <w:right w:val="single" w:sz="4" w:color="D9D9D9"/>
+              <w:insideH w:val="single" w:sz="4" w:color="D9D9D9"/>
+              <w:insideV w:val="single" w:sz="4" w:color="D9D9D9"/>
+            </w:tcBorders>
+            <w:shd w:fill="EAF0F7"/>
+            <w:vAlign w:val="center"/>
+          </w:tcPr>
+          <w:p>
+            <w:r>
+              <w:t>500 per stage</w:t>
+            </w:r>
+          </w:p>
+        </w:tc>
+        <w:tc>
+          <w:tcPr>
+            <w:tcW w:type="dxa" w:w="4752"/>
+            <w:tcBorders>
+              <w:top w:val="single" w:sz="4" w:color="D9D9D9"/>
+              <w:left w:val="single" w:sz="4" w:color="D9D9D9"/>
+              <w:bottom w:val="single" w:sz="4" w:color="D9D9D9"/>
+              <w:right w:val="single" w:sz="4" w:color="D9D9D9"/>
+              <w:insideH w:val="single" w:sz="4" w:color="D9D9D9"/>
+              <w:insideV w:val="single" w:sz="4" w:color="D9D9D9"/>
+            </w:tcBorders>
+            <w:shd w:fill="EAF0F7"/>
+            <w:vAlign w:val="center"/>
+          </w:tcPr>
+          <w:p>
+            <w:r>
+              <w:t>Prevent unsafe concurrency</w:t>
+            </w:r>
+          </w:p>
+        </w:tc>
+      </w:tr>
+      <w:tr>
+        <w:tc>
+          <w:tcPr>
+            <w:tcW w:type="dxa" w:w="2304"/>
+            <w:tcBorders>
+              <w:top w:val="single" w:sz="4" w:color="D9D9D9"/>
+              <w:left w:val="single" w:sz="4" w:color="D9D9D9"/>
+              <w:bottom w:val="single" w:sz="4" w:color="D9D9D9"/>
+              <w:right w:val="single" w:sz="4" w:color="D9D9D9"/>
+              <w:insideH w:val="single" w:sz="4" w:color="D9D9D9"/>
+              <w:insideV w:val="single" w:sz="4" w:color="D9D9D9"/>
+            </w:tcBorders>
+            <w:vAlign w:val="center"/>
+          </w:tcPr>
+          <w:p>
+            <w:r>
+              <w:t>Request rate</w:t>
+            </w:r>
+          </w:p>
+        </w:tc>
+        <w:tc>
+          <w:tcPr>
+            <w:tcW w:type="dxa" w:w="2880"/>
+            <w:tcBorders>
+              <w:top w:val="single" w:sz="4" w:color="D9D9D9"/>
+              <w:left w:val="single" w:sz="4" w:color="D9D9D9"/>
+              <w:bottom w:val="single" w:sz="4" w:color="D9D9D9"/>
+              <w:right w:val="single" w:sz="4" w:color="D9D9D9"/>
+              <w:insideH w:val="single" w:sz="4" w:color="D9D9D9"/>
+              <w:insideV w:val="single" w:sz="4" w:color="D9D9D9"/>
+            </w:tcBorders>
+            <w:vAlign w:val="center"/>
+          </w:tcPr>
+          <w:p>
+            <w:r>
+              <w:t>1000 per second</w:t>
+            </w:r>
+          </w:p>
+        </w:tc>
+        <w:tc>
+          <w:tcPr>
+            <w:tcW w:type="dxa" w:w="4752"/>
+            <w:tcBorders>
+              <w:top w:val="single" w:sz="4" w:color="D9D9D9"/>
+              <w:left w:val="single" w:sz="4" w:color="D9D9D9"/>
+              <w:bottom w:val="single" w:sz="4" w:color="D9D9D9"/>
+              <w:right w:val="single" w:sz="4" w:color="D9D9D9"/>
+              <w:insideH w:val="single" w:sz="4" w:color="D9D9D9"/>
+              <w:insideV w:val="single" w:sz="4" w:color="D9D9D9"/>
+            </w:tcBorders>
+            <w:vAlign w:val="center"/>
+          </w:tcPr>
+          <w:p>
+            <w:r>
+              <w:t>Protect shared services</w:t>
+            </w:r>
+          </w:p>
+        </w:tc>
+      </w:tr>
+      <w:tr>
+        <w:tc>
+          <w:tcPr>
+            <w:tcW w:type="dxa" w:w="2304"/>
+            <w:tcBorders>
+              <w:top w:val="single" w:sz="4" w:color="D9D9D9"/>
+              <w:left w:val="single" w:sz="4" w:color="D9D9D9"/>
+              <w:bottom w:val="single" w:sz="4" w:color="D9D9D9"/>
+              <w:right w:val="single" w:sz="4" w:color="D9D9D9"/>
+              <w:insideH w:val="single" w:sz="4" w:color="D9D9D9"/>
+              <w:insideV w:val="single" w:sz="4" w:color="D9D9D9"/>
+            </w:tcBorders>
+            <w:shd w:fill="EAF0F7"/>
+            <w:vAlign w:val="center"/>
+          </w:tcPr>
+          <w:p>
+            <w:r>
+              <w:t>CPU and memory</w:t>
+            </w:r>
+          </w:p>
+        </w:tc>
+        <w:tc>
+          <w:tcPr>
+            <w:tcW w:type="dxa" w:w="2880"/>
+            <w:tcBorders>
+              <w:top w:val="single" w:sz="4" w:color="D9D9D9"/>
+              <w:left w:val="single" w:sz="4" w:color="D9D9D9"/>
+              <w:bottom w:val="single" w:sz="4" w:color="D9D9D9"/>
+              <w:right w:val="single" w:sz="4" w:color="D9D9D9"/>
+              <w:insideH w:val="single" w:sz="4" w:color="D9D9D9"/>
+              <w:insideV w:val="single" w:sz="4" w:color="D9D9D9"/>
+            </w:tcBorders>
+            <w:shd w:fill="EAF0F7"/>
+            <w:vAlign w:val="center"/>
+          </w:tcPr>
+          <w:p>
+            <w:r>
+              <w:t>4 cores and 4096 MB</w:t>
+            </w:r>
+          </w:p>
+        </w:tc>
+        <w:tc>
+          <w:tcPr>
+            <w:tcW w:type="dxa" w:w="4752"/>
+            <w:tcBorders>
+              <w:top w:val="single" w:sz="4" w:color="D9D9D9"/>
+              <w:left w:val="single" w:sz="4" w:color="D9D9D9"/>
+              <w:bottom w:val="single" w:sz="4" w:color="D9D9D9"/>
+              <w:right w:val="single" w:sz="4" w:color="D9D9D9"/>
+              <w:insideH w:val="single" w:sz="4" w:color="D9D9D9"/>
+              <w:insideV w:val="single" w:sz="4" w:color="D9D9D9"/>
+            </w:tcBorders>
+            <w:shd w:fill="EAF0F7"/>
+            <w:vAlign w:val="center"/>
+          </w:tcPr>
+          <w:p>
+            <w:r>
+              <w:t>Keep resource budgets explicit</w:t>
+            </w:r>
+          </w:p>
+        </w:tc>
+      </w:tr>
+      <w:tr>
+        <w:tc>
+          <w:tcPr>
+            <w:tcW w:type="dxa" w:w="2304"/>
+            <w:tcBorders>
+              <w:top w:val="single" w:sz="4" w:color="D9D9D9"/>
+              <w:left w:val="single" w:sz="4" w:color="D9D9D9"/>
+              <w:bottom w:val="single" w:sz="4" w:color="D9D9D9"/>
+              <w:right w:val="single" w:sz="4" w:color="D9D9D9"/>
+              <w:insideH w:val="single" w:sz="4" w:color="D9D9D9"/>
+              <w:insideV w:val="single" w:sz="4" w:color="D9D9D9"/>
+            </w:tcBorders>
+            <w:vAlign w:val="center"/>
+          </w:tcPr>
+          <w:p>
+            <w:r>
+              <w:t>GPU</w:t>
+            </w:r>
+          </w:p>
+        </w:tc>
+        <w:tc>
+          <w:tcPr>
+            <w:tcW w:type="dxa" w:w="2880"/>
+            <w:tcBorders>
+              <w:top w:val="single" w:sz="4" w:color="D9D9D9"/>
+              <w:left w:val="single" w:sz="4" w:color="D9D9D9"/>
+              <w:bottom w:val="single" w:sz="4" w:color="D9D9D9"/>
+              <w:right w:val="single" w:sz="4" w:color="D9D9D9"/>
+              <w:insideH w:val="single" w:sz="4" w:color="D9D9D9"/>
+              <w:insideV w:val="single" w:sz="4" w:color="D9D9D9"/>
+            </w:tcBorders>
+            <w:vAlign w:val="center"/>
+          </w:tcPr>
+          <w:p>
+            <w:r>
+              <w:t>Always disabled</w:t>
+            </w:r>
+          </w:p>
+        </w:tc>
+        <w:tc>
+          <w:tcPr>
+            <w:tcW w:type="dxa" w:w="4752"/>
+            <w:tcBorders>
+              <w:top w:val="single" w:sz="4" w:color="D9D9D9"/>
+              <w:left w:val="single" w:sz="4" w:color="D9D9D9"/>
+              <w:bottom w:val="single" w:sz="4" w:color="D9D9D9"/>
+              <w:right w:val="single" w:sz="4" w:color="D9D9D9"/>
+              <w:insideH w:val="single" w:sz="4" w:color="D9D9D9"/>
+              <w:insideV w:val="single" w:sz="4" w:color="D9D9D9"/>
+            </w:tcBorders>
+            <w:vAlign w:val="center"/>
+          </w:tcPr>
+          <w:p>
+            <w:r>
+              <w:t>Protect workstation resources</w:t>
+            </w:r>
+          </w:p>
+        </w:tc>
+      </w:tr>
+      <w:tr>
+        <w:tc>
+          <w:tcPr>
+            <w:tcW w:type="dxa" w:w="2304"/>
+            <w:tcBorders>
+              <w:top w:val="single" w:sz="4" w:color="D9D9D9"/>
+              <w:left w:val="single" w:sz="4" w:color="D9D9D9"/>
+              <w:bottom w:val="single" w:sz="4" w:color="D9D9D9"/>
+              <w:right w:val="single" w:sz="4" w:color="D9D9D9"/>
+              <w:insideH w:val="single" w:sz="4" w:color="D9D9D9"/>
+              <w:insideV w:val="single" w:sz="4" w:color="D9D9D9"/>
+            </w:tcBorders>
+            <w:shd w:fill="EAF0F7"/>
+            <w:vAlign w:val="center"/>
+          </w:tcPr>
+          <w:p>
+            <w:r>
+              <w:t>Baseline</w:t>
+            </w:r>
+          </w:p>
+        </w:tc>
+        <w:tc>
+          <w:tcPr>
+            <w:tcW w:type="dxa" w:w="2880"/>
+            <w:tcBorders>
+              <w:top w:val="single" w:sz="4" w:color="D9D9D9"/>
+              <w:left w:val="single" w:sz="4" w:color="D9D9D9"/>
+              <w:bottom w:val="single" w:sz="4" w:color="D9D9D9"/>
+              <w:right w:val="single" w:sz="4" w:color="D9D9D9"/>
+              <w:insideH w:val="single" w:sz="4" w:color="D9D9D9"/>
+              <w:insideV w:val="single" w:sz="4" w:color="D9D9D9"/>
+            </w:tcBorders>
+            <w:shd w:fill="EAF0F7"/>
+            <w:vAlign w:val="center"/>
+          </w:tcPr>
+          <w:p>
+            <w:r>
+              <w:t>Same profile only</w:t>
+            </w:r>
+          </w:p>
+        </w:tc>
+        <w:tc>
+          <w:tcPr>
+            <w:tcW w:type="dxa" w:w="4752"/>
+            <w:tcBorders>
+              <w:top w:val="single" w:sz="4" w:color="D9D9D9"/>
+              <w:left w:val="single" w:sz="4" w:color="D9D9D9"/>
+              <w:bottom w:val="single" w:sz="4" w:color="D9D9D9"/>
+              <w:right w:val="single" w:sz="4" w:color="D9D9D9"/>
+              <w:insideH w:val="single" w:sz="4" w:color="D9D9D9"/>
+              <w:insideV w:val="single" w:sz="4" w:color="D9D9D9"/>
+            </w:tcBorders>
+            <w:shd w:fill="EAF0F7"/>
+            <w:vAlign w:val="center"/>
+          </w:tcPr>
+          <w:p>
+            <w:r>
+              <w:t>Make trends comparable</w:t>
+            </w:r>
+          </w:p>
+        </w:tc>
+      </w:tr>
+    </w:tbl>
+    <w:p/>
+    <w:p>
+      <w:r>
+        <w:br w:type="page"/>
+      </w:r>
+    </w:p>
+    <w:p>
+      <w:pPr>
+        <w:pStyle w:val="Heading1"/>
+      </w:pPr>
+      <w:r>
+        <w:t>11 Fault Campaigns</w:t>
       </w:r>
     </w:p>
     <w:p>
@@ -3830,7 +4341,7 @@
         <w:pStyle w:val="Heading1"/>
       </w:pPr>
       <w:r>
-        <w:t>11 Mutation Testing and Coverage</w:t>
+        <w:t>12 Mutation Testing and Coverage</w:t>
       </w:r>
     </w:p>
     <w:p>
@@ -4306,7 +4817,7 @@
         <w:pStyle w:val="Heading1"/>
       </w:pPr>
       <w:r>
-        <w:t>12 Cross Platform Automation Reporting</w:t>
+        <w:t>13 Cross Platform Automation Reporting</w:t>
       </w:r>
     </w:p>
     <w:p>
@@ -4782,7 +5293,7 @@
         <w:pStyle w:val="Heading1"/>
       </w:pPr>
       <w:r>
-        <w:t>13 Events and Audit</w:t>
+        <w:t>14 Events and Audit</w:t>
       </w:r>
     </w:p>
     <w:tbl>
@@ -5837,6 +6348,127 @@
           <w:p>
             <w:r>
               <w:t>requirement_coverage.updated</w:t>
+            </w:r>
+          </w:p>
+        </w:tc>
+      </w:tr>
+      <w:tr>
+        <w:tc>
+          <w:tcPr>
+            <w:tcW w:type="dxa" w:w="2376"/>
+            <w:tcBorders>
+              <w:top w:val="single" w:sz="4" w:color="D9D9D9"/>
+              <w:left w:val="single" w:sz="4" w:color="D9D9D9"/>
+              <w:bottom w:val="single" w:sz="4" w:color="D9D9D9"/>
+              <w:right w:val="single" w:sz="4" w:color="D9D9D9"/>
+              <w:insideH w:val="single" w:sz="4" w:color="D9D9D9"/>
+              <w:insideV w:val="single" w:sz="4" w:color="D9D9D9"/>
+            </w:tcBorders>
+            <w:vAlign w:val="center"/>
+          </w:tcPr>
+          <w:p>
+            <w:r>
+              <w:t>Create performance profile</w:t>
+            </w:r>
+          </w:p>
+        </w:tc>
+        <w:tc>
+          <w:tcPr>
+            <w:tcW w:type="dxa" w:w="4536"/>
+            <w:tcBorders>
+              <w:top w:val="single" w:sz="4" w:color="D9D9D9"/>
+              <w:left w:val="single" w:sz="4" w:color="D9D9D9"/>
+              <w:bottom w:val="single" w:sz="4" w:color="D9D9D9"/>
+              <w:right w:val="single" w:sz="4" w:color="D9D9D9"/>
+              <w:insideH w:val="single" w:sz="4" w:color="D9D9D9"/>
+              <w:insideV w:val="single" w:sz="4" w:color="D9D9D9"/>
+            </w:tcBorders>
+            <w:vAlign w:val="center"/>
+          </w:tcPr>
+          <w:p>
+            <w:r>
+              <w:t>atep.performance.profile.created.v1</w:t>
+            </w:r>
+          </w:p>
+        </w:tc>
+        <w:tc>
+          <w:tcPr>
+            <w:tcW w:type="dxa" w:w="3024"/>
+            <w:tcBorders>
+              <w:top w:val="single" w:sz="4" w:color="D9D9D9"/>
+              <w:left w:val="single" w:sz="4" w:color="D9D9D9"/>
+              <w:bottom w:val="single" w:sz="4" w:color="D9D9D9"/>
+              <w:right w:val="single" w:sz="4" w:color="D9D9D9"/>
+              <w:insideH w:val="single" w:sz="4" w:color="D9D9D9"/>
+              <w:insideV w:val="single" w:sz="4" w:color="D9D9D9"/>
+            </w:tcBorders>
+            <w:vAlign w:val="center"/>
+          </w:tcPr>
+          <w:p>
+            <w:r>
+              <w:t>performance.profile_created</w:t>
+            </w:r>
+          </w:p>
+        </w:tc>
+      </w:tr>
+      <w:tr>
+        <w:tc>
+          <w:tcPr>
+            <w:tcW w:type="dxa" w:w="2376"/>
+            <w:tcBorders>
+              <w:top w:val="single" w:sz="4" w:color="D9D9D9"/>
+              <w:left w:val="single" w:sz="4" w:color="D9D9D9"/>
+              <w:bottom w:val="single" w:sz="4" w:color="D9D9D9"/>
+              <w:right w:val="single" w:sz="4" w:color="D9D9D9"/>
+              <w:insideH w:val="single" w:sz="4" w:color="D9D9D9"/>
+              <w:insideV w:val="single" w:sz="4" w:color="D9D9D9"/>
+            </w:tcBorders>
+            <w:shd w:fill="EAF0F7"/>
+            <w:vAlign w:val="center"/>
+          </w:tcPr>
+          <w:p>
+            <w:r>
+              <w:t>Record performance execution</w:t>
+            </w:r>
+          </w:p>
+        </w:tc>
+        <w:tc>
+          <w:tcPr>
+            <w:tcW w:type="dxa" w:w="4536"/>
+            <w:tcBorders>
+              <w:top w:val="single" w:sz="4" w:color="D9D9D9"/>
+              <w:left w:val="single" w:sz="4" w:color="D9D9D9"/>
+              <w:bottom w:val="single" w:sz="4" w:color="D9D9D9"/>
+              <w:right w:val="single" w:sz="4" w:color="D9D9D9"/>
+              <w:insideH w:val="single" w:sz="4" w:color="D9D9D9"/>
+              <w:insideV w:val="single" w:sz="4" w:color="D9D9D9"/>
+            </w:tcBorders>
+            <w:shd w:fill="EAF0F7"/>
+            <w:vAlign w:val="center"/>
+          </w:tcPr>
+          <w:p>
+            <w:r>
+              <w:t>atep.performance.execution.recorded.v1</w:t>
+            </w:r>
+          </w:p>
+        </w:tc>
+        <w:tc>
+          <w:tcPr>
+            <w:tcW w:type="dxa" w:w="3024"/>
+            <w:tcBorders>
+              <w:top w:val="single" w:sz="4" w:color="D9D9D9"/>
+              <w:left w:val="single" w:sz="4" w:color="D9D9D9"/>
+              <w:bottom w:val="single" w:sz="4" w:color="D9D9D9"/>
+              <w:right w:val="single" w:sz="4" w:color="D9D9D9"/>
+              <w:insideH w:val="single" w:sz="4" w:color="D9D9D9"/>
+              <w:insideV w:val="single" w:sz="4" w:color="D9D9D9"/>
+            </w:tcBorders>
+            <w:shd w:fill="EAF0F7"/>
+            <w:vAlign w:val="center"/>
+          </w:tcPr>
+          <w:p>
+            <w:r>
+              <w:t>performance.execution_recorded</w:t>
             </w:r>
           </w:p>
         </w:tc>
@@ -5917,7 +6549,7 @@
         <w:pStyle w:val="Heading1"/>
       </w:pPr>
       <w:r>
-        <w:t>14 Engineering Decisions</w:t>
+        <w:t>15 Engineering Decisions</w:t>
       </w:r>
     </w:p>
     <w:tbl>
@@ -6805,7 +7437,7 @@
         <w:pStyle w:val="Heading1"/>
       </w:pPr>
       <w:r>
-        <w:t>15 Verification Catalogue</w:t>
+        <w:t>16 Verification Catalogue</w:t>
       </w:r>
     </w:p>
     <w:tbl>
@@ -7560,6 +8192,68 @@
           </w:p>
         </w:tc>
       </w:tr>
+      <w:tr>
+        <w:tc>
+          <w:tcPr>
+            <w:tcW w:type="dxa" w:w="2232"/>
+            <w:tcBorders>
+              <w:top w:val="single" w:sz="4" w:color="D9D9D9"/>
+              <w:left w:val="single" w:sz="4" w:color="D9D9D9"/>
+              <w:bottom w:val="single" w:sz="4" w:color="D9D9D9"/>
+              <w:right w:val="single" w:sz="4" w:color="D9D9D9"/>
+              <w:insideH w:val="single" w:sz="4" w:color="D9D9D9"/>
+              <w:insideV w:val="single" w:sz="4" w:color="D9D9D9"/>
+            </w:tcBorders>
+            <w:shd w:fill="EAF0F7"/>
+            <w:vAlign w:val="center"/>
+          </w:tcPr>
+          <w:p>
+            <w:r>
+              <w:t>TF-T-069 to 073</w:t>
+            </w:r>
+          </w:p>
+        </w:tc>
+        <w:tc>
+          <w:tcPr>
+            <w:tcW w:type="dxa" w:w="3528"/>
+            <w:tcBorders>
+              <w:top w:val="single" w:sz="4" w:color="D9D9D9"/>
+              <w:left w:val="single" w:sz="4" w:color="D9D9D9"/>
+              <w:bottom w:val="single" w:sz="4" w:color="D9D9D9"/>
+              <w:right w:val="single" w:sz="4" w:color="D9D9D9"/>
+              <w:insideH w:val="single" w:sz="4" w:color="D9D9D9"/>
+              <w:insideV w:val="single" w:sz="4" w:color="D9D9D9"/>
+            </w:tcBorders>
+            <w:shd w:fill="EAF0F7"/>
+            <w:vAlign w:val="center"/>
+          </w:tcPr>
+          <w:p>
+            <w:r>
+              <w:t>Performance and stress</w:t>
+            </w:r>
+          </w:p>
+        </w:tc>
+        <w:tc>
+          <w:tcPr>
+            <w:tcW w:type="dxa" w:w="4176"/>
+            <w:tcBorders>
+              <w:top w:val="single" w:sz="4" w:color="D9D9D9"/>
+              <w:left w:val="single" w:sz="4" w:color="D9D9D9"/>
+              <w:bottom w:val="single" w:sz="4" w:color="D9D9D9"/>
+              <w:right w:val="single" w:sz="4" w:color="D9D9D9"/>
+              <w:insideH w:val="single" w:sz="4" w:color="D9D9D9"/>
+              <w:insideV w:val="single" w:sz="4" w:color="D9D9D9"/>
+            </w:tcBorders>
+            <w:shd w:fill="EAF0F7"/>
+            <w:vAlign w:val="center"/>
+          </w:tcPr>
+          <w:p>
+            <w:r>
+              <w:t>Validate resource bounds, thresholds, baselines, evidence, and migration</w:t>
+            </w:r>
+          </w:p>
+        </w:tc>
+      </w:tr>
     </w:tbl>
     <w:p/>
     <w:p>
@@ -7572,7 +8266,7 @@
         <w:pStyle w:val="Heading1"/>
       </w:pPr>
       <w:r>
-        <w:t>16 Risks and Controls</w:t>
+        <w:t>17 Risks and Controls</w:t>
       </w:r>
     </w:p>
     <w:tbl>
@@ -8182,7 +8876,7 @@
           </w:tcPr>
           <w:p>
             <w:r>
-              <w:t>Defer VIII-4 until stable baselines</w:t>
+              <w:t>Enforce profile budgets and hosted CI</w:t>
             </w:r>
           </w:p>
         </w:tc>
@@ -8201,7 +8895,7 @@
           </w:tcPr>
           <w:p>
             <w:r>
-              <w:t>Run bounded CPU-only functional tests now</w:t>
+              <w:t>Keep local tests contract-only and GPU-free</w:t>
             </w:r>
           </w:p>
         </w:tc>
@@ -8455,7 +9149,7 @@
         <w:pStyle w:val="Heading1"/>
       </w:pPr>
       <w:r>
-        <w:t>17 Study Exercises</w:t>
+        <w:t>18 Study Exercises</w:t>
       </w:r>
     </w:p>
     <w:p>
@@ -8468,12 +9162,12 @@
         <w:pStyle w:val="Heading1"/>
       </w:pPr>
       <w:r>
-        <w:t>18 Volume Completion</w:t>
+        <w:t>19 Volume Completion</w:t>
       </w:r>
     </w:p>
     <w:p>
       <w:r>
-        <w:t>The functional Volume VIII baseline is complete. VIII-4 remains planned near project completion, when stable baselines make performance thresholds and comparable trends meaningful without unnecessary CPU or GPU use during active architecture changes.</w:t>
+        <w:t>The complete Volume VIII baseline is implemented. Performance and stress evidence uses bounded profiles, deterministic thresholds, and comparable historical baselines. Meaningful loads remain isolated from the API and prefer hosted CI to protect workstation resources.</w:t>
       </w:r>
     </w:p>
     <w:sectPr>

</xml_diff>

<commit_message>
feat(test-framework): add performance stress evidence (#98)
</commit_message>
<xml_diff>
--- a/docs/ATEP_Volume_VIII_Test_Framework_Engineering_Workbook.docx
+++ b/docs/ATEP_Volume_VIII_Test_Framework_Engineering_Workbook.docx
@@ -19,12 +19,12 @@
         <w:rPr>
           <w:b/>
         </w:rPr>
-        <w:t>Version 0.6.0   Functional Volume VIII Baseline Complete</w:t>
+        <w:t>Version 0.7.0   Complete Volume VIII Baseline</w:t>
       </w:r>
     </w:p>
     <w:p>
       <w:r>
-        <w:t>This workbook records the catalog, execution-binding, scheduled-selection, and bounded fault-campaign and mutation-quality baseline for ATEP. Reusable definitions describe test intent, suites preserve reviewed composition, and catalog-backed runs now persist deterministic case results and aggregate outcomes.</w:t>
+        <w:t>This workbook records the catalog, execution-binding, scheduled-selection, bounded performance evidence, fault-campaign, and mutation-quality baseline for ATEP. Reusable definitions describe test intent, suites preserve reviewed composition, and catalog-backed runs now persist deterministic case results and aggregate outcomes.</w:t>
       </w:r>
     </w:p>
     <w:tbl>
@@ -125,7 +125,7 @@
           </w:tcPr>
           <w:p>
             <w:r>
-              <w:t>Functional VIII-1, VIII-2, VIII-3, VIII-5, VIII-6, and VIII-7 complete</w:t>
+              <w:t>VIII-1 through VIII-7 complete</w:t>
             </w:r>
           </w:p>
         </w:tc>
@@ -289,7 +289,7 @@
           </w:tcPr>
           <w:p>
             <w:r>
-              <w:t>VIII-4 performance and stress near project completion</w:t>
+              <w:t>Volume IX AI Test Engineer increments</w:t>
             </w:r>
           </w:p>
         </w:tc>
@@ -306,7 +306,7 @@
     </w:p>
     <w:p>
       <w:r>
-        <w:t>VIII-1 separates reusable test design from test execution. A definition captures one test's preconditions, actions, inputs, expectations, classification, and resource budget. A suite selects active definitions in an explicit order and freezes their versions. VIII-2 binds that snapshot to a run and records each case outcome. VIII-3 schedules that immutable intent for later smoke, sanity, or regression execution. VIII-5 adds cross-domain fault campaigns with recovery plans and evidence. VIII-6 adds bounded mutation scoring and explicit requirement coverage gaps.</w:t>
+        <w:t>VIII-1 separates reusable test design from test execution. A definition captures one test's preconditions, actions, inputs, expectations, classification, and resource budget. A suite selects active definitions in an explicit order and freezes their versions. VIII-2 binds that snapshot to a run and records each case outcome. VIII-3 schedules that immutable intent for later smoke, sanity, or regression execution. VIII-4 adds bounded performance and stress evidence with historical comparison. VIII-5 adds cross-domain fault campaigns with recovery plans and evidence. VIII-6 adds bounded mutation scoring and explicit requirement coverage gaps.</w:t>
       </w:r>
     </w:p>
     <w:p>
@@ -330,7 +330,7 @@
         <w:pStyle w:val="ListBullet"/>
       </w:pPr>
       <w:r>
-        <w:t>Performance and stress remain planned but are deferred until near completion; the functional Volume VIII baseline is complete.</w:t>
+        <w:t>Performance and stress now use bounded profiles, deterministic thresholds, and comparable evidence; the complete Volume VIII baseline is implemented.</w:t>
       </w:r>
     </w:p>
     <w:p>
@@ -568,7 +568,7 @@
           </w:tcPr>
           <w:p>
             <w:r>
-              <w:t>Linear migrations 0051 through 0056 with reversible schema changes</w:t>
+              <w:t>Linear migrations 0051 through 0058 with reversible schema changes</w:t>
             </w:r>
           </w:p>
         </w:tc>
@@ -651,6 +651,46 @@
           <w:p>
             <w:r>
               <w:t>Snapshots bounded injection and recovery intent without arbitrary commands</w:t>
+            </w:r>
+          </w:p>
+        </w:tc>
+      </w:tr>
+      <w:tr>
+        <w:tc>
+          <w:tcPr>
+            <w:tcW w:type="dxa" w:w="2232"/>
+            <w:tcBorders>
+              <w:top w:val="single" w:sz="4" w:color="D9D9D9"/>
+              <w:left w:val="single" w:sz="4" w:color="D9D9D9"/>
+              <w:bottom w:val="single" w:sz="4" w:color="D9D9D9"/>
+              <w:right w:val="single" w:sz="4" w:color="D9D9D9"/>
+              <w:insideH w:val="single" w:sz="4" w:color="D9D9D9"/>
+              <w:insideV w:val="single" w:sz="4" w:color="D9D9D9"/>
+            </w:tcBorders>
+            <w:vAlign w:val="center"/>
+          </w:tcPr>
+          <w:p>
+            <w:r>
+              <w:t>Performance evidence</w:t>
+            </w:r>
+          </w:p>
+        </w:tc>
+        <w:tc>
+          <w:tcPr>
+            <w:tcW w:type="dxa" w:w="7704"/>
+            <w:tcBorders>
+              <w:top w:val="single" w:sz="4" w:color="D9D9D9"/>
+              <w:left w:val="single" w:sz="4" w:color="D9D9D9"/>
+              <w:bottom w:val="single" w:sz="4" w:color="D9D9D9"/>
+              <w:right w:val="single" w:sz="4" w:color="D9D9D9"/>
+              <w:insideH w:val="single" w:sz="4" w:color="D9D9D9"/>
+              <w:insideV w:val="single" w:sz="4" w:color="D9D9D9"/>
+            </w:tcBorders>
+            <w:vAlign w:val="center"/>
+          </w:tcPr>
+          <w:p>
+            <w:r>
+              <w:t>Stores bounded profiles, deterministic thresholds, and historical comparisons</w:t>
             </w:r>
           </w:p>
         </w:tc>
@@ -3354,7 +3394,478 @@
         <w:pStyle w:val="Heading1"/>
       </w:pPr>
       <w:r>
-        <w:t>10 Fault Campaigns</w:t>
+        <w:t>10 Performance and Stress</w:t>
+      </w:r>
+    </w:p>
+    <w:p>
+      <w:r>
+        <w:t>VIII-4 stores bounded workload profiles and immutable measured evidence without running a load generator in FastAPI. Every execution links to a terminal test run and passes only when all configured minimum and maximum thresholds pass.</w:t>
+      </w:r>
+    </w:p>
+    <w:tbl>
+      <w:tblPr>
+        <w:tblW w:type="auto" w:w="0"/>
+        <w:tblLayout w:type="fixed"/>
+        <w:tblLook w:firstColumn="1" w:firstRow="1" w:lastColumn="0" w:lastRow="0" w:noHBand="0" w:noVBand="1" w:val="04A0"/>
+      </w:tblPr>
+      <w:tblGrid>
+        <w:gridCol w:w="3312"/>
+        <w:gridCol w:w="3312"/>
+        <w:gridCol w:w="3312"/>
+      </w:tblGrid>
+      <w:tr>
+        <w:trPr>
+          <w:tblHeader/>
+        </w:trPr>
+        <w:tc>
+          <w:tcPr>
+            <w:tcW w:type="dxa" w:w="2304"/>
+            <w:shd w:fill="17365D"/>
+            <w:tcBorders>
+              <w:top w:val="single" w:sz="4" w:color="D9D9D9"/>
+              <w:left w:val="single" w:sz="4" w:color="D9D9D9"/>
+              <w:bottom w:val="single" w:sz="4" w:color="D9D9D9"/>
+              <w:right w:val="single" w:sz="4" w:color="D9D9D9"/>
+              <w:insideH w:val="single" w:sz="4" w:color="D9D9D9"/>
+              <w:insideV w:val="single" w:sz="4" w:color="D9D9D9"/>
+            </w:tcBorders>
+            <w:vAlign w:val="center"/>
+          </w:tcPr>
+          <w:p>
+            <w:r>
+              <w:rPr>
+                <w:b/>
+                <w:color w:val="FFFFFF"/>
+              </w:rPr>
+              <w:t>Control</w:t>
+            </w:r>
+          </w:p>
+        </w:tc>
+        <w:tc>
+          <w:tcPr>
+            <w:tcW w:type="dxa" w:w="2880"/>
+            <w:shd w:fill="17365D"/>
+            <w:tcBorders>
+              <w:top w:val="single" w:sz="4" w:color="D9D9D9"/>
+              <w:left w:val="single" w:sz="4" w:color="D9D9D9"/>
+              <w:bottom w:val="single" w:sz="4" w:color="D9D9D9"/>
+              <w:right w:val="single" w:sz="4" w:color="D9D9D9"/>
+              <w:insideH w:val="single" w:sz="4" w:color="D9D9D9"/>
+              <w:insideV w:val="single" w:sz="4" w:color="D9D9D9"/>
+            </w:tcBorders>
+            <w:vAlign w:val="center"/>
+          </w:tcPr>
+          <w:p>
+            <w:r>
+              <w:rPr>
+                <w:b/>
+                <w:color w:val="FFFFFF"/>
+              </w:rPr>
+              <w:t>Bound</w:t>
+            </w:r>
+          </w:p>
+        </w:tc>
+        <w:tc>
+          <w:tcPr>
+            <w:tcW w:type="dxa" w:w="4752"/>
+            <w:shd w:fill="17365D"/>
+            <w:tcBorders>
+              <w:top w:val="single" w:sz="4" w:color="D9D9D9"/>
+              <w:left w:val="single" w:sz="4" w:color="D9D9D9"/>
+              <w:bottom w:val="single" w:sz="4" w:color="D9D9D9"/>
+              <w:right w:val="single" w:sz="4" w:color="D9D9D9"/>
+              <w:insideH w:val="single" w:sz="4" w:color="D9D9D9"/>
+              <w:insideV w:val="single" w:sz="4" w:color="D9D9D9"/>
+            </w:tcBorders>
+            <w:vAlign w:val="center"/>
+          </w:tcPr>
+          <w:p>
+            <w:r>
+              <w:rPr>
+                <w:b/>
+                <w:color w:val="FFFFFF"/>
+              </w:rPr>
+              <w:t>Purpose</w:t>
+            </w:r>
+          </w:p>
+        </w:tc>
+      </w:tr>
+      <w:tr>
+        <w:tc>
+          <w:tcPr>
+            <w:tcW w:type="dxa" w:w="2304"/>
+            <w:tcBorders>
+              <w:top w:val="single" w:sz="4" w:color="D9D9D9"/>
+              <w:left w:val="single" w:sz="4" w:color="D9D9D9"/>
+              <w:bottom w:val="single" w:sz="4" w:color="D9D9D9"/>
+              <w:right w:val="single" w:sz="4" w:color="D9D9D9"/>
+              <w:insideH w:val="single" w:sz="4" w:color="D9D9D9"/>
+              <w:insideV w:val="single" w:sz="4" w:color="D9D9D9"/>
+            </w:tcBorders>
+            <w:vAlign w:val="center"/>
+          </w:tcPr>
+          <w:p>
+            <w:r>
+              <w:t>Duration</w:t>
+            </w:r>
+          </w:p>
+        </w:tc>
+        <w:tc>
+          <w:tcPr>
+            <w:tcW w:type="dxa" w:w="2880"/>
+            <w:tcBorders>
+              <w:top w:val="single" w:sz="4" w:color="D9D9D9"/>
+              <w:left w:val="single" w:sz="4" w:color="D9D9D9"/>
+              <w:bottom w:val="single" w:sz="4" w:color="D9D9D9"/>
+              <w:right w:val="single" w:sz="4" w:color="D9D9D9"/>
+              <w:insideH w:val="single" w:sz="4" w:color="D9D9D9"/>
+              <w:insideV w:val="single" w:sz="4" w:color="D9D9D9"/>
+            </w:tcBorders>
+            <w:vAlign w:val="center"/>
+          </w:tcPr>
+          <w:p>
+            <w:r>
+              <w:t>3600 seconds total</w:t>
+            </w:r>
+          </w:p>
+        </w:tc>
+        <w:tc>
+          <w:tcPr>
+            <w:tcW w:type="dxa" w:w="4752"/>
+            <w:tcBorders>
+              <w:top w:val="single" w:sz="4" w:color="D9D9D9"/>
+              <w:left w:val="single" w:sz="4" w:color="D9D9D9"/>
+              <w:bottom w:val="single" w:sz="4" w:color="D9D9D9"/>
+              <w:right w:val="single" w:sz="4" w:color="D9D9D9"/>
+              <w:insideH w:val="single" w:sz="4" w:color="D9D9D9"/>
+              <w:insideV w:val="single" w:sz="4" w:color="D9D9D9"/>
+            </w:tcBorders>
+            <w:vAlign w:val="center"/>
+          </w:tcPr>
+          <w:p>
+            <w:r>
+              <w:t>Bound execution exposure</w:t>
+            </w:r>
+          </w:p>
+        </w:tc>
+      </w:tr>
+      <w:tr>
+        <w:tc>
+          <w:tcPr>
+            <w:tcW w:type="dxa" w:w="2304"/>
+            <w:tcBorders>
+              <w:top w:val="single" w:sz="4" w:color="D9D9D9"/>
+              <w:left w:val="single" w:sz="4" w:color="D9D9D9"/>
+              <w:bottom w:val="single" w:sz="4" w:color="D9D9D9"/>
+              <w:right w:val="single" w:sz="4" w:color="D9D9D9"/>
+              <w:insideH w:val="single" w:sz="4" w:color="D9D9D9"/>
+              <w:insideV w:val="single" w:sz="4" w:color="D9D9D9"/>
+            </w:tcBorders>
+            <w:shd w:fill="EAF0F7"/>
+            <w:vAlign w:val="center"/>
+          </w:tcPr>
+          <w:p>
+            <w:r>
+              <w:t>Virtual users</w:t>
+            </w:r>
+          </w:p>
+        </w:tc>
+        <w:tc>
+          <w:tcPr>
+            <w:tcW w:type="dxa" w:w="2880"/>
+            <w:tcBorders>
+              <w:top w:val="single" w:sz="4" w:color="D9D9D9"/>
+              <w:left w:val="single" w:sz="4" w:color="D9D9D9"/>
+              <w:bottom w:val="single" w:sz="4" w:color="D9D9D9"/>
+              <w:right w:val="single" w:sz="4" w:color="D9D9D9"/>
+              <w:insideH w:val="single" w:sz="4" w:color="D9D9D9"/>
+              <w:insideV w:val="single" w:sz="4" w:color="D9D9D9"/>
+            </w:tcBorders>
+            <w:shd w:fill="EAF0F7"/>
+            <w:vAlign w:val="center"/>
+          </w:tcPr>
+          <w:p>
+            <w:r>
+              <w:t>500 per stage</w:t>
+            </w:r>
+          </w:p>
+        </w:tc>
+        <w:tc>
+          <w:tcPr>
+            <w:tcW w:type="dxa" w:w="4752"/>
+            <w:tcBorders>
+              <w:top w:val="single" w:sz="4" w:color="D9D9D9"/>
+              <w:left w:val="single" w:sz="4" w:color="D9D9D9"/>
+              <w:bottom w:val="single" w:sz="4" w:color="D9D9D9"/>
+              <w:right w:val="single" w:sz="4" w:color="D9D9D9"/>
+              <w:insideH w:val="single" w:sz="4" w:color="D9D9D9"/>
+              <w:insideV w:val="single" w:sz="4" w:color="D9D9D9"/>
+            </w:tcBorders>
+            <w:shd w:fill="EAF0F7"/>
+            <w:vAlign w:val="center"/>
+          </w:tcPr>
+          <w:p>
+            <w:r>
+              <w:t>Prevent unsafe concurrency</w:t>
+            </w:r>
+          </w:p>
+        </w:tc>
+      </w:tr>
+      <w:tr>
+        <w:tc>
+          <w:tcPr>
+            <w:tcW w:type="dxa" w:w="2304"/>
+            <w:tcBorders>
+              <w:top w:val="single" w:sz="4" w:color="D9D9D9"/>
+              <w:left w:val="single" w:sz="4" w:color="D9D9D9"/>
+              <w:bottom w:val="single" w:sz="4" w:color="D9D9D9"/>
+              <w:right w:val="single" w:sz="4" w:color="D9D9D9"/>
+              <w:insideH w:val="single" w:sz="4" w:color="D9D9D9"/>
+              <w:insideV w:val="single" w:sz="4" w:color="D9D9D9"/>
+            </w:tcBorders>
+            <w:vAlign w:val="center"/>
+          </w:tcPr>
+          <w:p>
+            <w:r>
+              <w:t>Request rate</w:t>
+            </w:r>
+          </w:p>
+        </w:tc>
+        <w:tc>
+          <w:tcPr>
+            <w:tcW w:type="dxa" w:w="2880"/>
+            <w:tcBorders>
+              <w:top w:val="single" w:sz="4" w:color="D9D9D9"/>
+              <w:left w:val="single" w:sz="4" w:color="D9D9D9"/>
+              <w:bottom w:val="single" w:sz="4" w:color="D9D9D9"/>
+              <w:right w:val="single" w:sz="4" w:color="D9D9D9"/>
+              <w:insideH w:val="single" w:sz="4" w:color="D9D9D9"/>
+              <w:insideV w:val="single" w:sz="4" w:color="D9D9D9"/>
+            </w:tcBorders>
+            <w:vAlign w:val="center"/>
+          </w:tcPr>
+          <w:p>
+            <w:r>
+              <w:t>1000 per second</w:t>
+            </w:r>
+          </w:p>
+        </w:tc>
+        <w:tc>
+          <w:tcPr>
+            <w:tcW w:type="dxa" w:w="4752"/>
+            <w:tcBorders>
+              <w:top w:val="single" w:sz="4" w:color="D9D9D9"/>
+              <w:left w:val="single" w:sz="4" w:color="D9D9D9"/>
+              <w:bottom w:val="single" w:sz="4" w:color="D9D9D9"/>
+              <w:right w:val="single" w:sz="4" w:color="D9D9D9"/>
+              <w:insideH w:val="single" w:sz="4" w:color="D9D9D9"/>
+              <w:insideV w:val="single" w:sz="4" w:color="D9D9D9"/>
+            </w:tcBorders>
+            <w:vAlign w:val="center"/>
+          </w:tcPr>
+          <w:p>
+            <w:r>
+              <w:t>Protect shared services</w:t>
+            </w:r>
+          </w:p>
+        </w:tc>
+      </w:tr>
+      <w:tr>
+        <w:tc>
+          <w:tcPr>
+            <w:tcW w:type="dxa" w:w="2304"/>
+            <w:tcBorders>
+              <w:top w:val="single" w:sz="4" w:color="D9D9D9"/>
+              <w:left w:val="single" w:sz="4" w:color="D9D9D9"/>
+              <w:bottom w:val="single" w:sz="4" w:color="D9D9D9"/>
+              <w:right w:val="single" w:sz="4" w:color="D9D9D9"/>
+              <w:insideH w:val="single" w:sz="4" w:color="D9D9D9"/>
+              <w:insideV w:val="single" w:sz="4" w:color="D9D9D9"/>
+            </w:tcBorders>
+            <w:shd w:fill="EAF0F7"/>
+            <w:vAlign w:val="center"/>
+          </w:tcPr>
+          <w:p>
+            <w:r>
+              <w:t>CPU and memory</w:t>
+            </w:r>
+          </w:p>
+        </w:tc>
+        <w:tc>
+          <w:tcPr>
+            <w:tcW w:type="dxa" w:w="2880"/>
+            <w:tcBorders>
+              <w:top w:val="single" w:sz="4" w:color="D9D9D9"/>
+              <w:left w:val="single" w:sz="4" w:color="D9D9D9"/>
+              <w:bottom w:val="single" w:sz="4" w:color="D9D9D9"/>
+              <w:right w:val="single" w:sz="4" w:color="D9D9D9"/>
+              <w:insideH w:val="single" w:sz="4" w:color="D9D9D9"/>
+              <w:insideV w:val="single" w:sz="4" w:color="D9D9D9"/>
+            </w:tcBorders>
+            <w:shd w:fill="EAF0F7"/>
+            <w:vAlign w:val="center"/>
+          </w:tcPr>
+          <w:p>
+            <w:r>
+              <w:t>4 cores and 4096 MB</w:t>
+            </w:r>
+          </w:p>
+        </w:tc>
+        <w:tc>
+          <w:tcPr>
+            <w:tcW w:type="dxa" w:w="4752"/>
+            <w:tcBorders>
+              <w:top w:val="single" w:sz="4" w:color="D9D9D9"/>
+              <w:left w:val="single" w:sz="4" w:color="D9D9D9"/>
+              <w:bottom w:val="single" w:sz="4" w:color="D9D9D9"/>
+              <w:right w:val="single" w:sz="4" w:color="D9D9D9"/>
+              <w:insideH w:val="single" w:sz="4" w:color="D9D9D9"/>
+              <w:insideV w:val="single" w:sz="4" w:color="D9D9D9"/>
+            </w:tcBorders>
+            <w:shd w:fill="EAF0F7"/>
+            <w:vAlign w:val="center"/>
+          </w:tcPr>
+          <w:p>
+            <w:r>
+              <w:t>Keep resource budgets explicit</w:t>
+            </w:r>
+          </w:p>
+        </w:tc>
+      </w:tr>
+      <w:tr>
+        <w:tc>
+          <w:tcPr>
+            <w:tcW w:type="dxa" w:w="2304"/>
+            <w:tcBorders>
+              <w:top w:val="single" w:sz="4" w:color="D9D9D9"/>
+              <w:left w:val="single" w:sz="4" w:color="D9D9D9"/>
+              <w:bottom w:val="single" w:sz="4" w:color="D9D9D9"/>
+              <w:right w:val="single" w:sz="4" w:color="D9D9D9"/>
+              <w:insideH w:val="single" w:sz="4" w:color="D9D9D9"/>
+              <w:insideV w:val="single" w:sz="4" w:color="D9D9D9"/>
+            </w:tcBorders>
+            <w:vAlign w:val="center"/>
+          </w:tcPr>
+          <w:p>
+            <w:r>
+              <w:t>GPU</w:t>
+            </w:r>
+          </w:p>
+        </w:tc>
+        <w:tc>
+          <w:tcPr>
+            <w:tcW w:type="dxa" w:w="2880"/>
+            <w:tcBorders>
+              <w:top w:val="single" w:sz="4" w:color="D9D9D9"/>
+              <w:left w:val="single" w:sz="4" w:color="D9D9D9"/>
+              <w:bottom w:val="single" w:sz="4" w:color="D9D9D9"/>
+              <w:right w:val="single" w:sz="4" w:color="D9D9D9"/>
+              <w:insideH w:val="single" w:sz="4" w:color="D9D9D9"/>
+              <w:insideV w:val="single" w:sz="4" w:color="D9D9D9"/>
+            </w:tcBorders>
+            <w:vAlign w:val="center"/>
+          </w:tcPr>
+          <w:p>
+            <w:r>
+              <w:t>Always disabled</w:t>
+            </w:r>
+          </w:p>
+        </w:tc>
+        <w:tc>
+          <w:tcPr>
+            <w:tcW w:type="dxa" w:w="4752"/>
+            <w:tcBorders>
+              <w:top w:val="single" w:sz="4" w:color="D9D9D9"/>
+              <w:left w:val="single" w:sz="4" w:color="D9D9D9"/>
+              <w:bottom w:val="single" w:sz="4" w:color="D9D9D9"/>
+              <w:right w:val="single" w:sz="4" w:color="D9D9D9"/>
+              <w:insideH w:val="single" w:sz="4" w:color="D9D9D9"/>
+              <w:insideV w:val="single" w:sz="4" w:color="D9D9D9"/>
+            </w:tcBorders>
+            <w:vAlign w:val="center"/>
+          </w:tcPr>
+          <w:p>
+            <w:r>
+              <w:t>Protect workstation resources</w:t>
+            </w:r>
+          </w:p>
+        </w:tc>
+      </w:tr>
+      <w:tr>
+        <w:tc>
+          <w:tcPr>
+            <w:tcW w:type="dxa" w:w="2304"/>
+            <w:tcBorders>
+              <w:top w:val="single" w:sz="4" w:color="D9D9D9"/>
+              <w:left w:val="single" w:sz="4" w:color="D9D9D9"/>
+              <w:bottom w:val="single" w:sz="4" w:color="D9D9D9"/>
+              <w:right w:val="single" w:sz="4" w:color="D9D9D9"/>
+              <w:insideH w:val="single" w:sz="4" w:color="D9D9D9"/>
+              <w:insideV w:val="single" w:sz="4" w:color="D9D9D9"/>
+            </w:tcBorders>
+            <w:shd w:fill="EAF0F7"/>
+            <w:vAlign w:val="center"/>
+          </w:tcPr>
+          <w:p>
+            <w:r>
+              <w:t>Baseline</w:t>
+            </w:r>
+          </w:p>
+        </w:tc>
+        <w:tc>
+          <w:tcPr>
+            <w:tcW w:type="dxa" w:w="2880"/>
+            <w:tcBorders>
+              <w:top w:val="single" w:sz="4" w:color="D9D9D9"/>
+              <w:left w:val="single" w:sz="4" w:color="D9D9D9"/>
+              <w:bottom w:val="single" w:sz="4" w:color="D9D9D9"/>
+              <w:right w:val="single" w:sz="4" w:color="D9D9D9"/>
+              <w:insideH w:val="single" w:sz="4" w:color="D9D9D9"/>
+              <w:insideV w:val="single" w:sz="4" w:color="D9D9D9"/>
+            </w:tcBorders>
+            <w:shd w:fill="EAF0F7"/>
+            <w:vAlign w:val="center"/>
+          </w:tcPr>
+          <w:p>
+            <w:r>
+              <w:t>Same profile only</w:t>
+            </w:r>
+          </w:p>
+        </w:tc>
+        <w:tc>
+          <w:tcPr>
+            <w:tcW w:type="dxa" w:w="4752"/>
+            <w:tcBorders>
+              <w:top w:val="single" w:sz="4" w:color="D9D9D9"/>
+              <w:left w:val="single" w:sz="4" w:color="D9D9D9"/>
+              <w:bottom w:val="single" w:sz="4" w:color="D9D9D9"/>
+              <w:right w:val="single" w:sz="4" w:color="D9D9D9"/>
+              <w:insideH w:val="single" w:sz="4" w:color="D9D9D9"/>
+              <w:insideV w:val="single" w:sz="4" w:color="D9D9D9"/>
+            </w:tcBorders>
+            <w:shd w:fill="EAF0F7"/>
+            <w:vAlign w:val="center"/>
+          </w:tcPr>
+          <w:p>
+            <w:r>
+              <w:t>Make trends comparable</w:t>
+            </w:r>
+          </w:p>
+        </w:tc>
+      </w:tr>
+    </w:tbl>
+    <w:p/>
+    <w:p>
+      <w:r>
+        <w:br w:type="page"/>
+      </w:r>
+    </w:p>
+    <w:p>
+      <w:pPr>
+        <w:pStyle w:val="Heading1"/>
+      </w:pPr>
+      <w:r>
+        <w:t>11 Fault Campaigns</w:t>
       </w:r>
     </w:p>
     <w:p>
@@ -3830,7 +4341,7 @@
         <w:pStyle w:val="Heading1"/>
       </w:pPr>
       <w:r>
-        <w:t>11 Mutation Testing and Coverage</w:t>
+        <w:t>12 Mutation Testing and Coverage</w:t>
       </w:r>
     </w:p>
     <w:p>
@@ -4306,7 +4817,7 @@
         <w:pStyle w:val="Heading1"/>
       </w:pPr>
       <w:r>
-        <w:t>12 Cross Platform Automation Reporting</w:t>
+        <w:t>13 Cross Platform Automation Reporting</w:t>
       </w:r>
     </w:p>
     <w:p>
@@ -4782,7 +5293,7 @@
         <w:pStyle w:val="Heading1"/>
       </w:pPr>
       <w:r>
-        <w:t>13 Events and Audit</w:t>
+        <w:t>14 Events and Audit</w:t>
       </w:r>
     </w:p>
     <w:tbl>
@@ -5837,6 +6348,127 @@
           <w:p>
             <w:r>
               <w:t>requirement_coverage.updated</w:t>
+            </w:r>
+          </w:p>
+        </w:tc>
+      </w:tr>
+      <w:tr>
+        <w:tc>
+          <w:tcPr>
+            <w:tcW w:type="dxa" w:w="2376"/>
+            <w:tcBorders>
+              <w:top w:val="single" w:sz="4" w:color="D9D9D9"/>
+              <w:left w:val="single" w:sz="4" w:color="D9D9D9"/>
+              <w:bottom w:val="single" w:sz="4" w:color="D9D9D9"/>
+              <w:right w:val="single" w:sz="4" w:color="D9D9D9"/>
+              <w:insideH w:val="single" w:sz="4" w:color="D9D9D9"/>
+              <w:insideV w:val="single" w:sz="4" w:color="D9D9D9"/>
+            </w:tcBorders>
+            <w:vAlign w:val="center"/>
+          </w:tcPr>
+          <w:p>
+            <w:r>
+              <w:t>Create performance profile</w:t>
+            </w:r>
+          </w:p>
+        </w:tc>
+        <w:tc>
+          <w:tcPr>
+            <w:tcW w:type="dxa" w:w="4536"/>
+            <w:tcBorders>
+              <w:top w:val="single" w:sz="4" w:color="D9D9D9"/>
+              <w:left w:val="single" w:sz="4" w:color="D9D9D9"/>
+              <w:bottom w:val="single" w:sz="4" w:color="D9D9D9"/>
+              <w:right w:val="single" w:sz="4" w:color="D9D9D9"/>
+              <w:insideH w:val="single" w:sz="4" w:color="D9D9D9"/>
+              <w:insideV w:val="single" w:sz="4" w:color="D9D9D9"/>
+            </w:tcBorders>
+            <w:vAlign w:val="center"/>
+          </w:tcPr>
+          <w:p>
+            <w:r>
+              <w:t>atep.performance.profile.created.v1</w:t>
+            </w:r>
+          </w:p>
+        </w:tc>
+        <w:tc>
+          <w:tcPr>
+            <w:tcW w:type="dxa" w:w="3024"/>
+            <w:tcBorders>
+              <w:top w:val="single" w:sz="4" w:color="D9D9D9"/>
+              <w:left w:val="single" w:sz="4" w:color="D9D9D9"/>
+              <w:bottom w:val="single" w:sz="4" w:color="D9D9D9"/>
+              <w:right w:val="single" w:sz="4" w:color="D9D9D9"/>
+              <w:insideH w:val="single" w:sz="4" w:color="D9D9D9"/>
+              <w:insideV w:val="single" w:sz="4" w:color="D9D9D9"/>
+            </w:tcBorders>
+            <w:vAlign w:val="center"/>
+          </w:tcPr>
+          <w:p>
+            <w:r>
+              <w:t>performance.profile_created</w:t>
+            </w:r>
+          </w:p>
+        </w:tc>
+      </w:tr>
+      <w:tr>
+        <w:tc>
+          <w:tcPr>
+            <w:tcW w:type="dxa" w:w="2376"/>
+            <w:tcBorders>
+              <w:top w:val="single" w:sz="4" w:color="D9D9D9"/>
+              <w:left w:val="single" w:sz="4" w:color="D9D9D9"/>
+              <w:bottom w:val="single" w:sz="4" w:color="D9D9D9"/>
+              <w:right w:val="single" w:sz="4" w:color="D9D9D9"/>
+              <w:insideH w:val="single" w:sz="4" w:color="D9D9D9"/>
+              <w:insideV w:val="single" w:sz="4" w:color="D9D9D9"/>
+            </w:tcBorders>
+            <w:shd w:fill="EAF0F7"/>
+            <w:vAlign w:val="center"/>
+          </w:tcPr>
+          <w:p>
+            <w:r>
+              <w:t>Record performance execution</w:t>
+            </w:r>
+          </w:p>
+        </w:tc>
+        <w:tc>
+          <w:tcPr>
+            <w:tcW w:type="dxa" w:w="4536"/>
+            <w:tcBorders>
+              <w:top w:val="single" w:sz="4" w:color="D9D9D9"/>
+              <w:left w:val="single" w:sz="4" w:color="D9D9D9"/>
+              <w:bottom w:val="single" w:sz="4" w:color="D9D9D9"/>
+              <w:right w:val="single" w:sz="4" w:color="D9D9D9"/>
+              <w:insideH w:val="single" w:sz="4" w:color="D9D9D9"/>
+              <w:insideV w:val="single" w:sz="4" w:color="D9D9D9"/>
+            </w:tcBorders>
+            <w:shd w:fill="EAF0F7"/>
+            <w:vAlign w:val="center"/>
+          </w:tcPr>
+          <w:p>
+            <w:r>
+              <w:t>atep.performance.execution.recorded.v1</w:t>
+            </w:r>
+          </w:p>
+        </w:tc>
+        <w:tc>
+          <w:tcPr>
+            <w:tcW w:type="dxa" w:w="3024"/>
+            <w:tcBorders>
+              <w:top w:val="single" w:sz="4" w:color="D9D9D9"/>
+              <w:left w:val="single" w:sz="4" w:color="D9D9D9"/>
+              <w:bottom w:val="single" w:sz="4" w:color="D9D9D9"/>
+              <w:right w:val="single" w:sz="4" w:color="D9D9D9"/>
+              <w:insideH w:val="single" w:sz="4" w:color="D9D9D9"/>
+              <w:insideV w:val="single" w:sz="4" w:color="D9D9D9"/>
+            </w:tcBorders>
+            <w:shd w:fill="EAF0F7"/>
+            <w:vAlign w:val="center"/>
+          </w:tcPr>
+          <w:p>
+            <w:r>
+              <w:t>performance.execution_recorded</w:t>
             </w:r>
           </w:p>
         </w:tc>
@@ -5917,7 +6549,7 @@
         <w:pStyle w:val="Heading1"/>
       </w:pPr>
       <w:r>
-        <w:t>14 Engineering Decisions</w:t>
+        <w:t>15 Engineering Decisions</w:t>
       </w:r>
     </w:p>
     <w:tbl>
@@ -6805,7 +7437,7 @@
         <w:pStyle w:val="Heading1"/>
       </w:pPr>
       <w:r>
-        <w:t>15 Verification Catalogue</w:t>
+        <w:t>16 Verification Catalogue</w:t>
       </w:r>
     </w:p>
     <w:tbl>
@@ -7560,6 +8192,68 @@
           </w:p>
         </w:tc>
       </w:tr>
+      <w:tr>
+        <w:tc>
+          <w:tcPr>
+            <w:tcW w:type="dxa" w:w="2232"/>
+            <w:tcBorders>
+              <w:top w:val="single" w:sz="4" w:color="D9D9D9"/>
+              <w:left w:val="single" w:sz="4" w:color="D9D9D9"/>
+              <w:bottom w:val="single" w:sz="4" w:color="D9D9D9"/>
+              <w:right w:val="single" w:sz="4" w:color="D9D9D9"/>
+              <w:insideH w:val="single" w:sz="4" w:color="D9D9D9"/>
+              <w:insideV w:val="single" w:sz="4" w:color="D9D9D9"/>
+            </w:tcBorders>
+            <w:shd w:fill="EAF0F7"/>
+            <w:vAlign w:val="center"/>
+          </w:tcPr>
+          <w:p>
+            <w:r>
+              <w:t>TF-T-069 to 073</w:t>
+            </w:r>
+          </w:p>
+        </w:tc>
+        <w:tc>
+          <w:tcPr>
+            <w:tcW w:type="dxa" w:w="3528"/>
+            <w:tcBorders>
+              <w:top w:val="single" w:sz="4" w:color="D9D9D9"/>
+              <w:left w:val="single" w:sz="4" w:color="D9D9D9"/>
+              <w:bottom w:val="single" w:sz="4" w:color="D9D9D9"/>
+              <w:right w:val="single" w:sz="4" w:color="D9D9D9"/>
+              <w:insideH w:val="single" w:sz="4" w:color="D9D9D9"/>
+              <w:insideV w:val="single" w:sz="4" w:color="D9D9D9"/>
+            </w:tcBorders>
+            <w:shd w:fill="EAF0F7"/>
+            <w:vAlign w:val="center"/>
+          </w:tcPr>
+          <w:p>
+            <w:r>
+              <w:t>Performance and stress</w:t>
+            </w:r>
+          </w:p>
+        </w:tc>
+        <w:tc>
+          <w:tcPr>
+            <w:tcW w:type="dxa" w:w="4176"/>
+            <w:tcBorders>
+              <w:top w:val="single" w:sz="4" w:color="D9D9D9"/>
+              <w:left w:val="single" w:sz="4" w:color="D9D9D9"/>
+              <w:bottom w:val="single" w:sz="4" w:color="D9D9D9"/>
+              <w:right w:val="single" w:sz="4" w:color="D9D9D9"/>
+              <w:insideH w:val="single" w:sz="4" w:color="D9D9D9"/>
+              <w:insideV w:val="single" w:sz="4" w:color="D9D9D9"/>
+            </w:tcBorders>
+            <w:shd w:fill="EAF0F7"/>
+            <w:vAlign w:val="center"/>
+          </w:tcPr>
+          <w:p>
+            <w:r>
+              <w:t>Validate resource bounds, thresholds, baselines, evidence, and migration</w:t>
+            </w:r>
+          </w:p>
+        </w:tc>
+      </w:tr>
     </w:tbl>
     <w:p/>
     <w:p>
@@ -7572,7 +8266,7 @@
         <w:pStyle w:val="Heading1"/>
       </w:pPr>
       <w:r>
-        <w:t>16 Risks and Controls</w:t>
+        <w:t>17 Risks and Controls</w:t>
       </w:r>
     </w:p>
     <w:tbl>
@@ -8182,7 +8876,7 @@
           </w:tcPr>
           <w:p>
             <w:r>
-              <w:t>Defer VIII-4 until stable baselines</w:t>
+              <w:t>Enforce profile budgets and hosted CI</w:t>
             </w:r>
           </w:p>
         </w:tc>
@@ -8201,7 +8895,7 @@
           </w:tcPr>
           <w:p>
             <w:r>
-              <w:t>Run bounded CPU-only functional tests now</w:t>
+              <w:t>Keep local tests contract-only and GPU-free</w:t>
             </w:r>
           </w:p>
         </w:tc>
@@ -8455,7 +9149,7 @@
         <w:pStyle w:val="Heading1"/>
       </w:pPr>
       <w:r>
-        <w:t>17 Study Exercises</w:t>
+        <w:t>18 Study Exercises</w:t>
       </w:r>
     </w:p>
     <w:p>
@@ -8468,12 +9162,12 @@
         <w:pStyle w:val="Heading1"/>
       </w:pPr>
       <w:r>
-        <w:t>18 Volume Completion</w:t>
+        <w:t>19 Volume Completion</w:t>
       </w:r>
     </w:p>
     <w:p>
       <w:r>
-        <w:t>The functional Volume VIII baseline is complete. VIII-4 remains planned near project completion, when stable baselines make performance thresholds and comparable trends meaningful without unnecessary CPU or GPU use during active architecture changes.</w:t>
+        <w:t>The complete Volume VIII baseline is implemented. Performance and stress evidence uses bounded profiles, deterministic thresholds, and comparable historical baselines. Meaningful loads remain isolated from the API and prefer hosted CI to protect workstation resources.</w:t>
       </w:r>
     </w:p>
     <w:sectPr>

</xml_diff>